<commit_message>
Retoca el indice del documento del analisis del proyecto
</commit_message>
<xml_diff>
--- a/documentacion/Análisis Del Enunciado 2/PROYECTO-RETO – Análisis _ Grupo2.docx
+++ b/documentacion/Análisis Del Enunciado 2/PROYECTO-RETO – Análisis _ Grupo2.docx
@@ -116,7 +116,29 @@
                                     <w:sz w:val="24"/>
                                     <w:szCs w:val="24"/>
                                   </w:rPr>
-                                  <w:t>Diana Rodriguez Pinillos</w:t>
+                                  <w:t xml:space="preserve">Diana </w:t>
+                                </w:r>
+                                <w:proofErr w:type="spellStart"/>
+                                <w:r>
+                                  <w:rPr>
+                                    <w:rFonts w:ascii="Calisto MT" w:hAnsi="Calisto MT"/>
+                                    <w:b/>
+                                    <w:bCs/>
+                                    <w:sz w:val="24"/>
+                                    <w:szCs w:val="24"/>
+                                  </w:rPr>
+                                  <w:t>Rodriguez</w:t>
+                                </w:r>
+                                <w:proofErr w:type="spellEnd"/>
+                                <w:r>
+                                  <w:rPr>
+                                    <w:rFonts w:ascii="Calisto MT" w:hAnsi="Calisto MT"/>
+                                    <w:b/>
+                                    <w:bCs/>
+                                    <w:sz w:val="24"/>
+                                    <w:szCs w:val="24"/>
+                                  </w:rPr>
+                                  <w:t xml:space="preserve"> Pinillos</w:t>
                                 </w:r>
                               </w:p>
                               <w:p>
@@ -138,8 +160,42 @@
                                     <w:sz w:val="24"/>
                                     <w:szCs w:val="24"/>
                                   </w:rPr>
-                                  <w:t>Alex Andrei Stoica</w:t>
+                                  <w:t xml:space="preserve">Alex </w:t>
                                 </w:r>
+                                <w:proofErr w:type="spellStart"/>
+                                <w:r>
+                                  <w:rPr>
+                                    <w:rFonts w:ascii="Calisto MT" w:hAnsi="Calisto MT"/>
+                                    <w:b/>
+                                    <w:bCs/>
+                                    <w:sz w:val="24"/>
+                                    <w:szCs w:val="24"/>
+                                  </w:rPr>
+                                  <w:t>Andrei</w:t>
+                                </w:r>
+                                <w:proofErr w:type="spellEnd"/>
+                                <w:r>
+                                  <w:rPr>
+                                    <w:rFonts w:ascii="Calisto MT" w:hAnsi="Calisto MT"/>
+                                    <w:b/>
+                                    <w:bCs/>
+                                    <w:sz w:val="24"/>
+                                    <w:szCs w:val="24"/>
+                                  </w:rPr>
+                                  <w:t xml:space="preserve"> </w:t>
+                                </w:r>
+                                <w:proofErr w:type="spellStart"/>
+                                <w:r>
+                                  <w:rPr>
+                                    <w:rFonts w:ascii="Calisto MT" w:hAnsi="Calisto MT"/>
+                                    <w:b/>
+                                    <w:bCs/>
+                                    <w:sz w:val="24"/>
+                                    <w:szCs w:val="24"/>
+                                  </w:rPr>
+                                  <w:t>Stoica</w:t>
+                                </w:r>
+                                <w:proofErr w:type="spellEnd"/>
                               </w:p>
                               <w:p>
                                 <w:pPr>
@@ -245,7 +301,29 @@
                               <w:sz w:val="24"/>
                               <w:szCs w:val="24"/>
                             </w:rPr>
-                            <w:t>Diana Rodriguez Pinillos</w:t>
+                            <w:t xml:space="preserve">Diana </w:t>
+                          </w:r>
+                          <w:proofErr w:type="spellStart"/>
+                          <w:r>
+                            <w:rPr>
+                              <w:rFonts w:ascii="Calisto MT" w:hAnsi="Calisto MT"/>
+                              <w:b/>
+                              <w:bCs/>
+                              <w:sz w:val="24"/>
+                              <w:szCs w:val="24"/>
+                            </w:rPr>
+                            <w:t>Rodriguez</w:t>
+                          </w:r>
+                          <w:proofErr w:type="spellEnd"/>
+                          <w:r>
+                            <w:rPr>
+                              <w:rFonts w:ascii="Calisto MT" w:hAnsi="Calisto MT"/>
+                              <w:b/>
+                              <w:bCs/>
+                              <w:sz w:val="24"/>
+                              <w:szCs w:val="24"/>
+                            </w:rPr>
+                            <w:t xml:space="preserve"> Pinillos</w:t>
                           </w:r>
                         </w:p>
                         <w:p>
@@ -267,8 +345,42 @@
                               <w:sz w:val="24"/>
                               <w:szCs w:val="24"/>
                             </w:rPr>
-                            <w:t>Alex Andrei Stoica</w:t>
+                            <w:t xml:space="preserve">Alex </w:t>
                           </w:r>
+                          <w:proofErr w:type="spellStart"/>
+                          <w:r>
+                            <w:rPr>
+                              <w:rFonts w:ascii="Calisto MT" w:hAnsi="Calisto MT"/>
+                              <w:b/>
+                              <w:bCs/>
+                              <w:sz w:val="24"/>
+                              <w:szCs w:val="24"/>
+                            </w:rPr>
+                            <w:t>Andrei</w:t>
+                          </w:r>
+                          <w:proofErr w:type="spellEnd"/>
+                          <w:r>
+                            <w:rPr>
+                              <w:rFonts w:ascii="Calisto MT" w:hAnsi="Calisto MT"/>
+                              <w:b/>
+                              <w:bCs/>
+                              <w:sz w:val="24"/>
+                              <w:szCs w:val="24"/>
+                            </w:rPr>
+                            <w:t xml:space="preserve"> </w:t>
+                          </w:r>
+                          <w:proofErr w:type="spellStart"/>
+                          <w:r>
+                            <w:rPr>
+                              <w:rFonts w:ascii="Calisto MT" w:hAnsi="Calisto MT"/>
+                              <w:b/>
+                              <w:bCs/>
+                              <w:sz w:val="24"/>
+                              <w:szCs w:val="24"/>
+                            </w:rPr>
+                            <w:t>Stoica</w:t>
+                          </w:r>
+                          <w:proofErr w:type="spellEnd"/>
                         </w:p>
                         <w:p>
                           <w:pPr>
@@ -852,7 +964,7 @@
                             <w:pPr>
                               <w:pStyle w:val="Ttulo1"/>
                             </w:pPr>
-                            <w:bookmarkStart w:id="0" w:name="_Toc225727454"/>
+                            <w:bookmarkStart w:id="0" w:name="_Toc225990358"/>
                             <w:r>
                               <w:rPr>
                                 <w:rFonts w:ascii="Segoe UI Emoji" w:hAnsi="Segoe UI Emoji"/>
@@ -891,7 +1003,7 @@
                       <w:pPr>
                         <w:pStyle w:val="Ttulo1"/>
                       </w:pPr>
-                      <w:bookmarkStart w:id="1" w:name="_Toc225727454"/>
+                      <w:bookmarkStart w:id="1" w:name="_Toc225990358"/>
                       <w:r>
                         <w:rPr>
                           <w:rFonts w:ascii="Segoe UI Emoji" w:hAnsi="Segoe UI Emoji"/>
@@ -967,7 +1079,7 @@
           <w:r>
             <w:fldChar w:fldCharType="separate"/>
           </w:r>
-          <w:hyperlink w:anchor="_Toc225727454" w:history="1">
+          <w:hyperlink w:anchor="_Toc225990358" w:history="1">
             <w:r>
               <w:rPr>
                 <w:rStyle w:val="Hipervnculo"/>
@@ -1002,7 +1114,7 @@
                 <w:noProof/>
                 <w:webHidden/>
               </w:rPr>
-              <w:instrText xml:space="preserve"> PAGEREF _Toc225727454 \h </w:instrText>
+              <w:instrText xml:space="preserve"> PAGEREF _Toc225990358 \h </w:instrText>
             </w:r>
             <w:r>
               <w:rPr>
@@ -1049,7 +1161,7 @@
               <w14:ligatures w14:val="standardContextual"/>
             </w:rPr>
           </w:pPr>
-          <w:hyperlink w:anchor="_Toc225727455" w:history="1">
+          <w:hyperlink w:anchor="_Toc225990359" w:history="1">
             <w:r>
               <w:rPr>
                 <w:rStyle w:val="Hipervnculo"/>
@@ -1084,7 +1196,7 @@
                 <w:noProof/>
                 <w:webHidden/>
               </w:rPr>
-              <w:instrText xml:space="preserve"> PAGEREF _Toc225727455 \h </w:instrText>
+              <w:instrText xml:space="preserve"> PAGEREF _Toc225990359 \h </w:instrText>
             </w:r>
             <w:r>
               <w:rPr>
@@ -1129,7 +1241,7 @@
               <w14:ligatures w14:val="standardContextual"/>
             </w:rPr>
           </w:pPr>
-          <w:hyperlink w:anchor="_Toc225727456" w:history="1">
+          <w:hyperlink w:anchor="_Toc225990360" w:history="1">
             <w:r>
               <w:rPr>
                 <w:rStyle w:val="Hipervnculo"/>
@@ -1152,7 +1264,7 @@
               <w:rPr>
                 <w:webHidden/>
               </w:rPr>
-              <w:instrText xml:space="preserve"> PAGEREF _Toc225727456 \h </w:instrText>
+              <w:instrText xml:space="preserve"> PAGEREF _Toc225990360 \h </w:instrText>
             </w:r>
             <w:r>
               <w:rPr>
@@ -1195,7 +1307,7 @@
               <w14:ligatures w14:val="standardContextual"/>
             </w:rPr>
           </w:pPr>
-          <w:hyperlink w:anchor="_Toc225727457" w:history="1">
+          <w:hyperlink w:anchor="_Toc225990361" w:history="1">
             <w:r>
               <w:rPr>
                 <w:rStyle w:val="Hipervnculo"/>
@@ -1222,7 +1334,7 @@
                 <w:noProof/>
                 <w:webHidden/>
               </w:rPr>
-              <w:instrText xml:space="preserve"> PAGEREF _Toc225727457 \h </w:instrText>
+              <w:instrText xml:space="preserve"> PAGEREF _Toc225990361 \h </w:instrText>
             </w:r>
             <w:r>
               <w:rPr>
@@ -1269,7 +1381,7 @@
               <w14:ligatures w14:val="standardContextual"/>
             </w:rPr>
           </w:pPr>
-          <w:hyperlink w:anchor="_Toc225727458" w:history="1">
+          <w:hyperlink w:anchor="_Toc225990362" w:history="1">
             <w:r>
               <w:rPr>
                 <w:rStyle w:val="Hipervnculo"/>
@@ -1296,7 +1408,7 @@
                 <w:noProof/>
                 <w:webHidden/>
               </w:rPr>
-              <w:instrText xml:space="preserve"> PAGEREF _Toc225727458 \h </w:instrText>
+              <w:instrText xml:space="preserve"> PAGEREF _Toc225990362 \h </w:instrText>
             </w:r>
             <w:r>
               <w:rPr>
@@ -1343,7 +1455,7 @@
               <w14:ligatures w14:val="standardContextual"/>
             </w:rPr>
           </w:pPr>
-          <w:hyperlink w:anchor="_Toc225727459" w:history="1">
+          <w:hyperlink w:anchor="_Toc225990363" w:history="1">
             <w:r>
               <w:rPr>
                 <w:rStyle w:val="Hipervnculo"/>
@@ -1370,7 +1482,7 @@
                 <w:noProof/>
                 <w:webHidden/>
               </w:rPr>
-              <w:instrText xml:space="preserve"> PAGEREF _Toc225727459 \h </w:instrText>
+              <w:instrText xml:space="preserve"> PAGEREF _Toc225990363 \h </w:instrText>
             </w:r>
             <w:r>
               <w:rPr>
@@ -1415,7 +1527,7 @@
               <w14:ligatures w14:val="standardContextual"/>
             </w:rPr>
           </w:pPr>
-          <w:hyperlink w:anchor="_Toc225727460" w:history="1">
+          <w:hyperlink w:anchor="_Toc225990364" w:history="1">
             <w:r>
               <w:rPr>
                 <w:rStyle w:val="Hipervnculo"/>
@@ -1438,7 +1550,7 @@
               <w:rPr>
                 <w:webHidden/>
               </w:rPr>
-              <w:instrText xml:space="preserve"> PAGEREF _Toc225727460 \h </w:instrText>
+              <w:instrText xml:space="preserve"> PAGEREF _Toc225990364 \h </w:instrText>
             </w:r>
             <w:r>
               <w:rPr>
@@ -1481,7 +1593,7 @@
               <w14:ligatures w14:val="standardContextual"/>
             </w:rPr>
           </w:pPr>
-          <w:hyperlink w:anchor="_Toc225727461" w:history="1">
+          <w:hyperlink w:anchor="_Toc225990365" w:history="1">
             <w:r>
               <w:rPr>
                 <w:rStyle w:val="Hipervnculo"/>
@@ -1508,7 +1620,7 @@
                 <w:noProof/>
                 <w:webHidden/>
               </w:rPr>
-              <w:instrText xml:space="preserve"> PAGEREF _Toc225727461 \h </w:instrText>
+              <w:instrText xml:space="preserve"> PAGEREF _Toc225990365 \h </w:instrText>
             </w:r>
             <w:r>
               <w:rPr>
@@ -1555,7 +1667,7 @@
               <w14:ligatures w14:val="standardContextual"/>
             </w:rPr>
           </w:pPr>
-          <w:hyperlink w:anchor="_Toc225727462" w:history="1">
+          <w:hyperlink w:anchor="_Toc225990366" w:history="1">
             <w:r>
               <w:rPr>
                 <w:rStyle w:val="Hipervnculo"/>
@@ -1582,7 +1694,7 @@
                 <w:noProof/>
                 <w:webHidden/>
               </w:rPr>
-              <w:instrText xml:space="preserve"> PAGEREF _Toc225727462 \h </w:instrText>
+              <w:instrText xml:space="preserve"> PAGEREF _Toc225990366 \h </w:instrText>
             </w:r>
             <w:r>
               <w:rPr>
@@ -1629,7 +1741,7 @@
               <w14:ligatures w14:val="standardContextual"/>
             </w:rPr>
           </w:pPr>
-          <w:hyperlink w:anchor="_Toc225727463" w:history="1">
+          <w:hyperlink w:anchor="_Toc225990367" w:history="1">
             <w:r>
               <w:rPr>
                 <w:rStyle w:val="Hipervnculo"/>
@@ -1656,7 +1768,7 @@
                 <w:noProof/>
                 <w:webHidden/>
               </w:rPr>
-              <w:instrText xml:space="preserve"> PAGEREF _Toc225727463 \h </w:instrText>
+              <w:instrText xml:space="preserve"> PAGEREF _Toc225990367 \h </w:instrText>
             </w:r>
             <w:r>
               <w:rPr>
@@ -1701,7 +1813,7 @@
               <w14:ligatures w14:val="standardContextual"/>
             </w:rPr>
           </w:pPr>
-          <w:hyperlink w:anchor="_Toc225727464" w:history="1">
+          <w:hyperlink w:anchor="_Toc225990368" w:history="1">
             <w:r>
               <w:rPr>
                 <w:rStyle w:val="Hipervnculo"/>
@@ -1724,7 +1836,7 @@
               <w:rPr>
                 <w:webHidden/>
               </w:rPr>
-              <w:instrText xml:space="preserve"> PAGEREF _Toc225727464 \h </w:instrText>
+              <w:instrText xml:space="preserve"> PAGEREF _Toc225990368 \h </w:instrText>
             </w:r>
             <w:r>
               <w:rPr>
@@ -1767,7 +1879,7 @@
               <w14:ligatures w14:val="standardContextual"/>
             </w:rPr>
           </w:pPr>
-          <w:hyperlink w:anchor="_Toc225727465" w:history="1">
+          <w:hyperlink w:anchor="_Toc225990369" w:history="1">
             <w:r>
               <w:rPr>
                 <w:rStyle w:val="Hipervnculo"/>
@@ -1794,7 +1906,7 @@
                 <w:noProof/>
                 <w:webHidden/>
               </w:rPr>
-              <w:instrText xml:space="preserve"> PAGEREF _Toc225727465 \h </w:instrText>
+              <w:instrText xml:space="preserve"> PAGEREF _Toc225990369 \h </w:instrText>
             </w:r>
             <w:r>
               <w:rPr>
@@ -1841,7 +1953,7 @@
               <w14:ligatures w14:val="standardContextual"/>
             </w:rPr>
           </w:pPr>
-          <w:hyperlink w:anchor="_Toc225727466" w:history="1">
+          <w:hyperlink w:anchor="_Toc225990370" w:history="1">
             <w:r>
               <w:rPr>
                 <w:rStyle w:val="Hipervnculo"/>
@@ -1868,7 +1980,7 @@
                 <w:noProof/>
                 <w:webHidden/>
               </w:rPr>
-              <w:instrText xml:space="preserve"> PAGEREF _Toc225727466 \h </w:instrText>
+              <w:instrText xml:space="preserve"> PAGEREF _Toc225990370 \h </w:instrText>
             </w:r>
             <w:r>
               <w:rPr>
@@ -1915,7 +2027,7 @@
               <w14:ligatures w14:val="standardContextual"/>
             </w:rPr>
           </w:pPr>
-          <w:hyperlink w:anchor="_Toc225727467" w:history="1">
+          <w:hyperlink w:anchor="_Toc225990371" w:history="1">
             <w:r>
               <w:rPr>
                 <w:rStyle w:val="Hipervnculo"/>
@@ -1942,7 +2054,7 @@
                 <w:noProof/>
                 <w:webHidden/>
               </w:rPr>
-              <w:instrText xml:space="preserve"> PAGEREF _Toc225727467 \h </w:instrText>
+              <w:instrText xml:space="preserve"> PAGEREF _Toc225990371 \h </w:instrText>
             </w:r>
             <w:r>
               <w:rPr>
@@ -1989,7 +2101,7 @@
               <w14:ligatures w14:val="standardContextual"/>
             </w:rPr>
           </w:pPr>
-          <w:hyperlink w:anchor="_Toc225727468" w:history="1">
+          <w:hyperlink w:anchor="_Toc225990372" w:history="1">
             <w:r>
               <w:rPr>
                 <w:rStyle w:val="Hipervnculo"/>
@@ -2016,7 +2128,7 @@
                 <w:noProof/>
                 <w:webHidden/>
               </w:rPr>
-              <w:instrText xml:space="preserve"> PAGEREF _Toc225727468 \h </w:instrText>
+              <w:instrText xml:space="preserve"> PAGEREF _Toc225990372 \h </w:instrText>
             </w:r>
             <w:r>
               <w:rPr>
@@ -2063,7 +2175,7 @@
               <w14:ligatures w14:val="standardContextual"/>
             </w:rPr>
           </w:pPr>
-          <w:hyperlink w:anchor="_Toc225727469" w:history="1">
+          <w:hyperlink w:anchor="_Toc225990373" w:history="1">
             <w:r>
               <w:rPr>
                 <w:rStyle w:val="Hipervnculo"/>
@@ -2090,7 +2202,7 @@
                 <w:noProof/>
                 <w:webHidden/>
               </w:rPr>
-              <w:instrText xml:space="preserve"> PAGEREF _Toc225727469 \h </w:instrText>
+              <w:instrText xml:space="preserve"> PAGEREF _Toc225990373 \h </w:instrText>
             </w:r>
             <w:r>
               <w:rPr>
@@ -2137,7 +2249,7 @@
               <w14:ligatures w14:val="standardContextual"/>
             </w:rPr>
           </w:pPr>
-          <w:hyperlink w:anchor="_Toc225727470" w:history="1">
+          <w:hyperlink w:anchor="_Toc225990374" w:history="1">
             <w:r>
               <w:rPr>
                 <w:rStyle w:val="Hipervnculo"/>
@@ -2164,7 +2276,7 @@
                 <w:noProof/>
                 <w:webHidden/>
               </w:rPr>
-              <w:instrText xml:space="preserve"> PAGEREF _Toc225727470 \h </w:instrText>
+              <w:instrText xml:space="preserve"> PAGEREF _Toc225990374 \h </w:instrText>
             </w:r>
             <w:r>
               <w:rPr>
@@ -2211,7 +2323,7 @@
               <w14:ligatures w14:val="standardContextual"/>
             </w:rPr>
           </w:pPr>
-          <w:hyperlink w:anchor="_Toc225727471" w:history="1">
+          <w:hyperlink w:anchor="_Toc225990375" w:history="1">
             <w:r>
               <w:rPr>
                 <w:rStyle w:val="Hipervnculo"/>
@@ -2238,7 +2350,7 @@
                 <w:noProof/>
                 <w:webHidden/>
               </w:rPr>
-              <w:instrText xml:space="preserve"> PAGEREF _Toc225727471 \h </w:instrText>
+              <w:instrText xml:space="preserve"> PAGEREF _Toc225990375 \h </w:instrText>
             </w:r>
             <w:r>
               <w:rPr>
@@ -2283,7 +2395,7 @@
               <w14:ligatures w14:val="standardContextual"/>
             </w:rPr>
           </w:pPr>
-          <w:hyperlink w:anchor="_Toc225727472" w:history="1">
+          <w:hyperlink w:anchor="_Toc225990376" w:history="1">
             <w:r>
               <w:rPr>
                 <w:rStyle w:val="Hipervnculo"/>
@@ -2306,7 +2418,7 @@
               <w:rPr>
                 <w:webHidden/>
               </w:rPr>
-              <w:instrText xml:space="preserve"> PAGEREF _Toc225727472 \h </w:instrText>
+              <w:instrText xml:space="preserve"> PAGEREF _Toc225990376 \h </w:instrText>
             </w:r>
             <w:r>
               <w:rPr>
@@ -2347,12 +2459,12 @@
               <w14:ligatures w14:val="standardContextual"/>
             </w:rPr>
           </w:pPr>
-          <w:hyperlink w:anchor="_Toc225727473" w:history="1">
+          <w:hyperlink w:anchor="_Toc225990377" w:history="1">
             <w:r>
               <w:rPr>
                 <w:rStyle w:val="Hipervnculo"/>
               </w:rPr>
-              <w:t>DATOS DE CADA ACTOR/ENTIDAD</w:t>
+              <w:t>DATOS DE CADA ACTOR Y ENTIDAD</w:t>
             </w:r>
             <w:r>
               <w:rPr>
@@ -2370,7 +2482,7 @@
               <w:rPr>
                 <w:webHidden/>
               </w:rPr>
-              <w:instrText xml:space="preserve"> PAGEREF _Toc225727473 \h </w:instrText>
+              <w:instrText xml:space="preserve"> PAGEREF _Toc225990377 \h </w:instrText>
             </w:r>
             <w:r>
               <w:rPr>
@@ -2388,134 +2500,6 @@
                 <w:webHidden/>
               </w:rPr>
               <w:t>18</w:t>
-            </w:r>
-            <w:r>
-              <w:rPr>
-                <w:webHidden/>
-              </w:rPr>
-              <w:fldChar w:fldCharType="end"/>
-            </w:r>
-          </w:hyperlink>
-        </w:p>
-        <w:p>
-          <w:pPr>
-            <w:pStyle w:val="TDC2"/>
-            <w:rPr>
-              <w:rFonts w:eastAsiaTheme="minorEastAsia"/>
-              <w:b w:val="0"/>
-              <w:bCs w:val="0"/>
-              <w:kern w:val="2"/>
-              <w:sz w:val="24"/>
-              <w:szCs w:val="24"/>
-              <w:lang w:eastAsia="es-ES"/>
-              <w14:ligatures w14:val="standardContextual"/>
-            </w:rPr>
-          </w:pPr>
-          <w:hyperlink w:anchor="_Toc225727474" w:history="1">
-            <w:r>
-              <w:rPr>
-                <w:rStyle w:val="Hipervnculo"/>
-              </w:rPr>
-              <w:t>ACCIONES DE CADA ACTOR/ENTIDAD</w:t>
-            </w:r>
-            <w:r>
-              <w:rPr>
-                <w:webHidden/>
-              </w:rPr>
-              <w:tab/>
-            </w:r>
-            <w:r>
-              <w:rPr>
-                <w:webHidden/>
-              </w:rPr>
-              <w:fldChar w:fldCharType="begin"/>
-            </w:r>
-            <w:r>
-              <w:rPr>
-                <w:webHidden/>
-              </w:rPr>
-              <w:instrText xml:space="preserve"> PAGEREF _Toc225727474 \h </w:instrText>
-            </w:r>
-            <w:r>
-              <w:rPr>
-                <w:webHidden/>
-              </w:rPr>
-            </w:r>
-            <w:r>
-              <w:rPr>
-                <w:webHidden/>
-              </w:rPr>
-              <w:fldChar w:fldCharType="separate"/>
-            </w:r>
-            <w:r>
-              <w:rPr>
-                <w:webHidden/>
-              </w:rPr>
-              <w:t>20</w:t>
-            </w:r>
-            <w:r>
-              <w:rPr>
-                <w:webHidden/>
-              </w:rPr>
-              <w:fldChar w:fldCharType="end"/>
-            </w:r>
-          </w:hyperlink>
-        </w:p>
-        <w:p>
-          <w:pPr>
-            <w:pStyle w:val="TDC2"/>
-            <w:rPr>
-              <w:rFonts w:eastAsiaTheme="minorEastAsia"/>
-              <w:b w:val="0"/>
-              <w:bCs w:val="0"/>
-              <w:kern w:val="2"/>
-              <w:sz w:val="24"/>
-              <w:szCs w:val="24"/>
-              <w:lang w:eastAsia="es-ES"/>
-              <w14:ligatures w14:val="standardContextual"/>
-            </w:rPr>
-          </w:pPr>
-          <w:hyperlink w:anchor="_Toc225727475" w:history="1">
-            <w:r>
-              <w:rPr>
-                <w:rStyle w:val="Hipervnculo"/>
-              </w:rPr>
-              <w:t>DECISIONES TOMADAS Y JUSTIFICADAS</w:t>
-            </w:r>
-            <w:r>
-              <w:rPr>
-                <w:webHidden/>
-              </w:rPr>
-              <w:tab/>
-            </w:r>
-            <w:r>
-              <w:rPr>
-                <w:webHidden/>
-              </w:rPr>
-              <w:fldChar w:fldCharType="begin"/>
-            </w:r>
-            <w:r>
-              <w:rPr>
-                <w:webHidden/>
-              </w:rPr>
-              <w:instrText xml:space="preserve"> PAGEREF _Toc225727475 \h </w:instrText>
-            </w:r>
-            <w:r>
-              <w:rPr>
-                <w:webHidden/>
-              </w:rPr>
-            </w:r>
-            <w:r>
-              <w:rPr>
-                <w:webHidden/>
-              </w:rPr>
-              <w:fldChar w:fldCharType="separate"/>
-            </w:r>
-            <w:r>
-              <w:rPr>
-                <w:webHidden/>
-              </w:rPr>
-              <w:t>21</w:t>
             </w:r>
             <w:r>
               <w:rPr>
@@ -2541,13 +2525,13 @@
               <w14:ligatures w14:val="standardContextual"/>
             </w:rPr>
           </w:pPr>
-          <w:hyperlink w:anchor="_Toc225727476" w:history="1">
+          <w:hyperlink w:anchor="_Toc225990378" w:history="1">
             <w:r>
               <w:rPr>
                 <w:rStyle w:val="Hipervnculo"/>
                 <w:noProof/>
               </w:rPr>
-              <w:t>¿Cómo simular el tiempo?</w:t>
+              <w:t>ACTORES</w:t>
             </w:r>
             <w:r>
               <w:rPr>
@@ -2568,7 +2552,7 @@
                 <w:noProof/>
                 <w:webHidden/>
               </w:rPr>
-              <w:instrText xml:space="preserve"> PAGEREF _Toc225727476 \h </w:instrText>
+              <w:instrText xml:space="preserve"> PAGEREF _Toc225990378 \h </w:instrText>
             </w:r>
             <w:r>
               <w:rPr>
@@ -2588,7 +2572,7 @@
                 <w:noProof/>
                 <w:webHidden/>
               </w:rPr>
-              <w:t>21</w:t>
+              <w:t>18</w:t>
             </w:r>
             <w:r>
               <w:rPr>
@@ -2615,12 +2599,362 @@
               <w14:ligatures w14:val="standardContextual"/>
             </w:rPr>
           </w:pPr>
-          <w:hyperlink w:anchor="_Toc225727477" w:history="1">
+          <w:hyperlink w:anchor="_Toc225990379" w:history="1">
             <w:r>
               <w:rPr>
                 <w:rStyle w:val="Hipervnculo"/>
                 <w:noProof/>
               </w:rPr>
+              <w:t>ENTIDADES</w:t>
+            </w:r>
+            <w:r>
+              <w:rPr>
+                <w:noProof/>
+                <w:webHidden/>
+              </w:rPr>
+              <w:tab/>
+            </w:r>
+            <w:r>
+              <w:rPr>
+                <w:noProof/>
+                <w:webHidden/>
+              </w:rPr>
+              <w:fldChar w:fldCharType="begin"/>
+            </w:r>
+            <w:r>
+              <w:rPr>
+                <w:noProof/>
+                <w:webHidden/>
+              </w:rPr>
+              <w:instrText xml:space="preserve"> PAGEREF _Toc225990379 \h </w:instrText>
+            </w:r>
+            <w:r>
+              <w:rPr>
+                <w:noProof/>
+                <w:webHidden/>
+              </w:rPr>
+            </w:r>
+            <w:r>
+              <w:rPr>
+                <w:noProof/>
+                <w:webHidden/>
+              </w:rPr>
+              <w:fldChar w:fldCharType="separate"/>
+            </w:r>
+            <w:r>
+              <w:rPr>
+                <w:noProof/>
+                <w:webHidden/>
+              </w:rPr>
+              <w:t>18</w:t>
+            </w:r>
+            <w:r>
+              <w:rPr>
+                <w:noProof/>
+                <w:webHidden/>
+              </w:rPr>
+              <w:fldChar w:fldCharType="end"/>
+            </w:r>
+          </w:hyperlink>
+        </w:p>
+        <w:p>
+          <w:pPr>
+            <w:pStyle w:val="TDC2"/>
+            <w:rPr>
+              <w:rFonts w:eastAsiaTheme="minorEastAsia"/>
+              <w:b w:val="0"/>
+              <w:bCs w:val="0"/>
+              <w:kern w:val="2"/>
+              <w:sz w:val="24"/>
+              <w:szCs w:val="24"/>
+              <w:lang w:eastAsia="es-ES"/>
+              <w14:ligatures w14:val="standardContextual"/>
+            </w:rPr>
+          </w:pPr>
+          <w:hyperlink w:anchor="_Toc225990380" w:history="1">
+            <w:r>
+              <w:rPr>
+                <w:rStyle w:val="Hipervnculo"/>
+              </w:rPr>
+              <w:t>MÉTODOS DE CADA ACTOR/ENTIDAD</w:t>
+            </w:r>
+            <w:r>
+              <w:rPr>
+                <w:webHidden/>
+              </w:rPr>
+              <w:tab/>
+            </w:r>
+            <w:r>
+              <w:rPr>
+                <w:webHidden/>
+              </w:rPr>
+              <w:fldChar w:fldCharType="begin"/>
+            </w:r>
+            <w:r>
+              <w:rPr>
+                <w:webHidden/>
+              </w:rPr>
+              <w:instrText xml:space="preserve"> PAGEREF _Toc225990380 \h </w:instrText>
+            </w:r>
+            <w:r>
+              <w:rPr>
+                <w:webHidden/>
+              </w:rPr>
+            </w:r>
+            <w:r>
+              <w:rPr>
+                <w:webHidden/>
+              </w:rPr>
+              <w:fldChar w:fldCharType="separate"/>
+            </w:r>
+            <w:r>
+              <w:rPr>
+                <w:webHidden/>
+              </w:rPr>
+              <w:t>20</w:t>
+            </w:r>
+            <w:r>
+              <w:rPr>
+                <w:webHidden/>
+              </w:rPr>
+              <w:fldChar w:fldCharType="end"/>
+            </w:r>
+          </w:hyperlink>
+        </w:p>
+        <w:p>
+          <w:pPr>
+            <w:pStyle w:val="TDC3"/>
+            <w:tabs>
+              <w:tab w:val="right" w:leader="dot" w:pos="8494"/>
+            </w:tabs>
+            <w:rPr>
+              <w:rFonts w:eastAsiaTheme="minorEastAsia"/>
+              <w:noProof/>
+              <w:kern w:val="2"/>
+              <w:sz w:val="24"/>
+              <w:szCs w:val="24"/>
+              <w:lang w:eastAsia="es-ES"/>
+              <w14:ligatures w14:val="standardContextual"/>
+            </w:rPr>
+          </w:pPr>
+          <w:hyperlink w:anchor="_Toc225990381" w:history="1">
+            <w:r>
+              <w:rPr>
+                <w:rStyle w:val="Hipervnculo"/>
+                <w:noProof/>
+              </w:rPr>
+              <w:t>ACTORES</w:t>
+            </w:r>
+            <w:r>
+              <w:rPr>
+                <w:noProof/>
+                <w:webHidden/>
+              </w:rPr>
+              <w:tab/>
+            </w:r>
+            <w:r>
+              <w:rPr>
+                <w:noProof/>
+                <w:webHidden/>
+              </w:rPr>
+              <w:fldChar w:fldCharType="begin"/>
+            </w:r>
+            <w:r>
+              <w:rPr>
+                <w:noProof/>
+                <w:webHidden/>
+              </w:rPr>
+              <w:instrText xml:space="preserve"> PAGEREF _Toc225990381 \h </w:instrText>
+            </w:r>
+            <w:r>
+              <w:rPr>
+                <w:noProof/>
+                <w:webHidden/>
+              </w:rPr>
+            </w:r>
+            <w:r>
+              <w:rPr>
+                <w:noProof/>
+                <w:webHidden/>
+              </w:rPr>
+              <w:fldChar w:fldCharType="separate"/>
+            </w:r>
+            <w:r>
+              <w:rPr>
+                <w:noProof/>
+                <w:webHidden/>
+              </w:rPr>
+              <w:t>20</w:t>
+            </w:r>
+            <w:r>
+              <w:rPr>
+                <w:noProof/>
+                <w:webHidden/>
+              </w:rPr>
+              <w:fldChar w:fldCharType="end"/>
+            </w:r>
+          </w:hyperlink>
+        </w:p>
+        <w:p>
+          <w:pPr>
+            <w:pStyle w:val="TDC2"/>
+            <w:rPr>
+              <w:rFonts w:eastAsiaTheme="minorEastAsia"/>
+              <w:b w:val="0"/>
+              <w:bCs w:val="0"/>
+              <w:kern w:val="2"/>
+              <w:sz w:val="24"/>
+              <w:szCs w:val="24"/>
+              <w:lang w:eastAsia="es-ES"/>
+              <w14:ligatures w14:val="standardContextual"/>
+            </w:rPr>
+          </w:pPr>
+          <w:hyperlink w:anchor="_Toc225990382" w:history="1">
+            <w:r>
+              <w:rPr>
+                <w:rStyle w:val="Hipervnculo"/>
+              </w:rPr>
+              <w:t>DECISIONES TOMADAS Y JUSTIFICADAS</w:t>
+            </w:r>
+            <w:r>
+              <w:rPr>
+                <w:webHidden/>
+              </w:rPr>
+              <w:tab/>
+            </w:r>
+            <w:r>
+              <w:rPr>
+                <w:webHidden/>
+              </w:rPr>
+              <w:fldChar w:fldCharType="begin"/>
+            </w:r>
+            <w:r>
+              <w:rPr>
+                <w:webHidden/>
+              </w:rPr>
+              <w:instrText xml:space="preserve"> PAGEREF _Toc225990382 \h </w:instrText>
+            </w:r>
+            <w:r>
+              <w:rPr>
+                <w:webHidden/>
+              </w:rPr>
+            </w:r>
+            <w:r>
+              <w:rPr>
+                <w:webHidden/>
+              </w:rPr>
+              <w:fldChar w:fldCharType="separate"/>
+            </w:r>
+            <w:r>
+              <w:rPr>
+                <w:webHidden/>
+              </w:rPr>
+              <w:t>21</w:t>
+            </w:r>
+            <w:r>
+              <w:rPr>
+                <w:webHidden/>
+              </w:rPr>
+              <w:fldChar w:fldCharType="end"/>
+            </w:r>
+          </w:hyperlink>
+        </w:p>
+        <w:p>
+          <w:pPr>
+            <w:pStyle w:val="TDC3"/>
+            <w:tabs>
+              <w:tab w:val="right" w:leader="dot" w:pos="8494"/>
+            </w:tabs>
+            <w:rPr>
+              <w:rFonts w:eastAsiaTheme="minorEastAsia"/>
+              <w:noProof/>
+              <w:kern w:val="2"/>
+              <w:sz w:val="24"/>
+              <w:szCs w:val="24"/>
+              <w:lang w:eastAsia="es-ES"/>
+              <w14:ligatures w14:val="standardContextual"/>
+            </w:rPr>
+          </w:pPr>
+          <w:hyperlink w:anchor="_Toc225990383" w:history="1">
+            <w:r>
+              <w:rPr>
+                <w:rStyle w:val="Hipervnculo"/>
+                <w:noProof/>
+              </w:rPr>
+              <w:t>¿Cómo simular el tiempo?</w:t>
+            </w:r>
+            <w:r>
+              <w:rPr>
+                <w:noProof/>
+                <w:webHidden/>
+              </w:rPr>
+              <w:tab/>
+            </w:r>
+            <w:r>
+              <w:rPr>
+                <w:noProof/>
+                <w:webHidden/>
+              </w:rPr>
+              <w:fldChar w:fldCharType="begin"/>
+            </w:r>
+            <w:r>
+              <w:rPr>
+                <w:noProof/>
+                <w:webHidden/>
+              </w:rPr>
+              <w:instrText xml:space="preserve"> PAGEREF _Toc225990383 \h </w:instrText>
+            </w:r>
+            <w:r>
+              <w:rPr>
+                <w:noProof/>
+                <w:webHidden/>
+              </w:rPr>
+            </w:r>
+            <w:r>
+              <w:rPr>
+                <w:noProof/>
+                <w:webHidden/>
+              </w:rPr>
+              <w:fldChar w:fldCharType="separate"/>
+            </w:r>
+            <w:r>
+              <w:rPr>
+                <w:noProof/>
+                <w:webHidden/>
+              </w:rPr>
+              <w:t>21</w:t>
+            </w:r>
+            <w:r>
+              <w:rPr>
+                <w:noProof/>
+                <w:webHidden/>
+              </w:rPr>
+              <w:fldChar w:fldCharType="end"/>
+            </w:r>
+          </w:hyperlink>
+        </w:p>
+        <w:p>
+          <w:pPr>
+            <w:pStyle w:val="TDC3"/>
+            <w:tabs>
+              <w:tab w:val="right" w:leader="dot" w:pos="8494"/>
+            </w:tabs>
+            <w:rPr>
+              <w:rFonts w:eastAsiaTheme="minorEastAsia"/>
+              <w:noProof/>
+              <w:kern w:val="2"/>
+              <w:sz w:val="24"/>
+              <w:szCs w:val="24"/>
+              <w:lang w:eastAsia="es-ES"/>
+              <w14:ligatures w14:val="standardContextual"/>
+            </w:rPr>
+          </w:pPr>
+          <w:hyperlink w:anchor="_Toc225990384" w:history="1">
+            <w:r>
+              <w:rPr>
+                <w:rStyle w:val="Hipervnculo"/>
+                <w:noProof/>
+              </w:rPr>
               <w:t>¿Qué se entiende por “médicos y personal de salud”?</w:t>
             </w:r>
             <w:r>
@@ -2642,7 +2976,7 @@
                 <w:noProof/>
                 <w:webHidden/>
               </w:rPr>
-              <w:instrText xml:space="preserve"> PAGEREF _Toc225727477 \h </w:instrText>
+              <w:instrText xml:space="preserve"> PAGEREF _Toc225990384 \h </w:instrText>
             </w:r>
             <w:r>
               <w:rPr>
@@ -2663,6 +2997,302 @@
                 <w:webHidden/>
               </w:rPr>
               <w:t>21</w:t>
+            </w:r>
+            <w:r>
+              <w:rPr>
+                <w:noProof/>
+                <w:webHidden/>
+              </w:rPr>
+              <w:fldChar w:fldCharType="end"/>
+            </w:r>
+          </w:hyperlink>
+        </w:p>
+        <w:p>
+          <w:pPr>
+            <w:pStyle w:val="TDC3"/>
+            <w:tabs>
+              <w:tab w:val="right" w:leader="dot" w:pos="8494"/>
+            </w:tabs>
+            <w:rPr>
+              <w:rFonts w:eastAsiaTheme="minorEastAsia"/>
+              <w:noProof/>
+              <w:kern w:val="2"/>
+              <w:sz w:val="24"/>
+              <w:szCs w:val="24"/>
+              <w:lang w:eastAsia="es-ES"/>
+              <w14:ligatures w14:val="standardContextual"/>
+            </w:rPr>
+          </w:pPr>
+          <w:hyperlink w:anchor="_Toc225990385" w:history="1">
+            <w:r>
+              <w:rPr>
+                <w:rStyle w:val="Hipervnculo"/>
+                <w:noProof/>
+              </w:rPr>
+              <w:t>¿Quién gestiona el traslado de pacientes?</w:t>
+            </w:r>
+            <w:r>
+              <w:rPr>
+                <w:noProof/>
+                <w:webHidden/>
+              </w:rPr>
+              <w:tab/>
+            </w:r>
+            <w:r>
+              <w:rPr>
+                <w:noProof/>
+                <w:webHidden/>
+              </w:rPr>
+              <w:fldChar w:fldCharType="begin"/>
+            </w:r>
+            <w:r>
+              <w:rPr>
+                <w:noProof/>
+                <w:webHidden/>
+              </w:rPr>
+              <w:instrText xml:space="preserve"> PAGEREF _Toc225990385 \h </w:instrText>
+            </w:r>
+            <w:r>
+              <w:rPr>
+                <w:noProof/>
+                <w:webHidden/>
+              </w:rPr>
+            </w:r>
+            <w:r>
+              <w:rPr>
+                <w:noProof/>
+                <w:webHidden/>
+              </w:rPr>
+              <w:fldChar w:fldCharType="separate"/>
+            </w:r>
+            <w:r>
+              <w:rPr>
+                <w:noProof/>
+                <w:webHidden/>
+              </w:rPr>
+              <w:t>21</w:t>
+            </w:r>
+            <w:r>
+              <w:rPr>
+                <w:noProof/>
+                <w:webHidden/>
+              </w:rPr>
+              <w:fldChar w:fldCharType="end"/>
+            </w:r>
+          </w:hyperlink>
+        </w:p>
+        <w:p>
+          <w:pPr>
+            <w:pStyle w:val="TDC3"/>
+            <w:tabs>
+              <w:tab w:val="right" w:leader="dot" w:pos="8494"/>
+            </w:tabs>
+            <w:rPr>
+              <w:rFonts w:eastAsiaTheme="minorEastAsia"/>
+              <w:noProof/>
+              <w:kern w:val="2"/>
+              <w:sz w:val="24"/>
+              <w:szCs w:val="24"/>
+              <w:lang w:eastAsia="es-ES"/>
+              <w14:ligatures w14:val="standardContextual"/>
+            </w:rPr>
+          </w:pPr>
+          <w:hyperlink w:anchor="_Toc225990386" w:history="1">
+            <w:r>
+              <w:rPr>
+                <w:rStyle w:val="Hipervnculo"/>
+                <w:noProof/>
+              </w:rPr>
+              <w:t>¿Quién se encarga de la evaluación final de los paceintes?</w:t>
+            </w:r>
+            <w:r>
+              <w:rPr>
+                <w:noProof/>
+                <w:webHidden/>
+              </w:rPr>
+              <w:tab/>
+            </w:r>
+            <w:r>
+              <w:rPr>
+                <w:noProof/>
+                <w:webHidden/>
+              </w:rPr>
+              <w:fldChar w:fldCharType="begin"/>
+            </w:r>
+            <w:r>
+              <w:rPr>
+                <w:noProof/>
+                <w:webHidden/>
+              </w:rPr>
+              <w:instrText xml:space="preserve"> PAGEREF _Toc225990386 \h </w:instrText>
+            </w:r>
+            <w:r>
+              <w:rPr>
+                <w:noProof/>
+                <w:webHidden/>
+              </w:rPr>
+            </w:r>
+            <w:r>
+              <w:rPr>
+                <w:noProof/>
+                <w:webHidden/>
+              </w:rPr>
+              <w:fldChar w:fldCharType="separate"/>
+            </w:r>
+            <w:r>
+              <w:rPr>
+                <w:noProof/>
+                <w:webHidden/>
+              </w:rPr>
+              <w:t>22</w:t>
+            </w:r>
+            <w:r>
+              <w:rPr>
+                <w:noProof/>
+                <w:webHidden/>
+              </w:rPr>
+              <w:fldChar w:fldCharType="end"/>
+            </w:r>
+          </w:hyperlink>
+        </w:p>
+        <w:p>
+          <w:pPr>
+            <w:pStyle w:val="TDC3"/>
+            <w:tabs>
+              <w:tab w:val="right" w:leader="dot" w:pos="8494"/>
+            </w:tabs>
+            <w:rPr>
+              <w:rFonts w:eastAsiaTheme="minorEastAsia"/>
+              <w:noProof/>
+              <w:kern w:val="2"/>
+              <w:sz w:val="24"/>
+              <w:szCs w:val="24"/>
+              <w:lang w:eastAsia="es-ES"/>
+              <w14:ligatures w14:val="standardContextual"/>
+            </w:rPr>
+          </w:pPr>
+          <w:hyperlink w:anchor="_Toc225990387" w:history="1">
+            <w:r>
+              <w:rPr>
+                <w:rStyle w:val="Hipervnculo"/>
+                <w:noProof/>
+              </w:rPr>
+              <w:t>¿Las notas de evolución solo se pueden generar en una ronda médica?</w:t>
+            </w:r>
+            <w:r>
+              <w:rPr>
+                <w:noProof/>
+                <w:webHidden/>
+              </w:rPr>
+              <w:tab/>
+            </w:r>
+            <w:r>
+              <w:rPr>
+                <w:noProof/>
+                <w:webHidden/>
+              </w:rPr>
+              <w:fldChar w:fldCharType="begin"/>
+            </w:r>
+            <w:r>
+              <w:rPr>
+                <w:noProof/>
+                <w:webHidden/>
+              </w:rPr>
+              <w:instrText xml:space="preserve"> PAGEREF _Toc225990387 \h </w:instrText>
+            </w:r>
+            <w:r>
+              <w:rPr>
+                <w:noProof/>
+                <w:webHidden/>
+              </w:rPr>
+            </w:r>
+            <w:r>
+              <w:rPr>
+                <w:noProof/>
+                <w:webHidden/>
+              </w:rPr>
+              <w:fldChar w:fldCharType="separate"/>
+            </w:r>
+            <w:r>
+              <w:rPr>
+                <w:noProof/>
+                <w:webHidden/>
+              </w:rPr>
+              <w:t>22</w:t>
+            </w:r>
+            <w:r>
+              <w:rPr>
+                <w:noProof/>
+                <w:webHidden/>
+              </w:rPr>
+              <w:fldChar w:fldCharType="end"/>
+            </w:r>
+          </w:hyperlink>
+        </w:p>
+        <w:p>
+          <w:pPr>
+            <w:pStyle w:val="TDC3"/>
+            <w:tabs>
+              <w:tab w:val="right" w:leader="dot" w:pos="8494"/>
+            </w:tabs>
+            <w:rPr>
+              <w:rFonts w:eastAsiaTheme="minorEastAsia"/>
+              <w:noProof/>
+              <w:kern w:val="2"/>
+              <w:sz w:val="24"/>
+              <w:szCs w:val="24"/>
+              <w:lang w:eastAsia="es-ES"/>
+              <w14:ligatures w14:val="standardContextual"/>
+            </w:rPr>
+          </w:pPr>
+          <w:hyperlink w:anchor="_Toc225990388" w:history="1">
+            <w:r>
+              <w:rPr>
+                <w:rStyle w:val="Hipervnculo"/>
+                <w:noProof/>
+              </w:rPr>
+              <w:t>¿Cómo sabe el sistema que un paciente está listo para la evaluación final?</w:t>
+            </w:r>
+            <w:r>
+              <w:rPr>
+                <w:noProof/>
+                <w:webHidden/>
+              </w:rPr>
+              <w:tab/>
+            </w:r>
+            <w:r>
+              <w:rPr>
+                <w:noProof/>
+                <w:webHidden/>
+              </w:rPr>
+              <w:fldChar w:fldCharType="begin"/>
+            </w:r>
+            <w:r>
+              <w:rPr>
+                <w:noProof/>
+                <w:webHidden/>
+              </w:rPr>
+              <w:instrText xml:space="preserve"> PAGEREF _Toc225990388 \h </w:instrText>
+            </w:r>
+            <w:r>
+              <w:rPr>
+                <w:noProof/>
+                <w:webHidden/>
+              </w:rPr>
+            </w:r>
+            <w:r>
+              <w:rPr>
+                <w:noProof/>
+                <w:webHidden/>
+              </w:rPr>
+              <w:fldChar w:fldCharType="separate"/>
+            </w:r>
+            <w:r>
+              <w:rPr>
+                <w:noProof/>
+                <w:webHidden/>
+              </w:rPr>
+              <w:t>23</w:t>
             </w:r>
             <w:r>
               <w:rPr>
@@ -2684,23 +3314,21 @@
       <w:r>
         <w:br w:type="page"/>
       </w:r>
-    </w:p>
-    <w:p/>
-    <w:p>
       <w:r>
         <w:rPr>
           <w:noProof/>
         </w:rPr>
+        <w:lastRenderedPageBreak/>
         <mc:AlternateContent>
           <mc:Choice Requires="wps">
             <w:drawing>
-              <wp:anchor distT="0" distB="0" distL="114300" distR="114300" simplePos="0" relativeHeight="251668480" behindDoc="0" locked="0" layoutInCell="1" allowOverlap="1" wp14:anchorId="1A5B8918" wp14:editId="419B2286">
+              <wp:anchor distT="0" distB="0" distL="114300" distR="114300" simplePos="0" relativeHeight="251668480" behindDoc="0" locked="0" layoutInCell="1" allowOverlap="1" wp14:anchorId="1A5B8918" wp14:editId="380936EA">
                 <wp:simplePos x="0" y="0"/>
                 <wp:positionH relativeFrom="margin">
                   <wp:align>right</wp:align>
                 </wp:positionH>
                 <wp:positionV relativeFrom="paragraph">
-                  <wp:posOffset>2488314</wp:posOffset>
+                  <wp:posOffset>2773680</wp:posOffset>
                 </wp:positionV>
                 <wp:extent cx="5314950" cy="3338184"/>
                 <wp:effectExtent l="19050" t="19050" r="19050" b="15240"/>
@@ -2749,7 +3377,7 @@
                             <w:bookmarkStart w:id="2" w:name="_Toc201837460"/>
                             <w:bookmarkStart w:id="3" w:name="_Toc201837471"/>
                             <w:bookmarkStart w:id="4" w:name="_Toc201837593"/>
-                            <w:bookmarkStart w:id="5" w:name="_Toc225727455"/>
+                            <w:bookmarkStart w:id="5" w:name="_Toc225990359"/>
                             <w:r>
                               <w:rPr>
                                 <w:rFonts w:ascii="Segoe UI Emoji" w:hAnsi="Segoe UI Emoji"/>
@@ -2789,7 +3417,7 @@
           </mc:Choice>
           <mc:Fallback>
             <w:pict>
-              <v:rect w14:anchorId="1A5B8918" id="_x0000_s1030" style="position:absolute;margin-left:367.3pt;margin-top:195.95pt;width:418.5pt;height:262.85pt;z-index:251668480;visibility:visible;mso-wrap-style:square;mso-height-percent:0;mso-wrap-distance-left:9pt;mso-wrap-distance-top:0;mso-wrap-distance-right:9pt;mso-wrap-distance-bottom:0;mso-position-horizontal:right;mso-position-horizontal-relative:margin;mso-position-vertical:absolute;mso-position-vertical-relative:text;mso-height-percent:0;mso-height-relative:margin;v-text-anchor:middle" o:gfxdata="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" filled="f" strokecolor="#030e13 [484]" strokeweight="2.25pt">
+              <v:rect w14:anchorId="1A5B8918" id="_x0000_s1030" style="position:absolute;margin-left:367.3pt;margin-top:218.4pt;width:418.5pt;height:262.85pt;z-index:251668480;visibility:visible;mso-wrap-style:square;mso-height-percent:0;mso-wrap-distance-left:9pt;mso-wrap-distance-top:0;mso-wrap-distance-right:9pt;mso-wrap-distance-bottom:0;mso-position-horizontal:right;mso-position-horizontal-relative:margin;mso-position-vertical:absolute;mso-position-vertical-relative:text;mso-height-percent:0;mso-height-relative:margin;v-text-anchor:middle" o:gfxdata="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" filled="f" strokecolor="#030e13 [484]" strokeweight="2.25pt">
                 <v:stroke dashstyle="dash"/>
                 <v:textbox>
                   <w:txbxContent>
@@ -2800,7 +3428,7 @@
                       <w:bookmarkStart w:id="6" w:name="_Toc201837460"/>
                       <w:bookmarkStart w:id="7" w:name="_Toc201837471"/>
                       <w:bookmarkStart w:id="8" w:name="_Toc201837593"/>
-                      <w:bookmarkStart w:id="9" w:name="_Toc225727455"/>
+                      <w:bookmarkStart w:id="9" w:name="_Toc225990359"/>
                       <w:r>
                         <w:rPr>
                           <w:rFonts w:ascii="Segoe UI Emoji" w:hAnsi="Segoe UI Emoji"/>
@@ -2838,7 +3466,7 @@
         <w:pStyle w:val="Ttulo2"/>
       </w:pPr>
       <w:bookmarkStart w:id="10" w:name="_Toc201837594"/>
-      <w:bookmarkStart w:id="11" w:name="_Toc225727456"/>
+      <w:bookmarkStart w:id="11" w:name="_Toc225990360"/>
       <w:r>
         <w:lastRenderedPageBreak/>
         <w:t>A</w:t>
@@ -2853,7 +3481,7 @@
       <w:pPr>
         <w:pStyle w:val="Ttulo3"/>
       </w:pPr>
-      <w:bookmarkStart w:id="12" w:name="_Toc225727457"/>
+      <w:bookmarkStart w:id="12" w:name="_Toc225990361"/>
       <w:r>
         <w:t>¿Qué es un actor?</w:t>
       </w:r>
@@ -2917,7 +3545,7 @@
       <w:pPr>
         <w:pStyle w:val="Ttulo3"/>
       </w:pPr>
-      <w:bookmarkStart w:id="13" w:name="_Toc225727458"/>
+      <w:bookmarkStart w:id="13" w:name="_Toc225990362"/>
       <w:r>
         <w:t>Actores:</w:t>
       </w:r>
@@ -2961,7 +3589,23 @@
           <w:b/>
           <w:bCs/>
         </w:rPr>
-        <w:t>Personal &lt;&lt;abstract&gt;&gt;:</w:t>
+        <w:t>Personal &lt;&lt;</w:t>
+      </w:r>
+      <w:proofErr w:type="spellStart"/>
+      <w:r>
+        <w:rPr>
+          <w:b/>
+          <w:bCs/>
+        </w:rPr>
+        <w:t>abstract</w:t>
+      </w:r>
+      <w:proofErr w:type="spellEnd"/>
+      <w:r>
+        <w:rPr>
+          <w:b/>
+          <w:bCs/>
+        </w:rPr>
+        <w:t>&gt;&gt;:</w:t>
       </w:r>
       <w:r>
         <w:t xml:space="preserve"> Representa a todos los tipos de trabajadores del hospital.</w:t>
@@ -3009,7 +3653,23 @@
           <w:b/>
           <w:bCs/>
         </w:rPr>
-        <w:t xml:space="preserve"> &lt;&lt;abstract&gt;&gt;</w:t>
+        <w:t xml:space="preserve"> &lt;&lt;</w:t>
+      </w:r>
+      <w:proofErr w:type="spellStart"/>
+      <w:r>
+        <w:rPr>
+          <w:b/>
+          <w:bCs/>
+        </w:rPr>
+        <w:t>abstract</w:t>
+      </w:r>
+      <w:proofErr w:type="spellEnd"/>
+      <w:r>
+        <w:rPr>
+          <w:b/>
+          <w:bCs/>
+        </w:rPr>
+        <w:t>&gt;&gt;</w:t>
       </w:r>
       <w:r>
         <w:rPr>
@@ -3171,7 +3831,23 @@
           <w:b/>
           <w:bCs/>
         </w:rPr>
-        <w:t>&lt;&lt;abstract&gt;&gt;</w:t>
+        <w:t>&lt;&lt;</w:t>
+      </w:r>
+      <w:proofErr w:type="spellStart"/>
+      <w:r>
+        <w:rPr>
+          <w:b/>
+          <w:bCs/>
+        </w:rPr>
+        <w:t>abstract</w:t>
+      </w:r>
+      <w:proofErr w:type="spellEnd"/>
+      <w:r>
+        <w:rPr>
+          <w:b/>
+          <w:bCs/>
+        </w:rPr>
+        <w:t>&gt;&gt;</w:t>
       </w:r>
       <w:r>
         <w:t>,</w:t>
@@ -3184,7 +3860,7 @@
       <w:pPr>
         <w:pStyle w:val="Ttulo3"/>
       </w:pPr>
-      <w:bookmarkStart w:id="14" w:name="_Toc225727459"/>
+      <w:bookmarkStart w:id="14" w:name="_Toc225990363"/>
       <w:r>
         <w:t xml:space="preserve">¿Por qué </w:t>
       </w:r>
@@ -3246,7 +3922,7 @@
       <w:pPr>
         <w:pStyle w:val="Ttulo2"/>
       </w:pPr>
-      <w:bookmarkStart w:id="15" w:name="_Toc225727460"/>
+      <w:bookmarkStart w:id="15" w:name="_Toc225990364"/>
       <w:r>
         <w:lastRenderedPageBreak/>
         <w:t>ENTIDADES</w:t>
@@ -3257,7 +3933,7 @@
       <w:pPr>
         <w:pStyle w:val="Ttulo3"/>
       </w:pPr>
-      <w:bookmarkStart w:id="16" w:name="_Toc225727461"/>
+      <w:bookmarkStart w:id="16" w:name="_Toc225990365"/>
       <w:r>
         <w:t>¿</w:t>
       </w:r>
@@ -3291,7 +3967,7 @@
       <w:pPr>
         <w:pStyle w:val="Ttulo3"/>
       </w:pPr>
-      <w:bookmarkStart w:id="17" w:name="_Toc225727462"/>
+      <w:bookmarkStart w:id="17" w:name="_Toc225990366"/>
       <w:r>
         <w:t>Entidades</w:t>
       </w:r>
@@ -3659,7 +4335,7 @@
       <w:pPr>
         <w:pStyle w:val="Ttulo3"/>
       </w:pPr>
-      <w:bookmarkStart w:id="18" w:name="_Toc225727463"/>
+      <w:bookmarkStart w:id="18" w:name="_Toc225990367"/>
       <w:r>
         <w:t>¿Por qué elegimos estas Entidades?</w:t>
       </w:r>
@@ -3702,7 +4378,7 @@
       <w:pPr>
         <w:pStyle w:val="Ttulo2"/>
       </w:pPr>
-      <w:bookmarkStart w:id="19" w:name="_Toc225727464"/>
+      <w:bookmarkStart w:id="19" w:name="_Toc225990368"/>
       <w:r>
         <w:lastRenderedPageBreak/>
         <w:t>PROCESOS</w:t>
@@ -3716,7 +4392,7 @@
       <w:pPr>
         <w:pStyle w:val="Ttulo3"/>
       </w:pPr>
-      <w:bookmarkStart w:id="20" w:name="_Toc225727465"/>
+      <w:bookmarkStart w:id="20" w:name="_Toc225990369"/>
       <w:r>
         <w:t>Verificación de Condición del Paciente</w:t>
       </w:r>
@@ -4014,7 +4690,7 @@
       <w:pPr>
         <w:pStyle w:val="Ttulo3"/>
       </w:pPr>
-      <w:bookmarkStart w:id="21" w:name="_Toc225727466"/>
+      <w:bookmarkStart w:id="21" w:name="_Toc225990370"/>
       <w:r>
         <w:lastRenderedPageBreak/>
         <w:t>Asignación de Camas</w:t>
@@ -4390,8 +5066,13 @@
       <w:r>
         <w:t xml:space="preserve"> </w:t>
       </w:r>
-      <w:r>
-        <w:t>Enfermeria” mediante una super clase común o mediante una interfaz.</w:t>
+      <w:proofErr w:type="spellStart"/>
+      <w:r>
+        <w:t>Enfermeria</w:t>
+      </w:r>
+      <w:proofErr w:type="spellEnd"/>
+      <w:r>
+        <w:t>” mediante una super clase común o mediante una interfaz.</w:t>
       </w:r>
     </w:p>
     <w:p>
@@ -4441,7 +5122,7 @@
       <w:pPr>
         <w:pStyle w:val="Ttulo3"/>
       </w:pPr>
-      <w:bookmarkStart w:id="29" w:name="_Toc225727467"/>
+      <w:bookmarkStart w:id="29" w:name="_Toc225990371"/>
       <w:r>
         <w:lastRenderedPageBreak/>
         <w:t>Proceso de Rondas Medicas Diarias</w:t>
@@ -4787,7 +5468,15 @@
         <w:t xml:space="preserve">a clase </w:t>
       </w:r>
       <w:r>
-        <w:t>“PersonalDeSalud”.</w:t>
+        <w:t>“</w:t>
+      </w:r>
+      <w:proofErr w:type="spellStart"/>
+      <w:r>
+        <w:t>PersonalDeSalud</w:t>
+      </w:r>
+      <w:proofErr w:type="spellEnd"/>
+      <w:r>
+        <w:t>”.</w:t>
       </w:r>
     </w:p>
     <w:p>
@@ -4849,7 +5538,15 @@
         <w:t xml:space="preserve">” de la </w:t>
       </w:r>
       <w:r>
-        <w:t>misma clase “PersonalDeSalud”</w:t>
+        <w:t>misma clase “</w:t>
+      </w:r>
+      <w:proofErr w:type="spellStart"/>
+      <w:r>
+        <w:t>PersonalDeSalud</w:t>
+      </w:r>
+      <w:proofErr w:type="spellEnd"/>
+      <w:r>
+        <w:t>”</w:t>
       </w:r>
       <w:r>
         <w:t xml:space="preserve">, para generar </w:t>
@@ -4858,7 +5555,15 @@
         <w:t>un</w:t>
       </w:r>
       <w:r>
-        <w:t xml:space="preserve"> objeto “NotaDeEvolución” en el objeto “Ingreso” correspondiente al ingreso</w:t>
+        <w:t xml:space="preserve"> objeto “</w:t>
+      </w:r>
+      <w:proofErr w:type="spellStart"/>
+      <w:r>
+        <w:t>NotaDeEvolución</w:t>
+      </w:r>
+      <w:proofErr w:type="spellEnd"/>
+      <w:r>
+        <w:t>” en el objeto “Ingreso” correspondiente al ingreso</w:t>
       </w:r>
       <w:r>
         <w:t xml:space="preserve"> activo</w:t>
@@ -4939,7 +5644,15 @@
         <w:jc w:val="both"/>
       </w:pPr>
       <w:r>
-        <w:t>Guardaremos la información de las rondas médicas realizadas mediante la instanciación de objetos de una clase llamada “RondaMedicaDiaria”.</w:t>
+        <w:t>Guardaremos la información de las rondas médicas realizadas mediante la instanciación de objetos de una clase llamada “</w:t>
+      </w:r>
+      <w:proofErr w:type="spellStart"/>
+      <w:r>
+        <w:t>RondaMedicaDiaria</w:t>
+      </w:r>
+      <w:proofErr w:type="spellEnd"/>
+      <w:r>
+        <w:t>”.</w:t>
       </w:r>
       <w:r>
         <w:t xml:space="preserve"> </w:t>
@@ -4951,10 +5664,31 @@
         <w:t xml:space="preserve">l método </w:t>
       </w:r>
       <w:r>
-        <w:t xml:space="preserve">“rondaMedicaDiaria()” </w:t>
-      </w:r>
-      <w:r>
-        <w:t xml:space="preserve">deberá generar un objeto de la clase “RondaMedicaDiaria” para guardar constancia de si una ronda se </w:t>
+        <w:t>“</w:t>
+      </w:r>
+      <w:proofErr w:type="spellStart"/>
+      <w:proofErr w:type="gramStart"/>
+      <w:r>
+        <w:t>rondaMedicaDiaria</w:t>
+      </w:r>
+      <w:proofErr w:type="spellEnd"/>
+      <w:r>
+        <w:t>(</w:t>
+      </w:r>
+      <w:proofErr w:type="gramEnd"/>
+      <w:r>
+        <w:t xml:space="preserve">)” </w:t>
+      </w:r>
+      <w:r>
+        <w:t>deberá generar un objeto de la clase “</w:t>
+      </w:r>
+      <w:proofErr w:type="spellStart"/>
+      <w:r>
+        <w:t>RondaMedicaDiaria</w:t>
+      </w:r>
+      <w:proofErr w:type="spellEnd"/>
+      <w:r>
+        <w:t xml:space="preserve">” para guardar constancia de si una ronda se </w:t>
       </w:r>
       <w:r>
         <w:t>realizó</w:t>
@@ -4988,7 +5722,15 @@
         <w:t xml:space="preserve">en </w:t>
       </w:r>
       <w:r>
-        <w:t xml:space="preserve">el objeto “RondaMedicaDiaria” de cada </w:t>
+        <w:t>el objeto “</w:t>
+      </w:r>
+      <w:proofErr w:type="spellStart"/>
+      <w:r>
+        <w:t>RondaMedicaDiaria</w:t>
+      </w:r>
+      <w:proofErr w:type="spellEnd"/>
+      <w:r>
+        <w:t xml:space="preserve">” de cada </w:t>
       </w:r>
       <w:r>
         <w:t>día, si el paciente ya está listo para la evaluación final.</w:t>
@@ -5034,7 +5776,7 @@
       <w:pPr>
         <w:pStyle w:val="Ttulo3"/>
       </w:pPr>
-      <w:bookmarkStart w:id="32" w:name="_Toc225727468"/>
+      <w:bookmarkStart w:id="32" w:name="_Toc225990372"/>
       <w:r>
         <w:lastRenderedPageBreak/>
         <w:t>Generación de Notas de Evolución</w:t>
@@ -5318,7 +6060,15 @@
         <w:jc w:val="both"/>
       </w:pPr>
       <w:r>
-        <w:t>Implementaremos este método en la clase “PersonalDeSalud”</w:t>
+        <w:t>Implementaremos este método en la clase “</w:t>
+      </w:r>
+      <w:proofErr w:type="spellStart"/>
+      <w:r>
+        <w:t>PersonalDeSalud</w:t>
+      </w:r>
+      <w:proofErr w:type="spellEnd"/>
+      <w:r>
+        <w:t>”</w:t>
       </w:r>
       <w:r>
         <w:t>.</w:t>
@@ -5366,13 +6116,21 @@
         <w:t>á</w:t>
       </w:r>
       <w:r>
-        <w:t xml:space="preserve"> nuevas instancias de la clase “NotaDeEv</w:t>
+        <w:t xml:space="preserve"> nuevas instancias de la clase “</w:t>
+      </w:r>
+      <w:proofErr w:type="spellStart"/>
+      <w:r>
+        <w:t>NotaDeEv</w:t>
       </w:r>
       <w:r>
         <w:t>o</w:t>
       </w:r>
       <w:r>
-        <w:t xml:space="preserve">lucion” en </w:t>
+        <w:t>lucion</w:t>
+      </w:r>
+      <w:proofErr w:type="spellEnd"/>
+      <w:r>
+        <w:t xml:space="preserve">” en </w:t>
       </w:r>
       <w:r>
         <w:t>el objeto “Ingreso” correspondiente a</w:t>
@@ -5412,7 +6170,28 @@
         <w:t>Este</w:t>
       </w:r>
       <w:r>
-        <w:t xml:space="preserve"> método, también podrá ser llamado desde el método “rondaMedicaDiaria()” de la clase “PersonalDeSalud”.</w:t>
+        <w:t xml:space="preserve"> método, también podrá ser llamado desde el método “</w:t>
+      </w:r>
+      <w:proofErr w:type="spellStart"/>
+      <w:proofErr w:type="gramStart"/>
+      <w:r>
+        <w:t>rondaMedicaDiaria</w:t>
+      </w:r>
+      <w:proofErr w:type="spellEnd"/>
+      <w:r>
+        <w:t>(</w:t>
+      </w:r>
+      <w:proofErr w:type="gramEnd"/>
+      <w:r>
+        <w:t>)” de la clase “</w:t>
+      </w:r>
+      <w:proofErr w:type="spellStart"/>
+      <w:r>
+        <w:t>PersonalDeSalud</w:t>
+      </w:r>
+      <w:proofErr w:type="spellEnd"/>
+      <w:r>
+        <w:t>”.</w:t>
       </w:r>
     </w:p>
     <w:p/>
@@ -5433,7 +6212,7 @@
       <w:pPr>
         <w:pStyle w:val="Ttulo3"/>
       </w:pPr>
-      <w:bookmarkStart w:id="33" w:name="_Toc225727469"/>
+      <w:bookmarkStart w:id="33" w:name="_Toc225990373"/>
       <w:r>
         <w:lastRenderedPageBreak/>
         <w:t>Evaluación final</w:t>
@@ -5993,7 +6772,7 @@
       <w:pPr>
         <w:pStyle w:val="Ttulo3"/>
       </w:pPr>
-      <w:bookmarkStart w:id="35" w:name="_Toc225727470"/>
+      <w:bookmarkStart w:id="35" w:name="_Toc225990374"/>
       <w:r>
         <w:lastRenderedPageBreak/>
         <w:t xml:space="preserve">Documentación del Alta </w:t>
@@ -6211,7 +6990,15 @@
         <w:t>este</w:t>
       </w:r>
       <w:r>
-        <w:t xml:space="preserve"> método en la clase “PersonalAdministrativo”.</w:t>
+        <w:t xml:space="preserve"> método en la clase “</w:t>
+      </w:r>
+      <w:proofErr w:type="spellStart"/>
+      <w:r>
+        <w:t>PersonalAdministrativo</w:t>
+      </w:r>
+      <w:proofErr w:type="spellEnd"/>
+      <w:r>
+        <w:t>”.</w:t>
       </w:r>
     </w:p>
     <w:p>
@@ -6290,7 +7077,7 @@
         <w:pStyle w:val="Ttulo3"/>
         <w:ind w:left="0" w:firstLine="0"/>
       </w:pPr>
-      <w:bookmarkStart w:id="38" w:name="_Toc225727471"/>
+      <w:bookmarkStart w:id="38" w:name="_Toc225990375"/>
       <w:r>
         <w:lastRenderedPageBreak/>
         <w:t>Traslado de un paciente a otra unidad u otro centro</w:t>
@@ -6720,7 +7507,23 @@
         <w:t xml:space="preserve">as clases </w:t>
       </w:r>
       <w:r>
-        <w:t>“PersonalAdministrativo” y “PersonalDeEnfermeria”</w:t>
+        <w:t>“</w:t>
+      </w:r>
+      <w:proofErr w:type="spellStart"/>
+      <w:r>
+        <w:t>PersonalAdministrativo</w:t>
+      </w:r>
+      <w:proofErr w:type="spellEnd"/>
+      <w:r>
+        <w:t>” y “</w:t>
+      </w:r>
+      <w:proofErr w:type="spellStart"/>
+      <w:r>
+        <w:t>PersonalDeEnfermeria</w:t>
+      </w:r>
+      <w:proofErr w:type="spellEnd"/>
+      <w:r>
+        <w:t>”</w:t>
       </w:r>
       <w:r>
         <w:t xml:space="preserve"> mediante una super clase común o mediante una interfaz, dependiendo de cuál sea más adecuada al momento de implementar está función.</w:t>
@@ -7048,7 +7851,7 @@
       <w:pPr>
         <w:pStyle w:val="Ttulo2"/>
       </w:pPr>
-      <w:bookmarkStart w:id="39" w:name="_Toc225727472"/>
+      <w:bookmarkStart w:id="39" w:name="_Toc225990376"/>
       <w:r>
         <w:lastRenderedPageBreak/>
         <w:t>REGLAS DEL SISTEMA</w:t>
@@ -7348,7 +8151,7 @@
       <w:pPr>
         <w:pStyle w:val="Ttulo2"/>
       </w:pPr>
-      <w:bookmarkStart w:id="40" w:name="_Toc225727473"/>
+      <w:bookmarkStart w:id="40" w:name="_Toc225990377"/>
       <w:r>
         <w:lastRenderedPageBreak/>
         <w:t xml:space="preserve">DATOS DE </w:t>
@@ -7371,16 +8174,26 @@
       <w:pPr>
         <w:pStyle w:val="Ttulo3"/>
       </w:pPr>
+      <w:bookmarkStart w:id="41" w:name="_Toc225990378"/>
       <w:r>
         <w:t>ACTORES</w:t>
       </w:r>
+      <w:bookmarkEnd w:id="41"/>
     </w:p>
     <w:p>
       <w:pPr>
         <w:pStyle w:val="Ttulo4"/>
       </w:pPr>
       <w:r>
-        <w:t>Personal &lt;&lt;abstract&gt;&gt;:</w:t>
+        <w:t>Personal &lt;&lt;</w:t>
+      </w:r>
+      <w:proofErr w:type="spellStart"/>
+      <w:r>
+        <w:t>abstract</w:t>
+      </w:r>
+      <w:proofErr w:type="spellEnd"/>
+      <w:r>
+        <w:t>&gt;&gt;:</w:t>
       </w:r>
     </w:p>
     <w:p>
@@ -7425,9 +8238,11 @@
         <w:spacing w:before="480"/>
         <w:ind w:left="357" w:hanging="357"/>
       </w:pPr>
+      <w:bookmarkStart w:id="42" w:name="_Toc225990379"/>
       <w:r>
         <w:t>ENTIDADES</w:t>
       </w:r>
+      <w:bookmarkEnd w:id="42"/>
     </w:p>
     <w:p>
       <w:pPr>
@@ -7990,7 +8805,7 @@
       <w:pPr>
         <w:pStyle w:val="Ttulo2"/>
       </w:pPr>
-      <w:bookmarkStart w:id="41" w:name="_Toc225727474"/>
+      <w:bookmarkStart w:id="43" w:name="_Toc225990380"/>
       <w:r>
         <w:lastRenderedPageBreak/>
         <w:t>MÉTODOS</w:t>
@@ -7998,22 +8813,32 @@
       <w:r>
         <w:t xml:space="preserve"> DE CADA ACTOR/ENTIDAD</w:t>
       </w:r>
-      <w:bookmarkEnd w:id="41"/>
+      <w:bookmarkEnd w:id="43"/>
     </w:p>
     <w:p>
       <w:pPr>
         <w:pStyle w:val="Ttulo3"/>
       </w:pPr>
+      <w:bookmarkStart w:id="44" w:name="_Toc225990381"/>
       <w:r>
         <w:t>ACTORES</w:t>
       </w:r>
+      <w:bookmarkEnd w:id="44"/>
     </w:p>
     <w:p>
       <w:pPr>
         <w:pStyle w:val="Ttulo4"/>
       </w:pPr>
       <w:r>
-        <w:t>Personal de Salud &lt;&lt;asbtract&gt;&gt;:</w:t>
+        <w:t>Personal de Salud &lt;&lt;</w:t>
+      </w:r>
+      <w:proofErr w:type="spellStart"/>
+      <w:r>
+        <w:t>asbtract</w:t>
+      </w:r>
+      <w:proofErr w:type="spellEnd"/>
+      <w:r>
+        <w:t>&gt;&gt;:</w:t>
       </w:r>
     </w:p>
     <w:p>
@@ -8027,12 +8852,30 @@
         <w:contextualSpacing w:val="0"/>
         <w:jc w:val="both"/>
       </w:pPr>
+      <w:proofErr w:type="spellStart"/>
+      <w:proofErr w:type="gramStart"/>
       <w:r>
         <w:rPr>
           <w:b/>
           <w:bCs/>
         </w:rPr>
-        <w:t>rondaMedicaDiariaPaciente():</w:t>
+        <w:t>rondaMedicaDiariaPaciente</w:t>
+      </w:r>
+      <w:proofErr w:type="spellEnd"/>
+      <w:r>
+        <w:rPr>
+          <w:b/>
+          <w:bCs/>
+        </w:rPr>
+        <w:t>(</w:t>
+      </w:r>
+      <w:proofErr w:type="gramEnd"/>
+      <w:r>
+        <w:rPr>
+          <w:b/>
+          <w:bCs/>
+        </w:rPr>
+        <w:t>):</w:t>
       </w:r>
       <w:r>
         <w:t xml:space="preserve"> Método que sirve para hacer una ronda médica diaria a un paciente en específico.</w:t>
@@ -8047,15 +8890,41 @@
         </w:numPr>
         <w:jc w:val="both"/>
       </w:pPr>
+      <w:proofErr w:type="spellStart"/>
+      <w:proofErr w:type="gramStart"/>
       <w:r>
         <w:rPr>
           <w:b/>
           <w:bCs/>
         </w:rPr>
-        <w:t>generarNotaEvolucionPaciente():</w:t>
-      </w:r>
-      <w:r>
-        <w:t xml:space="preserve"> Método que sirve para generar un nuevo objeto “NotaDeEvolucion” en el objeto “Ingreso” correspondiente al ingreso activo de un paciente en específico.</w:t>
+        <w:t>generarNotaEvolucionPaciente</w:t>
+      </w:r>
+      <w:proofErr w:type="spellEnd"/>
+      <w:r>
+        <w:rPr>
+          <w:b/>
+          <w:bCs/>
+        </w:rPr>
+        <w:t>(</w:t>
+      </w:r>
+      <w:proofErr w:type="gramEnd"/>
+      <w:r>
+        <w:rPr>
+          <w:b/>
+          <w:bCs/>
+        </w:rPr>
+        <w:t>):</w:t>
+      </w:r>
+      <w:r>
+        <w:t xml:space="preserve"> Método que sirve para generar un nuevo objeto “</w:t>
+      </w:r>
+      <w:proofErr w:type="spellStart"/>
+      <w:r>
+        <w:t>NotaDeEvolucion</w:t>
+      </w:r>
+      <w:proofErr w:type="spellEnd"/>
+      <w:r>
+        <w:t>” en el objeto “Ingreso” correspondiente al ingreso activo de un paciente en específico.</w:t>
       </w:r>
     </w:p>
     <w:p>
@@ -8080,12 +8949,30 @@
         <w:contextualSpacing w:val="0"/>
         <w:jc w:val="both"/>
       </w:pPr>
+      <w:proofErr w:type="spellStart"/>
+      <w:proofErr w:type="gramStart"/>
       <w:r>
         <w:rPr>
           <w:b/>
           <w:bCs/>
         </w:rPr>
-        <w:t>asignarCamaPaciente():</w:t>
+        <w:t>asignarCamaPaciente</w:t>
+      </w:r>
+      <w:proofErr w:type="spellEnd"/>
+      <w:r>
+        <w:rPr>
+          <w:b/>
+          <w:bCs/>
+        </w:rPr>
+        <w:t>(</w:t>
+      </w:r>
+      <w:proofErr w:type="gramEnd"/>
+      <w:r>
+        <w:rPr>
+          <w:b/>
+          <w:bCs/>
+        </w:rPr>
+        <w:t>):</w:t>
       </w:r>
       <w:r>
         <w:t xml:space="preserve"> Método que sirve para vincular un Paciente a una cama y la unidad de esa cama.</w:t>
@@ -8100,12 +8987,30 @@
         </w:numPr>
         <w:jc w:val="both"/>
       </w:pPr>
+      <w:proofErr w:type="spellStart"/>
+      <w:proofErr w:type="gramStart"/>
       <w:r>
         <w:rPr>
           <w:b/>
           <w:bCs/>
         </w:rPr>
-        <w:t>trasladoPaciente():</w:t>
+        <w:t>trasladoPaciente</w:t>
+      </w:r>
+      <w:proofErr w:type="spellEnd"/>
+      <w:r>
+        <w:rPr>
+          <w:b/>
+          <w:bCs/>
+        </w:rPr>
+        <w:t>(</w:t>
+      </w:r>
+      <w:proofErr w:type="gramEnd"/>
+      <w:r>
+        <w:rPr>
+          <w:b/>
+          <w:bCs/>
+        </w:rPr>
+        <w:t>):</w:t>
       </w:r>
       <w:r>
         <w:t xml:space="preserve"> Método que sirve para trasladar a otro hospital o a otra unidad del nuestro hospital.</w:t>
@@ -8128,12 +9033,30 @@
         </w:numPr>
         <w:jc w:val="both"/>
       </w:pPr>
+      <w:proofErr w:type="spellStart"/>
+      <w:proofErr w:type="gramStart"/>
       <w:r>
         <w:rPr>
           <w:b/>
           <w:bCs/>
         </w:rPr>
-        <w:t>evaluacionFinalPaciente():</w:t>
+        <w:t>evaluacionFinalPaciente</w:t>
+      </w:r>
+      <w:proofErr w:type="spellEnd"/>
+      <w:r>
+        <w:rPr>
+          <w:b/>
+          <w:bCs/>
+        </w:rPr>
+        <w:t>(</w:t>
+      </w:r>
+      <w:proofErr w:type="gramEnd"/>
+      <w:r>
+        <w:rPr>
+          <w:b/>
+          <w:bCs/>
+        </w:rPr>
+        <w:t>):</w:t>
       </w:r>
       <w:r>
         <w:t xml:space="preserve"> Método que sirve para hacer la evaluación final a un paciente en específico después de una ronda médica diaria exitosa.</w:t>
@@ -8158,12 +9081,30 @@
         <w:contextualSpacing w:val="0"/>
         <w:jc w:val="both"/>
       </w:pPr>
+      <w:proofErr w:type="spellStart"/>
+      <w:proofErr w:type="gramStart"/>
       <w:r>
         <w:rPr>
           <w:b/>
           <w:bCs/>
         </w:rPr>
-        <w:t>asignarCamaPaciente():</w:t>
+        <w:t>asignarCamaPaciente</w:t>
+      </w:r>
+      <w:proofErr w:type="spellEnd"/>
+      <w:r>
+        <w:rPr>
+          <w:b/>
+          <w:bCs/>
+        </w:rPr>
+        <w:t>(</w:t>
+      </w:r>
+      <w:proofErr w:type="gramEnd"/>
+      <w:r>
+        <w:rPr>
+          <w:b/>
+          <w:bCs/>
+        </w:rPr>
+        <w:t>):</w:t>
       </w:r>
       <w:r>
         <w:t xml:space="preserve"> Método que sirve para vincular un Paciente a una cama y la unidad de esa cama.</w:t>
@@ -8180,12 +9121,30 @@
         <w:contextualSpacing w:val="0"/>
         <w:jc w:val="both"/>
       </w:pPr>
+      <w:proofErr w:type="spellStart"/>
+      <w:proofErr w:type="gramStart"/>
       <w:r>
         <w:rPr>
           <w:b/>
           <w:bCs/>
         </w:rPr>
-        <w:t>trasladoPaciente():</w:t>
+        <w:t>trasladoPaciente</w:t>
+      </w:r>
+      <w:proofErr w:type="spellEnd"/>
+      <w:r>
+        <w:rPr>
+          <w:b/>
+          <w:bCs/>
+        </w:rPr>
+        <w:t>(</w:t>
+      </w:r>
+      <w:proofErr w:type="gramEnd"/>
+      <w:r>
+        <w:rPr>
+          <w:b/>
+          <w:bCs/>
+        </w:rPr>
+        <w:t>):</w:t>
       </w:r>
       <w:r>
         <w:t xml:space="preserve"> Método que sirve para trasladar a otro hospital o a otra unidad del nuestro hospital.</w:t>
@@ -8200,12 +9159,30 @@
         </w:numPr>
         <w:jc w:val="both"/>
       </w:pPr>
+      <w:proofErr w:type="spellStart"/>
+      <w:proofErr w:type="gramStart"/>
       <w:r>
         <w:rPr>
           <w:b/>
           <w:bCs/>
         </w:rPr>
-        <w:t>documentacionAltaPaciente():</w:t>
+        <w:t>documentacionAltaPaciente</w:t>
+      </w:r>
+      <w:proofErr w:type="spellEnd"/>
+      <w:r>
+        <w:rPr>
+          <w:b/>
+          <w:bCs/>
+        </w:rPr>
+        <w:t>(</w:t>
+      </w:r>
+      <w:proofErr w:type="gramEnd"/>
+      <w:r>
+        <w:rPr>
+          <w:b/>
+          <w:bCs/>
+        </w:rPr>
+        <w:t>):</w:t>
       </w:r>
       <w:r>
         <w:t xml:space="preserve"> Método que rellena el atributo referente a la documentación del alta del ingreso de un paciente</w:t>
@@ -8226,7 +9203,7 @@
       <w:pPr>
         <w:pStyle w:val="Ttulo2"/>
       </w:pPr>
-      <w:bookmarkStart w:id="42" w:name="_Toc225727475"/>
+      <w:bookmarkStart w:id="45" w:name="_Toc225990382"/>
       <w:r>
         <w:lastRenderedPageBreak/>
         <w:t xml:space="preserve">DECISIONES </w:t>
@@ -8237,17 +9214,17 @@
       <w:r>
         <w:t xml:space="preserve"> Y JUSTIFICADAS</w:t>
       </w:r>
-      <w:bookmarkEnd w:id="42"/>
+      <w:bookmarkEnd w:id="45"/>
     </w:p>
     <w:p>
       <w:pPr>
         <w:pStyle w:val="Ttulo3"/>
       </w:pPr>
-      <w:bookmarkStart w:id="43" w:name="_Toc225727476"/>
+      <w:bookmarkStart w:id="46" w:name="_Toc225990383"/>
       <w:r>
         <w:t>¿Cómo simular el tiempo?</w:t>
       </w:r>
-      <w:bookmarkEnd w:id="43"/>
+      <w:bookmarkEnd w:id="46"/>
     </w:p>
     <w:p>
       <w:pPr>
@@ -8262,7 +9239,20 @@
         <w:jc w:val="both"/>
       </w:pPr>
       <w:r>
-        <w:t>Podríamos crear una clase de utilidad llamada “Tiempo” o algo así, con un método llamado “avanzarDia()”</w:t>
+        <w:t>Podríamos crear una clase de utilidad llamada “Tiempo” o algo así, con un método llamado “</w:t>
+      </w:r>
+      <w:proofErr w:type="spellStart"/>
+      <w:proofErr w:type="gramStart"/>
+      <w:r>
+        <w:t>avanzarDia</w:t>
+      </w:r>
+      <w:proofErr w:type="spellEnd"/>
+      <w:r>
+        <w:t>(</w:t>
+      </w:r>
+      <w:proofErr w:type="gramEnd"/>
+      <w:r>
+        <w:t>)”</w:t>
       </w:r>
       <w:r>
         <w:t xml:space="preserve"> que simule el avance de un día a otro en el hospital</w:t>
@@ -8289,11 +9279,11 @@
       <w:pPr>
         <w:pStyle w:val="Ttulo3"/>
       </w:pPr>
-      <w:bookmarkStart w:id="44" w:name="_Toc225727477"/>
+      <w:bookmarkStart w:id="47" w:name="_Toc225990384"/>
       <w:r>
         <w:t>¿Qué se entiende por “médicos y personal de salud”?</w:t>
       </w:r>
-      <w:bookmarkEnd w:id="44"/>
+      <w:bookmarkEnd w:id="47"/>
     </w:p>
     <w:p>
       <w:pPr>
@@ -8350,7 +9340,15 @@
         <w:jc w:val="both"/>
       </w:pPr>
       <w:r>
-        <w:t>“Personal de Salud” es un termino que se usa para referirse a todos los trabajadores orientados al cuidado sanitario del paciente.</w:t>
+        <w:t xml:space="preserve">“Personal de Salud” es un </w:t>
+      </w:r>
+      <w:proofErr w:type="spellStart"/>
+      <w:r>
+        <w:t>termino</w:t>
+      </w:r>
+      <w:proofErr w:type="spellEnd"/>
+      <w:r>
+        <w:t xml:space="preserve"> que se usa para referirse a todos los trabajadores orientados al cuidado sanitario del paciente.</w:t>
       </w:r>
     </w:p>
     <w:p>
@@ -8366,9 +9364,11 @@
       <w:pPr>
         <w:pStyle w:val="Ttulo3"/>
       </w:pPr>
+      <w:bookmarkStart w:id="48" w:name="_Toc225990385"/>
       <w:r>
         <w:t>¿Quién gestiona el traslado de pacientes?</w:t>
       </w:r>
+      <w:bookmarkEnd w:id="48"/>
     </w:p>
     <w:p>
       <w:pPr>
@@ -8411,10 +9411,20 @@
       <w:pPr>
         <w:pStyle w:val="Ttulo3"/>
       </w:pPr>
+      <w:bookmarkStart w:id="49" w:name="_Toc225990386"/>
       <w:r>
         <w:lastRenderedPageBreak/>
-        <w:t>¿Quién se encarga de la evaluación final de los paceintes?</w:t>
-      </w:r>
+        <w:t xml:space="preserve">¿Quién se encarga de la evaluación final de los </w:t>
+      </w:r>
+      <w:proofErr w:type="spellStart"/>
+      <w:r>
+        <w:t>paceintes</w:t>
+      </w:r>
+      <w:proofErr w:type="spellEnd"/>
+      <w:r>
+        <w:t>?</w:t>
+      </w:r>
+      <w:bookmarkEnd w:id="49"/>
     </w:p>
     <w:p>
       <w:pPr>
@@ -8457,31 +9467,7 @@
         <w:jc w:val="both"/>
       </w:pPr>
       <w:r>
-        <w:t xml:space="preserve">Debido al enunciado, podría sonar a que tanto </w:t>
-      </w:r>
-      <w:r>
-        <w:t>los</w:t>
-      </w:r>
-      <w:r>
-        <w:t xml:space="preserve"> miembro</w:t>
-      </w:r>
-      <w:r>
-        <w:t>s</w:t>
-      </w:r>
-      <w:r>
-        <w:t xml:space="preserve"> del personal administrativo y </w:t>
-      </w:r>
-      <w:r>
-        <w:t>los</w:t>
-      </w:r>
-      <w:r>
-        <w:t xml:space="preserve"> médico</w:t>
-      </w:r>
-      <w:r>
-        <w:t>s</w:t>
-      </w:r>
-      <w:r>
-        <w:t xml:space="preserve"> forman parte del proceso de evaluación final, pero en realidad, sería más adecuado decir que el médico hace la evaluación final y el personal administrativo trabaja con el resultado de esa evaluación.</w:t>
+        <w:t>Debido al enunciado, podría sonar a que tanto los miembros del personal administrativo y los médicos forman parte del proceso de evaluación final, pero en realidad, sería más adecuado decir que el médico hace la evaluación final y el personal administrativo trabaja con el resultado de esa evaluación.</w:t>
       </w:r>
     </w:p>
     <w:p>
@@ -8497,9 +9483,11 @@
         <w:pStyle w:val="Ttulo3"/>
         <w:ind w:left="0" w:hanging="76"/>
       </w:pPr>
+      <w:bookmarkStart w:id="50" w:name="_Toc225990387"/>
       <w:r>
         <w:t>¿Las notas de evolución solo se pueden generar en una ronda médica?</w:t>
       </w:r>
+      <w:bookmarkEnd w:id="50"/>
     </w:p>
     <w:p>
       <w:pPr>
@@ -8584,10 +9572,12 @@
         <w:pStyle w:val="Ttulo3"/>
         <w:ind w:left="0" w:firstLine="0"/>
       </w:pPr>
+      <w:bookmarkStart w:id="51" w:name="_Toc225990388"/>
       <w:r>
         <w:lastRenderedPageBreak/>
         <w:t>¿Cómo sabe el sistema que un paciente está listo para la evaluación final?</w:t>
       </w:r>
+      <w:bookmarkEnd w:id="51"/>
     </w:p>
     <w:p>
       <w:pPr>
@@ -10822,6 +11812,7 @@
   <w:style w:type="character" w:default="1" w:styleId="Fuentedeprrafopredeter">
     <w:name w:val="Default Paragraph Font"/>
     <w:uiPriority w:val="1"/>
+    <w:semiHidden/>
     <w:unhideWhenUsed/>
   </w:style>
   <w:style w:type="table" w:default="1" w:styleId="Tablanormal">

</xml_diff>

<commit_message>
Añade pequeñas modificaciones al archivo .docx y .pdf del Analisis del proyecto
</commit_message>
<xml_diff>
--- a/documentacion/Análisis Del Enunciado 2/PROYECTO-RETO – Análisis _ Grupo2.docx
+++ b/documentacion/Análisis Del Enunciado 2/PROYECTO-RETO – Análisis _ Grupo2.docx
@@ -116,29 +116,7 @@
                                     <w:sz w:val="24"/>
                                     <w:szCs w:val="24"/>
                                   </w:rPr>
-                                  <w:t xml:space="preserve">Diana </w:t>
-                                </w:r>
-                                <w:proofErr w:type="spellStart"/>
-                                <w:r>
-                                  <w:rPr>
-                                    <w:rFonts w:ascii="Calisto MT" w:hAnsi="Calisto MT"/>
-                                    <w:b/>
-                                    <w:bCs/>
-                                    <w:sz w:val="24"/>
-                                    <w:szCs w:val="24"/>
-                                  </w:rPr>
-                                  <w:t>Rodriguez</w:t>
-                                </w:r>
-                                <w:proofErr w:type="spellEnd"/>
-                                <w:r>
-                                  <w:rPr>
-                                    <w:rFonts w:ascii="Calisto MT" w:hAnsi="Calisto MT"/>
-                                    <w:b/>
-                                    <w:bCs/>
-                                    <w:sz w:val="24"/>
-                                    <w:szCs w:val="24"/>
-                                  </w:rPr>
-                                  <w:t xml:space="preserve"> Pinillos</w:t>
+                                  <w:t>Diana Rodriguez Pinillos</w:t>
                                 </w:r>
                               </w:p>
                               <w:p>
@@ -160,42 +138,8 @@
                                     <w:sz w:val="24"/>
                                     <w:szCs w:val="24"/>
                                   </w:rPr>
-                                  <w:t xml:space="preserve">Alex </w:t>
+                                  <w:t>Alex Andrei Stoica</w:t>
                                 </w:r>
-                                <w:proofErr w:type="spellStart"/>
-                                <w:r>
-                                  <w:rPr>
-                                    <w:rFonts w:ascii="Calisto MT" w:hAnsi="Calisto MT"/>
-                                    <w:b/>
-                                    <w:bCs/>
-                                    <w:sz w:val="24"/>
-                                    <w:szCs w:val="24"/>
-                                  </w:rPr>
-                                  <w:t>Andrei</w:t>
-                                </w:r>
-                                <w:proofErr w:type="spellEnd"/>
-                                <w:r>
-                                  <w:rPr>
-                                    <w:rFonts w:ascii="Calisto MT" w:hAnsi="Calisto MT"/>
-                                    <w:b/>
-                                    <w:bCs/>
-                                    <w:sz w:val="24"/>
-                                    <w:szCs w:val="24"/>
-                                  </w:rPr>
-                                  <w:t xml:space="preserve"> </w:t>
-                                </w:r>
-                                <w:proofErr w:type="spellStart"/>
-                                <w:r>
-                                  <w:rPr>
-                                    <w:rFonts w:ascii="Calisto MT" w:hAnsi="Calisto MT"/>
-                                    <w:b/>
-                                    <w:bCs/>
-                                    <w:sz w:val="24"/>
-                                    <w:szCs w:val="24"/>
-                                  </w:rPr>
-                                  <w:t>Stoica</w:t>
-                                </w:r>
-                                <w:proofErr w:type="spellEnd"/>
                               </w:p>
                               <w:p>
                                 <w:pPr>
@@ -301,29 +245,7 @@
                               <w:sz w:val="24"/>
                               <w:szCs w:val="24"/>
                             </w:rPr>
-                            <w:t xml:space="preserve">Diana </w:t>
-                          </w:r>
-                          <w:proofErr w:type="spellStart"/>
-                          <w:r>
-                            <w:rPr>
-                              <w:rFonts w:ascii="Calisto MT" w:hAnsi="Calisto MT"/>
-                              <w:b/>
-                              <w:bCs/>
-                              <w:sz w:val="24"/>
-                              <w:szCs w:val="24"/>
-                            </w:rPr>
-                            <w:t>Rodriguez</w:t>
-                          </w:r>
-                          <w:proofErr w:type="spellEnd"/>
-                          <w:r>
-                            <w:rPr>
-                              <w:rFonts w:ascii="Calisto MT" w:hAnsi="Calisto MT"/>
-                              <w:b/>
-                              <w:bCs/>
-                              <w:sz w:val="24"/>
-                              <w:szCs w:val="24"/>
-                            </w:rPr>
-                            <w:t xml:space="preserve"> Pinillos</w:t>
+                            <w:t>Diana Rodriguez Pinillos</w:t>
                           </w:r>
                         </w:p>
                         <w:p>
@@ -345,42 +267,8 @@
                               <w:sz w:val="24"/>
                               <w:szCs w:val="24"/>
                             </w:rPr>
-                            <w:t xml:space="preserve">Alex </w:t>
+                            <w:t>Alex Andrei Stoica</w:t>
                           </w:r>
-                          <w:proofErr w:type="spellStart"/>
-                          <w:r>
-                            <w:rPr>
-                              <w:rFonts w:ascii="Calisto MT" w:hAnsi="Calisto MT"/>
-                              <w:b/>
-                              <w:bCs/>
-                              <w:sz w:val="24"/>
-                              <w:szCs w:val="24"/>
-                            </w:rPr>
-                            <w:t>Andrei</w:t>
-                          </w:r>
-                          <w:proofErr w:type="spellEnd"/>
-                          <w:r>
-                            <w:rPr>
-                              <w:rFonts w:ascii="Calisto MT" w:hAnsi="Calisto MT"/>
-                              <w:b/>
-                              <w:bCs/>
-                              <w:sz w:val="24"/>
-                              <w:szCs w:val="24"/>
-                            </w:rPr>
-                            <w:t xml:space="preserve"> </w:t>
-                          </w:r>
-                          <w:proofErr w:type="spellStart"/>
-                          <w:r>
-                            <w:rPr>
-                              <w:rFonts w:ascii="Calisto MT" w:hAnsi="Calisto MT"/>
-                              <w:b/>
-                              <w:bCs/>
-                              <w:sz w:val="24"/>
-                              <w:szCs w:val="24"/>
-                            </w:rPr>
-                            <w:t>Stoica</w:t>
-                          </w:r>
-                          <w:proofErr w:type="spellEnd"/>
                         </w:p>
                         <w:p>
                           <w:pPr>
@@ -2074,7 +1962,7 @@
                 <w:noProof/>
                 <w:webHidden/>
               </w:rPr>
-              <w:t>8</w:t>
+              <w:t>9</w:t>
             </w:r>
             <w:r>
               <w:rPr>
@@ -2148,7 +2036,7 @@
                 <w:noProof/>
                 <w:webHidden/>
               </w:rPr>
-              <w:t>10</w:t>
+              <w:t>11</w:t>
             </w:r>
             <w:r>
               <w:rPr>
@@ -2222,7 +2110,7 @@
                 <w:noProof/>
                 <w:webHidden/>
               </w:rPr>
-              <w:t>12</w:t>
+              <w:t>13</w:t>
             </w:r>
             <w:r>
               <w:rPr>
@@ -2296,7 +2184,7 @@
                 <w:noProof/>
                 <w:webHidden/>
               </w:rPr>
-              <w:t>14</w:t>
+              <w:t>15</w:t>
             </w:r>
             <w:r>
               <w:rPr>
@@ -2370,7 +2258,7 @@
                 <w:noProof/>
                 <w:webHidden/>
               </w:rPr>
-              <w:t>15</w:t>
+              <w:t>16</w:t>
             </w:r>
             <w:r>
               <w:rPr>
@@ -2435,7 +2323,7 @@
               <w:rPr>
                 <w:webHidden/>
               </w:rPr>
-              <w:t>17</w:t>
+              <w:t>19</w:t>
             </w:r>
             <w:r>
               <w:rPr>
@@ -2499,7 +2387,7 @@
               <w:rPr>
                 <w:webHidden/>
               </w:rPr>
-              <w:t>18</w:t>
+              <w:t>21</w:t>
             </w:r>
             <w:r>
               <w:rPr>
@@ -2572,7 +2460,7 @@
                 <w:noProof/>
                 <w:webHidden/>
               </w:rPr>
-              <w:t>18</w:t>
+              <w:t>21</w:t>
             </w:r>
             <w:r>
               <w:rPr>
@@ -2646,7 +2534,7 @@
                 <w:noProof/>
                 <w:webHidden/>
               </w:rPr>
-              <w:t>18</w:t>
+              <w:t>21</w:t>
             </w:r>
             <w:r>
               <w:rPr>
@@ -2711,7 +2599,7 @@
               <w:rPr>
                 <w:webHidden/>
               </w:rPr>
-              <w:t>20</w:t>
+              <w:t>23</w:t>
             </w:r>
             <w:r>
               <w:rPr>
@@ -2784,7 +2672,7 @@
                 <w:noProof/>
                 <w:webHidden/>
               </w:rPr>
-              <w:t>20</w:t>
+              <w:t>23</w:t>
             </w:r>
             <w:r>
               <w:rPr>
@@ -2849,7 +2737,7 @@
               <w:rPr>
                 <w:webHidden/>
               </w:rPr>
-              <w:t>21</w:t>
+              <w:t>24</w:t>
             </w:r>
             <w:r>
               <w:rPr>
@@ -2922,7 +2810,7 @@
                 <w:noProof/>
                 <w:webHidden/>
               </w:rPr>
-              <w:t>21</w:t>
+              <w:t>24</w:t>
             </w:r>
             <w:r>
               <w:rPr>
@@ -2996,7 +2884,7 @@
                 <w:noProof/>
                 <w:webHidden/>
               </w:rPr>
-              <w:t>21</w:t>
+              <w:t>24</w:t>
             </w:r>
             <w:r>
               <w:rPr>
@@ -3070,7 +2958,7 @@
                 <w:noProof/>
                 <w:webHidden/>
               </w:rPr>
-              <w:t>21</w:t>
+              <w:t>24</w:t>
             </w:r>
             <w:r>
               <w:rPr>
@@ -3144,7 +3032,7 @@
                 <w:noProof/>
                 <w:webHidden/>
               </w:rPr>
-              <w:t>22</w:t>
+              <w:t>25</w:t>
             </w:r>
             <w:r>
               <w:rPr>
@@ -3218,7 +3106,7 @@
                 <w:noProof/>
                 <w:webHidden/>
               </w:rPr>
-              <w:t>22</w:t>
+              <w:t>25</w:t>
             </w:r>
             <w:r>
               <w:rPr>
@@ -3292,7 +3180,7 @@
                 <w:noProof/>
                 <w:webHidden/>
               </w:rPr>
-              <w:t>23</w:t>
+              <w:t>26</w:t>
             </w:r>
             <w:r>
               <w:rPr>
@@ -3589,23 +3477,7 @@
           <w:b/>
           <w:bCs/>
         </w:rPr>
-        <w:t>Personal &lt;&lt;</w:t>
-      </w:r>
-      <w:proofErr w:type="spellStart"/>
-      <w:r>
-        <w:rPr>
-          <w:b/>
-          <w:bCs/>
-        </w:rPr>
-        <w:t>abstract</w:t>
-      </w:r>
-      <w:proofErr w:type="spellEnd"/>
-      <w:r>
-        <w:rPr>
-          <w:b/>
-          <w:bCs/>
-        </w:rPr>
-        <w:t>&gt;&gt;:</w:t>
+        <w:t>Personal &lt;&lt;abstract&gt;&gt;:</w:t>
       </w:r>
       <w:r>
         <w:t xml:space="preserve"> Representa a todos los tipos de trabajadores del hospital.</w:t>
@@ -3653,23 +3525,7 @@
           <w:b/>
           <w:bCs/>
         </w:rPr>
-        <w:t xml:space="preserve"> &lt;&lt;</w:t>
-      </w:r>
-      <w:proofErr w:type="spellStart"/>
-      <w:r>
-        <w:rPr>
-          <w:b/>
-          <w:bCs/>
-        </w:rPr>
-        <w:t>abstract</w:t>
-      </w:r>
-      <w:proofErr w:type="spellEnd"/>
-      <w:r>
-        <w:rPr>
-          <w:b/>
-          <w:bCs/>
-        </w:rPr>
-        <w:t>&gt;&gt;</w:t>
+        <w:t xml:space="preserve"> &lt;&lt;abstract&gt;&gt;</w:t>
       </w:r>
       <w:r>
         <w:rPr>
@@ -3831,23 +3687,7 @@
           <w:b/>
           <w:bCs/>
         </w:rPr>
-        <w:t>&lt;&lt;</w:t>
-      </w:r>
-      <w:proofErr w:type="spellStart"/>
-      <w:r>
-        <w:rPr>
-          <w:b/>
-          <w:bCs/>
-        </w:rPr>
-        <w:t>abstract</w:t>
-      </w:r>
-      <w:proofErr w:type="spellEnd"/>
-      <w:r>
-        <w:rPr>
-          <w:b/>
-          <w:bCs/>
-        </w:rPr>
-        <w:t>&gt;&gt;</w:t>
+        <w:t>&lt;&lt;abstract&gt;&gt;</w:t>
       </w:r>
       <w:r>
         <w:t>,</w:t>
@@ -4040,7 +3880,6 @@
           <w:numId w:val="2"/>
         </w:numPr>
         <w:spacing w:after="60" w:line="276" w:lineRule="auto"/>
-        <w:ind w:hanging="357"/>
         <w:contextualSpacing w:val="0"/>
         <w:jc w:val="both"/>
       </w:pPr>
@@ -4049,16 +3888,16 @@
           <w:b/>
           <w:bCs/>
         </w:rPr>
-        <w:t>Expediente Médico:</w:t>
+        <w:t>Ingreso:</w:t>
       </w:r>
       <w:r>
         <w:t xml:space="preserve"> </w:t>
       </w:r>
       <w:r>
-        <w:t>Representa</w:t>
-      </w:r>
-      <w:r>
-        <w:t xml:space="preserve"> todo el historial de un paciente.</w:t>
+        <w:t>Representa c</w:t>
+      </w:r>
+      <w:r>
+        <w:t>ada vez que el paciente ha estado ingresado en el hospital.</w:t>
       </w:r>
     </w:p>
     <w:p>
@@ -4069,7 +3908,6 @@
           <w:numId w:val="2"/>
         </w:numPr>
         <w:spacing w:after="60" w:line="276" w:lineRule="auto"/>
-        <w:ind w:hanging="357"/>
         <w:contextualSpacing w:val="0"/>
         <w:jc w:val="both"/>
       </w:pPr>
@@ -4078,16 +3916,16 @@
           <w:b/>
           <w:bCs/>
         </w:rPr>
-        <w:t>Ingreso:</w:t>
+        <w:t>Alta:</w:t>
       </w:r>
       <w:r>
         <w:t xml:space="preserve"> </w:t>
       </w:r>
       <w:r>
-        <w:t>Representa c</w:t>
-      </w:r>
-      <w:r>
-        <w:t>ada vez que el paciente ha estado ingresado en el hospital.</w:t>
+        <w:t>Representa la i</w:t>
+      </w:r>
+      <w:r>
+        <w:t>nformación sobre el alta de un ingreso.</w:t>
       </w:r>
     </w:p>
     <w:p>
@@ -4097,37 +3935,7 @@
           <w:ilvl w:val="3"/>
           <w:numId w:val="2"/>
         </w:numPr>
-        <w:spacing w:after="60" w:line="276" w:lineRule="auto"/>
-        <w:ind w:hanging="357"/>
-        <w:contextualSpacing w:val="0"/>
-        <w:jc w:val="both"/>
-      </w:pPr>
-      <w:r>
-        <w:rPr>
-          <w:b/>
-          <w:bCs/>
-        </w:rPr>
-        <w:t>Alta:</w:t>
-      </w:r>
-      <w:r>
-        <w:t xml:space="preserve"> </w:t>
-      </w:r>
-      <w:r>
-        <w:t>Representa la i</w:t>
-      </w:r>
-      <w:r>
-        <w:t>nformación sobre el alta de un ingreso.</w:t>
-      </w:r>
-    </w:p>
-    <w:p>
-      <w:pPr>
-        <w:pStyle w:val="Prrafodelista"/>
-        <w:numPr>
-          <w:ilvl w:val="4"/>
-          <w:numId w:val="2"/>
-        </w:numPr>
         <w:spacing w:after="120" w:line="276" w:lineRule="auto"/>
-        <w:ind w:hanging="357"/>
         <w:contextualSpacing w:val="0"/>
         <w:jc w:val="both"/>
       </w:pPr>
@@ -4158,11 +3966,10 @@
       <w:pPr>
         <w:pStyle w:val="Prrafodelista"/>
         <w:numPr>
-          <w:ilvl w:val="3"/>
+          <w:ilvl w:val="2"/>
           <w:numId w:val="2"/>
         </w:numPr>
         <w:spacing w:line="276" w:lineRule="auto"/>
-        <w:ind w:hanging="357"/>
         <w:contextualSpacing w:val="0"/>
         <w:jc w:val="both"/>
       </w:pPr>
@@ -4941,9 +4748,68 @@
     </w:p>
     <w:p>
       <w:pPr>
+        <w:jc w:val="both"/>
+      </w:pPr>
+      <w:r>
+        <w:t>Está acción solo se podrá usar si el paciente no fue asignado antes, en ese caso, se usara el proceso de traslado de paciente.</w:t>
+      </w:r>
+    </w:p>
+    <w:p>
+      <w:pPr>
+        <w:jc w:val="both"/>
+      </w:pPr>
+    </w:p>
+    <w:p>
+      <w:pPr>
+        <w:jc w:val="both"/>
+      </w:pPr>
+    </w:p>
+    <w:p>
+      <w:pPr>
+        <w:jc w:val="both"/>
+      </w:pPr>
+    </w:p>
+    <w:p>
+      <w:pPr>
+        <w:jc w:val="both"/>
+      </w:pPr>
+    </w:p>
+    <w:p>
+      <w:pPr>
+        <w:jc w:val="both"/>
+      </w:pPr>
+    </w:p>
+    <w:p>
+      <w:pPr>
+        <w:jc w:val="both"/>
+      </w:pPr>
+    </w:p>
+    <w:p>
+      <w:pPr>
+        <w:jc w:val="both"/>
+      </w:pPr>
+    </w:p>
+    <w:p>
+      <w:pPr>
+        <w:jc w:val="both"/>
+      </w:pPr>
+    </w:p>
+    <w:p>
+      <w:pPr>
+        <w:jc w:val="both"/>
+      </w:pPr>
+    </w:p>
+    <w:p>
+      <w:pPr>
+        <w:jc w:val="both"/>
+      </w:pPr>
+    </w:p>
+    <w:p>
+      <w:pPr>
         <w:pStyle w:val="Ttulo4"/>
       </w:pPr>
       <w:r>
+        <w:lastRenderedPageBreak/>
         <w:t>Implementación</w:t>
       </w:r>
       <w:r>
@@ -5066,13 +4932,8 @@
       <w:r>
         <w:t xml:space="preserve"> </w:t>
       </w:r>
-      <w:proofErr w:type="spellStart"/>
-      <w:r>
-        <w:t>Enfermeria</w:t>
-      </w:r>
-      <w:proofErr w:type="spellEnd"/>
-      <w:r>
-        <w:t>” mediante una super clase común o mediante una interfaz.</w:t>
+      <w:r>
+        <w:t>Enfermeria” mediante una super clase común o mediante una interfaz.</w:t>
       </w:r>
     </w:p>
     <w:p>
@@ -5117,6 +4978,111 @@
       <w:r>
         <w:t>paciente. En el código de la cama se actualiza el atributo referente a que paciente la ocupa y el atributo referente a la disponibilidad de la cama.</w:t>
       </w:r>
+      <w:r>
+        <w:t xml:space="preserve"> Esté método solo se podrá si el paciente no fue asignado antes, en ese caso se hará el proceso de traslado.</w:t>
+      </w:r>
+    </w:p>
+    <w:p>
+      <w:pPr>
+        <w:spacing w:line="276" w:lineRule="auto"/>
+        <w:jc w:val="both"/>
+      </w:pPr>
+      <w:r>
+        <w:t>Esté método solo se podrá usar en pacientes que aun no fueron asignados, si se intenta usar en pacientes que ya fueron asignados, esté método lanzara excepción.</w:t>
+      </w:r>
+    </w:p>
+    <w:p>
+      <w:pPr>
+        <w:spacing w:line="276" w:lineRule="auto"/>
+        <w:jc w:val="both"/>
+      </w:pPr>
+      <w:r>
+        <w:t>Para asignar nuevamente a pacientes que ya fueron asignados está el método referente al proceso de traslado de pacientes.</w:t>
+      </w:r>
+    </w:p>
+    <w:p>
+      <w:pPr>
+        <w:spacing w:line="276" w:lineRule="auto"/>
+        <w:jc w:val="both"/>
+      </w:pPr>
+    </w:p>
+    <w:p>
+      <w:pPr>
+        <w:spacing w:line="276" w:lineRule="auto"/>
+        <w:jc w:val="both"/>
+      </w:pPr>
+    </w:p>
+    <w:p>
+      <w:pPr>
+        <w:spacing w:line="276" w:lineRule="auto"/>
+        <w:jc w:val="both"/>
+      </w:pPr>
+    </w:p>
+    <w:p>
+      <w:pPr>
+        <w:spacing w:line="276" w:lineRule="auto"/>
+        <w:jc w:val="both"/>
+      </w:pPr>
+    </w:p>
+    <w:p>
+      <w:pPr>
+        <w:spacing w:line="276" w:lineRule="auto"/>
+        <w:jc w:val="both"/>
+      </w:pPr>
+    </w:p>
+    <w:p>
+      <w:pPr>
+        <w:spacing w:line="276" w:lineRule="auto"/>
+        <w:jc w:val="both"/>
+      </w:pPr>
+    </w:p>
+    <w:p>
+      <w:pPr>
+        <w:spacing w:line="276" w:lineRule="auto"/>
+        <w:jc w:val="both"/>
+      </w:pPr>
+    </w:p>
+    <w:p>
+      <w:pPr>
+        <w:spacing w:line="276" w:lineRule="auto"/>
+        <w:jc w:val="both"/>
+      </w:pPr>
+    </w:p>
+    <w:p>
+      <w:pPr>
+        <w:spacing w:line="276" w:lineRule="auto"/>
+        <w:jc w:val="both"/>
+      </w:pPr>
+    </w:p>
+    <w:p>
+      <w:pPr>
+        <w:spacing w:line="276" w:lineRule="auto"/>
+        <w:jc w:val="both"/>
+      </w:pPr>
+    </w:p>
+    <w:p>
+      <w:pPr>
+        <w:spacing w:line="276" w:lineRule="auto"/>
+        <w:jc w:val="both"/>
+      </w:pPr>
+    </w:p>
+    <w:p>
+      <w:pPr>
+        <w:spacing w:line="276" w:lineRule="auto"/>
+        <w:jc w:val="both"/>
+      </w:pPr>
+    </w:p>
+    <w:p>
+      <w:pPr>
+        <w:spacing w:line="276" w:lineRule="auto"/>
+        <w:jc w:val="both"/>
+      </w:pPr>
+    </w:p>
+    <w:p>
+      <w:pPr>
+        <w:spacing w:line="276" w:lineRule="auto"/>
+        <w:jc w:val="both"/>
+      </w:pPr>
     </w:p>
     <w:p>
       <w:pPr>
@@ -5468,269 +5434,211 @@
         <w:t xml:space="preserve">a clase </w:t>
       </w:r>
       <w:r>
+        <w:t>“PersonalDeSalud”.</w:t>
+      </w:r>
+    </w:p>
+    <w:p>
+      <w:pPr>
+        <w:pStyle w:val="Ttulo5"/>
+      </w:pPr>
+      <w:r>
+        <w:t>¿Q</w:t>
+      </w:r>
+      <w:r>
+        <w:t>ué</w:t>
+      </w:r>
+      <w:r>
+        <w:t xml:space="preserve"> cambiar</w:t>
+      </w:r>
+      <w:r>
+        <w:t>á</w:t>
+      </w:r>
+      <w:r>
+        <w:t xml:space="preserve"> el método en el código del sistema?</w:t>
+      </w:r>
+    </w:p>
+    <w:p>
+      <w:pPr>
+        <w:spacing w:line="276" w:lineRule="auto"/>
+        <w:jc w:val="both"/>
+      </w:pPr>
+      <w:r>
+        <w:t>Un Paciente puede tener varios ingresos.</w:t>
+      </w:r>
+    </w:p>
+    <w:p>
+      <w:pPr>
+        <w:spacing w:line="276" w:lineRule="auto"/>
+        <w:jc w:val="both"/>
+      </w:pPr>
+      <w:r>
+        <w:t>E</w:t>
+      </w:r>
+      <w:r>
+        <w:t>ste</w:t>
+      </w:r>
+      <w:r>
+        <w:t xml:space="preserve"> método </w:t>
+      </w:r>
+      <w:r>
+        <w:t>podrá usar</w:t>
+      </w:r>
+      <w:r>
+        <w:t xml:space="preserve"> el método de </w:t>
+      </w:r>
+      <w:r>
         <w:t>“</w:t>
       </w:r>
-      <w:proofErr w:type="spellStart"/>
-      <w:r>
-        <w:t>PersonalDeSalud</w:t>
-      </w:r>
-      <w:proofErr w:type="spellEnd"/>
-      <w:r>
-        <w:t>”.</w:t>
-      </w:r>
-    </w:p>
-    <w:p>
-      <w:pPr>
-        <w:pStyle w:val="Ttulo5"/>
-      </w:pPr>
-      <w:r>
-        <w:t>¿Q</w:t>
-      </w:r>
-      <w:r>
-        <w:t>ué</w:t>
-      </w:r>
-      <w:r>
-        <w:t xml:space="preserve"> cambiar</w:t>
+      <w:r>
+        <w:t>generar Notas de Evolución</w:t>
+      </w:r>
+      <w:r>
+        <w:t xml:space="preserve">” de la </w:t>
+      </w:r>
+      <w:r>
+        <w:t>misma clase “PersonalDeSalud”</w:t>
+      </w:r>
+      <w:r>
+        <w:t xml:space="preserve">, para generar </w:t>
+      </w:r>
+      <w:r>
+        <w:t>un</w:t>
+      </w:r>
+      <w:r>
+        <w:t xml:space="preserve"> objeto “NotaDeEvolución” en el objeto “Ingreso” correspondiente al ingreso</w:t>
+      </w:r>
+      <w:r>
+        <w:t xml:space="preserve"> activo</w:t>
+      </w:r>
+      <w:r>
+        <w:t xml:space="preserve"> </w:t>
+      </w:r>
+      <w:r>
+        <w:t>del paciente especificado. Todo esto en base a si se le especifica por parámetro</w:t>
+      </w:r>
+      <w:r>
+        <w:t>,</w:t>
+      </w:r>
+      <w:r>
+        <w:t xml:space="preserve"> al método</w:t>
+      </w:r>
+      <w:r>
+        <w:t>,</w:t>
+      </w:r>
+      <w:r>
+        <w:t xml:space="preserve"> si el</w:t>
+      </w:r>
+      <w:r>
+        <w:t xml:space="preserve"> personal</w:t>
+      </w:r>
+      <w:r>
+        <w:t xml:space="preserve"> desea crear</w:t>
+      </w:r>
+      <w:r>
+        <w:t xml:space="preserve"> o no</w:t>
+      </w:r>
+      <w:r>
+        <w:t xml:space="preserve"> una nueva nota de evolución para el Paciente.</w:t>
+      </w:r>
+    </w:p>
+    <w:p>
+      <w:pPr>
+        <w:spacing w:line="276" w:lineRule="auto"/>
+        <w:jc w:val="both"/>
+      </w:pPr>
+      <w:r>
+        <w:t>Este</w:t>
+      </w:r>
+      <w:r>
+        <w:t xml:space="preserve"> método solo se podrá usar en pacientes c</w:t>
+      </w:r>
+      <w:r>
+        <w:t>on su último ingreso activo</w:t>
+      </w:r>
+      <w:r>
+        <w:t>.</w:t>
+      </w:r>
+      <w:r>
+        <w:t xml:space="preserve"> </w:t>
+      </w:r>
+      <w:r>
+        <w:t>S</w:t>
+      </w:r>
+      <w:r>
+        <w:t>i se intenta usar en objeto</w:t>
+      </w:r>
+      <w:r>
+        <w:t>s</w:t>
+      </w:r>
+      <w:r>
+        <w:t xml:space="preserve"> “Paciente” que no tienen un ingreso activo, el método deberá lanzar excepción.</w:t>
+      </w:r>
+    </w:p>
+    <w:p>
+      <w:pPr>
+        <w:spacing w:line="276" w:lineRule="auto"/>
+        <w:jc w:val="both"/>
+      </w:pPr>
+      <w:r>
+        <w:t>El método comprobará el estado del paciente y actualizará los atributos relacionados a sus tratamientos.</w:t>
+      </w:r>
+    </w:p>
+    <w:p>
+      <w:pPr>
+        <w:spacing w:line="276" w:lineRule="auto"/>
+        <w:jc w:val="both"/>
+      </w:pPr>
+      <w:r>
+        <w:t>Guardaremos la información de las rondas médicas realizadas mediante la instanciación de objetos de una clase llamada “RondaMedicaDiaria”.</w:t>
+      </w:r>
+      <w:r>
+        <w:t xml:space="preserve"> </w:t>
+      </w:r>
+      <w:r>
+        <w:t>E</w:t>
+      </w:r>
+      <w:r>
+        <w:t xml:space="preserve">l método </w:t>
+      </w:r>
+      <w:r>
+        <w:t xml:space="preserve">“rondaMedicaDiaria()” </w:t>
+      </w:r>
+      <w:r>
+        <w:t xml:space="preserve">deberá generar un objeto de la clase “RondaMedicaDiaria” para guardar constancia de si una ronda se </w:t>
+      </w:r>
+      <w:r>
+        <w:t>realizó</w:t>
+      </w:r>
+      <w:r>
+        <w:t xml:space="preserve"> o no</w:t>
+      </w:r>
+      <w:r>
+        <w:t xml:space="preserve"> en cierto día, con cierto paciente</w:t>
+      </w:r>
+      <w:r>
+        <w:t>.</w:t>
+      </w:r>
+    </w:p>
+    <w:bookmarkEnd w:id="31"/>
+    <w:p>
+      <w:pPr>
+        <w:spacing w:line="276" w:lineRule="auto"/>
+        <w:jc w:val="both"/>
+      </w:pPr>
+      <w:r>
+        <w:t>A parte, el método marcar</w:t>
       </w:r>
       <w:r>
         <w:t>á</w:t>
       </w:r>
       <w:r>
-        <w:t xml:space="preserve"> el método en el código del sistema?</w:t>
-      </w:r>
-    </w:p>
-    <w:p>
-      <w:pPr>
-        <w:spacing w:line="276" w:lineRule="auto"/>
-        <w:jc w:val="both"/>
-      </w:pPr>
-      <w:r>
-        <w:t>Un Paciente tiene un expediente, y dentro de su expediente puede tener varios ingresos.</w:t>
-      </w:r>
-    </w:p>
-    <w:p>
-      <w:pPr>
-        <w:spacing w:line="276" w:lineRule="auto"/>
-        <w:jc w:val="both"/>
-      </w:pPr>
-      <w:r>
-        <w:t>E</w:t>
-      </w:r>
-      <w:r>
-        <w:t>ste</w:t>
-      </w:r>
-      <w:r>
-        <w:t xml:space="preserve"> método </w:t>
-      </w:r>
-      <w:r>
-        <w:t>podrá usar</w:t>
-      </w:r>
-      <w:r>
-        <w:t xml:space="preserve"> el método de </w:t>
-      </w:r>
-      <w:r>
-        <w:t>“</w:t>
-      </w:r>
-      <w:r>
-        <w:t>generar Notas de Evolución</w:t>
-      </w:r>
-      <w:r>
-        <w:t xml:space="preserve">” de la </w:t>
-      </w:r>
-      <w:r>
-        <w:t>misma clase “</w:t>
-      </w:r>
-      <w:proofErr w:type="spellStart"/>
-      <w:r>
-        <w:t>PersonalDeSalud</w:t>
-      </w:r>
-      <w:proofErr w:type="spellEnd"/>
-      <w:r>
-        <w:t>”</w:t>
-      </w:r>
-      <w:r>
-        <w:t xml:space="preserve">, para generar </w:t>
-      </w:r>
-      <w:r>
-        <w:t>un</w:t>
-      </w:r>
-      <w:r>
-        <w:t xml:space="preserve"> objeto “</w:t>
-      </w:r>
-      <w:proofErr w:type="spellStart"/>
-      <w:r>
-        <w:t>NotaDeEvolución</w:t>
-      </w:r>
-      <w:proofErr w:type="spellEnd"/>
-      <w:r>
-        <w:t>” en el objeto “Ingreso” correspondiente al ingreso</w:t>
-      </w:r>
-      <w:r>
-        <w:t xml:space="preserve"> activo</w:t>
-      </w:r>
-      <w:r>
-        <w:t xml:space="preserve"> del expediente del paciente especificado. Todo esto en base a si se le especifica por parámetro</w:t>
-      </w:r>
-      <w:r>
-        <w:t>,</w:t>
-      </w:r>
-      <w:r>
-        <w:t xml:space="preserve"> al método</w:t>
-      </w:r>
-      <w:r>
-        <w:t>,</w:t>
-      </w:r>
-      <w:r>
-        <w:t xml:space="preserve"> si el</w:t>
-      </w:r>
-      <w:r>
-        <w:t xml:space="preserve"> personal</w:t>
-      </w:r>
-      <w:r>
-        <w:t xml:space="preserve"> desea crear</w:t>
-      </w:r>
-      <w:r>
-        <w:t xml:space="preserve"> o no</w:t>
-      </w:r>
-      <w:r>
-        <w:t xml:space="preserve"> una nueva nota de evolución para el Paciente.</w:t>
-      </w:r>
-    </w:p>
-    <w:p>
-      <w:pPr>
-        <w:spacing w:line="276" w:lineRule="auto"/>
-        <w:jc w:val="both"/>
-      </w:pPr>
-      <w:r>
-        <w:t>Este</w:t>
-      </w:r>
-      <w:r>
-        <w:t xml:space="preserve"> método solo se podrá usar en pacientes c</w:t>
-      </w:r>
-      <w:r>
-        <w:t>on su último ingreso activo</w:t>
-      </w:r>
-      <w:r>
-        <w:t>.</w:t>
-      </w:r>
-      <w:r>
         <w:t xml:space="preserve"> </w:t>
       </w:r>
       <w:r>
-        <w:t>S</w:t>
-      </w:r>
-      <w:r>
-        <w:t>i se intenta usar en objeto</w:t>
-      </w:r>
-      <w:r>
-        <w:t>s</w:t>
-      </w:r>
-      <w:r>
-        <w:t xml:space="preserve"> “Paciente” que no tienen un ingreso activo, el método deberá lanzar excepción.</w:t>
-      </w:r>
-    </w:p>
-    <w:p>
-      <w:pPr>
-        <w:spacing w:line="276" w:lineRule="auto"/>
-        <w:jc w:val="both"/>
-      </w:pPr>
-      <w:r>
-        <w:t>El método comprobará el estado del paciente y actualizará los atributos relacionados a sus tratamientos.</w:t>
-      </w:r>
-    </w:p>
-    <w:p>
-      <w:pPr>
-        <w:spacing w:line="276" w:lineRule="auto"/>
-        <w:jc w:val="both"/>
-      </w:pPr>
-      <w:r>
-        <w:t>Guardaremos la información de las rondas médicas realizadas mediante la instanciación de objetos de una clase llamada “</w:t>
-      </w:r>
-      <w:proofErr w:type="spellStart"/>
-      <w:r>
-        <w:t>RondaMedicaDiaria</w:t>
-      </w:r>
-      <w:proofErr w:type="spellEnd"/>
-      <w:r>
-        <w:t>”.</w:t>
-      </w:r>
-      <w:r>
-        <w:t xml:space="preserve"> </w:t>
-      </w:r>
-      <w:r>
-        <w:t>E</w:t>
-      </w:r>
-      <w:r>
-        <w:t xml:space="preserve">l método </w:t>
-      </w:r>
-      <w:r>
-        <w:t>“</w:t>
-      </w:r>
-      <w:proofErr w:type="spellStart"/>
-      <w:proofErr w:type="gramStart"/>
-      <w:r>
-        <w:t>rondaMedicaDiaria</w:t>
-      </w:r>
-      <w:proofErr w:type="spellEnd"/>
-      <w:r>
-        <w:t>(</w:t>
-      </w:r>
-      <w:proofErr w:type="gramEnd"/>
-      <w:r>
-        <w:t xml:space="preserve">)” </w:t>
-      </w:r>
-      <w:r>
-        <w:t>deberá generar un objeto de la clase “</w:t>
-      </w:r>
-      <w:proofErr w:type="spellStart"/>
-      <w:r>
-        <w:t>RondaMedicaDiaria</w:t>
-      </w:r>
-      <w:proofErr w:type="spellEnd"/>
-      <w:r>
-        <w:t xml:space="preserve">” para guardar constancia de si una ronda se </w:t>
-      </w:r>
-      <w:r>
-        <w:t>realizó</w:t>
-      </w:r>
-      <w:r>
-        <w:t xml:space="preserve"> o no</w:t>
-      </w:r>
-      <w:r>
-        <w:t xml:space="preserve"> en cierto día, con cierto paciente</w:t>
-      </w:r>
-      <w:r>
-        <w:t>.</w:t>
-      </w:r>
-    </w:p>
-    <w:bookmarkEnd w:id="31"/>
-    <w:p>
-      <w:pPr>
-        <w:spacing w:line="276" w:lineRule="auto"/>
-        <w:jc w:val="both"/>
-      </w:pPr>
-      <w:r>
-        <w:t>A parte, el método marcar</w:t>
-      </w:r>
-      <w:r>
-        <w:t>á</w:t>
-      </w:r>
-      <w:r>
-        <w:t xml:space="preserve"> </w:t>
-      </w:r>
-      <w:r>
         <w:t xml:space="preserve">en </w:t>
       </w:r>
       <w:r>
-        <w:t>el objeto “</w:t>
-      </w:r>
-      <w:proofErr w:type="spellStart"/>
-      <w:r>
-        <w:t>RondaMedicaDiaria</w:t>
-      </w:r>
-      <w:proofErr w:type="spellEnd"/>
-      <w:r>
-        <w:t xml:space="preserve">” de cada </w:t>
+        <w:t xml:space="preserve">el objeto “RondaMedicaDiaria” de cada </w:t>
       </w:r>
       <w:r>
         <w:t>día, si el paciente ya está listo para la evaluación final.</w:t>
@@ -6060,15 +5968,7 @@
         <w:jc w:val="both"/>
       </w:pPr>
       <w:r>
-        <w:t>Implementaremos este método en la clase “</w:t>
-      </w:r>
-      <w:proofErr w:type="spellStart"/>
-      <w:r>
-        <w:t>PersonalDeSalud</w:t>
-      </w:r>
-      <w:proofErr w:type="spellEnd"/>
-      <w:r>
-        <w:t>”</w:t>
+        <w:t>Implementaremos este método en la clase “PersonalDeSalud”</w:t>
       </w:r>
       <w:r>
         <w:t>.</w:t>
@@ -6093,7 +5993,7 @@
         <w:jc w:val="both"/>
       </w:pPr>
       <w:r>
-        <w:t>Un Paciente tiene un expediente, y dentro de su expediente puede tener varios ingresos.</w:t>
+        <w:t>Un Paciente puede tener varios ingresos.</w:t>
       </w:r>
     </w:p>
     <w:p>
@@ -6116,30 +6016,28 @@
         <w:t>á</w:t>
       </w:r>
       <w:r>
-        <w:t xml:space="preserve"> nuevas instancias de la clase “</w:t>
-      </w:r>
-      <w:proofErr w:type="spellStart"/>
-      <w:r>
-        <w:t>NotaDeEv</w:t>
+        <w:t xml:space="preserve"> nuevas instancias de la clase “NotaDeEv</w:t>
       </w:r>
       <w:r>
         <w:t>o</w:t>
       </w:r>
       <w:r>
-        <w:t>lucion</w:t>
-      </w:r>
-      <w:proofErr w:type="spellEnd"/>
-      <w:r>
-        <w:t xml:space="preserve">” en </w:t>
+        <w:t xml:space="preserve">lucion” en </w:t>
       </w:r>
       <w:r>
         <w:t>el objeto “Ingreso” correspondiente a</w:t>
       </w:r>
       <w:r>
-        <w:t>l último ingreso</w:t>
-      </w:r>
-      <w:r>
-        <w:t>, del expediente del paciente especificado</w:t>
+        <w:t xml:space="preserve">l </w:t>
+      </w:r>
+      <w:r>
+        <w:t>ingreso</w:t>
+      </w:r>
+      <w:r>
+        <w:t xml:space="preserve"> activo del</w:t>
+      </w:r>
+      <w:r>
+        <w:t xml:space="preserve"> paciente especificado</w:t>
       </w:r>
       <w:r>
         <w:t>.</w:t>
@@ -6170,28 +6068,7 @@
         <w:t>Este</w:t>
       </w:r>
       <w:r>
-        <w:t xml:space="preserve"> método, también podrá ser llamado desde el método “</w:t>
-      </w:r>
-      <w:proofErr w:type="spellStart"/>
-      <w:proofErr w:type="gramStart"/>
-      <w:r>
-        <w:t>rondaMedicaDiaria</w:t>
-      </w:r>
-      <w:proofErr w:type="spellEnd"/>
-      <w:r>
-        <w:t>(</w:t>
-      </w:r>
-      <w:proofErr w:type="gramEnd"/>
-      <w:r>
-        <w:t>)” de la clase “</w:t>
-      </w:r>
-      <w:proofErr w:type="spellStart"/>
-      <w:r>
-        <w:t>PersonalDeSalud</w:t>
-      </w:r>
-      <w:proofErr w:type="spellEnd"/>
-      <w:r>
-        <w:t>”.</w:t>
+        <w:t xml:space="preserve"> método, también podrá ser llamado desde el método “rondaMedicaDiaria()” de la clase “PersonalDeSalud”.</w:t>
       </w:r>
     </w:p>
     <w:p/>
@@ -6461,7 +6338,10 @@
         <w:t xml:space="preserve"> que </w:t>
       </w:r>
       <w:r>
-        <w:t xml:space="preserve">alguna </w:t>
+        <w:t>la última</w:t>
+      </w:r>
+      <w:r>
+        <w:t xml:space="preserve"> </w:t>
       </w:r>
       <w:r>
         <w:t>“ronda médica diaria” del paciente especificado marque que está listo para la evaluación final.</w:t>
@@ -6568,7 +6448,7 @@
         <w:jc w:val="both"/>
       </w:pPr>
       <w:r>
-        <w:t>Un Paciente tiene un objeto “Expediente”, y dentro de su expediente puede tener varios objetos “Ingreso”.</w:t>
+        <w:t>Un Paciente puede tener varios objetos “Ingreso”.</w:t>
       </w:r>
     </w:p>
     <w:p>
@@ -6990,15 +6870,7 @@
         <w:t>este</w:t>
       </w:r>
       <w:r>
-        <w:t xml:space="preserve"> método en la clase “</w:t>
-      </w:r>
-      <w:proofErr w:type="spellStart"/>
-      <w:r>
-        <w:t>PersonalAdministrativo</w:t>
-      </w:r>
-      <w:proofErr w:type="spellEnd"/>
-      <w:r>
-        <w:t>”.</w:t>
+        <w:t xml:space="preserve"> método en la clase “PersonalAdministrativo”.</w:t>
       </w:r>
     </w:p>
     <w:p>
@@ -7021,7 +6893,7 @@
       </w:pPr>
       <w:bookmarkStart w:id="37" w:name="_Hlk225635875"/>
       <w:r>
-        <w:t>Un Paciente tiene un objeto “Expediente”, y dentro de su expediente puede tener varios objetos “Ingreso”, cada ingreso puede tener un único objeto “Alta”.</w:t>
+        <w:t>Un Paciente puede tener varios objetos “Ingreso”, cada ingreso puede tener un único objeto “Alta”.</w:t>
       </w:r>
     </w:p>
     <w:p>
@@ -7310,9 +7182,52 @@
     </w:p>
     <w:p>
       <w:pPr>
+        <w:spacing w:line="276" w:lineRule="auto"/>
+        <w:jc w:val="both"/>
+      </w:pPr>
+    </w:p>
+    <w:p>
+      <w:pPr>
+        <w:spacing w:line="276" w:lineRule="auto"/>
+        <w:jc w:val="both"/>
+      </w:pPr>
+    </w:p>
+    <w:p>
+      <w:pPr>
+        <w:spacing w:line="276" w:lineRule="auto"/>
+        <w:jc w:val="both"/>
+      </w:pPr>
+    </w:p>
+    <w:p>
+      <w:pPr>
+        <w:spacing w:line="276" w:lineRule="auto"/>
+        <w:jc w:val="both"/>
+      </w:pPr>
+    </w:p>
+    <w:p>
+      <w:pPr>
+        <w:spacing w:line="276" w:lineRule="auto"/>
+        <w:jc w:val="both"/>
+      </w:pPr>
+    </w:p>
+    <w:p>
+      <w:pPr>
+        <w:spacing w:line="276" w:lineRule="auto"/>
+        <w:jc w:val="both"/>
+      </w:pPr>
+    </w:p>
+    <w:p>
+      <w:pPr>
+        <w:spacing w:line="276" w:lineRule="auto"/>
+        <w:jc w:val="both"/>
+      </w:pPr>
+    </w:p>
+    <w:p>
+      <w:pPr>
         <w:pStyle w:val="Ttulo5"/>
       </w:pPr>
       <w:r>
+        <w:lastRenderedPageBreak/>
         <w:t>¿Qué cambiar</w:t>
       </w:r>
       <w:r>
@@ -7429,6 +7344,119 @@
       <w:r>
         <w:t xml:space="preserve">. </w:t>
       </w:r>
+    </w:p>
+    <w:p>
+      <w:pPr>
+        <w:jc w:val="both"/>
+      </w:pPr>
+      <w:r>
+        <w:t>Solo se podrá hacer el proceso de traslado en pacientes que ya fueron asignados en primer lugar.</w:t>
+      </w:r>
+    </w:p>
+    <w:p>
+      <w:pPr>
+        <w:jc w:val="both"/>
+      </w:pPr>
+    </w:p>
+    <w:p>
+      <w:pPr>
+        <w:jc w:val="both"/>
+      </w:pPr>
+    </w:p>
+    <w:p>
+      <w:pPr>
+        <w:jc w:val="both"/>
+      </w:pPr>
+    </w:p>
+    <w:p>
+      <w:pPr>
+        <w:jc w:val="both"/>
+      </w:pPr>
+    </w:p>
+    <w:p>
+      <w:pPr>
+        <w:jc w:val="both"/>
+      </w:pPr>
+    </w:p>
+    <w:p>
+      <w:pPr>
+        <w:jc w:val="both"/>
+      </w:pPr>
+    </w:p>
+    <w:p>
+      <w:pPr>
+        <w:jc w:val="both"/>
+      </w:pPr>
+    </w:p>
+    <w:p>
+      <w:pPr>
+        <w:jc w:val="both"/>
+      </w:pPr>
+    </w:p>
+    <w:p>
+      <w:pPr>
+        <w:jc w:val="both"/>
+      </w:pPr>
+    </w:p>
+    <w:p>
+      <w:pPr>
+        <w:jc w:val="both"/>
+      </w:pPr>
+    </w:p>
+    <w:p>
+      <w:pPr>
+        <w:jc w:val="both"/>
+      </w:pPr>
+    </w:p>
+    <w:p>
+      <w:pPr>
+        <w:jc w:val="both"/>
+      </w:pPr>
+    </w:p>
+    <w:p>
+      <w:pPr>
+        <w:jc w:val="both"/>
+      </w:pPr>
+    </w:p>
+    <w:p>
+      <w:pPr>
+        <w:jc w:val="both"/>
+      </w:pPr>
+    </w:p>
+    <w:p>
+      <w:pPr>
+        <w:jc w:val="both"/>
+      </w:pPr>
+    </w:p>
+    <w:p>
+      <w:pPr>
+        <w:jc w:val="both"/>
+      </w:pPr>
+    </w:p>
+    <w:p>
+      <w:pPr>
+        <w:jc w:val="both"/>
+      </w:pPr>
+    </w:p>
+    <w:p>
+      <w:pPr>
+        <w:jc w:val="both"/>
+      </w:pPr>
+    </w:p>
+    <w:p>
+      <w:pPr>
+        <w:jc w:val="both"/>
+      </w:pPr>
+    </w:p>
+    <w:p>
+      <w:pPr>
+        <w:jc w:val="both"/>
+      </w:pPr>
+    </w:p>
+    <w:p>
+      <w:pPr>
+        <w:jc w:val="both"/>
+      </w:pPr>
     </w:p>
     <w:p>
       <w:pPr>
@@ -7507,23 +7535,7 @@
         <w:t xml:space="preserve">as clases </w:t>
       </w:r>
       <w:r>
-        <w:t>“</w:t>
-      </w:r>
-      <w:proofErr w:type="spellStart"/>
-      <w:r>
-        <w:t>PersonalAdministrativo</w:t>
-      </w:r>
-      <w:proofErr w:type="spellEnd"/>
-      <w:r>
-        <w:t>” y “</w:t>
-      </w:r>
-      <w:proofErr w:type="spellStart"/>
-      <w:r>
-        <w:t>PersonalDeEnfermeria</w:t>
-      </w:r>
-      <w:proofErr w:type="spellEnd"/>
-      <w:r>
-        <w:t>”</w:t>
+        <w:t>“PersonalAdministrativo” y “PersonalDeEnfermeria”</w:t>
       </w:r>
       <w:r>
         <w:t xml:space="preserve"> mediante una super clase común o mediante una interfaz, dependiendo de cuál sea más adecuada al momento de implementar está función.</w:t>
@@ -7835,6 +7847,15 @@
         <w:spacing w:line="276" w:lineRule="auto"/>
         <w:jc w:val="both"/>
       </w:pPr>
+      <w:r>
+        <w:t>Este método solo se podrá usar en pacientes que ya hayan sido asignados anteriormente, con el método referente al proceso de asignación de pacientes de está misma clase, el método deberá lanzar excepción si esto no se cumple.</w:t>
+      </w:r>
+    </w:p>
+    <w:p>
+      <w:pPr>
+        <w:spacing w:line="276" w:lineRule="auto"/>
+        <w:jc w:val="both"/>
+      </w:pPr>
     </w:p>
     <w:p>
       <w:pPr>
@@ -7864,6 +7885,22 @@
       </w:pPr>
       <w:r>
         <w:t>Sobre las Camas y su asignación:</w:t>
+      </w:r>
+    </w:p>
+    <w:p>
+      <w:pPr>
+        <w:pStyle w:val="Prrafodelista"/>
+        <w:numPr>
+          <w:ilvl w:val="0"/>
+          <w:numId w:val="19"/>
+        </w:numPr>
+        <w:spacing w:line="276" w:lineRule="auto"/>
+        <w:ind w:left="357" w:hanging="357"/>
+        <w:contextualSpacing w:val="0"/>
+        <w:jc w:val="both"/>
+      </w:pPr>
+      <w:r>
+        <w:t>El proceso de asignación solo deberá funcionar la primera vez que el paciente valla a ser vinculado con una unidad, habitación y cama, si se quiere reasignar al paciente se usara el proceso de traslado.</w:t>
       </w:r>
     </w:p>
     <w:p>
@@ -8108,9 +8145,25 @@
     </w:p>
     <w:p>
       <w:pPr>
+        <w:jc w:val="both"/>
+      </w:pPr>
+    </w:p>
+    <w:p>
+      <w:pPr>
+        <w:jc w:val="both"/>
+      </w:pPr>
+    </w:p>
+    <w:p>
+      <w:pPr>
+        <w:jc w:val="both"/>
+      </w:pPr>
+    </w:p>
+    <w:p>
+      <w:pPr>
         <w:pStyle w:val="Ttulo4"/>
       </w:pPr>
       <w:r>
+        <w:lastRenderedPageBreak/>
         <w:t>Sobre el Traslado:</w:t>
       </w:r>
     </w:p>
@@ -8185,15 +8238,7 @@
         <w:pStyle w:val="Ttulo4"/>
       </w:pPr>
       <w:r>
-        <w:t>Personal &lt;&lt;</w:t>
-      </w:r>
-      <w:proofErr w:type="spellStart"/>
-      <w:r>
-        <w:t>abstract</w:t>
-      </w:r>
-      <w:proofErr w:type="spellEnd"/>
-      <w:r>
-        <w:t>&gt;&gt;:</w:t>
+        <w:t>Personal &lt;&lt;abstract&gt;&gt;:</w:t>
       </w:r>
     </w:p>
     <w:p>
@@ -8302,13 +8347,10 @@
         <w:spacing w:line="276" w:lineRule="auto"/>
       </w:pPr>
       <w:r>
-        <w:t xml:space="preserve">Contiene un </w:t>
-      </w:r>
-      <w:r>
-        <w:t>Expediente</w:t>
-      </w:r>
-      <w:r>
-        <w:t xml:space="preserve"> Médico</w:t>
+        <w:t>Contiene un</w:t>
+      </w:r>
+      <w:r>
+        <w:t>a lista de Ingresos, a está lista la llamaremos “expediente”</w:t>
       </w:r>
     </w:p>
     <w:p>
@@ -8316,7 +8358,7 @@
         <w:pStyle w:val="Ttulo4"/>
       </w:pPr>
       <w:r>
-        <w:t>Expediente Médico:</w:t>
+        <w:t>Ingreso:</w:t>
       </w:r>
     </w:p>
     <w:p>
@@ -8328,21 +8370,10 @@
         </w:numPr>
       </w:pPr>
       <w:r>
-        <w:t xml:space="preserve">Lista </w:t>
-      </w:r>
-      <w:r>
-        <w:t>d</w:t>
-      </w:r>
-      <w:r>
-        <w:t>e Ingresos del Paciente</w:t>
-      </w:r>
-    </w:p>
-    <w:p>
-      <w:pPr>
-        <w:pStyle w:val="Ttulo4"/>
-      </w:pPr>
-      <w:r>
-        <w:t>Ingreso:</w:t>
+        <w:t>Activo</w:t>
+      </w:r>
+      <w:r>
+        <w:t xml:space="preserve"> (Si el ingreso se encuentra activo o inactivo)</w:t>
       </w:r>
     </w:p>
     <w:p>
@@ -8354,10 +8385,7 @@
         </w:numPr>
       </w:pPr>
       <w:r>
-        <w:t>Activo</w:t>
-      </w:r>
-      <w:r>
-        <w:t xml:space="preserve"> (Si el ingreso se encuentra activo o inactivo)</w:t>
+        <w:t>Especialidad Médica Requerida</w:t>
       </w:r>
     </w:p>
     <w:p>
@@ -8369,7 +8397,13 @@
         </w:numPr>
       </w:pPr>
       <w:r>
-        <w:t>Especialidad Médica Requerida</w:t>
+        <w:t xml:space="preserve">Gravedad </w:t>
+      </w:r>
+      <w:r>
+        <w:t>d</w:t>
+      </w:r>
+      <w:r>
+        <w:t>el Paciente</w:t>
       </w:r>
     </w:p>
     <w:p>
@@ -8381,13 +8415,7 @@
         </w:numPr>
       </w:pPr>
       <w:r>
-        <w:t xml:space="preserve">Gravedad </w:t>
-      </w:r>
-      <w:r>
-        <w:t>d</w:t>
-      </w:r>
-      <w:r>
-        <w:t>el Paciente</w:t>
+        <w:t>Unidad Asignada</w:t>
       </w:r>
     </w:p>
     <w:p>
@@ -8399,7 +8427,7 @@
         </w:numPr>
       </w:pPr>
       <w:r>
-        <w:t>Unidad Asignada</w:t>
+        <w:t>Habitación Asignada</w:t>
       </w:r>
     </w:p>
     <w:p>
@@ -8491,14 +8519,11 @@
         <w:t>.</w:t>
       </w:r>
     </w:p>
-    <w:p/>
-    <w:p/>
     <w:p>
       <w:pPr>
         <w:pStyle w:val="Ttulo4"/>
       </w:pPr>
       <w:r>
-        <w:lastRenderedPageBreak/>
         <w:t>Alta:</w:t>
       </w:r>
     </w:p>
@@ -8569,6 +8594,7 @@
         <w:pStyle w:val="Ttulo4"/>
       </w:pPr>
       <w:r>
+        <w:lastRenderedPageBreak/>
         <w:t>Traslado:</w:t>
       </w:r>
     </w:p>
@@ -8803,6 +8829,31 @@
     </w:p>
     <w:p>
       <w:pPr>
+        <w:spacing w:line="276" w:lineRule="auto"/>
+      </w:pPr>
+    </w:p>
+    <w:p>
+      <w:pPr>
+        <w:spacing w:line="276" w:lineRule="auto"/>
+      </w:pPr>
+    </w:p>
+    <w:p>
+      <w:pPr>
+        <w:spacing w:line="276" w:lineRule="auto"/>
+      </w:pPr>
+    </w:p>
+    <w:p>
+      <w:pPr>
+        <w:spacing w:line="276" w:lineRule="auto"/>
+      </w:pPr>
+    </w:p>
+    <w:p>
+      <w:pPr>
+        <w:spacing w:line="276" w:lineRule="auto"/>
+      </w:pPr>
+    </w:p>
+    <w:p>
+      <w:pPr>
         <w:pStyle w:val="Ttulo2"/>
       </w:pPr>
       <w:bookmarkStart w:id="43" w:name="_Toc225990380"/>
@@ -8830,15 +8881,27 @@
         <w:pStyle w:val="Ttulo4"/>
       </w:pPr>
       <w:r>
-        <w:t>Personal de Salud &lt;&lt;</w:t>
-      </w:r>
-      <w:proofErr w:type="spellStart"/>
-      <w:r>
-        <w:t>asbtract</w:t>
-      </w:r>
-      <w:proofErr w:type="spellEnd"/>
-      <w:r>
-        <w:t>&gt;&gt;:</w:t>
+        <w:t>Personal de Salud &lt;&lt;asbtract&gt;&gt;:</w:t>
+      </w:r>
+    </w:p>
+    <w:p>
+      <w:pPr>
+        <w:pStyle w:val="Prrafodelista"/>
+        <w:numPr>
+          <w:ilvl w:val="0"/>
+          <w:numId w:val="21"/>
+        </w:numPr>
+        <w:jc w:val="both"/>
+      </w:pPr>
+      <w:r>
+        <w:rPr>
+          <w:b/>
+          <w:bCs/>
+        </w:rPr>
+        <w:t>generarNotaEvolucionPaciente():</w:t>
+      </w:r>
+      <w:r>
+        <w:t xml:space="preserve"> Método que sirve para generar un nuevo objeto “NotaDeEvolucion” en el objeto “Ingreso” correspondiente al ingreso activo de un paciente en específico.</w:t>
       </w:r>
     </w:p>
     <w:p>
@@ -8852,79 +8915,15 @@
         <w:contextualSpacing w:val="0"/>
         <w:jc w:val="both"/>
       </w:pPr>
-      <w:proofErr w:type="spellStart"/>
-      <w:proofErr w:type="gramStart"/>
       <w:r>
         <w:rPr>
           <w:b/>
           <w:bCs/>
         </w:rPr>
-        <w:t>rondaMedicaDiariaPaciente</w:t>
-      </w:r>
-      <w:proofErr w:type="spellEnd"/>
-      <w:r>
-        <w:rPr>
-          <w:b/>
-          <w:bCs/>
-        </w:rPr>
-        <w:t>(</w:t>
-      </w:r>
-      <w:proofErr w:type="gramEnd"/>
-      <w:r>
-        <w:rPr>
-          <w:b/>
-          <w:bCs/>
-        </w:rPr>
-        <w:t>):</w:t>
+        <w:t>rondaMedicaDiariaPaciente():</w:t>
       </w:r>
       <w:r>
         <w:t xml:space="preserve"> Método que sirve para hacer una ronda médica diaria a un paciente en específico.</w:t>
-      </w:r>
-    </w:p>
-    <w:p>
-      <w:pPr>
-        <w:pStyle w:val="Prrafodelista"/>
-        <w:numPr>
-          <w:ilvl w:val="0"/>
-          <w:numId w:val="21"/>
-        </w:numPr>
-        <w:jc w:val="both"/>
-      </w:pPr>
-      <w:proofErr w:type="spellStart"/>
-      <w:proofErr w:type="gramStart"/>
-      <w:r>
-        <w:rPr>
-          <w:b/>
-          <w:bCs/>
-        </w:rPr>
-        <w:t>generarNotaEvolucionPaciente</w:t>
-      </w:r>
-      <w:proofErr w:type="spellEnd"/>
-      <w:r>
-        <w:rPr>
-          <w:b/>
-          <w:bCs/>
-        </w:rPr>
-        <w:t>(</w:t>
-      </w:r>
-      <w:proofErr w:type="gramEnd"/>
-      <w:r>
-        <w:rPr>
-          <w:b/>
-          <w:bCs/>
-        </w:rPr>
-        <w:t>):</w:t>
-      </w:r>
-      <w:r>
-        <w:t xml:space="preserve"> Método que sirve para generar un nuevo objeto “</w:t>
-      </w:r>
-      <w:proofErr w:type="spellStart"/>
-      <w:r>
-        <w:t>NotaDeEvolucion</w:t>
-      </w:r>
-      <w:proofErr w:type="spellEnd"/>
-      <w:r>
-        <w:t>” en el objeto “Ingreso” correspondiente al ingreso activo de un paciente en específico.</w:t>
       </w:r>
     </w:p>
     <w:p>
@@ -8949,30 +8948,12 @@
         <w:contextualSpacing w:val="0"/>
         <w:jc w:val="both"/>
       </w:pPr>
-      <w:proofErr w:type="spellStart"/>
-      <w:proofErr w:type="gramStart"/>
       <w:r>
         <w:rPr>
           <w:b/>
           <w:bCs/>
         </w:rPr>
-        <w:t>asignarCamaPaciente</w:t>
-      </w:r>
-      <w:proofErr w:type="spellEnd"/>
-      <w:r>
-        <w:rPr>
-          <w:b/>
-          <w:bCs/>
-        </w:rPr>
-        <w:t>(</w:t>
-      </w:r>
-      <w:proofErr w:type="gramEnd"/>
-      <w:r>
-        <w:rPr>
-          <w:b/>
-          <w:bCs/>
-        </w:rPr>
-        <w:t>):</w:t>
+        <w:t>asignarCamaPaciente():</w:t>
       </w:r>
       <w:r>
         <w:t xml:space="preserve"> Método que sirve para vincular un Paciente a una cama y la unidad de esa cama.</w:t>
@@ -8987,30 +8968,12 @@
         </w:numPr>
         <w:jc w:val="both"/>
       </w:pPr>
-      <w:proofErr w:type="spellStart"/>
-      <w:proofErr w:type="gramStart"/>
       <w:r>
         <w:rPr>
           <w:b/>
           <w:bCs/>
         </w:rPr>
-        <w:t>trasladoPaciente</w:t>
-      </w:r>
-      <w:proofErr w:type="spellEnd"/>
-      <w:r>
-        <w:rPr>
-          <w:b/>
-          <w:bCs/>
-        </w:rPr>
-        <w:t>(</w:t>
-      </w:r>
-      <w:proofErr w:type="gramEnd"/>
-      <w:r>
-        <w:rPr>
-          <w:b/>
-          <w:bCs/>
-        </w:rPr>
-        <w:t>):</w:t>
+        <w:t>trasladoPaciente():</w:t>
       </w:r>
       <w:r>
         <w:t xml:space="preserve"> Método que sirve para trasladar a otro hospital o a otra unidad del nuestro hospital.</w:t>
@@ -9033,30 +8996,12 @@
         </w:numPr>
         <w:jc w:val="both"/>
       </w:pPr>
-      <w:proofErr w:type="spellStart"/>
-      <w:proofErr w:type="gramStart"/>
       <w:r>
         <w:rPr>
           <w:b/>
           <w:bCs/>
         </w:rPr>
-        <w:t>evaluacionFinalPaciente</w:t>
-      </w:r>
-      <w:proofErr w:type="spellEnd"/>
-      <w:r>
-        <w:rPr>
-          <w:b/>
-          <w:bCs/>
-        </w:rPr>
-        <w:t>(</w:t>
-      </w:r>
-      <w:proofErr w:type="gramEnd"/>
-      <w:r>
-        <w:rPr>
-          <w:b/>
-          <w:bCs/>
-        </w:rPr>
-        <w:t>):</w:t>
+        <w:t>evaluacionFinalPaciente():</w:t>
       </w:r>
       <w:r>
         <w:t xml:space="preserve"> Método que sirve para hacer la evaluación final a un paciente en específico después de una ronda médica diaria exitosa.</w:t>
@@ -9081,33 +9026,35 @@
         <w:contextualSpacing w:val="0"/>
         <w:jc w:val="both"/>
       </w:pPr>
-      <w:proofErr w:type="spellStart"/>
-      <w:proofErr w:type="gramStart"/>
       <w:r>
         <w:rPr>
           <w:b/>
           <w:bCs/>
         </w:rPr>
-        <w:t>asignarCamaPaciente</w:t>
-      </w:r>
-      <w:proofErr w:type="spellEnd"/>
+        <w:t>asigna</w:t>
+      </w:r>
       <w:r>
         <w:rPr>
           <w:b/>
           <w:bCs/>
         </w:rPr>
-        <w:t>(</w:t>
-      </w:r>
-      <w:proofErr w:type="gramEnd"/>
+        <w:t>cion</w:t>
+      </w:r>
       <w:r>
         <w:rPr>
           <w:b/>
           <w:bCs/>
         </w:rPr>
-        <w:t>):</w:t>
-      </w:r>
-      <w:r>
-        <w:t xml:space="preserve"> Método que sirve para vincular un Paciente a una cama y la unidad de esa cama.</w:t>
+        <w:t>Paciente():</w:t>
+      </w:r>
+      <w:r>
+        <w:t xml:space="preserve"> Método que sirve para vincular un Paciente a una</w:t>
+      </w:r>
+      <w:r>
+        <w:t xml:space="preserve"> unidad, habitación y cama de esa unidad</w:t>
+      </w:r>
+      <w:r>
+        <w:t>.</w:t>
       </w:r>
     </w:p>
     <w:p>
@@ -9121,30 +9068,12 @@
         <w:contextualSpacing w:val="0"/>
         <w:jc w:val="both"/>
       </w:pPr>
-      <w:proofErr w:type="spellStart"/>
-      <w:proofErr w:type="gramStart"/>
       <w:r>
         <w:rPr>
           <w:b/>
           <w:bCs/>
         </w:rPr>
-        <w:t>trasladoPaciente</w:t>
-      </w:r>
-      <w:proofErr w:type="spellEnd"/>
-      <w:r>
-        <w:rPr>
-          <w:b/>
-          <w:bCs/>
-        </w:rPr>
-        <w:t>(</w:t>
-      </w:r>
-      <w:proofErr w:type="gramEnd"/>
-      <w:r>
-        <w:rPr>
-          <w:b/>
-          <w:bCs/>
-        </w:rPr>
-        <w:t>):</w:t>
+        <w:t>trasladoPaciente():</w:t>
       </w:r>
       <w:r>
         <w:t xml:space="preserve"> Método que sirve para trasladar a otro hospital o a otra unidad del nuestro hospital.</w:t>
@@ -9159,30 +9088,12 @@
         </w:numPr>
         <w:jc w:val="both"/>
       </w:pPr>
-      <w:proofErr w:type="spellStart"/>
-      <w:proofErr w:type="gramStart"/>
       <w:r>
         <w:rPr>
           <w:b/>
           <w:bCs/>
         </w:rPr>
-        <w:t>documentacionAltaPaciente</w:t>
-      </w:r>
-      <w:proofErr w:type="spellEnd"/>
-      <w:r>
-        <w:rPr>
-          <w:b/>
-          <w:bCs/>
-        </w:rPr>
-        <w:t>(</w:t>
-      </w:r>
-      <w:proofErr w:type="gramEnd"/>
-      <w:r>
-        <w:rPr>
-          <w:b/>
-          <w:bCs/>
-        </w:rPr>
-        <w:t>):</w:t>
+        <w:t>documentacionAltaPaciente():</w:t>
       </w:r>
       <w:r>
         <w:t xml:space="preserve"> Método que rellena el atributo referente a la documentación del alta del ingreso de un paciente</w:t>
@@ -9239,20 +9150,7 @@
         <w:jc w:val="both"/>
       </w:pPr>
       <w:r>
-        <w:t>Podríamos crear una clase de utilidad llamada “Tiempo” o algo así, con un método llamado “</w:t>
-      </w:r>
-      <w:proofErr w:type="spellStart"/>
-      <w:proofErr w:type="gramStart"/>
-      <w:r>
-        <w:t>avanzarDia</w:t>
-      </w:r>
-      <w:proofErr w:type="spellEnd"/>
-      <w:r>
-        <w:t>(</w:t>
-      </w:r>
-      <w:proofErr w:type="gramEnd"/>
-      <w:r>
-        <w:t>)”</w:t>
+        <w:t>Podríamos crear una clase de utilidad llamada “Tiempo” o algo así, con un método llamado “avanzarDia()”</w:t>
       </w:r>
       <w:r>
         <w:t xml:space="preserve"> que simule el avance de un día a otro en el hospital</w:t>
@@ -9340,15 +9238,7 @@
         <w:jc w:val="both"/>
       </w:pPr>
       <w:r>
-        <w:t xml:space="preserve">“Personal de Salud” es un </w:t>
-      </w:r>
-      <w:proofErr w:type="spellStart"/>
-      <w:r>
-        <w:t>termino</w:t>
-      </w:r>
-      <w:proofErr w:type="spellEnd"/>
-      <w:r>
-        <w:t xml:space="preserve"> que se usa para referirse a todos los trabajadores orientados al cuidado sanitario del paciente.</w:t>
+        <w:t>“Personal de Salud” es un termino que se usa para referirse a todos los trabajadores orientados al cuidado sanitario del paciente.</w:t>
       </w:r>
     </w:p>
     <w:p>
@@ -9414,15 +9304,7 @@
       <w:bookmarkStart w:id="49" w:name="_Toc225990386"/>
       <w:r>
         <w:lastRenderedPageBreak/>
-        <w:t xml:space="preserve">¿Quién se encarga de la evaluación final de los </w:t>
-      </w:r>
-      <w:proofErr w:type="spellStart"/>
-      <w:r>
-        <w:t>paceintes</w:t>
-      </w:r>
-      <w:proofErr w:type="spellEnd"/>
-      <w:r>
-        <w:t>?</w:t>
+        <w:t>¿Quién se encarga de la evaluación final de los paceintes?</w:t>
       </w:r>
       <w:bookmarkEnd w:id="49"/>
     </w:p>

</xml_diff>

<commit_message>
Modifica diagrama de casos de uso
</commit_message>
<xml_diff>
--- a/documentacion/Análisis Del Enunciado 2/PROYECTO-RETO – Análisis _ Grupo2.docx
+++ b/documentacion/Análisis Del Enunciado 2/PROYECTO-RETO – Análisis _ Grupo2.docx
@@ -116,7 +116,29 @@
                                     <w:sz w:val="24"/>
                                     <w:szCs w:val="24"/>
                                   </w:rPr>
-                                  <w:t>Diana Rodriguez Pinillos</w:t>
+                                  <w:t xml:space="preserve">Diana </w:t>
+                                </w:r>
+                                <w:proofErr w:type="spellStart"/>
+                                <w:r>
+                                  <w:rPr>
+                                    <w:rFonts w:ascii="Calisto MT" w:hAnsi="Calisto MT"/>
+                                    <w:b/>
+                                    <w:bCs/>
+                                    <w:sz w:val="24"/>
+                                    <w:szCs w:val="24"/>
+                                  </w:rPr>
+                                  <w:t>Rodriguez</w:t>
+                                </w:r>
+                                <w:proofErr w:type="spellEnd"/>
+                                <w:r>
+                                  <w:rPr>
+                                    <w:rFonts w:ascii="Calisto MT" w:hAnsi="Calisto MT"/>
+                                    <w:b/>
+                                    <w:bCs/>
+                                    <w:sz w:val="24"/>
+                                    <w:szCs w:val="24"/>
+                                  </w:rPr>
+                                  <w:t xml:space="preserve"> Pinillos</w:t>
                                 </w:r>
                               </w:p>
                               <w:p>
@@ -138,8 +160,42 @@
                                     <w:sz w:val="24"/>
                                     <w:szCs w:val="24"/>
                                   </w:rPr>
-                                  <w:t>Alex Andrei Stoica</w:t>
+                                  <w:t xml:space="preserve">Alex </w:t>
                                 </w:r>
+                                <w:proofErr w:type="spellStart"/>
+                                <w:r>
+                                  <w:rPr>
+                                    <w:rFonts w:ascii="Calisto MT" w:hAnsi="Calisto MT"/>
+                                    <w:b/>
+                                    <w:bCs/>
+                                    <w:sz w:val="24"/>
+                                    <w:szCs w:val="24"/>
+                                  </w:rPr>
+                                  <w:t>Andrei</w:t>
+                                </w:r>
+                                <w:proofErr w:type="spellEnd"/>
+                                <w:r>
+                                  <w:rPr>
+                                    <w:rFonts w:ascii="Calisto MT" w:hAnsi="Calisto MT"/>
+                                    <w:b/>
+                                    <w:bCs/>
+                                    <w:sz w:val="24"/>
+                                    <w:szCs w:val="24"/>
+                                  </w:rPr>
+                                  <w:t xml:space="preserve"> </w:t>
+                                </w:r>
+                                <w:proofErr w:type="spellStart"/>
+                                <w:r>
+                                  <w:rPr>
+                                    <w:rFonts w:ascii="Calisto MT" w:hAnsi="Calisto MT"/>
+                                    <w:b/>
+                                    <w:bCs/>
+                                    <w:sz w:val="24"/>
+                                    <w:szCs w:val="24"/>
+                                  </w:rPr>
+                                  <w:t>Stoica</w:t>
+                                </w:r>
+                                <w:proofErr w:type="spellEnd"/>
                               </w:p>
                               <w:p>
                                 <w:pPr>
@@ -245,7 +301,29 @@
                               <w:sz w:val="24"/>
                               <w:szCs w:val="24"/>
                             </w:rPr>
-                            <w:t>Diana Rodriguez Pinillos</w:t>
+                            <w:t xml:space="preserve">Diana </w:t>
+                          </w:r>
+                          <w:proofErr w:type="spellStart"/>
+                          <w:r>
+                            <w:rPr>
+                              <w:rFonts w:ascii="Calisto MT" w:hAnsi="Calisto MT"/>
+                              <w:b/>
+                              <w:bCs/>
+                              <w:sz w:val="24"/>
+                              <w:szCs w:val="24"/>
+                            </w:rPr>
+                            <w:t>Rodriguez</w:t>
+                          </w:r>
+                          <w:proofErr w:type="spellEnd"/>
+                          <w:r>
+                            <w:rPr>
+                              <w:rFonts w:ascii="Calisto MT" w:hAnsi="Calisto MT"/>
+                              <w:b/>
+                              <w:bCs/>
+                              <w:sz w:val="24"/>
+                              <w:szCs w:val="24"/>
+                            </w:rPr>
+                            <w:t xml:space="preserve"> Pinillos</w:t>
                           </w:r>
                         </w:p>
                         <w:p>
@@ -267,8 +345,42 @@
                               <w:sz w:val="24"/>
                               <w:szCs w:val="24"/>
                             </w:rPr>
-                            <w:t>Alex Andrei Stoica</w:t>
+                            <w:t xml:space="preserve">Alex </w:t>
                           </w:r>
+                          <w:proofErr w:type="spellStart"/>
+                          <w:r>
+                            <w:rPr>
+                              <w:rFonts w:ascii="Calisto MT" w:hAnsi="Calisto MT"/>
+                              <w:b/>
+                              <w:bCs/>
+                              <w:sz w:val="24"/>
+                              <w:szCs w:val="24"/>
+                            </w:rPr>
+                            <w:t>Andrei</w:t>
+                          </w:r>
+                          <w:proofErr w:type="spellEnd"/>
+                          <w:r>
+                            <w:rPr>
+                              <w:rFonts w:ascii="Calisto MT" w:hAnsi="Calisto MT"/>
+                              <w:b/>
+                              <w:bCs/>
+                              <w:sz w:val="24"/>
+                              <w:szCs w:val="24"/>
+                            </w:rPr>
+                            <w:t xml:space="preserve"> </w:t>
+                          </w:r>
+                          <w:proofErr w:type="spellStart"/>
+                          <w:r>
+                            <w:rPr>
+                              <w:rFonts w:ascii="Calisto MT" w:hAnsi="Calisto MT"/>
+                              <w:b/>
+                              <w:bCs/>
+                              <w:sz w:val="24"/>
+                              <w:szCs w:val="24"/>
+                            </w:rPr>
+                            <w:t>Stoica</w:t>
+                          </w:r>
+                          <w:proofErr w:type="spellEnd"/>
                         </w:p>
                         <w:p>
                           <w:pPr>
@@ -3477,7 +3589,23 @@
           <w:b/>
           <w:bCs/>
         </w:rPr>
-        <w:t>Personal &lt;&lt;abstract&gt;&gt;:</w:t>
+        <w:t>Personal &lt;&lt;</w:t>
+      </w:r>
+      <w:proofErr w:type="spellStart"/>
+      <w:r>
+        <w:rPr>
+          <w:b/>
+          <w:bCs/>
+        </w:rPr>
+        <w:t>abstract</w:t>
+      </w:r>
+      <w:proofErr w:type="spellEnd"/>
+      <w:r>
+        <w:rPr>
+          <w:b/>
+          <w:bCs/>
+        </w:rPr>
+        <w:t>&gt;&gt;:</w:t>
       </w:r>
       <w:r>
         <w:t xml:space="preserve"> Representa a todos los tipos de trabajadores del hospital.</w:t>
@@ -3525,7 +3653,23 @@
           <w:b/>
           <w:bCs/>
         </w:rPr>
-        <w:t xml:space="preserve"> &lt;&lt;abstract&gt;&gt;</w:t>
+        <w:t xml:space="preserve"> &lt;&lt;</w:t>
+      </w:r>
+      <w:proofErr w:type="spellStart"/>
+      <w:r>
+        <w:rPr>
+          <w:b/>
+          <w:bCs/>
+        </w:rPr>
+        <w:t>abstract</w:t>
+      </w:r>
+      <w:proofErr w:type="spellEnd"/>
+      <w:r>
+        <w:rPr>
+          <w:b/>
+          <w:bCs/>
+        </w:rPr>
+        <w:t>&gt;&gt;</w:t>
       </w:r>
       <w:r>
         <w:rPr>
@@ -3687,7 +3831,23 @@
           <w:b/>
           <w:bCs/>
         </w:rPr>
-        <w:t>&lt;&lt;abstract&gt;&gt;</w:t>
+        <w:t>&lt;&lt;</w:t>
+      </w:r>
+      <w:proofErr w:type="spellStart"/>
+      <w:r>
+        <w:rPr>
+          <w:b/>
+          <w:bCs/>
+        </w:rPr>
+        <w:t>abstract</w:t>
+      </w:r>
+      <w:proofErr w:type="spellEnd"/>
+      <w:r>
+        <w:rPr>
+          <w:b/>
+          <w:bCs/>
+        </w:rPr>
+        <w:t>&gt;&gt;</w:t>
       </w:r>
       <w:r>
         <w:t>,</w:t>
@@ -4274,7 +4434,13 @@
         <w:t>“</w:t>
       </w:r>
       <w:r>
-        <w:t>los momentos que un paciente fue ingresado</w:t>
+        <w:t xml:space="preserve">los momentos </w:t>
+      </w:r>
+      <w:r>
+        <w:t xml:space="preserve">en </w:t>
+      </w:r>
+      <w:r>
+        <w:t>que un paciente fue ingresado</w:t>
       </w:r>
       <w:r>
         <w:t>”</w:t>
@@ -4321,171 +4487,69 @@
     </w:p>
     <w:p>
       <w:pPr>
-        <w:pStyle w:val="Ttulo4"/>
-      </w:pPr>
-      <w:r>
-        <w:t>Implementación</w:t>
-      </w:r>
-      <w:r>
-        <w:t xml:space="preserve"> en código</w:t>
-      </w:r>
-      <w:r>
-        <w:t>:</w:t>
-      </w:r>
-    </w:p>
-    <w:p>
-      <w:pPr>
-        <w:spacing w:line="276" w:lineRule="auto"/>
-        <w:jc w:val="both"/>
-      </w:pPr>
-      <w:r>
-        <w:t xml:space="preserve">En </w:t>
-      </w:r>
-      <w:r>
-        <w:t xml:space="preserve">términos de código, admitiremos un paciente al sistema cuando creemos un nuevo </w:t>
-      </w:r>
-      <w:r>
-        <w:t xml:space="preserve">objeto “Ingreso” dentro del código de un </w:t>
-      </w:r>
-      <w:r>
-        <w:t>objeto “Paciente”.</w:t>
-      </w:r>
-    </w:p>
-    <w:p>
-      <w:pPr>
-        <w:spacing w:line="276" w:lineRule="auto"/>
-        <w:jc w:val="both"/>
-      </w:pPr>
-      <w:r>
-        <w:t xml:space="preserve">La condición del paciente debe ser registrada en el momento de </w:t>
-      </w:r>
-      <w:r>
-        <w:t>la creación de su</w:t>
-      </w:r>
-      <w:r>
-        <w:t xml:space="preserve"> actual</w:t>
-      </w:r>
-      <w:r>
-        <w:t xml:space="preserve"> ingreso </w:t>
-      </w:r>
-      <w:r>
-        <w:t>en el sistema, esto se puede implementar pasando la condición del paciente como parámetro en el constructor del nuevo objeto “</w:t>
-      </w:r>
-      <w:r>
-        <w:t>Ingreso</w:t>
-      </w:r>
-      <w:r>
-        <w:t>”.</w:t>
-      </w:r>
-    </w:p>
-    <w:p>
-      <w:pPr>
-        <w:pStyle w:val="Ttulo4"/>
-      </w:pPr>
-      <w:r>
-        <w:t>Resumen:</w:t>
-      </w:r>
-    </w:p>
-    <w:p>
-      <w:pPr>
-        <w:pStyle w:val="Prrafodelista"/>
-        <w:numPr>
-          <w:ilvl w:val="0"/>
-          <w:numId w:val="4"/>
-        </w:numPr>
-        <w:spacing w:line="276" w:lineRule="auto"/>
-        <w:jc w:val="both"/>
-      </w:pPr>
-      <w:r>
-        <w:t xml:space="preserve">Un paciente se considera “admitido” cuando </w:t>
-      </w:r>
-      <w:r>
-        <w:t xml:space="preserve">su ingreso </w:t>
-      </w:r>
-      <w:r>
-        <w:t>empieza a existir dentro del sistema</w:t>
-      </w:r>
-      <w:r>
-        <w:t>.</w:t>
-      </w:r>
-    </w:p>
-    <w:p>
-      <w:pPr>
-        <w:pStyle w:val="Prrafodelista"/>
-        <w:numPr>
-          <w:ilvl w:val="0"/>
-          <w:numId w:val="3"/>
-        </w:numPr>
-        <w:spacing w:line="276" w:lineRule="auto"/>
-        <w:jc w:val="both"/>
-      </w:pPr>
-      <w:r>
-        <w:t>En el momento de la creación del</w:t>
-      </w:r>
-      <w:r>
-        <w:t xml:space="preserve"> ingreso de un</w:t>
-      </w:r>
-      <w:r>
-        <w:t xml:space="preserve"> paciente dentro del sistema, se debe guardar </w:t>
-      </w:r>
-      <w:r>
-        <w:t>la</w:t>
-      </w:r>
-      <w:r>
-        <w:t xml:space="preserve"> condición</w:t>
-      </w:r>
-      <w:r>
-        <w:t xml:space="preserve"> de dicho paciente</w:t>
-      </w:r>
-      <w:r>
-        <w:t xml:space="preserve"> en el sistema</w:t>
-      </w:r>
-      <w:r>
-        <w:t>.</w:t>
-      </w:r>
-    </w:p>
-    <w:p>
-      <w:pPr>
-        <w:pStyle w:val="Prrafodelista"/>
-        <w:numPr>
-          <w:ilvl w:val="0"/>
-          <w:numId w:val="3"/>
-        </w:numPr>
-        <w:spacing w:line="276" w:lineRule="auto"/>
-        <w:jc w:val="both"/>
-      </w:pPr>
-      <w:r>
-        <w:t xml:space="preserve">Implementar un paciente es lo mismo que crear un nuevo objeto </w:t>
-      </w:r>
-      <w:r>
-        <w:t>“Ingreso” en el código de un paciente</w:t>
-      </w:r>
-      <w:r>
-        <w:t>.</w:t>
-      </w:r>
-    </w:p>
-    <w:p>
-      <w:pPr>
-        <w:pStyle w:val="Prrafodelista"/>
-        <w:numPr>
-          <w:ilvl w:val="0"/>
-          <w:numId w:val="3"/>
-        </w:numPr>
-        <w:spacing w:line="276" w:lineRule="auto"/>
-        <w:jc w:val="both"/>
-      </w:pPr>
-      <w:r>
-        <w:t xml:space="preserve">Se verifica “la condición del paciente” pasando esa condición por parámetro en el constructor del nuevo objeto </w:t>
-      </w:r>
-      <w:r>
-        <w:t xml:space="preserve">“Ingreso” del </w:t>
-      </w:r>
-      <w:r>
-        <w:t>paciente.</w:t>
-      </w:r>
-      <w:r>
-        <w:t xml:space="preserve"> </w:t>
-      </w:r>
+        <w:spacing w:line="276" w:lineRule="auto"/>
+        <w:jc w:val="both"/>
+      </w:pPr>
+    </w:p>
+    <w:p>
+      <w:pPr>
+        <w:spacing w:line="276" w:lineRule="auto"/>
+        <w:jc w:val="both"/>
+      </w:pPr>
+    </w:p>
+    <w:p>
+      <w:pPr>
+        <w:spacing w:line="276" w:lineRule="auto"/>
+        <w:jc w:val="both"/>
+      </w:pPr>
+    </w:p>
+    <w:p>
+      <w:pPr>
+        <w:spacing w:line="276" w:lineRule="auto"/>
+        <w:jc w:val="both"/>
+      </w:pPr>
+    </w:p>
+    <w:p>
+      <w:pPr>
+        <w:spacing w:line="276" w:lineRule="auto"/>
+        <w:jc w:val="both"/>
+      </w:pPr>
+    </w:p>
+    <w:p>
+      <w:pPr>
+        <w:spacing w:line="276" w:lineRule="auto"/>
+        <w:jc w:val="both"/>
+      </w:pPr>
+    </w:p>
+    <w:p>
+      <w:pPr>
+        <w:spacing w:line="276" w:lineRule="auto"/>
+        <w:jc w:val="both"/>
+      </w:pPr>
+    </w:p>
+    <w:p>
+      <w:pPr>
+        <w:spacing w:line="276" w:lineRule="auto"/>
+        <w:jc w:val="both"/>
+      </w:pPr>
+    </w:p>
+    <w:p>
+      <w:pPr>
+        <w:spacing w:line="276" w:lineRule="auto"/>
+        <w:jc w:val="both"/>
+      </w:pPr>
+    </w:p>
+    <w:p>
+      <w:pPr>
+        <w:spacing w:line="276" w:lineRule="auto"/>
+        <w:jc w:val="both"/>
+      </w:pPr>
+    </w:p>
+    <w:p>
+      <w:pPr>
+        <w:spacing w:line="276" w:lineRule="auto"/>
+        <w:jc w:val="both"/>
+      </w:pPr>
     </w:p>
     <w:p>
       <w:pPr>
@@ -4751,7 +4815,15 @@
         <w:jc w:val="both"/>
       </w:pPr>
       <w:r>
-        <w:t>Está acción solo se podrá usar si el paciente no fue asignado antes, en ese caso, se usara el proceso de traslado de paciente.</w:t>
+        <w:t xml:space="preserve">Está acción solo se podrá usar si el paciente no fue asignado antes, en ese caso, se </w:t>
+      </w:r>
+      <w:proofErr w:type="gramStart"/>
+      <w:r>
+        <w:t>usara</w:t>
+      </w:r>
+      <w:proofErr w:type="gramEnd"/>
+      <w:r>
+        <w:t xml:space="preserve"> el proceso de traslado de paciente.</w:t>
       </w:r>
     </w:p>
     <w:p>
@@ -4932,8 +5004,13 @@
       <w:r>
         <w:t xml:space="preserve"> </w:t>
       </w:r>
-      <w:r>
-        <w:t>Enfermeria” mediante una super clase común o mediante una interfaz.</w:t>
+      <w:proofErr w:type="spellStart"/>
+      <w:r>
+        <w:t>Enfermeria</w:t>
+      </w:r>
+      <w:proofErr w:type="spellEnd"/>
+      <w:r>
+        <w:t>” mediante una super clase común o mediante una interfaz.</w:t>
       </w:r>
     </w:p>
     <w:p>
@@ -4988,7 +5065,15 @@
         <w:jc w:val="both"/>
       </w:pPr>
       <w:r>
-        <w:t>Esté método solo se podrá usar en pacientes que aun no fueron asignados, si se intenta usar en pacientes que ya fueron asignados, esté método lanzara excepción.</w:t>
+        <w:t xml:space="preserve">Esté método solo se podrá usar en pacientes que </w:t>
+      </w:r>
+      <w:proofErr w:type="spellStart"/>
+      <w:r>
+        <w:t>aun</w:t>
+      </w:r>
+      <w:proofErr w:type="spellEnd"/>
+      <w:r>
+        <w:t xml:space="preserve"> no fueron asignados, si se intenta usar en pacientes que ya fueron asignados, esté método lanzara excepción.</w:t>
       </w:r>
     </w:p>
     <w:p>
@@ -5434,7 +5519,15 @@
         <w:t xml:space="preserve">a clase </w:t>
       </w:r>
       <w:r>
-        <w:t>“PersonalDeSalud”.</w:t>
+        <w:t>“</w:t>
+      </w:r>
+      <w:proofErr w:type="spellStart"/>
+      <w:r>
+        <w:t>PersonalDeSalud</w:t>
+      </w:r>
+      <w:proofErr w:type="spellEnd"/>
+      <w:r>
+        <w:t>”.</w:t>
       </w:r>
     </w:p>
     <w:p>
@@ -5496,7 +5589,15 @@
         <w:t xml:space="preserve">” de la </w:t>
       </w:r>
       <w:r>
-        <w:t>misma clase “PersonalDeSalud”</w:t>
+        <w:t>misma clase “</w:t>
+      </w:r>
+      <w:proofErr w:type="spellStart"/>
+      <w:r>
+        <w:t>PersonalDeSalud</w:t>
+      </w:r>
+      <w:proofErr w:type="spellEnd"/>
+      <w:r>
+        <w:t>”</w:t>
       </w:r>
       <w:r>
         <w:t xml:space="preserve">, para generar </w:t>
@@ -5505,7 +5606,15 @@
         <w:t>un</w:t>
       </w:r>
       <w:r>
-        <w:t xml:space="preserve"> objeto “NotaDeEvolución” en el objeto “Ingreso” correspondiente al ingreso</w:t>
+        <w:t xml:space="preserve"> objeto “</w:t>
+      </w:r>
+      <w:proofErr w:type="spellStart"/>
+      <w:r>
+        <w:t>NotaDeEvolución</w:t>
+      </w:r>
+      <w:proofErr w:type="spellEnd"/>
+      <w:r>
+        <w:t>” en el objeto “Ingreso” correspondiente al ingreso</w:t>
       </w:r>
       <w:r>
         <w:t xml:space="preserve"> activo</w:t>
@@ -5589,7 +5698,15 @@
         <w:jc w:val="both"/>
       </w:pPr>
       <w:r>
-        <w:t>Guardaremos la información de las rondas médicas realizadas mediante la instanciación de objetos de una clase llamada “RondaMedicaDiaria”.</w:t>
+        <w:t>Guardaremos la información de las rondas médicas realizadas mediante la instanciación de objetos de una clase llamada “</w:t>
+      </w:r>
+      <w:proofErr w:type="spellStart"/>
+      <w:r>
+        <w:t>RondaMedicaDiaria</w:t>
+      </w:r>
+      <w:proofErr w:type="spellEnd"/>
+      <w:r>
+        <w:t>”.</w:t>
       </w:r>
       <w:r>
         <w:t xml:space="preserve"> </w:t>
@@ -5601,10 +5718,31 @@
         <w:t xml:space="preserve">l método </w:t>
       </w:r>
       <w:r>
-        <w:t xml:space="preserve">“rondaMedicaDiaria()” </w:t>
-      </w:r>
-      <w:r>
-        <w:t xml:space="preserve">deberá generar un objeto de la clase “RondaMedicaDiaria” para guardar constancia de si una ronda se </w:t>
+        <w:t>“</w:t>
+      </w:r>
+      <w:proofErr w:type="spellStart"/>
+      <w:proofErr w:type="gramStart"/>
+      <w:r>
+        <w:t>rondaMedicaDiaria</w:t>
+      </w:r>
+      <w:proofErr w:type="spellEnd"/>
+      <w:r>
+        <w:t>(</w:t>
+      </w:r>
+      <w:proofErr w:type="gramEnd"/>
+      <w:r>
+        <w:t xml:space="preserve">)” </w:t>
+      </w:r>
+      <w:r>
+        <w:t>deberá generar un objeto de la clase “</w:t>
+      </w:r>
+      <w:proofErr w:type="spellStart"/>
+      <w:r>
+        <w:t>RondaMedicaDiaria</w:t>
+      </w:r>
+      <w:proofErr w:type="spellEnd"/>
+      <w:r>
+        <w:t xml:space="preserve">” para guardar constancia de si una ronda se </w:t>
       </w:r>
       <w:r>
         <w:t>realizó</w:t>
@@ -5638,7 +5776,15 @@
         <w:t xml:space="preserve">en </w:t>
       </w:r>
       <w:r>
-        <w:t xml:space="preserve">el objeto “RondaMedicaDiaria” de cada </w:t>
+        <w:t>el objeto “</w:t>
+      </w:r>
+      <w:proofErr w:type="spellStart"/>
+      <w:r>
+        <w:t>RondaMedicaDiaria</w:t>
+      </w:r>
+      <w:proofErr w:type="spellEnd"/>
+      <w:r>
+        <w:t xml:space="preserve">” de cada </w:t>
       </w:r>
       <w:r>
         <w:t>día, si el paciente ya está listo para la evaluación final.</w:t>
@@ -5968,7 +6114,15 @@
         <w:jc w:val="both"/>
       </w:pPr>
       <w:r>
-        <w:t>Implementaremos este método en la clase “PersonalDeSalud”</w:t>
+        <w:t>Implementaremos este método en la clase “</w:t>
+      </w:r>
+      <w:proofErr w:type="spellStart"/>
+      <w:r>
+        <w:t>PersonalDeSalud</w:t>
+      </w:r>
+      <w:proofErr w:type="spellEnd"/>
+      <w:r>
+        <w:t>”</w:t>
       </w:r>
       <w:r>
         <w:t>.</w:t>
@@ -6016,13 +6170,21 @@
         <w:t>á</w:t>
       </w:r>
       <w:r>
-        <w:t xml:space="preserve"> nuevas instancias de la clase “NotaDeEv</w:t>
+        <w:t xml:space="preserve"> nuevas instancias de la clase “</w:t>
+      </w:r>
+      <w:proofErr w:type="spellStart"/>
+      <w:r>
+        <w:t>NotaDeEv</w:t>
       </w:r>
       <w:r>
         <w:t>o</w:t>
       </w:r>
       <w:r>
-        <w:t xml:space="preserve">lucion” en </w:t>
+        <w:t>lucion</w:t>
+      </w:r>
+      <w:proofErr w:type="spellEnd"/>
+      <w:r>
+        <w:t xml:space="preserve">” en </w:t>
       </w:r>
       <w:r>
         <w:t>el objeto “Ingreso” correspondiente a</w:t>
@@ -6068,7 +6230,28 @@
         <w:t>Este</w:t>
       </w:r>
       <w:r>
-        <w:t xml:space="preserve"> método, también podrá ser llamado desde el método “rondaMedicaDiaria()” de la clase “PersonalDeSalud”.</w:t>
+        <w:t xml:space="preserve"> método, también podrá ser llamado desde el método “</w:t>
+      </w:r>
+      <w:proofErr w:type="spellStart"/>
+      <w:proofErr w:type="gramStart"/>
+      <w:r>
+        <w:t>rondaMedicaDiaria</w:t>
+      </w:r>
+      <w:proofErr w:type="spellEnd"/>
+      <w:r>
+        <w:t>(</w:t>
+      </w:r>
+      <w:proofErr w:type="gramEnd"/>
+      <w:r>
+        <w:t>)” de la clase “</w:t>
+      </w:r>
+      <w:proofErr w:type="spellStart"/>
+      <w:r>
+        <w:t>PersonalDeSalud</w:t>
+      </w:r>
+      <w:proofErr w:type="spellEnd"/>
+      <w:r>
+        <w:t>”.</w:t>
       </w:r>
     </w:p>
     <w:p/>
@@ -6870,7 +7053,15 @@
         <w:t>este</w:t>
       </w:r>
       <w:r>
-        <w:t xml:space="preserve"> método en la clase “PersonalAdministrativo”.</w:t>
+        <w:t xml:space="preserve"> método en la clase “</w:t>
+      </w:r>
+      <w:proofErr w:type="spellStart"/>
+      <w:r>
+        <w:t>PersonalAdministrativo</w:t>
+      </w:r>
+      <w:proofErr w:type="spellEnd"/>
+      <w:r>
+        <w:t>”.</w:t>
       </w:r>
     </w:p>
     <w:p>
@@ -7535,7 +7726,23 @@
         <w:t xml:space="preserve">as clases </w:t>
       </w:r>
       <w:r>
-        <w:t>“PersonalAdministrativo” y “PersonalDeEnfermeria”</w:t>
+        <w:t>“</w:t>
+      </w:r>
+      <w:proofErr w:type="spellStart"/>
+      <w:r>
+        <w:t>PersonalAdministrativo</w:t>
+      </w:r>
+      <w:proofErr w:type="spellEnd"/>
+      <w:r>
+        <w:t>” y “</w:t>
+      </w:r>
+      <w:proofErr w:type="spellStart"/>
+      <w:r>
+        <w:t>PersonalDeEnfermeria</w:t>
+      </w:r>
+      <w:proofErr w:type="spellEnd"/>
+      <w:r>
+        <w:t>”</w:t>
       </w:r>
       <w:r>
         <w:t xml:space="preserve"> mediante una super clase común o mediante una interfaz, dependiendo de cuál sea más adecuada al momento de implementar está función.</w:t>
@@ -7848,7 +8055,15 @@
         <w:jc w:val="both"/>
       </w:pPr>
       <w:r>
-        <w:t>Este método solo se podrá usar en pacientes que ya hayan sido asignados anteriormente, con el método referente al proceso de asignación de pacientes de está misma clase, el método deberá lanzar excepción si esto no se cumple.</w:t>
+        <w:t xml:space="preserve">Este método solo se podrá usar en pacientes que ya hayan sido asignados anteriormente, con el método referente al proceso de asignación de pacientes de </w:t>
+      </w:r>
+      <w:proofErr w:type="spellStart"/>
+      <w:r>
+        <w:t>está</w:t>
+      </w:r>
+      <w:proofErr w:type="spellEnd"/>
+      <w:r>
+        <w:t xml:space="preserve"> misma clase, el método deberá lanzar excepción si esto no se cumple.</w:t>
       </w:r>
     </w:p>
     <w:p>
@@ -7900,7 +8115,15 @@
         <w:jc w:val="both"/>
       </w:pPr>
       <w:r>
-        <w:t>El proceso de asignación solo deberá funcionar la primera vez que el paciente valla a ser vinculado con una unidad, habitación y cama, si se quiere reasignar al paciente se usara el proceso de traslado.</w:t>
+        <w:t xml:space="preserve">El proceso de asignación solo deberá funcionar la primera vez que el paciente valla a ser vinculado con una unidad, habitación y cama, si se quiere reasignar al paciente se </w:t>
+      </w:r>
+      <w:proofErr w:type="gramStart"/>
+      <w:r>
+        <w:t>usara</w:t>
+      </w:r>
+      <w:proofErr w:type="gramEnd"/>
+      <w:r>
+        <w:t xml:space="preserve"> el proceso de traslado.</w:t>
       </w:r>
     </w:p>
     <w:p>
@@ -8238,7 +8461,15 @@
         <w:pStyle w:val="Ttulo4"/>
       </w:pPr>
       <w:r>
-        <w:t>Personal &lt;&lt;abstract&gt;&gt;:</w:t>
+        <w:t>Personal &lt;&lt;</w:t>
+      </w:r>
+      <w:proofErr w:type="spellStart"/>
+      <w:r>
+        <w:t>abstract</w:t>
+      </w:r>
+      <w:proofErr w:type="spellEnd"/>
+      <w:r>
+        <w:t>&gt;&gt;:</w:t>
       </w:r>
     </w:p>
     <w:p>
@@ -8881,7 +9112,15 @@
         <w:pStyle w:val="Ttulo4"/>
       </w:pPr>
       <w:r>
-        <w:t>Personal de Salud &lt;&lt;asbtract&gt;&gt;:</w:t>
+        <w:t>Personal de Salud &lt;&lt;</w:t>
+      </w:r>
+      <w:proofErr w:type="spellStart"/>
+      <w:r>
+        <w:t>asbtract</w:t>
+      </w:r>
+      <w:proofErr w:type="spellEnd"/>
+      <w:r>
+        <w:t>&gt;&gt;:</w:t>
       </w:r>
     </w:p>
     <w:p>
@@ -8893,15 +9132,41 @@
         </w:numPr>
         <w:jc w:val="both"/>
       </w:pPr>
+      <w:proofErr w:type="spellStart"/>
+      <w:proofErr w:type="gramStart"/>
       <w:r>
         <w:rPr>
           <w:b/>
           <w:bCs/>
         </w:rPr>
-        <w:t>generarNotaEvolucionPaciente():</w:t>
-      </w:r>
-      <w:r>
-        <w:t xml:space="preserve"> Método que sirve para generar un nuevo objeto “NotaDeEvolucion” en el objeto “Ingreso” correspondiente al ingreso activo de un paciente en específico.</w:t>
+        <w:t>generarNotaEvolucionPaciente</w:t>
+      </w:r>
+      <w:proofErr w:type="spellEnd"/>
+      <w:r>
+        <w:rPr>
+          <w:b/>
+          <w:bCs/>
+        </w:rPr>
+        <w:t>(</w:t>
+      </w:r>
+      <w:proofErr w:type="gramEnd"/>
+      <w:r>
+        <w:rPr>
+          <w:b/>
+          <w:bCs/>
+        </w:rPr>
+        <w:t>):</w:t>
+      </w:r>
+      <w:r>
+        <w:t xml:space="preserve"> Método que sirve para generar un nuevo objeto “</w:t>
+      </w:r>
+      <w:proofErr w:type="spellStart"/>
+      <w:r>
+        <w:t>NotaDeEvolucion</w:t>
+      </w:r>
+      <w:proofErr w:type="spellEnd"/>
+      <w:r>
+        <w:t>” en el objeto “Ingreso” correspondiente al ingreso activo de un paciente en específico.</w:t>
       </w:r>
     </w:p>
     <w:p>
@@ -8915,12 +9180,30 @@
         <w:contextualSpacing w:val="0"/>
         <w:jc w:val="both"/>
       </w:pPr>
+      <w:proofErr w:type="spellStart"/>
+      <w:proofErr w:type="gramStart"/>
       <w:r>
         <w:rPr>
           <w:b/>
           <w:bCs/>
         </w:rPr>
-        <w:t>rondaMedicaDiariaPaciente():</w:t>
+        <w:t>rondaMedicaDiariaPaciente</w:t>
+      </w:r>
+      <w:proofErr w:type="spellEnd"/>
+      <w:r>
+        <w:rPr>
+          <w:b/>
+          <w:bCs/>
+        </w:rPr>
+        <w:t>(</w:t>
+      </w:r>
+      <w:proofErr w:type="gramEnd"/>
+      <w:r>
+        <w:rPr>
+          <w:b/>
+          <w:bCs/>
+        </w:rPr>
+        <w:t>):</w:t>
       </w:r>
       <w:r>
         <w:t xml:space="preserve"> Método que sirve para hacer una ronda médica diaria a un paciente en específico.</w:t>
@@ -8948,12 +9231,30 @@
         <w:contextualSpacing w:val="0"/>
         <w:jc w:val="both"/>
       </w:pPr>
+      <w:proofErr w:type="spellStart"/>
+      <w:proofErr w:type="gramStart"/>
       <w:r>
         <w:rPr>
           <w:b/>
           <w:bCs/>
         </w:rPr>
-        <w:t>asignarCamaPaciente():</w:t>
+        <w:t>asignarCamaPaciente</w:t>
+      </w:r>
+      <w:proofErr w:type="spellEnd"/>
+      <w:r>
+        <w:rPr>
+          <w:b/>
+          <w:bCs/>
+        </w:rPr>
+        <w:t>(</w:t>
+      </w:r>
+      <w:proofErr w:type="gramEnd"/>
+      <w:r>
+        <w:rPr>
+          <w:b/>
+          <w:bCs/>
+        </w:rPr>
+        <w:t>):</w:t>
       </w:r>
       <w:r>
         <w:t xml:space="preserve"> Método que sirve para vincular un Paciente a una cama y la unidad de esa cama.</w:t>
@@ -8968,12 +9269,30 @@
         </w:numPr>
         <w:jc w:val="both"/>
       </w:pPr>
+      <w:proofErr w:type="spellStart"/>
+      <w:proofErr w:type="gramStart"/>
       <w:r>
         <w:rPr>
           <w:b/>
           <w:bCs/>
         </w:rPr>
-        <w:t>trasladoPaciente():</w:t>
+        <w:t>trasladoPaciente</w:t>
+      </w:r>
+      <w:proofErr w:type="spellEnd"/>
+      <w:r>
+        <w:rPr>
+          <w:b/>
+          <w:bCs/>
+        </w:rPr>
+        <w:t>(</w:t>
+      </w:r>
+      <w:proofErr w:type="gramEnd"/>
+      <w:r>
+        <w:rPr>
+          <w:b/>
+          <w:bCs/>
+        </w:rPr>
+        <w:t>):</w:t>
       </w:r>
       <w:r>
         <w:t xml:space="preserve"> Método que sirve para trasladar a otro hospital o a otra unidad del nuestro hospital.</w:t>
@@ -8996,12 +9315,30 @@
         </w:numPr>
         <w:jc w:val="both"/>
       </w:pPr>
+      <w:proofErr w:type="spellStart"/>
+      <w:proofErr w:type="gramStart"/>
       <w:r>
         <w:rPr>
           <w:b/>
           <w:bCs/>
         </w:rPr>
-        <w:t>evaluacionFinalPaciente():</w:t>
+        <w:t>evaluacionFinalPaciente</w:t>
+      </w:r>
+      <w:proofErr w:type="spellEnd"/>
+      <w:r>
+        <w:rPr>
+          <w:b/>
+          <w:bCs/>
+        </w:rPr>
+        <w:t>(</w:t>
+      </w:r>
+      <w:proofErr w:type="gramEnd"/>
+      <w:r>
+        <w:rPr>
+          <w:b/>
+          <w:bCs/>
+        </w:rPr>
+        <w:t>):</w:t>
       </w:r>
       <w:r>
         <w:t xml:space="preserve"> Método que sirve para hacer la evaluación final a un paciente en específico después de una ronda médica diaria exitosa.</w:t>
@@ -9026,6 +9363,8 @@
         <w:contextualSpacing w:val="0"/>
         <w:jc w:val="both"/>
       </w:pPr>
+      <w:proofErr w:type="spellStart"/>
+      <w:proofErr w:type="gramStart"/>
       <w:r>
         <w:rPr>
           <w:b/>
@@ -9045,7 +9384,23 @@
           <w:b/>
           <w:bCs/>
         </w:rPr>
-        <w:t>Paciente():</w:t>
+        <w:t>Paciente</w:t>
+      </w:r>
+      <w:proofErr w:type="spellEnd"/>
+      <w:r>
+        <w:rPr>
+          <w:b/>
+          <w:bCs/>
+        </w:rPr>
+        <w:t>(</w:t>
+      </w:r>
+      <w:proofErr w:type="gramEnd"/>
+      <w:r>
+        <w:rPr>
+          <w:b/>
+          <w:bCs/>
+        </w:rPr>
+        <w:t>):</w:t>
       </w:r>
       <w:r>
         <w:t xml:space="preserve"> Método que sirve para vincular un Paciente a una</w:t>
@@ -9068,12 +9423,30 @@
         <w:contextualSpacing w:val="0"/>
         <w:jc w:val="both"/>
       </w:pPr>
+      <w:proofErr w:type="spellStart"/>
+      <w:proofErr w:type="gramStart"/>
       <w:r>
         <w:rPr>
           <w:b/>
           <w:bCs/>
         </w:rPr>
-        <w:t>trasladoPaciente():</w:t>
+        <w:t>trasladoPaciente</w:t>
+      </w:r>
+      <w:proofErr w:type="spellEnd"/>
+      <w:r>
+        <w:rPr>
+          <w:b/>
+          <w:bCs/>
+        </w:rPr>
+        <w:t>(</w:t>
+      </w:r>
+      <w:proofErr w:type="gramEnd"/>
+      <w:r>
+        <w:rPr>
+          <w:b/>
+          <w:bCs/>
+        </w:rPr>
+        <w:t>):</w:t>
       </w:r>
       <w:r>
         <w:t xml:space="preserve"> Método que sirve para trasladar a otro hospital o a otra unidad del nuestro hospital.</w:t>
@@ -9088,12 +9461,30 @@
         </w:numPr>
         <w:jc w:val="both"/>
       </w:pPr>
+      <w:proofErr w:type="spellStart"/>
+      <w:proofErr w:type="gramStart"/>
       <w:r>
         <w:rPr>
           <w:b/>
           <w:bCs/>
         </w:rPr>
-        <w:t>documentacionAltaPaciente():</w:t>
+        <w:t>documentacionAltaPaciente</w:t>
+      </w:r>
+      <w:proofErr w:type="spellEnd"/>
+      <w:r>
+        <w:rPr>
+          <w:b/>
+          <w:bCs/>
+        </w:rPr>
+        <w:t>(</w:t>
+      </w:r>
+      <w:proofErr w:type="gramEnd"/>
+      <w:r>
+        <w:rPr>
+          <w:b/>
+          <w:bCs/>
+        </w:rPr>
+        <w:t>):</w:t>
       </w:r>
       <w:r>
         <w:t xml:space="preserve"> Método que rellena el atributo referente a la documentación del alta del ingreso de un paciente</w:t>
@@ -9150,7 +9541,20 @@
         <w:jc w:val="both"/>
       </w:pPr>
       <w:r>
-        <w:t>Podríamos crear una clase de utilidad llamada “Tiempo” o algo así, con un método llamado “avanzarDia()”</w:t>
+        <w:t>Podríamos crear una clase de utilidad llamada “Tiempo” o algo así, con un método llamado “</w:t>
+      </w:r>
+      <w:proofErr w:type="spellStart"/>
+      <w:proofErr w:type="gramStart"/>
+      <w:r>
+        <w:t>avanzarDia</w:t>
+      </w:r>
+      <w:proofErr w:type="spellEnd"/>
+      <w:r>
+        <w:t>(</w:t>
+      </w:r>
+      <w:proofErr w:type="gramEnd"/>
+      <w:r>
+        <w:t>)”</w:t>
       </w:r>
       <w:r>
         <w:t xml:space="preserve"> que simule el avance de un día a otro en el hospital</w:t>
@@ -9238,7 +9642,15 @@
         <w:jc w:val="both"/>
       </w:pPr>
       <w:r>
-        <w:t>“Personal de Salud” es un termino que se usa para referirse a todos los trabajadores orientados al cuidado sanitario del paciente.</w:t>
+        <w:t xml:space="preserve">“Personal de Salud” es un </w:t>
+      </w:r>
+      <w:proofErr w:type="spellStart"/>
+      <w:r>
+        <w:t>termino</w:t>
+      </w:r>
+      <w:proofErr w:type="spellEnd"/>
+      <w:r>
+        <w:t xml:space="preserve"> que se usa para referirse a todos los trabajadores orientados al cuidado sanitario del paciente.</w:t>
       </w:r>
     </w:p>
     <w:p>
@@ -9304,7 +9716,15 @@
       <w:bookmarkStart w:id="49" w:name="_Toc225990386"/>
       <w:r>
         <w:lastRenderedPageBreak/>
-        <w:t>¿Quién se encarga de la evaluación final de los paceintes?</w:t>
+        <w:t xml:space="preserve">¿Quién se encarga de la evaluación final de los </w:t>
+      </w:r>
+      <w:proofErr w:type="spellStart"/>
+      <w:r>
+        <w:t>paceintes</w:t>
+      </w:r>
+      <w:proofErr w:type="spellEnd"/>
+      <w:r>
+        <w:t>?</w:t>
       </w:r>
       <w:bookmarkEnd w:id="49"/>
     </w:p>

</xml_diff>

<commit_message>
Correción del analisis en base a nueva perspectiva
</commit_message>
<xml_diff>
--- a/documentacion/Análisis Del Enunciado 2/PROYECTO-RETO – Análisis _ Grupo2.docx
+++ b/documentacion/Análisis Del Enunciado 2/PROYECTO-RETO – Análisis _ Grupo2.docx
@@ -964,7 +964,7 @@
                             <w:pPr>
                               <w:pStyle w:val="Ttulo1"/>
                             </w:pPr>
-                            <w:bookmarkStart w:id="0" w:name="_Toc225990358"/>
+                            <w:bookmarkStart w:id="0" w:name="_Toc228071385"/>
                             <w:r>
                               <w:rPr>
                                 <w:rFonts w:ascii="Segoe UI Emoji" w:hAnsi="Segoe UI Emoji"/>
@@ -1003,7 +1003,7 @@
                       <w:pPr>
                         <w:pStyle w:val="Ttulo1"/>
                       </w:pPr>
-                      <w:bookmarkStart w:id="1" w:name="_Toc225990358"/>
+                      <w:bookmarkStart w:id="1" w:name="_Toc228071385"/>
                       <w:r>
                         <w:rPr>
                           <w:rFonts w:ascii="Segoe UI Emoji" w:hAnsi="Segoe UI Emoji"/>
@@ -1079,7 +1079,7 @@
           <w:r>
             <w:fldChar w:fldCharType="separate"/>
           </w:r>
-          <w:hyperlink w:anchor="_Toc225990358" w:history="1">
+          <w:hyperlink w:anchor="_Toc228071385" w:history="1">
             <w:r>
               <w:rPr>
                 <w:rStyle w:val="Hipervnculo"/>
@@ -1114,7 +1114,7 @@
                 <w:noProof/>
                 <w:webHidden/>
               </w:rPr>
-              <w:instrText xml:space="preserve"> PAGEREF _Toc225990358 \h </w:instrText>
+              <w:instrText xml:space="preserve"> PAGEREF _Toc228071385 \h </w:instrText>
             </w:r>
             <w:r>
               <w:rPr>
@@ -1161,7 +1161,7 @@
               <w14:ligatures w14:val="standardContextual"/>
             </w:rPr>
           </w:pPr>
-          <w:hyperlink w:anchor="_Toc225990359" w:history="1">
+          <w:hyperlink w:anchor="_Toc228071386" w:history="1">
             <w:r>
               <w:rPr>
                 <w:rStyle w:val="Hipervnculo"/>
@@ -1196,7 +1196,7 @@
                 <w:noProof/>
                 <w:webHidden/>
               </w:rPr>
-              <w:instrText xml:space="preserve"> PAGEREF _Toc225990359 \h </w:instrText>
+              <w:instrText xml:space="preserve"> PAGEREF _Toc228071386 \h </w:instrText>
             </w:r>
             <w:r>
               <w:rPr>
@@ -1241,7 +1241,7 @@
               <w14:ligatures w14:val="standardContextual"/>
             </w:rPr>
           </w:pPr>
-          <w:hyperlink w:anchor="_Toc225990360" w:history="1">
+          <w:hyperlink w:anchor="_Toc228071387" w:history="1">
             <w:r>
               <w:rPr>
                 <w:rStyle w:val="Hipervnculo"/>
@@ -1264,7 +1264,7 @@
               <w:rPr>
                 <w:webHidden/>
               </w:rPr>
-              <w:instrText xml:space="preserve"> PAGEREF _Toc225990360 \h </w:instrText>
+              <w:instrText xml:space="preserve"> PAGEREF _Toc228071387 \h </w:instrText>
             </w:r>
             <w:r>
               <w:rPr>
@@ -1307,7 +1307,7 @@
               <w14:ligatures w14:val="standardContextual"/>
             </w:rPr>
           </w:pPr>
-          <w:hyperlink w:anchor="_Toc225990361" w:history="1">
+          <w:hyperlink w:anchor="_Toc228071388" w:history="1">
             <w:r>
               <w:rPr>
                 <w:rStyle w:val="Hipervnculo"/>
@@ -1334,7 +1334,7 @@
                 <w:noProof/>
                 <w:webHidden/>
               </w:rPr>
-              <w:instrText xml:space="preserve"> PAGEREF _Toc225990361 \h </w:instrText>
+              <w:instrText xml:space="preserve"> PAGEREF _Toc228071388 \h </w:instrText>
             </w:r>
             <w:r>
               <w:rPr>
@@ -1381,7 +1381,7 @@
               <w14:ligatures w14:val="standardContextual"/>
             </w:rPr>
           </w:pPr>
-          <w:hyperlink w:anchor="_Toc225990362" w:history="1">
+          <w:hyperlink w:anchor="_Toc228071389" w:history="1">
             <w:r>
               <w:rPr>
                 <w:rStyle w:val="Hipervnculo"/>
@@ -1408,7 +1408,7 @@
                 <w:noProof/>
                 <w:webHidden/>
               </w:rPr>
-              <w:instrText xml:space="preserve"> PAGEREF _Toc225990362 \h </w:instrText>
+              <w:instrText xml:space="preserve"> PAGEREF _Toc228071389 \h </w:instrText>
             </w:r>
             <w:r>
               <w:rPr>
@@ -1455,7 +1455,7 @@
               <w14:ligatures w14:val="standardContextual"/>
             </w:rPr>
           </w:pPr>
-          <w:hyperlink w:anchor="_Toc225990363" w:history="1">
+          <w:hyperlink w:anchor="_Toc228071390" w:history="1">
             <w:r>
               <w:rPr>
                 <w:rStyle w:val="Hipervnculo"/>
@@ -1482,7 +1482,7 @@
                 <w:noProof/>
                 <w:webHidden/>
               </w:rPr>
-              <w:instrText xml:space="preserve"> PAGEREF _Toc225990363 \h </w:instrText>
+              <w:instrText xml:space="preserve"> PAGEREF _Toc228071390 \h </w:instrText>
             </w:r>
             <w:r>
               <w:rPr>
@@ -1527,7 +1527,7 @@
               <w14:ligatures w14:val="standardContextual"/>
             </w:rPr>
           </w:pPr>
-          <w:hyperlink w:anchor="_Toc225990364" w:history="1">
+          <w:hyperlink w:anchor="_Toc228071391" w:history="1">
             <w:r>
               <w:rPr>
                 <w:rStyle w:val="Hipervnculo"/>
@@ -1550,7 +1550,7 @@
               <w:rPr>
                 <w:webHidden/>
               </w:rPr>
-              <w:instrText xml:space="preserve"> PAGEREF _Toc225990364 \h </w:instrText>
+              <w:instrText xml:space="preserve"> PAGEREF _Toc228071391 \h </w:instrText>
             </w:r>
             <w:r>
               <w:rPr>
@@ -1593,7 +1593,7 @@
               <w14:ligatures w14:val="standardContextual"/>
             </w:rPr>
           </w:pPr>
-          <w:hyperlink w:anchor="_Toc225990365" w:history="1">
+          <w:hyperlink w:anchor="_Toc228071392" w:history="1">
             <w:r>
               <w:rPr>
                 <w:rStyle w:val="Hipervnculo"/>
@@ -1620,7 +1620,7 @@
                 <w:noProof/>
                 <w:webHidden/>
               </w:rPr>
-              <w:instrText xml:space="preserve"> PAGEREF _Toc225990365 \h </w:instrText>
+              <w:instrText xml:space="preserve"> PAGEREF _Toc228071392 \h </w:instrText>
             </w:r>
             <w:r>
               <w:rPr>
@@ -1667,7 +1667,7 @@
               <w14:ligatures w14:val="standardContextual"/>
             </w:rPr>
           </w:pPr>
-          <w:hyperlink w:anchor="_Toc225990366" w:history="1">
+          <w:hyperlink w:anchor="_Toc228071393" w:history="1">
             <w:r>
               <w:rPr>
                 <w:rStyle w:val="Hipervnculo"/>
@@ -1694,7 +1694,7 @@
                 <w:noProof/>
                 <w:webHidden/>
               </w:rPr>
-              <w:instrText xml:space="preserve"> PAGEREF _Toc225990366 \h </w:instrText>
+              <w:instrText xml:space="preserve"> PAGEREF _Toc228071393 \h </w:instrText>
             </w:r>
             <w:r>
               <w:rPr>
@@ -1741,7 +1741,7 @@
               <w14:ligatures w14:val="standardContextual"/>
             </w:rPr>
           </w:pPr>
-          <w:hyperlink w:anchor="_Toc225990367" w:history="1">
+          <w:hyperlink w:anchor="_Toc228071394" w:history="1">
             <w:r>
               <w:rPr>
                 <w:rStyle w:val="Hipervnculo"/>
@@ -1768,7 +1768,7 @@
                 <w:noProof/>
                 <w:webHidden/>
               </w:rPr>
-              <w:instrText xml:space="preserve"> PAGEREF _Toc225990367 \h </w:instrText>
+              <w:instrText xml:space="preserve"> PAGEREF _Toc228071394 \h </w:instrText>
             </w:r>
             <w:r>
               <w:rPr>
@@ -1813,12 +1813,12 @@
               <w14:ligatures w14:val="standardContextual"/>
             </w:rPr>
           </w:pPr>
-          <w:hyperlink w:anchor="_Toc225990368" w:history="1">
+          <w:hyperlink w:anchor="_Toc228071395" w:history="1">
             <w:r>
               <w:rPr>
                 <w:rStyle w:val="Hipervnculo"/>
               </w:rPr>
-              <w:t>PROCESOS/ACCIONES</w:t>
+              <w:t>ACCIONES</w:t>
             </w:r>
             <w:r>
               <w:rPr>
@@ -1836,7 +1836,7 @@
               <w:rPr>
                 <w:webHidden/>
               </w:rPr>
-              <w:instrText xml:space="preserve"> PAGEREF _Toc225990368 \h </w:instrText>
+              <w:instrText xml:space="preserve"> PAGEREF _Toc228071395 \h </w:instrText>
             </w:r>
             <w:r>
               <w:rPr>
@@ -1879,13 +1879,13 @@
               <w14:ligatures w14:val="standardContextual"/>
             </w:rPr>
           </w:pPr>
-          <w:hyperlink w:anchor="_Toc225990369" w:history="1">
+          <w:hyperlink w:anchor="_Toc228071396" w:history="1">
             <w:r>
               <w:rPr>
                 <w:rStyle w:val="Hipervnculo"/>
                 <w:noProof/>
               </w:rPr>
-              <w:t>Verificación de Condición del Paciente:</w:t>
+              <w:t>¿Qué son las acciones?:</w:t>
             </w:r>
             <w:r>
               <w:rPr>
@@ -1906,7 +1906,7 @@
                 <w:noProof/>
                 <w:webHidden/>
               </w:rPr>
-              <w:instrText xml:space="preserve"> PAGEREF _Toc225990369 \h </w:instrText>
+              <w:instrText xml:space="preserve"> PAGEREF _Toc228071396 \h </w:instrText>
             </w:r>
             <w:r>
               <w:rPr>
@@ -1953,7 +1953,7 @@
               <w14:ligatures w14:val="standardContextual"/>
             </w:rPr>
           </w:pPr>
-          <w:hyperlink w:anchor="_Toc225990370" w:history="1">
+          <w:hyperlink w:anchor="_Toc228071397" w:history="1">
             <w:r>
               <w:rPr>
                 <w:rStyle w:val="Hipervnculo"/>
@@ -1980,7 +1980,7 @@
                 <w:noProof/>
                 <w:webHidden/>
               </w:rPr>
-              <w:instrText xml:space="preserve"> PAGEREF _Toc225990370 \h </w:instrText>
+              <w:instrText xml:space="preserve"> PAGEREF _Toc228071397 \h </w:instrText>
             </w:r>
             <w:r>
               <w:rPr>
@@ -2027,7 +2027,7 @@
               <w14:ligatures w14:val="standardContextual"/>
             </w:rPr>
           </w:pPr>
-          <w:hyperlink w:anchor="_Toc225990371" w:history="1">
+          <w:hyperlink w:anchor="_Toc228071398" w:history="1">
             <w:r>
               <w:rPr>
                 <w:rStyle w:val="Hipervnculo"/>
@@ -2054,7 +2054,7 @@
                 <w:noProof/>
                 <w:webHidden/>
               </w:rPr>
-              <w:instrText xml:space="preserve"> PAGEREF _Toc225990371 \h </w:instrText>
+              <w:instrText xml:space="preserve"> PAGEREF _Toc228071398 \h </w:instrText>
             </w:r>
             <w:r>
               <w:rPr>
@@ -2074,7 +2074,7 @@
                 <w:noProof/>
                 <w:webHidden/>
               </w:rPr>
-              <w:t>9</w:t>
+              <w:t>8</w:t>
             </w:r>
             <w:r>
               <w:rPr>
@@ -2101,13 +2101,13 @@
               <w14:ligatures w14:val="standardContextual"/>
             </w:rPr>
           </w:pPr>
-          <w:hyperlink w:anchor="_Toc225990372" w:history="1">
+          <w:hyperlink w:anchor="_Toc228071399" w:history="1">
             <w:r>
               <w:rPr>
                 <w:rStyle w:val="Hipervnculo"/>
                 <w:noProof/>
               </w:rPr>
-              <w:t>Generación de Notas de Evolución</w:t>
+              <w:t>Evaluación final a un Paciente</w:t>
             </w:r>
             <w:r>
               <w:rPr>
@@ -2128,7 +2128,7 @@
                 <w:noProof/>
                 <w:webHidden/>
               </w:rPr>
-              <w:instrText xml:space="preserve"> PAGEREF _Toc225990372 \h </w:instrText>
+              <w:instrText xml:space="preserve"> PAGEREF _Toc228071399 \h </w:instrText>
             </w:r>
             <w:r>
               <w:rPr>
@@ -2148,7 +2148,7 @@
                 <w:noProof/>
                 <w:webHidden/>
               </w:rPr>
-              <w:t>11</w:t>
+              <w:t>10</w:t>
             </w:r>
             <w:r>
               <w:rPr>
@@ -2175,13 +2175,13 @@
               <w14:ligatures w14:val="standardContextual"/>
             </w:rPr>
           </w:pPr>
-          <w:hyperlink w:anchor="_Toc225990373" w:history="1">
+          <w:hyperlink w:anchor="_Toc228071400" w:history="1">
             <w:r>
               <w:rPr>
                 <w:rStyle w:val="Hipervnculo"/>
                 <w:noProof/>
               </w:rPr>
-              <w:t>Evaluación final a un Paciente</w:t>
+              <w:t>Documentación del Alta de un Paciente</w:t>
             </w:r>
             <w:r>
               <w:rPr>
@@ -2202,7 +2202,7 @@
                 <w:noProof/>
                 <w:webHidden/>
               </w:rPr>
-              <w:instrText xml:space="preserve"> PAGEREF _Toc225990373 \h </w:instrText>
+              <w:instrText xml:space="preserve"> PAGEREF _Toc228071400 \h </w:instrText>
             </w:r>
             <w:r>
               <w:rPr>
@@ -2222,7 +2222,7 @@
                 <w:noProof/>
                 <w:webHidden/>
               </w:rPr>
-              <w:t>13</w:t>
+              <w:t>11</w:t>
             </w:r>
             <w:r>
               <w:rPr>
@@ -2249,13 +2249,13 @@
               <w14:ligatures w14:val="standardContextual"/>
             </w:rPr>
           </w:pPr>
-          <w:hyperlink w:anchor="_Toc225990374" w:history="1">
+          <w:hyperlink w:anchor="_Toc228071401" w:history="1">
             <w:r>
               <w:rPr>
                 <w:rStyle w:val="Hipervnculo"/>
                 <w:noProof/>
               </w:rPr>
-              <w:t>Documentación del Alta de un Paciente</w:t>
+              <w:t>Traslado de un paciente a otra unidad u otro centro médico</w:t>
             </w:r>
             <w:r>
               <w:rPr>
@@ -2276,7 +2276,7 @@
                 <w:noProof/>
                 <w:webHidden/>
               </w:rPr>
-              <w:instrText xml:space="preserve"> PAGEREF _Toc225990374 \h </w:instrText>
+              <w:instrText xml:space="preserve"> PAGEREF _Toc228071401 \h </w:instrText>
             </w:r>
             <w:r>
               <w:rPr>
@@ -2296,11 +2296,139 @@
                 <w:noProof/>
                 <w:webHidden/>
               </w:rPr>
-              <w:t>15</w:t>
-            </w:r>
-            <w:r>
-              <w:rPr>
-                <w:noProof/>
+              <w:t>12</w:t>
+            </w:r>
+            <w:r>
+              <w:rPr>
+                <w:noProof/>
+                <w:webHidden/>
+              </w:rPr>
+              <w:fldChar w:fldCharType="end"/>
+            </w:r>
+          </w:hyperlink>
+        </w:p>
+        <w:p>
+          <w:pPr>
+            <w:pStyle w:val="TDC2"/>
+            <w:rPr>
+              <w:rFonts w:eastAsiaTheme="minorEastAsia"/>
+              <w:b w:val="0"/>
+              <w:bCs w:val="0"/>
+              <w:kern w:val="2"/>
+              <w:sz w:val="24"/>
+              <w:szCs w:val="24"/>
+              <w:lang w:eastAsia="es-ES"/>
+              <w14:ligatures w14:val="standardContextual"/>
+            </w:rPr>
+          </w:pPr>
+          <w:hyperlink w:anchor="_Toc228071402" w:history="1">
+            <w:r>
+              <w:rPr>
+                <w:rStyle w:val="Hipervnculo"/>
+              </w:rPr>
+              <w:t>REGLAS DEL SISTEMA</w:t>
+            </w:r>
+            <w:r>
+              <w:rPr>
+                <w:webHidden/>
+              </w:rPr>
+              <w:tab/>
+            </w:r>
+            <w:r>
+              <w:rPr>
+                <w:webHidden/>
+              </w:rPr>
+              <w:fldChar w:fldCharType="begin"/>
+            </w:r>
+            <w:r>
+              <w:rPr>
+                <w:webHidden/>
+              </w:rPr>
+              <w:instrText xml:space="preserve"> PAGEREF _Toc228071402 \h </w:instrText>
+            </w:r>
+            <w:r>
+              <w:rPr>
+                <w:webHidden/>
+              </w:rPr>
+            </w:r>
+            <w:r>
+              <w:rPr>
+                <w:webHidden/>
+              </w:rPr>
+              <w:fldChar w:fldCharType="separate"/>
+            </w:r>
+            <w:r>
+              <w:rPr>
+                <w:webHidden/>
+              </w:rPr>
+              <w:t>13</w:t>
+            </w:r>
+            <w:r>
+              <w:rPr>
+                <w:webHidden/>
+              </w:rPr>
+              <w:fldChar w:fldCharType="end"/>
+            </w:r>
+          </w:hyperlink>
+        </w:p>
+        <w:p>
+          <w:pPr>
+            <w:pStyle w:val="TDC2"/>
+            <w:rPr>
+              <w:rFonts w:eastAsiaTheme="minorEastAsia"/>
+              <w:b w:val="0"/>
+              <w:bCs w:val="0"/>
+              <w:kern w:val="2"/>
+              <w:sz w:val="24"/>
+              <w:szCs w:val="24"/>
+              <w:lang w:eastAsia="es-ES"/>
+              <w14:ligatures w14:val="standardContextual"/>
+            </w:rPr>
+          </w:pPr>
+          <w:hyperlink w:anchor="_Toc228071403" w:history="1">
+            <w:r>
+              <w:rPr>
+                <w:rStyle w:val="Hipervnculo"/>
+              </w:rPr>
+              <w:t>DATOS DE CADA ACTOR Y ENTIDAD</w:t>
+            </w:r>
+            <w:r>
+              <w:rPr>
+                <w:webHidden/>
+              </w:rPr>
+              <w:tab/>
+            </w:r>
+            <w:r>
+              <w:rPr>
+                <w:webHidden/>
+              </w:rPr>
+              <w:fldChar w:fldCharType="begin"/>
+            </w:r>
+            <w:r>
+              <w:rPr>
+                <w:webHidden/>
+              </w:rPr>
+              <w:instrText xml:space="preserve"> PAGEREF _Toc228071403 \h </w:instrText>
+            </w:r>
+            <w:r>
+              <w:rPr>
+                <w:webHidden/>
+              </w:rPr>
+            </w:r>
+            <w:r>
+              <w:rPr>
+                <w:webHidden/>
+              </w:rPr>
+              <w:fldChar w:fldCharType="separate"/>
+            </w:r>
+            <w:r>
+              <w:rPr>
+                <w:webHidden/>
+              </w:rPr>
+              <w:t>14</w:t>
+            </w:r>
+            <w:r>
+              <w:rPr>
                 <w:webHidden/>
               </w:rPr>
               <w:fldChar w:fldCharType="end"/>
@@ -2323,13 +2451,13 @@
               <w14:ligatures w14:val="standardContextual"/>
             </w:rPr>
           </w:pPr>
-          <w:hyperlink w:anchor="_Toc225990375" w:history="1">
+          <w:hyperlink w:anchor="_Toc228071404" w:history="1">
             <w:r>
               <w:rPr>
                 <w:rStyle w:val="Hipervnculo"/>
                 <w:noProof/>
               </w:rPr>
-              <w:t>Traslado de un paciente a otra unidad u otro centro médico</w:t>
+              <w:t>ACTORES</w:t>
             </w:r>
             <w:r>
               <w:rPr>
@@ -2350,7 +2478,7 @@
                 <w:noProof/>
                 <w:webHidden/>
               </w:rPr>
-              <w:instrText xml:space="preserve"> PAGEREF _Toc225990375 \h </w:instrText>
+              <w:instrText xml:space="preserve"> PAGEREF _Toc228071404 \h </w:instrText>
             </w:r>
             <w:r>
               <w:rPr>
@@ -2370,139 +2498,11 @@
                 <w:noProof/>
                 <w:webHidden/>
               </w:rPr>
-              <w:t>16</w:t>
-            </w:r>
-            <w:r>
-              <w:rPr>
-                <w:noProof/>
-                <w:webHidden/>
-              </w:rPr>
-              <w:fldChar w:fldCharType="end"/>
-            </w:r>
-          </w:hyperlink>
-        </w:p>
-        <w:p>
-          <w:pPr>
-            <w:pStyle w:val="TDC2"/>
-            <w:rPr>
-              <w:rFonts w:eastAsiaTheme="minorEastAsia"/>
-              <w:b w:val="0"/>
-              <w:bCs w:val="0"/>
-              <w:kern w:val="2"/>
-              <w:sz w:val="24"/>
-              <w:szCs w:val="24"/>
-              <w:lang w:eastAsia="es-ES"/>
-              <w14:ligatures w14:val="standardContextual"/>
-            </w:rPr>
-          </w:pPr>
-          <w:hyperlink w:anchor="_Toc225990376" w:history="1">
-            <w:r>
-              <w:rPr>
-                <w:rStyle w:val="Hipervnculo"/>
-              </w:rPr>
-              <w:t>REGLAS DEL SISTEMA</w:t>
-            </w:r>
-            <w:r>
-              <w:rPr>
-                <w:webHidden/>
-              </w:rPr>
-              <w:tab/>
-            </w:r>
-            <w:r>
-              <w:rPr>
-                <w:webHidden/>
-              </w:rPr>
-              <w:fldChar w:fldCharType="begin"/>
-            </w:r>
-            <w:r>
-              <w:rPr>
-                <w:webHidden/>
-              </w:rPr>
-              <w:instrText xml:space="preserve"> PAGEREF _Toc225990376 \h </w:instrText>
-            </w:r>
-            <w:r>
-              <w:rPr>
-                <w:webHidden/>
-              </w:rPr>
-            </w:r>
-            <w:r>
-              <w:rPr>
-                <w:webHidden/>
-              </w:rPr>
-              <w:fldChar w:fldCharType="separate"/>
-            </w:r>
-            <w:r>
-              <w:rPr>
-                <w:webHidden/>
-              </w:rPr>
-              <w:t>19</w:t>
-            </w:r>
-            <w:r>
-              <w:rPr>
-                <w:webHidden/>
-              </w:rPr>
-              <w:fldChar w:fldCharType="end"/>
-            </w:r>
-          </w:hyperlink>
-        </w:p>
-        <w:p>
-          <w:pPr>
-            <w:pStyle w:val="TDC2"/>
-            <w:rPr>
-              <w:rFonts w:eastAsiaTheme="minorEastAsia"/>
-              <w:b w:val="0"/>
-              <w:bCs w:val="0"/>
-              <w:kern w:val="2"/>
-              <w:sz w:val="24"/>
-              <w:szCs w:val="24"/>
-              <w:lang w:eastAsia="es-ES"/>
-              <w14:ligatures w14:val="standardContextual"/>
-            </w:rPr>
-          </w:pPr>
-          <w:hyperlink w:anchor="_Toc225990377" w:history="1">
-            <w:r>
-              <w:rPr>
-                <w:rStyle w:val="Hipervnculo"/>
-              </w:rPr>
-              <w:t>DATOS DE CADA ACTOR Y ENTIDAD</w:t>
-            </w:r>
-            <w:r>
-              <w:rPr>
-                <w:webHidden/>
-              </w:rPr>
-              <w:tab/>
-            </w:r>
-            <w:r>
-              <w:rPr>
-                <w:webHidden/>
-              </w:rPr>
-              <w:fldChar w:fldCharType="begin"/>
-            </w:r>
-            <w:r>
-              <w:rPr>
-                <w:webHidden/>
-              </w:rPr>
-              <w:instrText xml:space="preserve"> PAGEREF _Toc225990377 \h </w:instrText>
-            </w:r>
-            <w:r>
-              <w:rPr>
-                <w:webHidden/>
-              </w:rPr>
-            </w:r>
-            <w:r>
-              <w:rPr>
-                <w:webHidden/>
-              </w:rPr>
-              <w:fldChar w:fldCharType="separate"/>
-            </w:r>
-            <w:r>
-              <w:rPr>
-                <w:webHidden/>
-              </w:rPr>
-              <w:t>21</w:t>
-            </w:r>
-            <w:r>
-              <w:rPr>
+              <w:t>14</w:t>
+            </w:r>
+            <w:r>
+              <w:rPr>
+                <w:noProof/>
                 <w:webHidden/>
               </w:rPr>
               <w:fldChar w:fldCharType="end"/>
@@ -2525,13 +2525,13 @@
               <w14:ligatures w14:val="standardContextual"/>
             </w:rPr>
           </w:pPr>
-          <w:hyperlink w:anchor="_Toc225990378" w:history="1">
+          <w:hyperlink w:anchor="_Toc228071405" w:history="1">
             <w:r>
               <w:rPr>
                 <w:rStyle w:val="Hipervnculo"/>
                 <w:noProof/>
               </w:rPr>
-              <w:t>ACTORES</w:t>
+              <w:t>ENTIDADES</w:t>
             </w:r>
             <w:r>
               <w:rPr>
@@ -2552,7 +2552,7 @@
                 <w:noProof/>
                 <w:webHidden/>
               </w:rPr>
-              <w:instrText xml:space="preserve"> PAGEREF _Toc225990378 \h </w:instrText>
+              <w:instrText xml:space="preserve"> PAGEREF _Toc228071405 \h </w:instrText>
             </w:r>
             <w:r>
               <w:rPr>
@@ -2572,11 +2572,75 @@
                 <w:noProof/>
                 <w:webHidden/>
               </w:rPr>
-              <w:t>21</w:t>
-            </w:r>
-            <w:r>
-              <w:rPr>
-                <w:noProof/>
+              <w:t>14</w:t>
+            </w:r>
+            <w:r>
+              <w:rPr>
+                <w:noProof/>
+                <w:webHidden/>
+              </w:rPr>
+              <w:fldChar w:fldCharType="end"/>
+            </w:r>
+          </w:hyperlink>
+        </w:p>
+        <w:p>
+          <w:pPr>
+            <w:pStyle w:val="TDC2"/>
+            <w:rPr>
+              <w:rFonts w:eastAsiaTheme="minorEastAsia"/>
+              <w:b w:val="0"/>
+              <w:bCs w:val="0"/>
+              <w:kern w:val="2"/>
+              <w:sz w:val="24"/>
+              <w:szCs w:val="24"/>
+              <w:lang w:eastAsia="es-ES"/>
+              <w14:ligatures w14:val="standardContextual"/>
+            </w:rPr>
+          </w:pPr>
+          <w:hyperlink w:anchor="_Toc228071406" w:history="1">
+            <w:r>
+              <w:rPr>
+                <w:rStyle w:val="Hipervnculo"/>
+              </w:rPr>
+              <w:t>DECISIONES TOMADAS Y JUSTIFICADAS</w:t>
+            </w:r>
+            <w:r>
+              <w:rPr>
+                <w:webHidden/>
+              </w:rPr>
+              <w:tab/>
+            </w:r>
+            <w:r>
+              <w:rPr>
+                <w:webHidden/>
+              </w:rPr>
+              <w:fldChar w:fldCharType="begin"/>
+            </w:r>
+            <w:r>
+              <w:rPr>
+                <w:webHidden/>
+              </w:rPr>
+              <w:instrText xml:space="preserve"> PAGEREF _Toc228071406 \h </w:instrText>
+            </w:r>
+            <w:r>
+              <w:rPr>
+                <w:webHidden/>
+              </w:rPr>
+            </w:r>
+            <w:r>
+              <w:rPr>
+                <w:webHidden/>
+              </w:rPr>
+              <w:fldChar w:fldCharType="separate"/>
+            </w:r>
+            <w:r>
+              <w:rPr>
+                <w:webHidden/>
+              </w:rPr>
+              <w:t>16</w:t>
+            </w:r>
+            <w:r>
+              <w:rPr>
                 <w:webHidden/>
               </w:rPr>
               <w:fldChar w:fldCharType="end"/>
@@ -2599,13 +2663,13 @@
               <w14:ligatures w14:val="standardContextual"/>
             </w:rPr>
           </w:pPr>
-          <w:hyperlink w:anchor="_Toc225990379" w:history="1">
+          <w:hyperlink w:anchor="_Toc228071407" w:history="1">
             <w:r>
               <w:rPr>
                 <w:rStyle w:val="Hipervnculo"/>
                 <w:noProof/>
               </w:rPr>
-              <w:t>ENTIDADES</w:t>
+              <w:t>¿Cómo simular el tiempo?</w:t>
             </w:r>
             <w:r>
               <w:rPr>
@@ -2626,7 +2690,7 @@
                 <w:noProof/>
                 <w:webHidden/>
               </w:rPr>
-              <w:instrText xml:space="preserve"> PAGEREF _Toc225990379 \h </w:instrText>
+              <w:instrText xml:space="preserve"> PAGEREF _Toc228071407 \h </w:instrText>
             </w:r>
             <w:r>
               <w:rPr>
@@ -2646,75 +2710,11 @@
                 <w:noProof/>
                 <w:webHidden/>
               </w:rPr>
-              <w:t>21</w:t>
-            </w:r>
-            <w:r>
-              <w:rPr>
-                <w:noProof/>
-                <w:webHidden/>
-              </w:rPr>
-              <w:fldChar w:fldCharType="end"/>
-            </w:r>
-          </w:hyperlink>
-        </w:p>
-        <w:p>
-          <w:pPr>
-            <w:pStyle w:val="TDC2"/>
-            <w:rPr>
-              <w:rFonts w:eastAsiaTheme="minorEastAsia"/>
-              <w:b w:val="0"/>
-              <w:bCs w:val="0"/>
-              <w:kern w:val="2"/>
-              <w:sz w:val="24"/>
-              <w:szCs w:val="24"/>
-              <w:lang w:eastAsia="es-ES"/>
-              <w14:ligatures w14:val="standardContextual"/>
-            </w:rPr>
-          </w:pPr>
-          <w:hyperlink w:anchor="_Toc225990380" w:history="1">
-            <w:r>
-              <w:rPr>
-                <w:rStyle w:val="Hipervnculo"/>
-              </w:rPr>
-              <w:t>MÉTODOS DE CADA ACTOR/ENTIDAD</w:t>
-            </w:r>
-            <w:r>
-              <w:rPr>
-                <w:webHidden/>
-              </w:rPr>
-              <w:tab/>
-            </w:r>
-            <w:r>
-              <w:rPr>
-                <w:webHidden/>
-              </w:rPr>
-              <w:fldChar w:fldCharType="begin"/>
-            </w:r>
-            <w:r>
-              <w:rPr>
-                <w:webHidden/>
-              </w:rPr>
-              <w:instrText xml:space="preserve"> PAGEREF _Toc225990380 \h </w:instrText>
-            </w:r>
-            <w:r>
-              <w:rPr>
-                <w:webHidden/>
-              </w:rPr>
-            </w:r>
-            <w:r>
-              <w:rPr>
-                <w:webHidden/>
-              </w:rPr>
-              <w:fldChar w:fldCharType="separate"/>
-            </w:r>
-            <w:r>
-              <w:rPr>
-                <w:webHidden/>
-              </w:rPr>
-              <w:t>23</w:t>
-            </w:r>
-            <w:r>
-              <w:rPr>
+              <w:t>16</w:t>
+            </w:r>
+            <w:r>
+              <w:rPr>
+                <w:noProof/>
                 <w:webHidden/>
               </w:rPr>
               <w:fldChar w:fldCharType="end"/>
@@ -2737,13 +2737,13 @@
               <w14:ligatures w14:val="standardContextual"/>
             </w:rPr>
           </w:pPr>
-          <w:hyperlink w:anchor="_Toc225990381" w:history="1">
+          <w:hyperlink w:anchor="_Toc228071408" w:history="1">
             <w:r>
               <w:rPr>
                 <w:rStyle w:val="Hipervnculo"/>
                 <w:noProof/>
               </w:rPr>
-              <w:t>ACTORES</w:t>
+              <w:t>¿Qué se entiende por “médicos y personal de salud”?</w:t>
             </w:r>
             <w:r>
               <w:rPr>
@@ -2764,7 +2764,7 @@
                 <w:noProof/>
                 <w:webHidden/>
               </w:rPr>
-              <w:instrText xml:space="preserve"> PAGEREF _Toc225990381 \h </w:instrText>
+              <w:instrText xml:space="preserve"> PAGEREF _Toc228071408 \h </w:instrText>
             </w:r>
             <w:r>
               <w:rPr>
@@ -2784,75 +2784,11 @@
                 <w:noProof/>
                 <w:webHidden/>
               </w:rPr>
-              <w:t>23</w:t>
-            </w:r>
-            <w:r>
-              <w:rPr>
-                <w:noProof/>
-                <w:webHidden/>
-              </w:rPr>
-              <w:fldChar w:fldCharType="end"/>
-            </w:r>
-          </w:hyperlink>
-        </w:p>
-        <w:p>
-          <w:pPr>
-            <w:pStyle w:val="TDC2"/>
-            <w:rPr>
-              <w:rFonts w:eastAsiaTheme="minorEastAsia"/>
-              <w:b w:val="0"/>
-              <w:bCs w:val="0"/>
-              <w:kern w:val="2"/>
-              <w:sz w:val="24"/>
-              <w:szCs w:val="24"/>
-              <w:lang w:eastAsia="es-ES"/>
-              <w14:ligatures w14:val="standardContextual"/>
-            </w:rPr>
-          </w:pPr>
-          <w:hyperlink w:anchor="_Toc225990382" w:history="1">
-            <w:r>
-              <w:rPr>
-                <w:rStyle w:val="Hipervnculo"/>
-              </w:rPr>
-              <w:t>DECISIONES TOMADAS Y JUSTIFICADAS</w:t>
-            </w:r>
-            <w:r>
-              <w:rPr>
-                <w:webHidden/>
-              </w:rPr>
-              <w:tab/>
-            </w:r>
-            <w:r>
-              <w:rPr>
-                <w:webHidden/>
-              </w:rPr>
-              <w:fldChar w:fldCharType="begin"/>
-            </w:r>
-            <w:r>
-              <w:rPr>
-                <w:webHidden/>
-              </w:rPr>
-              <w:instrText xml:space="preserve"> PAGEREF _Toc225990382 \h </w:instrText>
-            </w:r>
-            <w:r>
-              <w:rPr>
-                <w:webHidden/>
-              </w:rPr>
-            </w:r>
-            <w:r>
-              <w:rPr>
-                <w:webHidden/>
-              </w:rPr>
-              <w:fldChar w:fldCharType="separate"/>
-            </w:r>
-            <w:r>
-              <w:rPr>
-                <w:webHidden/>
-              </w:rPr>
-              <w:t>24</w:t>
-            </w:r>
-            <w:r>
-              <w:rPr>
+              <w:t>16</w:t>
+            </w:r>
+            <w:r>
+              <w:rPr>
+                <w:noProof/>
                 <w:webHidden/>
               </w:rPr>
               <w:fldChar w:fldCharType="end"/>
@@ -2875,13 +2811,13 @@
               <w14:ligatures w14:val="standardContextual"/>
             </w:rPr>
           </w:pPr>
-          <w:hyperlink w:anchor="_Toc225990383" w:history="1">
+          <w:hyperlink w:anchor="_Toc228071409" w:history="1">
             <w:r>
               <w:rPr>
                 <w:rStyle w:val="Hipervnculo"/>
                 <w:noProof/>
               </w:rPr>
-              <w:t>¿Cómo simular el tiempo?</w:t>
+              <w:t>¿Quién gestiona el traslado de pacientes?</w:t>
             </w:r>
             <w:r>
               <w:rPr>
@@ -2902,7 +2838,7 @@
                 <w:noProof/>
                 <w:webHidden/>
               </w:rPr>
-              <w:instrText xml:space="preserve"> PAGEREF _Toc225990383 \h </w:instrText>
+              <w:instrText xml:space="preserve"> PAGEREF _Toc228071409 \h </w:instrText>
             </w:r>
             <w:r>
               <w:rPr>
@@ -2922,7 +2858,7 @@
                 <w:noProof/>
                 <w:webHidden/>
               </w:rPr>
-              <w:t>24</w:t>
+              <w:t>16</w:t>
             </w:r>
             <w:r>
               <w:rPr>
@@ -2949,13 +2885,13 @@
               <w14:ligatures w14:val="standardContextual"/>
             </w:rPr>
           </w:pPr>
-          <w:hyperlink w:anchor="_Toc225990384" w:history="1">
+          <w:hyperlink w:anchor="_Toc228071410" w:history="1">
             <w:r>
               <w:rPr>
                 <w:rStyle w:val="Hipervnculo"/>
                 <w:noProof/>
               </w:rPr>
-              <w:t>¿Qué se entiende por “médicos y personal de salud”?</w:t>
+              <w:t>¿Quién se encarga de la evaluación final de los pacientes?</w:t>
             </w:r>
             <w:r>
               <w:rPr>
@@ -2976,7 +2912,7 @@
                 <w:noProof/>
                 <w:webHidden/>
               </w:rPr>
-              <w:instrText xml:space="preserve"> PAGEREF _Toc225990384 \h </w:instrText>
+              <w:instrText xml:space="preserve"> PAGEREF _Toc228071410 \h </w:instrText>
             </w:r>
             <w:r>
               <w:rPr>
@@ -2996,7 +2932,7 @@
                 <w:noProof/>
                 <w:webHidden/>
               </w:rPr>
-              <w:t>24</w:t>
+              <w:t>17</w:t>
             </w:r>
             <w:r>
               <w:rPr>
@@ -3023,13 +2959,13 @@
               <w14:ligatures w14:val="standardContextual"/>
             </w:rPr>
           </w:pPr>
-          <w:hyperlink w:anchor="_Toc225990385" w:history="1">
+          <w:hyperlink w:anchor="_Toc228071411" w:history="1">
             <w:r>
               <w:rPr>
                 <w:rStyle w:val="Hipervnculo"/>
                 <w:noProof/>
               </w:rPr>
-              <w:t>¿Quién gestiona el traslado de pacientes?</w:t>
+              <w:t>¿Cómo sabe el sistema que un paciente está listo para la evaluación final?</w:t>
             </w:r>
             <w:r>
               <w:rPr>
@@ -3050,7 +2986,7 @@
                 <w:noProof/>
                 <w:webHidden/>
               </w:rPr>
-              <w:instrText xml:space="preserve"> PAGEREF _Toc225990385 \h </w:instrText>
+              <w:instrText xml:space="preserve"> PAGEREF _Toc228071411 \h </w:instrText>
             </w:r>
             <w:r>
               <w:rPr>
@@ -3070,229 +3006,7 @@
                 <w:noProof/>
                 <w:webHidden/>
               </w:rPr>
-              <w:t>24</w:t>
-            </w:r>
-            <w:r>
-              <w:rPr>
-                <w:noProof/>
-                <w:webHidden/>
-              </w:rPr>
-              <w:fldChar w:fldCharType="end"/>
-            </w:r>
-          </w:hyperlink>
-        </w:p>
-        <w:p>
-          <w:pPr>
-            <w:pStyle w:val="TDC3"/>
-            <w:tabs>
-              <w:tab w:val="right" w:leader="dot" w:pos="8494"/>
-            </w:tabs>
-            <w:rPr>
-              <w:rFonts w:eastAsiaTheme="minorEastAsia"/>
-              <w:noProof/>
-              <w:kern w:val="2"/>
-              <w:sz w:val="24"/>
-              <w:szCs w:val="24"/>
-              <w:lang w:eastAsia="es-ES"/>
-              <w14:ligatures w14:val="standardContextual"/>
-            </w:rPr>
-          </w:pPr>
-          <w:hyperlink w:anchor="_Toc225990386" w:history="1">
-            <w:r>
-              <w:rPr>
-                <w:rStyle w:val="Hipervnculo"/>
-                <w:noProof/>
-              </w:rPr>
-              <w:t>¿Quién se encarga de la evaluación final de los paceintes?</w:t>
-            </w:r>
-            <w:r>
-              <w:rPr>
-                <w:noProof/>
-                <w:webHidden/>
-              </w:rPr>
-              <w:tab/>
-            </w:r>
-            <w:r>
-              <w:rPr>
-                <w:noProof/>
-                <w:webHidden/>
-              </w:rPr>
-              <w:fldChar w:fldCharType="begin"/>
-            </w:r>
-            <w:r>
-              <w:rPr>
-                <w:noProof/>
-                <w:webHidden/>
-              </w:rPr>
-              <w:instrText xml:space="preserve"> PAGEREF _Toc225990386 \h </w:instrText>
-            </w:r>
-            <w:r>
-              <w:rPr>
-                <w:noProof/>
-                <w:webHidden/>
-              </w:rPr>
-            </w:r>
-            <w:r>
-              <w:rPr>
-                <w:noProof/>
-                <w:webHidden/>
-              </w:rPr>
-              <w:fldChar w:fldCharType="separate"/>
-            </w:r>
-            <w:r>
-              <w:rPr>
-                <w:noProof/>
-                <w:webHidden/>
-              </w:rPr>
-              <w:t>25</w:t>
-            </w:r>
-            <w:r>
-              <w:rPr>
-                <w:noProof/>
-                <w:webHidden/>
-              </w:rPr>
-              <w:fldChar w:fldCharType="end"/>
-            </w:r>
-          </w:hyperlink>
-        </w:p>
-        <w:p>
-          <w:pPr>
-            <w:pStyle w:val="TDC3"/>
-            <w:tabs>
-              <w:tab w:val="right" w:leader="dot" w:pos="8494"/>
-            </w:tabs>
-            <w:rPr>
-              <w:rFonts w:eastAsiaTheme="minorEastAsia"/>
-              <w:noProof/>
-              <w:kern w:val="2"/>
-              <w:sz w:val="24"/>
-              <w:szCs w:val="24"/>
-              <w:lang w:eastAsia="es-ES"/>
-              <w14:ligatures w14:val="standardContextual"/>
-            </w:rPr>
-          </w:pPr>
-          <w:hyperlink w:anchor="_Toc225990387" w:history="1">
-            <w:r>
-              <w:rPr>
-                <w:rStyle w:val="Hipervnculo"/>
-                <w:noProof/>
-              </w:rPr>
-              <w:t>¿Las notas de evolución solo se pueden generar en una ronda médica?</w:t>
-            </w:r>
-            <w:r>
-              <w:rPr>
-                <w:noProof/>
-                <w:webHidden/>
-              </w:rPr>
-              <w:tab/>
-            </w:r>
-            <w:r>
-              <w:rPr>
-                <w:noProof/>
-                <w:webHidden/>
-              </w:rPr>
-              <w:fldChar w:fldCharType="begin"/>
-            </w:r>
-            <w:r>
-              <w:rPr>
-                <w:noProof/>
-                <w:webHidden/>
-              </w:rPr>
-              <w:instrText xml:space="preserve"> PAGEREF _Toc225990387 \h </w:instrText>
-            </w:r>
-            <w:r>
-              <w:rPr>
-                <w:noProof/>
-                <w:webHidden/>
-              </w:rPr>
-            </w:r>
-            <w:r>
-              <w:rPr>
-                <w:noProof/>
-                <w:webHidden/>
-              </w:rPr>
-              <w:fldChar w:fldCharType="separate"/>
-            </w:r>
-            <w:r>
-              <w:rPr>
-                <w:noProof/>
-                <w:webHidden/>
-              </w:rPr>
-              <w:t>25</w:t>
-            </w:r>
-            <w:r>
-              <w:rPr>
-                <w:noProof/>
-                <w:webHidden/>
-              </w:rPr>
-              <w:fldChar w:fldCharType="end"/>
-            </w:r>
-          </w:hyperlink>
-        </w:p>
-        <w:p>
-          <w:pPr>
-            <w:pStyle w:val="TDC3"/>
-            <w:tabs>
-              <w:tab w:val="right" w:leader="dot" w:pos="8494"/>
-            </w:tabs>
-            <w:rPr>
-              <w:rFonts w:eastAsiaTheme="minorEastAsia"/>
-              <w:noProof/>
-              <w:kern w:val="2"/>
-              <w:sz w:val="24"/>
-              <w:szCs w:val="24"/>
-              <w:lang w:eastAsia="es-ES"/>
-              <w14:ligatures w14:val="standardContextual"/>
-            </w:rPr>
-          </w:pPr>
-          <w:hyperlink w:anchor="_Toc225990388" w:history="1">
-            <w:r>
-              <w:rPr>
-                <w:rStyle w:val="Hipervnculo"/>
-                <w:noProof/>
-              </w:rPr>
-              <w:t>¿Cómo sabe el sistema que un paciente está listo para la evaluación final?</w:t>
-            </w:r>
-            <w:r>
-              <w:rPr>
-                <w:noProof/>
-                <w:webHidden/>
-              </w:rPr>
-              <w:tab/>
-            </w:r>
-            <w:r>
-              <w:rPr>
-                <w:noProof/>
-                <w:webHidden/>
-              </w:rPr>
-              <w:fldChar w:fldCharType="begin"/>
-            </w:r>
-            <w:r>
-              <w:rPr>
-                <w:noProof/>
-                <w:webHidden/>
-              </w:rPr>
-              <w:instrText xml:space="preserve"> PAGEREF _Toc225990388 \h </w:instrText>
-            </w:r>
-            <w:r>
-              <w:rPr>
-                <w:noProof/>
-                <w:webHidden/>
-              </w:rPr>
-            </w:r>
-            <w:r>
-              <w:rPr>
-                <w:noProof/>
-                <w:webHidden/>
-              </w:rPr>
-              <w:fldChar w:fldCharType="separate"/>
-            </w:r>
-            <w:r>
-              <w:rPr>
-                <w:noProof/>
-                <w:webHidden/>
-              </w:rPr>
-              <w:t>26</w:t>
+              <w:t>17</w:t>
             </w:r>
             <w:r>
               <w:rPr>
@@ -3377,7 +3091,7 @@
                             <w:bookmarkStart w:id="2" w:name="_Toc201837460"/>
                             <w:bookmarkStart w:id="3" w:name="_Toc201837471"/>
                             <w:bookmarkStart w:id="4" w:name="_Toc201837593"/>
-                            <w:bookmarkStart w:id="5" w:name="_Toc225990359"/>
+                            <w:bookmarkStart w:id="5" w:name="_Toc228071386"/>
                             <w:r>
                               <w:rPr>
                                 <w:rFonts w:ascii="Segoe UI Emoji" w:hAnsi="Segoe UI Emoji"/>
@@ -3428,7 +3142,7 @@
                       <w:bookmarkStart w:id="6" w:name="_Toc201837460"/>
                       <w:bookmarkStart w:id="7" w:name="_Toc201837471"/>
                       <w:bookmarkStart w:id="8" w:name="_Toc201837593"/>
-                      <w:bookmarkStart w:id="9" w:name="_Toc225990359"/>
+                      <w:bookmarkStart w:id="9" w:name="_Toc228071386"/>
                       <w:r>
                         <w:rPr>
                           <w:rFonts w:ascii="Segoe UI Emoji" w:hAnsi="Segoe UI Emoji"/>
@@ -3466,7 +3180,7 @@
         <w:pStyle w:val="Ttulo2"/>
       </w:pPr>
       <w:bookmarkStart w:id="10" w:name="_Toc201837594"/>
-      <w:bookmarkStart w:id="11" w:name="_Toc225990360"/>
+      <w:bookmarkStart w:id="11" w:name="_Toc228071387"/>
       <w:r>
         <w:lastRenderedPageBreak/>
         <w:t>A</w:t>
@@ -3481,7 +3195,7 @@
       <w:pPr>
         <w:pStyle w:val="Ttulo3"/>
       </w:pPr>
-      <w:bookmarkStart w:id="12" w:name="_Toc225990361"/>
+      <w:bookmarkStart w:id="12" w:name="_Toc228071388"/>
       <w:r>
         <w:t>¿Qué es un actor?</w:t>
       </w:r>
@@ -3545,7 +3259,7 @@
       <w:pPr>
         <w:pStyle w:val="Ttulo3"/>
       </w:pPr>
-      <w:bookmarkStart w:id="13" w:name="_Toc225990362"/>
+      <w:bookmarkStart w:id="13" w:name="_Toc228071389"/>
       <w:r>
         <w:t>Actores:</w:t>
       </w:r>
@@ -3860,7 +3574,7 @@
       <w:pPr>
         <w:pStyle w:val="Ttulo3"/>
       </w:pPr>
-      <w:bookmarkStart w:id="14" w:name="_Toc225990363"/>
+      <w:bookmarkStart w:id="14" w:name="_Toc228071390"/>
       <w:r>
         <w:t xml:space="preserve">¿Por qué </w:t>
       </w:r>
@@ -3922,7 +3636,7 @@
       <w:pPr>
         <w:pStyle w:val="Ttulo2"/>
       </w:pPr>
-      <w:bookmarkStart w:id="15" w:name="_Toc225990364"/>
+      <w:bookmarkStart w:id="15" w:name="_Toc228071391"/>
       <w:r>
         <w:lastRenderedPageBreak/>
         <w:t>ENTIDADES</w:t>
@@ -3933,7 +3647,7 @@
       <w:pPr>
         <w:pStyle w:val="Ttulo3"/>
       </w:pPr>
-      <w:bookmarkStart w:id="16" w:name="_Toc225990365"/>
+      <w:bookmarkStart w:id="16" w:name="_Toc228071392"/>
       <w:r>
         <w:t>¿</w:t>
       </w:r>
@@ -3967,7 +3681,7 @@
       <w:pPr>
         <w:pStyle w:val="Ttulo3"/>
       </w:pPr>
-      <w:bookmarkStart w:id="17" w:name="_Toc225990366"/>
+      <w:bookmarkStart w:id="17" w:name="_Toc228071393"/>
       <w:r>
         <w:t>Entidades</w:t>
       </w:r>
@@ -4302,7 +4016,7 @@
       <w:pPr>
         <w:pStyle w:val="Ttulo3"/>
       </w:pPr>
-      <w:bookmarkStart w:id="18" w:name="_Toc225990367"/>
+      <w:bookmarkStart w:id="18" w:name="_Toc228071394"/>
       <w:r>
         <w:t>¿Por qué elegimos estas Entidades?</w:t>
       </w:r>
@@ -4345,7 +4059,7 @@
       <w:pPr>
         <w:pStyle w:val="Ttulo2"/>
       </w:pPr>
-      <w:bookmarkStart w:id="19" w:name="_Toc225990368"/>
+      <w:bookmarkStart w:id="19" w:name="_Toc228071395"/>
       <w:r>
         <w:lastRenderedPageBreak/>
         <w:t>ACCIONES</w:t>
@@ -4356,7 +4070,7 @@
       <w:pPr>
         <w:pStyle w:val="Ttulo3"/>
       </w:pPr>
-      <w:bookmarkStart w:id="20" w:name="_Toc225990369"/>
+      <w:bookmarkStart w:id="20" w:name="_Toc228071396"/>
       <w:r>
         <w:t>¿Qué son las acciones</w:t>
       </w:r>
@@ -4532,7 +4246,7 @@
       <w:pPr>
         <w:pStyle w:val="Ttulo3"/>
       </w:pPr>
-      <w:bookmarkStart w:id="21" w:name="_Toc225990370"/>
+      <w:bookmarkStart w:id="21" w:name="_Toc228071397"/>
       <w:r>
         <w:lastRenderedPageBreak/>
         <w:t>Asignación de Camas</w:t>
@@ -4837,7 +4551,7 @@
       <w:pPr>
         <w:pStyle w:val="Ttulo3"/>
       </w:pPr>
-      <w:bookmarkStart w:id="25" w:name="_Toc225990371"/>
+      <w:bookmarkStart w:id="25" w:name="_Toc228071398"/>
       <w:r>
         <w:lastRenderedPageBreak/>
         <w:t>Proceso de Rondas Medicas Diarias</w:t>
@@ -5261,7 +4975,7 @@
       <w:pPr>
         <w:pStyle w:val="Ttulo3"/>
       </w:pPr>
-      <w:bookmarkStart w:id="27" w:name="_Toc225990373"/>
+      <w:bookmarkStart w:id="27" w:name="_Toc228071399"/>
       <w:r>
         <w:lastRenderedPageBreak/>
         <w:t>Evaluación final</w:t>
@@ -5553,7 +5267,7 @@
       <w:pPr>
         <w:pStyle w:val="Ttulo3"/>
       </w:pPr>
-      <w:bookmarkStart w:id="28" w:name="_Toc225990374"/>
+      <w:bookmarkStart w:id="28" w:name="_Toc228071400"/>
       <w:r>
         <w:lastRenderedPageBreak/>
         <w:t xml:space="preserve">Documentación del Alta </w:t>
@@ -5652,7 +5366,31 @@
         <w:jc w:val="both"/>
       </w:pPr>
       <w:r>
-        <w:t>Una vez</w:t>
+        <w:t>Cuando el miembro del personal administrativo inicie sesión, aparecerá una opción llamada “documentar altas”.</w:t>
+      </w:r>
+    </w:p>
+    <w:p>
+      <w:pPr>
+        <w:spacing w:line="276" w:lineRule="auto"/>
+        <w:jc w:val="both"/>
+      </w:pPr>
+      <w:r>
+        <w:t>Al darle en la opción, aparecerá una lista con los pacientes que ya tienen registrada un alta por recuperación o traslado.</w:t>
+      </w:r>
+    </w:p>
+    <w:p>
+      <w:pPr>
+        <w:spacing w:line="276" w:lineRule="auto"/>
+        <w:jc w:val="both"/>
+      </w:pPr>
+      <w:r>
+        <w:t xml:space="preserve">Al seleccionar un paciente, se podrá escribir la documentación de </w:t>
+      </w:r>
+      <w:r>
+        <w:t>dicha alta</w:t>
+      </w:r>
+      <w:r>
+        <w:t>.</w:t>
       </w:r>
     </w:p>
     <w:p>
@@ -5696,16 +5434,10 @@
         <w:t>á</w:t>
       </w:r>
       <w:r>
-        <w:t xml:space="preserve"> la documentación del Alta en el código referente al paciente especificado, todo esto en base a si se </w:t>
-      </w:r>
-      <w:r>
-        <w:t>creó</w:t>
-      </w:r>
-      <w:r>
-        <w:t xml:space="preserve"> </w:t>
-      </w:r>
-      <w:r>
-        <w:t>un Alta por recuperación o traslado anteriormente</w:t>
+        <w:t xml:space="preserve"> la documentación del Alt</w:t>
+      </w:r>
+      <w:r>
+        <w:t>a registrada del paciente en el sistema</w:t>
       </w:r>
       <w:r>
         <w:t>.</w:t>
@@ -5829,7 +5561,7 @@
         <w:pStyle w:val="Ttulo3"/>
         <w:ind w:left="0" w:firstLine="0"/>
       </w:pPr>
-      <w:bookmarkStart w:id="30" w:name="_Toc225990375"/>
+      <w:bookmarkStart w:id="30" w:name="_Toc228071401"/>
       <w:r>
         <w:lastRenderedPageBreak/>
         <w:t>Traslado de un paciente a otra unidad u otro centro</w:t>
@@ -5948,7 +5680,13 @@
         </w:numPr>
       </w:pPr>
       <w:r>
-        <w:t>¿Quiénes se involucran en el proceso/acción?</w:t>
+        <w:t xml:space="preserve">¿Quiénes se involucran en </w:t>
+      </w:r>
+      <w:r>
+        <w:t xml:space="preserve">la </w:t>
+      </w:r>
+      <w:r>
+        <w:t>acción?</w:t>
       </w:r>
     </w:p>
     <w:p>
@@ -6034,15 +5772,7 @@
         <w:pStyle w:val="Ttulo5"/>
       </w:pPr>
       <w:r>
-        <w:t>¿Dónde se implementará el proceso/acción en el sistema?</w:t>
-      </w:r>
-    </w:p>
-    <w:p>
-      <w:pPr>
-        <w:jc w:val="both"/>
-      </w:pPr>
-      <w:r>
-        <w:t>Dentro del código del sistema, en general, el código referente a una acción debería tenerla el código de quien hace la acción, y no de quien la sufre.</w:t>
+        <w:t>¿Cómo se verá visualmente está acción?</w:t>
       </w:r>
     </w:p>
     <w:p>
@@ -6051,10 +5781,95 @@
         <w:jc w:val="both"/>
       </w:pPr>
       <w:r>
-        <w:t xml:space="preserve">Debido a esto, implementaremos está acción en el código referente a los miembros del personal administrativo y los miembros del personal de </w:t>
-      </w:r>
-      <w:r>
-        <w:t>enfermaría</w:t>
+        <w:t xml:space="preserve">Cuando el miembro del personal </w:t>
+      </w:r>
+      <w:r>
+        <w:t>administrativo o de</w:t>
+      </w:r>
+      <w:r>
+        <w:t xml:space="preserve"> </w:t>
+      </w:r>
+      <w:r>
+        <w:t xml:space="preserve">enfermería </w:t>
+      </w:r>
+      <w:r>
+        <w:t>inicie sesión, aparecerá una opción llamada</w:t>
+      </w:r>
+      <w:r>
+        <w:t xml:space="preserve"> “Traslado”.</w:t>
+      </w:r>
+    </w:p>
+    <w:p>
+      <w:pPr>
+        <w:spacing w:line="276" w:lineRule="auto"/>
+        <w:jc w:val="both"/>
+      </w:pPr>
+      <w:r>
+        <w:t>Al seleccionar está opción, y luego seleccionar una unidad, aparecer una lista de los pacientes de dicha unidad, con información como su estado.</w:t>
+      </w:r>
+    </w:p>
+    <w:p>
+      <w:pPr>
+        <w:spacing w:line="276" w:lineRule="auto"/>
+        <w:jc w:val="both"/>
+      </w:pPr>
+      <w:r>
+        <w:t>Al seleccionar un paciente se dará la opción de trasladarlo a otra unidad o a otro hospital.</w:t>
+      </w:r>
+    </w:p>
+    <w:p>
+      <w:pPr>
+        <w:spacing w:line="276" w:lineRule="auto"/>
+        <w:jc w:val="both"/>
+      </w:pPr>
+      <w:r>
+        <w:t xml:space="preserve">Se </w:t>
+      </w:r>
+      <w:r>
+        <w:t>avisará</w:t>
+      </w:r>
+      <w:r>
+        <w:t xml:space="preserve"> si en dicha unidad no hay espacio para el traslado.</w:t>
+      </w:r>
+    </w:p>
+    <w:p>
+      <w:pPr>
+        <w:pStyle w:val="Ttulo5"/>
+      </w:pPr>
+      <w:r>
+        <w:t>¿Qué cambiar</w:t>
+      </w:r>
+      <w:r>
+        <w:t>á</w:t>
+      </w:r>
+      <w:r>
+        <w:t xml:space="preserve"> </w:t>
+      </w:r>
+      <w:r>
+        <w:t>este</w:t>
+      </w:r>
+      <w:r>
+        <w:t xml:space="preserve"> proceso/acción en el sistema?</w:t>
+      </w:r>
+    </w:p>
+    <w:p>
+      <w:pPr>
+        <w:jc w:val="both"/>
+      </w:pPr>
+      <w:r>
+        <w:t xml:space="preserve">Está acción </w:t>
+      </w:r>
+      <w:r>
+        <w:t>actualizar</w:t>
+      </w:r>
+      <w:r>
+        <w:t>á</w:t>
+      </w:r>
+      <w:r>
+        <w:t xml:space="preserve"> </w:t>
+      </w:r>
+      <w:r>
+        <w:t>la ubicación del paciente dentro del hospital</w:t>
       </w:r>
       <w:r>
         <w:t>.</w:t>
@@ -6062,141 +5877,22 @@
     </w:p>
     <w:p>
       <w:pPr>
-        <w:spacing w:line="276" w:lineRule="auto"/>
-        <w:jc w:val="both"/>
-      </w:pPr>
-    </w:p>
-    <w:p>
-      <w:pPr>
-        <w:spacing w:line="276" w:lineRule="auto"/>
-        <w:jc w:val="both"/>
-      </w:pPr>
-    </w:p>
-    <w:p>
-      <w:pPr>
-        <w:spacing w:line="276" w:lineRule="auto"/>
-        <w:jc w:val="both"/>
-      </w:pPr>
-    </w:p>
-    <w:p>
-      <w:pPr>
-        <w:spacing w:line="276" w:lineRule="auto"/>
-        <w:jc w:val="both"/>
-      </w:pPr>
-    </w:p>
-    <w:p>
-      <w:pPr>
-        <w:spacing w:line="276" w:lineRule="auto"/>
-        <w:jc w:val="both"/>
-      </w:pPr>
-    </w:p>
-    <w:p>
-      <w:pPr>
-        <w:spacing w:line="276" w:lineRule="auto"/>
-        <w:jc w:val="both"/>
-      </w:pPr>
-    </w:p>
-    <w:p>
-      <w:pPr>
-        <w:spacing w:line="276" w:lineRule="auto"/>
-        <w:jc w:val="both"/>
-      </w:pPr>
-    </w:p>
-    <w:p>
-      <w:pPr>
-        <w:pStyle w:val="Ttulo5"/>
-      </w:pPr>
-      <w:r>
-        <w:lastRenderedPageBreak/>
-        <w:t>¿Qué cambiar</w:t>
-      </w:r>
-      <w:r>
-        <w:t>á</w:t>
-      </w:r>
-      <w:r>
-        <w:t xml:space="preserve"> </w:t>
-      </w:r>
-      <w:r>
-        <w:t>este</w:t>
-      </w:r>
-      <w:r>
-        <w:t xml:space="preserve"> proceso/acción en el sistema?</w:t>
-      </w:r>
-    </w:p>
-    <w:p>
-      <w:pPr>
-        <w:jc w:val="both"/>
-      </w:pPr>
-      <w:r>
-        <w:t xml:space="preserve">Está acción </w:t>
-      </w:r>
-      <w:r>
-        <w:t>actualizar</w:t>
-      </w:r>
-      <w:r>
-        <w:t>á</w:t>
-      </w:r>
-      <w:r>
-        <w:t xml:space="preserve"> el dato referente a donde se aloja el paciente en el código del </w:t>
-      </w:r>
-      <w:r>
-        <w:t xml:space="preserve">ingreso </w:t>
-      </w:r>
-      <w:r>
-        <w:t xml:space="preserve">activo </w:t>
-      </w:r>
-      <w:r>
-        <w:t xml:space="preserve">del </w:t>
-      </w:r>
-      <w:r>
-        <w:t>propio paciente.</w:t>
-      </w:r>
-      <w:r>
-        <w:t xml:space="preserve"> </w:t>
-      </w:r>
-    </w:p>
-    <w:p>
-      <w:pPr>
-        <w:jc w:val="both"/>
-      </w:pPr>
-      <w:r>
-        <w:t xml:space="preserve">Si el traslado es a una nueva unidad, el dato </w:t>
-      </w:r>
-      <w:r>
-        <w:t>de</w:t>
-      </w:r>
-      <w:r>
-        <w:t xml:space="preserve"> donde se aloja el paciente se referirá a su nueva </w:t>
-      </w:r>
-      <w:r>
-        <w:t>localización</w:t>
-      </w:r>
-      <w:r>
-        <w:t xml:space="preserve"> asignada. Si el traslado es a </w:t>
+        <w:jc w:val="both"/>
+      </w:pPr>
+      <w:r>
+        <w:t xml:space="preserve">Si el traslado es a </w:t>
       </w:r>
       <w:r>
         <w:t>otro hospital</w:t>
       </w:r>
       <w:r>
-        <w:t>, el dato</w:t>
-      </w:r>
-      <w:r>
-        <w:t xml:space="preserve"> de</w:t>
-      </w:r>
-      <w:r>
-        <w:t xml:space="preserve"> donde se aloja el paciente se vaciará</w:t>
-      </w:r>
-      <w:r>
-        <w:t xml:space="preserve"> y</w:t>
-      </w:r>
-      <w:r>
-        <w:t xml:space="preserve"> se rellenará </w:t>
+        <w:t xml:space="preserve">, se rellenará </w:t>
       </w:r>
       <w:r>
         <w:t>los datos</w:t>
       </w:r>
       <w:r>
-        <w:t xml:space="preserve"> sobre el nuevo hospital del paciente en el código referente al propio paciente</w:t>
+        <w:t xml:space="preserve"> sobre el nuevo hospital del paciente</w:t>
       </w:r>
       <w:r>
         <w:t>,</w:t>
@@ -6218,565 +5914,12 @@
       <w:pPr>
         <w:jc w:val="both"/>
       </w:pPr>
-      <w:r>
-        <w:t>Solo se podrá hacer está acción sobre el código de los pacientes residentes del hospital, es decir, los pacientes con un ingreso activo</w:t>
-      </w:r>
-      <w:r>
-        <w:t xml:space="preserve">. </w:t>
-      </w:r>
-    </w:p>
-    <w:p>
-      <w:pPr>
-        <w:jc w:val="both"/>
-      </w:pPr>
-      <w:r>
-        <w:t>Solo se podrá hacer el proceso de traslado en pacientes que ya fueron asignados en primer lugar.</w:t>
-      </w:r>
-    </w:p>
-    <w:p>
-      <w:pPr>
-        <w:jc w:val="both"/>
-      </w:pPr>
-    </w:p>
-    <w:p>
-      <w:pPr>
-        <w:jc w:val="both"/>
-      </w:pPr>
-    </w:p>
-    <w:p>
-      <w:pPr>
-        <w:jc w:val="both"/>
-      </w:pPr>
-    </w:p>
-    <w:p>
-      <w:pPr>
-        <w:jc w:val="both"/>
-      </w:pPr>
-    </w:p>
-    <w:p>
-      <w:pPr>
-        <w:jc w:val="both"/>
-      </w:pPr>
-    </w:p>
-    <w:p>
-      <w:pPr>
-        <w:jc w:val="both"/>
-      </w:pPr>
-    </w:p>
-    <w:p>
-      <w:pPr>
-        <w:jc w:val="both"/>
-      </w:pPr>
-    </w:p>
-    <w:p>
-      <w:pPr>
-        <w:jc w:val="both"/>
-      </w:pPr>
-    </w:p>
-    <w:p>
-      <w:pPr>
-        <w:jc w:val="both"/>
-      </w:pPr>
-    </w:p>
-    <w:p>
-      <w:pPr>
-        <w:jc w:val="both"/>
-      </w:pPr>
-    </w:p>
-    <w:p>
-      <w:pPr>
-        <w:jc w:val="both"/>
-      </w:pPr>
-    </w:p>
-    <w:p>
-      <w:pPr>
-        <w:jc w:val="both"/>
-      </w:pPr>
-    </w:p>
-    <w:p>
-      <w:pPr>
-        <w:jc w:val="both"/>
-      </w:pPr>
-    </w:p>
-    <w:p>
-      <w:pPr>
-        <w:jc w:val="both"/>
-      </w:pPr>
-    </w:p>
-    <w:p>
-      <w:pPr>
-        <w:jc w:val="both"/>
-      </w:pPr>
-    </w:p>
-    <w:p>
-      <w:pPr>
-        <w:jc w:val="both"/>
-      </w:pPr>
-    </w:p>
-    <w:p>
-      <w:pPr>
-        <w:jc w:val="both"/>
-      </w:pPr>
-    </w:p>
-    <w:p>
-      <w:pPr>
-        <w:jc w:val="both"/>
-      </w:pPr>
-    </w:p>
-    <w:p>
-      <w:pPr>
-        <w:jc w:val="both"/>
-      </w:pPr>
-    </w:p>
-    <w:p>
-      <w:pPr>
-        <w:jc w:val="both"/>
-      </w:pPr>
-    </w:p>
-    <w:p>
-      <w:pPr>
-        <w:jc w:val="both"/>
-      </w:pPr>
-    </w:p>
-    <w:p>
-      <w:pPr>
-        <w:pStyle w:val="Ttulo4"/>
-      </w:pPr>
-      <w:r>
-        <w:lastRenderedPageBreak/>
-        <w:t>Implementación en código:</w:t>
-      </w:r>
-    </w:p>
-    <w:p>
-      <w:pPr>
-        <w:pStyle w:val="Ttulo5"/>
-        <w:numPr>
-          <w:ilvl w:val="0"/>
-          <w:numId w:val="17"/>
-        </w:numPr>
-      </w:pPr>
-      <w:r>
-        <w:t>¿De qué forma implementamos el proceso/acción?</w:t>
-      </w:r>
-    </w:p>
-    <w:p>
-      <w:pPr>
-        <w:spacing w:line="276" w:lineRule="auto"/>
-        <w:jc w:val="both"/>
-        <w:rPr>
-          <w:rFonts w:ascii="Arial" w:hAnsi="Arial" w:cs="Arial"/>
-        </w:rPr>
-      </w:pPr>
-      <w:r>
-        <w:t>“Trasladar a un paciente”</w:t>
-      </w:r>
-      <w:r>
-        <w:rPr>
-          <w:rFonts w:ascii="Arial" w:hAnsi="Arial" w:cs="Arial"/>
-        </w:rPr>
-        <w:t xml:space="preserve"> es una acción que hace algo o alguien </w:t>
-      </w:r>
-      <w:r>
-        <w:rPr>
-          <w:rFonts w:ascii="Arial" w:hAnsi="Arial" w:cs="Arial"/>
-        </w:rPr>
-        <w:t>en</w:t>
-      </w:r>
-      <w:r>
-        <w:rPr>
-          <w:rFonts w:ascii="Arial" w:hAnsi="Arial" w:cs="Arial"/>
-        </w:rPr>
-        <w:t xml:space="preserve"> el sistema, debido a eso es apropiado implementar está acción mediante un método.</w:t>
-      </w:r>
-    </w:p>
-    <w:p>
-      <w:pPr>
-        <w:pStyle w:val="Ttulo5"/>
-      </w:pPr>
-      <w:r>
-        <w:t>¿Dónde y cómo implementamos el método?</w:t>
-      </w:r>
-    </w:p>
-    <w:p>
-      <w:pPr>
-        <w:spacing w:line="276" w:lineRule="auto"/>
-        <w:jc w:val="both"/>
-      </w:pPr>
-      <w:r>
-        <w:t xml:space="preserve">Implementaremos </w:t>
-      </w:r>
-      <w:r>
-        <w:t>este</w:t>
-      </w:r>
-      <w:r>
-        <w:t xml:space="preserve"> método en l</w:t>
-      </w:r>
-      <w:r>
-        <w:t xml:space="preserve">as clases </w:t>
-      </w:r>
-      <w:r>
-        <w:t>“</w:t>
-      </w:r>
-      <w:proofErr w:type="spellStart"/>
-      <w:r>
-        <w:t>PersonalAdministrativo</w:t>
-      </w:r>
-      <w:proofErr w:type="spellEnd"/>
-      <w:r>
-        <w:t>” y “</w:t>
-      </w:r>
-      <w:proofErr w:type="spellStart"/>
-      <w:r>
-        <w:t>PersonalDeEnfermeria</w:t>
-      </w:r>
-      <w:proofErr w:type="spellEnd"/>
-      <w:r>
-        <w:t>”</w:t>
-      </w:r>
-      <w:r>
-        <w:t xml:space="preserve"> mediante una super clase común o mediante una interfaz, dependiendo de cuál sea más adecuada al momento de implementar está función.</w:t>
-      </w:r>
-    </w:p>
-    <w:p>
-      <w:pPr>
-        <w:pStyle w:val="Ttulo5"/>
-      </w:pPr>
-      <w:r>
-        <w:t>¿Qué cambiar</w:t>
-      </w:r>
-      <w:r>
-        <w:t>á</w:t>
-      </w:r>
-      <w:r>
-        <w:t xml:space="preserve"> el método en el código del sistema?</w:t>
-      </w:r>
-    </w:p>
-    <w:p>
-      <w:pPr>
-        <w:spacing w:line="276" w:lineRule="auto"/>
-        <w:jc w:val="both"/>
-      </w:pPr>
-      <w:r>
-        <w:t>Si en el método se especifica por parámetro que el traslado será a una nueva unidad:</w:t>
-      </w:r>
-    </w:p>
-    <w:p>
-      <w:pPr>
-        <w:pStyle w:val="Prrafodelista"/>
-        <w:numPr>
-          <w:ilvl w:val="0"/>
-          <w:numId w:val="18"/>
-        </w:numPr>
-        <w:spacing w:line="276" w:lineRule="auto"/>
-        <w:jc w:val="both"/>
-      </w:pPr>
-      <w:r>
-        <w:t>E</w:t>
-      </w:r>
-      <w:r>
-        <w:t xml:space="preserve">l método </w:t>
-      </w:r>
-      <w:r>
-        <w:t>actualiza</w:t>
-      </w:r>
-      <w:r>
-        <w:t xml:space="preserve"> </w:t>
-      </w:r>
-      <w:r>
-        <w:t>los</w:t>
-      </w:r>
-      <w:r>
-        <w:t xml:space="preserve"> </w:t>
-      </w:r>
-      <w:r>
-        <w:t>atributos referentes</w:t>
-      </w:r>
-      <w:r>
-        <w:t xml:space="preserve"> a </w:t>
-      </w:r>
-      <w:r>
-        <w:t xml:space="preserve">su </w:t>
-      </w:r>
-      <w:r>
-        <w:t>“</w:t>
-      </w:r>
-      <w:r>
-        <w:t>unidad asignada</w:t>
-      </w:r>
-      <w:r>
-        <w:t>”</w:t>
-      </w:r>
-      <w:r>
-        <w:t xml:space="preserve"> y “cama asignada”</w:t>
-      </w:r>
-      <w:r>
-        <w:t xml:space="preserve"> d</w:t>
-      </w:r>
-      <w:r>
-        <w:t>el objeto</w:t>
-      </w:r>
-      <w:r>
-        <w:t xml:space="preserve"> “Ingreso” </w:t>
-      </w:r>
-      <w:r>
-        <w:t>correspondiente</w:t>
-      </w:r>
-      <w:r>
-        <w:t xml:space="preserve"> al ingreso activo de un paciente</w:t>
-      </w:r>
-      <w:r>
-        <w:t>.</w:t>
-      </w:r>
-    </w:p>
-    <w:p>
-      <w:pPr>
-        <w:pStyle w:val="Prrafodelista"/>
-        <w:numPr>
-          <w:ilvl w:val="0"/>
-          <w:numId w:val="18"/>
-        </w:numPr>
-        <w:spacing w:line="276" w:lineRule="auto"/>
-        <w:jc w:val="both"/>
-      </w:pPr>
-      <w:r>
-        <w:t xml:space="preserve">El método </w:t>
-      </w:r>
-      <w:r>
-        <w:t>vaciara</w:t>
-      </w:r>
-      <w:r>
-        <w:t xml:space="preserve"> el atributo referente al “paciente asignado” del objeto “Cama” de la antigua cama y la marcara como “cama libre”.</w:t>
-      </w:r>
-    </w:p>
-    <w:p>
-      <w:pPr>
-        <w:pStyle w:val="Prrafodelista"/>
-        <w:numPr>
-          <w:ilvl w:val="0"/>
-          <w:numId w:val="18"/>
-        </w:numPr>
-        <w:spacing w:line="276" w:lineRule="auto"/>
-        <w:jc w:val="both"/>
-      </w:pPr>
-      <w:r>
-        <w:t>El método actualizara el atributo referente al “paciente asignado” del objeto “Cama” de la nueva cama y la marcara como una “cama ocupada”.</w:t>
-      </w:r>
-    </w:p>
-    <w:p>
-      <w:pPr>
-        <w:spacing w:line="276" w:lineRule="auto"/>
-        <w:jc w:val="both"/>
-      </w:pPr>
-      <w:r>
-        <w:t>Pero si se especifica por parámetro que el traslado será a otro hospital:</w:t>
-      </w:r>
-    </w:p>
-    <w:p>
-      <w:pPr>
-        <w:pStyle w:val="Prrafodelista"/>
-        <w:numPr>
-          <w:ilvl w:val="0"/>
-          <w:numId w:val="18"/>
-        </w:numPr>
-        <w:spacing w:line="276" w:lineRule="auto"/>
-        <w:jc w:val="both"/>
-      </w:pPr>
-      <w:r>
-        <w:t>El método vaciar</w:t>
-      </w:r>
-      <w:r>
-        <w:t>á</w:t>
-      </w:r>
-      <w:r>
-        <w:t xml:space="preserve"> </w:t>
-      </w:r>
-      <w:r>
-        <w:t>los</w:t>
-      </w:r>
-      <w:r>
-        <w:t xml:space="preserve"> atributo</w:t>
-      </w:r>
-      <w:r>
-        <w:t>s</w:t>
-      </w:r>
-      <w:r>
-        <w:t xml:space="preserve"> referente</w:t>
-      </w:r>
-      <w:r>
-        <w:t>s</w:t>
-      </w:r>
-      <w:r>
-        <w:t xml:space="preserve"> a “</w:t>
-      </w:r>
-      <w:r>
-        <w:t>unidad asignada</w:t>
-      </w:r>
-      <w:r>
-        <w:t>”</w:t>
-      </w:r>
-      <w:r>
-        <w:t xml:space="preserve"> y “cama asignada”</w:t>
-      </w:r>
-      <w:r>
-        <w:t xml:space="preserve"> del objeto </w:t>
-      </w:r>
-      <w:r>
-        <w:t>“Ingreso” correspondiente al ingreso activo del p</w:t>
-      </w:r>
-      <w:r>
-        <w:t>aciente.</w:t>
-      </w:r>
-    </w:p>
-    <w:p>
-      <w:pPr>
-        <w:pStyle w:val="Prrafodelista"/>
-        <w:numPr>
-          <w:ilvl w:val="0"/>
-          <w:numId w:val="18"/>
-        </w:numPr>
-        <w:spacing w:line="276" w:lineRule="auto"/>
-        <w:jc w:val="both"/>
-      </w:pPr>
-      <w:r>
-        <w:t xml:space="preserve">El método </w:t>
-      </w:r>
-      <w:r>
-        <w:t>vaciará</w:t>
-      </w:r>
-      <w:r>
-        <w:t xml:space="preserve"> el atributo referente al “paciente asignado” del objeto “Cama” de la antigua cama y la </w:t>
-      </w:r>
-      <w:r>
-        <w:t>marcará</w:t>
-      </w:r>
-      <w:r>
-        <w:t xml:space="preserve"> como “cama libre”.</w:t>
-      </w:r>
-    </w:p>
-    <w:p>
-      <w:pPr>
-        <w:pStyle w:val="Prrafodelista"/>
-        <w:numPr>
-          <w:ilvl w:val="0"/>
-          <w:numId w:val="18"/>
-        </w:numPr>
-        <w:spacing w:line="276" w:lineRule="auto"/>
-        <w:jc w:val="both"/>
-      </w:pPr>
-      <w:r>
-        <w:t>El método creará</w:t>
-      </w:r>
-      <w:r>
-        <w:t xml:space="preserve"> un nuevo objeto “Alta” de tipo “Traslado”</w:t>
-      </w:r>
-      <w:r>
-        <w:t>.</w:t>
-      </w:r>
-      <w:r>
-        <w:t xml:space="preserve"> </w:t>
-      </w:r>
-      <w:r>
-        <w:t>D</w:t>
-      </w:r>
-      <w:r>
-        <w:t xml:space="preserve">entro del alta se </w:t>
-      </w:r>
-      <w:r>
-        <w:t>creará</w:t>
-      </w:r>
-      <w:r>
-        <w:t xml:space="preserve"> un objeto “Traslado”, donde se guardará la información sobre el traslado, como “fecha de traslado”</w:t>
-      </w:r>
-      <w:r>
-        <w:t xml:space="preserve">, </w:t>
-      </w:r>
-      <w:r>
-        <w:t>“Hospital destino”</w:t>
-      </w:r>
-      <w:r>
-        <w:t>, etc</w:t>
-      </w:r>
-      <w:r>
-        <w:t>.</w:t>
-      </w:r>
-    </w:p>
-    <w:p>
-      <w:pPr>
-        <w:pStyle w:val="Prrafodelista"/>
-        <w:numPr>
-          <w:ilvl w:val="0"/>
-          <w:numId w:val="18"/>
-        </w:numPr>
-        <w:spacing w:line="276" w:lineRule="auto"/>
-        <w:jc w:val="both"/>
-      </w:pPr>
-      <w:r>
-        <w:t>El ingreso activo del paciente pasar</w:t>
-      </w:r>
-      <w:r>
-        <w:t>á</w:t>
-      </w:r>
-      <w:r>
-        <w:t xml:space="preserve"> a estar inactivo.</w:t>
-      </w:r>
-    </w:p>
-    <w:p>
-      <w:pPr>
-        <w:spacing w:line="276" w:lineRule="auto"/>
-        <w:jc w:val="both"/>
-      </w:pPr>
-      <w:r>
-        <w:t>Este</w:t>
-      </w:r>
-      <w:r>
-        <w:t xml:space="preserve"> método solo se podrá usar en pacientes con su último ingreso activo, si se intenta usar en objeto</w:t>
-      </w:r>
-      <w:r>
-        <w:t>s</w:t>
-      </w:r>
-      <w:r>
-        <w:t xml:space="preserve"> “Paciente” que no tienen un ingreso activo, el método deberá lanzar excepción.</w:t>
-      </w:r>
-    </w:p>
-    <w:p>
-      <w:pPr>
-        <w:spacing w:line="276" w:lineRule="auto"/>
-        <w:jc w:val="both"/>
-      </w:pPr>
-      <w:r>
-        <w:t xml:space="preserve">Este método solo se podrá usar en pacientes que ya hayan sido asignados anteriormente, con el método referente al proceso de asignación de pacientes de </w:t>
-      </w:r>
-      <w:proofErr w:type="spellStart"/>
-      <w:r>
-        <w:t>está</w:t>
-      </w:r>
-      <w:proofErr w:type="spellEnd"/>
-      <w:r>
-        <w:t xml:space="preserve"> misma clase, el método deberá lanzar excepción si esto no se cumple.</w:t>
-      </w:r>
-    </w:p>
-    <w:p>
-      <w:pPr>
-        <w:spacing w:line="276" w:lineRule="auto"/>
-        <w:jc w:val="both"/>
-      </w:pPr>
-    </w:p>
-    <w:p>
-      <w:pPr>
-        <w:spacing w:line="276" w:lineRule="auto"/>
-        <w:jc w:val="both"/>
-      </w:pPr>
-    </w:p>
-    <w:p>
-      <w:r>
-        <w:br w:type="page"/>
-      </w:r>
     </w:p>
     <w:p>
       <w:pPr>
         <w:pStyle w:val="Ttulo2"/>
       </w:pPr>
-      <w:bookmarkStart w:id="31" w:name="_Toc225990376"/>
+      <w:bookmarkStart w:id="31" w:name="_Toc228071402"/>
       <w:r>
         <w:lastRenderedPageBreak/>
         <w:t>REGLAS DEL SISTEMA</w:t>
@@ -6804,15 +5947,7 @@
         <w:jc w:val="both"/>
       </w:pPr>
       <w:r>
-        <w:t xml:space="preserve">El proceso de asignación solo deberá funcionar la primera vez que el paciente valla a ser vinculado con una unidad, habitación y cama, si se quiere reasignar al paciente se </w:t>
-      </w:r>
-      <w:proofErr w:type="gramStart"/>
-      <w:r>
-        <w:t>usara</w:t>
-      </w:r>
-      <w:proofErr w:type="gramEnd"/>
-      <w:r>
-        <w:t xml:space="preserve"> el proceso de traslado.</w:t>
+        <w:t>Una cama solo puede estar asignada a un único paciente, no puede haber 2 pacientes asignados a la misma cama a la vez.</w:t>
       </w:r>
     </w:p>
     <w:p>
@@ -6828,7 +5963,7 @@
         <w:jc w:val="both"/>
       </w:pPr>
       <w:r>
-        <w:t>Una cama solo puede estar asignada a un único paciente, no puede haber 2 pacientes asignados a la misma cama a la vez.</w:t>
+        <w:t>Solo se puede asignar una cama a un paciente, si el estado de la cama es “disponible”, no se puede asignar una cama ocupada.</w:t>
       </w:r>
     </w:p>
     <w:p>
@@ -6844,7 +5979,7 @@
         <w:jc w:val="both"/>
       </w:pPr>
       <w:r>
-        <w:t>Solo se puede asignar una cama a un paciente, si el estado de la cama es “disponible”, no se puede asignar una cama ocupada.</w:t>
+        <w:t>La disponibilidad de una unidad se calcula como el porcentaje de camas disponibles sobre el total de camas en esa unidad.</w:t>
       </w:r>
     </w:p>
     <w:p>
@@ -6860,22 +5995,6 @@
         <w:jc w:val="both"/>
       </w:pPr>
       <w:r>
-        <w:t>La disponibilidad de una unidad se calcula como el porcentaje de camas disponibles sobre el total de camas en esa unidad.</w:t>
-      </w:r>
-    </w:p>
-    <w:p>
-      <w:pPr>
-        <w:pStyle w:val="Prrafodelista"/>
-        <w:numPr>
-          <w:ilvl w:val="0"/>
-          <w:numId w:val="19"/>
-        </w:numPr>
-        <w:spacing w:line="276" w:lineRule="auto"/>
-        <w:ind w:left="357" w:hanging="357"/>
-        <w:contextualSpacing w:val="0"/>
-        <w:jc w:val="both"/>
-      </w:pPr>
-      <w:r>
         <w:t>Solo se puede asignar una cama a un paciente con su último ingreso activo.</w:t>
       </w:r>
     </w:p>
@@ -7057,25 +6176,9 @@
     </w:p>
     <w:p>
       <w:pPr>
-        <w:jc w:val="both"/>
-      </w:pPr>
-    </w:p>
-    <w:p>
-      <w:pPr>
-        <w:jc w:val="both"/>
-      </w:pPr>
-    </w:p>
-    <w:p>
-      <w:pPr>
-        <w:jc w:val="both"/>
-      </w:pPr>
-    </w:p>
-    <w:p>
-      <w:pPr>
         <w:pStyle w:val="Ttulo4"/>
       </w:pPr>
       <w:r>
-        <w:lastRenderedPageBreak/>
         <w:t>Sobre el Traslado:</w:t>
       </w:r>
     </w:p>
@@ -7116,7 +6219,7 @@
       <w:pPr>
         <w:pStyle w:val="Ttulo2"/>
       </w:pPr>
-      <w:bookmarkStart w:id="32" w:name="_Toc225990377"/>
+      <w:bookmarkStart w:id="32" w:name="_Toc228071403"/>
       <w:r>
         <w:lastRenderedPageBreak/>
         <w:t xml:space="preserve">DATOS DE </w:t>
@@ -7139,7 +6242,7 @@
       <w:pPr>
         <w:pStyle w:val="Ttulo3"/>
       </w:pPr>
-      <w:bookmarkStart w:id="33" w:name="_Toc225990378"/>
+      <w:bookmarkStart w:id="33" w:name="_Toc228071404"/>
       <w:r>
         <w:t>ACTORES</w:t>
       </w:r>
@@ -7203,7 +6306,7 @@
         <w:spacing w:before="480"/>
         <w:ind w:left="357" w:hanging="357"/>
       </w:pPr>
-      <w:bookmarkStart w:id="34" w:name="_Toc225990379"/>
+      <w:bookmarkStart w:id="34" w:name="_Toc228071405"/>
       <w:r>
         <w:t>ENTIDADES</w:t>
       </w:r>
@@ -7539,7 +6642,13 @@
         </w:numPr>
       </w:pPr>
       <w:r>
-        <w:t>Fecha del Traslado</w:t>
+        <w:t>Hora</w:t>
+      </w:r>
+      <w:r>
+        <w:t xml:space="preserve"> del</w:t>
+      </w:r>
+      <w:r>
+        <w:t xml:space="preserve"> Traslado</w:t>
       </w:r>
     </w:p>
     <w:p>
@@ -7768,21 +6877,24 @@
       </w:pPr>
     </w:p>
     <w:p>
-      <w:pPr>
-        <w:spacing w:line="276" w:lineRule="auto"/>
-      </w:pPr>
+      <w:r>
+        <w:br w:type="page"/>
+      </w:r>
     </w:p>
     <w:p>
       <w:pPr>
         <w:pStyle w:val="Ttulo2"/>
       </w:pPr>
-      <w:bookmarkStart w:id="35" w:name="_Toc225990380"/>
+      <w:bookmarkStart w:id="35" w:name="_Toc228071406"/>
       <w:r>
         <w:lastRenderedPageBreak/>
-        <w:t>MÉTODOS</w:t>
-      </w:r>
-      <w:r>
-        <w:t xml:space="preserve"> DE CADA ACTOR/ENTIDAD</w:t>
+        <w:t xml:space="preserve">DECISIONES </w:t>
+      </w:r>
+      <w:r>
+        <w:t>TOMADAS</w:t>
+      </w:r>
+      <w:r>
+        <w:t xml:space="preserve"> Y JUSTIFICADAS</w:t>
       </w:r>
       <w:bookmarkEnd w:id="35"/>
     </w:p>
@@ -7790,491 +6902,70 @@
       <w:pPr>
         <w:pStyle w:val="Ttulo3"/>
       </w:pPr>
-      <w:bookmarkStart w:id="36" w:name="_Toc225990381"/>
-      <w:r>
-        <w:t>ACTORES</w:t>
+      <w:bookmarkStart w:id="36" w:name="_Toc228071407"/>
+      <w:r>
+        <w:t>¿Cómo simular el tiempo?</w:t>
       </w:r>
       <w:bookmarkEnd w:id="36"/>
     </w:p>
     <w:p>
       <w:pPr>
-        <w:pStyle w:val="Ttulo4"/>
-      </w:pPr>
-      <w:r>
-        <w:t>Personal de Salud &lt;&lt;</w:t>
-      </w:r>
-      <w:proofErr w:type="spellStart"/>
-      <w:r>
-        <w:t>asbtract</w:t>
-      </w:r>
-      <w:proofErr w:type="spellEnd"/>
-      <w:r>
-        <w:t>&gt;&gt;:</w:t>
-      </w:r>
-    </w:p>
-    <w:p>
-      <w:pPr>
-        <w:pStyle w:val="Prrafodelista"/>
-        <w:numPr>
-          <w:ilvl w:val="0"/>
-          <w:numId w:val="21"/>
-        </w:numPr>
-        <w:jc w:val="both"/>
-      </w:pPr>
+        <w:jc w:val="both"/>
+      </w:pPr>
+      <w:r>
+        <w:t>El manejo de un hospital es algo que lleva días. Así que, pensamos para nuestro programa simular el tiempo de forma más rápida.</w:t>
+      </w:r>
+    </w:p>
+    <w:p>
+      <w:pPr>
+        <w:jc w:val="both"/>
+      </w:pPr>
+      <w:r>
+        <w:t>Podríamos crear una clase de utilidad llamada “Tiempo” o algo así, con un método llamado “</w:t>
+      </w:r>
       <w:proofErr w:type="spellStart"/>
       <w:proofErr w:type="gramStart"/>
       <w:r>
-        <w:rPr>
-          <w:b/>
-          <w:bCs/>
-        </w:rPr>
-        <w:t>generarNotaEvolucionPaciente</w:t>
+        <w:t>avanzarDia</w:t>
       </w:r>
       <w:proofErr w:type="spellEnd"/>
       <w:r>
-        <w:rPr>
-          <w:b/>
-          <w:bCs/>
-        </w:rPr>
         <w:t>(</w:t>
       </w:r>
       <w:proofErr w:type="gramEnd"/>
       <w:r>
-        <w:rPr>
-          <w:b/>
-          <w:bCs/>
-        </w:rPr>
-        <w:t>):</w:t>
-      </w:r>
-      <w:r>
-        <w:t xml:space="preserve"> Método que sirve para generar un nuevo objeto “</w:t>
-      </w:r>
-      <w:proofErr w:type="spellStart"/>
-      <w:r>
-        <w:t>NotaDeEvolucion</w:t>
-      </w:r>
-      <w:proofErr w:type="spellEnd"/>
-      <w:r>
-        <w:t>” en el objeto “Ingreso” correspondiente al ingreso activo de un paciente en específico.</w:t>
-      </w:r>
-    </w:p>
-    <w:p>
-      <w:pPr>
-        <w:pStyle w:val="Prrafodelista"/>
-        <w:numPr>
-          <w:ilvl w:val="0"/>
-          <w:numId w:val="21"/>
-        </w:numPr>
-        <w:ind w:left="357" w:hanging="357"/>
-        <w:contextualSpacing w:val="0"/>
-        <w:jc w:val="both"/>
-      </w:pPr>
-      <w:proofErr w:type="spellStart"/>
-      <w:proofErr w:type="gramStart"/>
-      <w:r>
-        <w:rPr>
-          <w:b/>
-          <w:bCs/>
-        </w:rPr>
-        <w:t>rondaMedicaDiariaPaciente</w:t>
-      </w:r>
-      <w:proofErr w:type="spellEnd"/>
-      <w:r>
-        <w:rPr>
-          <w:b/>
-          <w:bCs/>
-        </w:rPr>
-        <w:t>(</w:t>
-      </w:r>
-      <w:proofErr w:type="gramEnd"/>
-      <w:r>
-        <w:rPr>
-          <w:b/>
-          <w:bCs/>
-        </w:rPr>
-        <w:t>):</w:t>
-      </w:r>
-      <w:r>
-        <w:t xml:space="preserve"> Método que sirve para hacer una ronda médica diaria a un paciente en específico.</w:t>
-      </w:r>
-    </w:p>
-    <w:p>
-      <w:pPr>
-        <w:pStyle w:val="Ttulo4"/>
-      </w:pPr>
-      <w:r>
-        <w:t>Personal</w:t>
-      </w:r>
-      <w:r>
-        <w:t xml:space="preserve"> de Enfermería:</w:t>
-      </w:r>
-    </w:p>
-    <w:p>
-      <w:pPr>
-        <w:pStyle w:val="Prrafodelista"/>
-        <w:numPr>
-          <w:ilvl w:val="0"/>
-          <w:numId w:val="21"/>
-        </w:numPr>
-        <w:ind w:left="357" w:hanging="357"/>
-        <w:contextualSpacing w:val="0"/>
-        <w:jc w:val="both"/>
-      </w:pPr>
-      <w:proofErr w:type="spellStart"/>
-      <w:proofErr w:type="gramStart"/>
-      <w:r>
-        <w:rPr>
-          <w:b/>
-          <w:bCs/>
-        </w:rPr>
-        <w:t>asignarCamaPaciente</w:t>
-      </w:r>
-      <w:proofErr w:type="spellEnd"/>
-      <w:r>
-        <w:rPr>
-          <w:b/>
-          <w:bCs/>
-        </w:rPr>
-        <w:t>(</w:t>
-      </w:r>
-      <w:proofErr w:type="gramEnd"/>
-      <w:r>
-        <w:rPr>
-          <w:b/>
-          <w:bCs/>
-        </w:rPr>
-        <w:t>):</w:t>
-      </w:r>
-      <w:r>
-        <w:t xml:space="preserve"> Método que sirve para vincular un Paciente a una cama y la unidad de esa cama.</w:t>
-      </w:r>
-    </w:p>
-    <w:p>
-      <w:pPr>
-        <w:pStyle w:val="Prrafodelista"/>
-        <w:numPr>
-          <w:ilvl w:val="0"/>
-          <w:numId w:val="21"/>
-        </w:numPr>
-        <w:jc w:val="both"/>
-      </w:pPr>
-      <w:proofErr w:type="spellStart"/>
-      <w:proofErr w:type="gramStart"/>
-      <w:r>
-        <w:rPr>
-          <w:b/>
-          <w:bCs/>
-        </w:rPr>
-        <w:t>trasladoPaciente</w:t>
-      </w:r>
-      <w:proofErr w:type="spellEnd"/>
-      <w:r>
-        <w:rPr>
-          <w:b/>
-          <w:bCs/>
-        </w:rPr>
-        <w:t>(</w:t>
-      </w:r>
-      <w:proofErr w:type="gramEnd"/>
-      <w:r>
-        <w:rPr>
-          <w:b/>
-          <w:bCs/>
-        </w:rPr>
-        <w:t>):</w:t>
-      </w:r>
-      <w:r>
-        <w:t xml:space="preserve"> Método que sirve para trasladar a otro hospital o a otra unidad del nuestro hospital.</w:t>
-      </w:r>
-    </w:p>
-    <w:p>
-      <w:pPr>
-        <w:pStyle w:val="Ttulo4"/>
-      </w:pPr>
-      <w:r>
-        <w:t>Médico:</w:t>
-      </w:r>
-    </w:p>
-    <w:p>
-      <w:pPr>
-        <w:pStyle w:val="Prrafodelista"/>
-        <w:numPr>
-          <w:ilvl w:val="0"/>
-          <w:numId w:val="21"/>
-        </w:numPr>
-        <w:jc w:val="both"/>
-      </w:pPr>
-      <w:proofErr w:type="spellStart"/>
-      <w:proofErr w:type="gramStart"/>
-      <w:r>
-        <w:rPr>
-          <w:b/>
-          <w:bCs/>
-        </w:rPr>
-        <w:t>evaluacionFinalPaciente</w:t>
-      </w:r>
-      <w:proofErr w:type="spellEnd"/>
-      <w:r>
-        <w:rPr>
-          <w:b/>
-          <w:bCs/>
-        </w:rPr>
-        <w:t>(</w:t>
-      </w:r>
-      <w:proofErr w:type="gramEnd"/>
-      <w:r>
-        <w:rPr>
-          <w:b/>
-          <w:bCs/>
-        </w:rPr>
-        <w:t>):</w:t>
-      </w:r>
-      <w:r>
-        <w:t xml:space="preserve"> Método que sirve para hacer la evaluación final a un paciente en específico después de una ronda médica diaria exitosa.</w:t>
-      </w:r>
-    </w:p>
-    <w:p>
-      <w:pPr>
-        <w:pStyle w:val="Ttulo4"/>
-      </w:pPr>
-      <w:r>
-        <w:t>Personal Administrativo:</w:t>
-      </w:r>
-    </w:p>
-    <w:p>
-      <w:pPr>
-        <w:pStyle w:val="Prrafodelista"/>
-        <w:numPr>
-          <w:ilvl w:val="0"/>
-          <w:numId w:val="21"/>
-        </w:numPr>
-        <w:ind w:left="357" w:hanging="357"/>
-        <w:contextualSpacing w:val="0"/>
-        <w:jc w:val="both"/>
-      </w:pPr>
-      <w:proofErr w:type="spellStart"/>
-      <w:proofErr w:type="gramStart"/>
-      <w:r>
-        <w:rPr>
-          <w:b/>
-          <w:bCs/>
-        </w:rPr>
-        <w:t>asigna</w:t>
-      </w:r>
-      <w:r>
-        <w:rPr>
-          <w:b/>
-          <w:bCs/>
-        </w:rPr>
-        <w:t>cion</w:t>
-      </w:r>
-      <w:r>
-        <w:rPr>
-          <w:b/>
-          <w:bCs/>
-        </w:rPr>
-        <w:t>Paciente</w:t>
-      </w:r>
-      <w:proofErr w:type="spellEnd"/>
-      <w:r>
-        <w:rPr>
-          <w:b/>
-          <w:bCs/>
-        </w:rPr>
-        <w:t>(</w:t>
-      </w:r>
-      <w:proofErr w:type="gramEnd"/>
-      <w:r>
-        <w:rPr>
-          <w:b/>
-          <w:bCs/>
-        </w:rPr>
-        <w:t>):</w:t>
-      </w:r>
-      <w:r>
-        <w:t xml:space="preserve"> Método que sirve para vincular un Paciente a una</w:t>
-      </w:r>
-      <w:r>
-        <w:t xml:space="preserve"> unidad, habitación y cama de esa unidad</w:t>
-      </w:r>
-      <w:r>
-        <w:t>.</w:t>
-      </w:r>
-    </w:p>
-    <w:p>
-      <w:pPr>
-        <w:pStyle w:val="Prrafodelista"/>
-        <w:numPr>
-          <w:ilvl w:val="0"/>
-          <w:numId w:val="21"/>
-        </w:numPr>
-        <w:ind w:left="357" w:hanging="357"/>
-        <w:contextualSpacing w:val="0"/>
-        <w:jc w:val="both"/>
-      </w:pPr>
-      <w:proofErr w:type="spellStart"/>
-      <w:proofErr w:type="gramStart"/>
-      <w:r>
-        <w:rPr>
-          <w:b/>
-          <w:bCs/>
-        </w:rPr>
-        <w:t>trasladoPaciente</w:t>
-      </w:r>
-      <w:proofErr w:type="spellEnd"/>
-      <w:r>
-        <w:rPr>
-          <w:b/>
-          <w:bCs/>
-        </w:rPr>
-        <w:t>(</w:t>
-      </w:r>
-      <w:proofErr w:type="gramEnd"/>
-      <w:r>
-        <w:rPr>
-          <w:b/>
-          <w:bCs/>
-        </w:rPr>
-        <w:t>):</w:t>
-      </w:r>
-      <w:r>
-        <w:t xml:space="preserve"> Método que sirve para trasladar a otro hospital o a otra unidad del nuestro hospital.</w:t>
-      </w:r>
-    </w:p>
-    <w:p>
-      <w:pPr>
-        <w:pStyle w:val="Prrafodelista"/>
-        <w:numPr>
-          <w:ilvl w:val="0"/>
-          <w:numId w:val="21"/>
-        </w:numPr>
-        <w:jc w:val="both"/>
-      </w:pPr>
-      <w:proofErr w:type="spellStart"/>
-      <w:proofErr w:type="gramStart"/>
-      <w:r>
-        <w:rPr>
-          <w:b/>
-          <w:bCs/>
-        </w:rPr>
-        <w:t>documentacionAltaPaciente</w:t>
-      </w:r>
-      <w:proofErr w:type="spellEnd"/>
-      <w:r>
-        <w:rPr>
-          <w:b/>
-          <w:bCs/>
-        </w:rPr>
-        <w:t>(</w:t>
-      </w:r>
-      <w:proofErr w:type="gramEnd"/>
-      <w:r>
-        <w:rPr>
-          <w:b/>
-          <w:bCs/>
-        </w:rPr>
-        <w:t>):</w:t>
-      </w:r>
-      <w:r>
-        <w:t xml:space="preserve"> Método que rellena el atributo referente a la documentación del alta del ingreso de un paciente</w:t>
-      </w:r>
-    </w:p>
-    <w:p>
-      <w:pPr>
-        <w:spacing w:line="276" w:lineRule="auto"/>
-      </w:pPr>
-    </w:p>
-    <w:p/>
-    <w:p>
-      <w:r>
-        <w:br w:type="page"/>
-      </w:r>
-    </w:p>
-    <w:p>
-      <w:pPr>
-        <w:pStyle w:val="Ttulo2"/>
-      </w:pPr>
-      <w:bookmarkStart w:id="37" w:name="_Toc225990382"/>
-      <w:r>
-        <w:lastRenderedPageBreak/>
-        <w:t xml:space="preserve">DECISIONES </w:t>
-      </w:r>
-      <w:r>
-        <w:t>TOMADAS</w:t>
-      </w:r>
-      <w:r>
-        <w:t xml:space="preserve"> Y JUSTIFICADAS</w:t>
+        <w:t>)”</w:t>
+      </w:r>
+      <w:r>
+        <w:t xml:space="preserve"> que simule el avance de un día a otro en el hospital</w:t>
+      </w:r>
+      <w:r>
+        <w:t xml:space="preserve">. </w:t>
+      </w:r>
+    </w:p>
+    <w:p>
+      <w:pPr>
+        <w:jc w:val="both"/>
+      </w:pPr>
+      <w:r>
+        <w:t xml:space="preserve">De </w:t>
+      </w:r>
+      <w:r>
+        <w:t>esta</w:t>
+      </w:r>
+      <w:r>
+        <w:t xml:space="preserve"> forma, podremos simular el tiempo de forma más rápida en el hospital usando este método.</w:t>
+      </w:r>
+    </w:p>
+    <w:p>
+      <w:pPr>
+        <w:pStyle w:val="Ttulo3"/>
+      </w:pPr>
+      <w:bookmarkStart w:id="37" w:name="_Toc228071408"/>
+      <w:r>
+        <w:t>¿Qué se entiende por “médicos y personal de salud”?</w:t>
       </w:r>
       <w:bookmarkEnd w:id="37"/>
-    </w:p>
-    <w:p>
-      <w:pPr>
-        <w:pStyle w:val="Ttulo3"/>
-      </w:pPr>
-      <w:bookmarkStart w:id="38" w:name="_Toc225990383"/>
-      <w:r>
-        <w:t>¿Cómo simular el tiempo?</w:t>
-      </w:r>
-      <w:bookmarkEnd w:id="38"/>
-    </w:p>
-    <w:p>
-      <w:pPr>
-        <w:jc w:val="both"/>
-      </w:pPr>
-      <w:r>
-        <w:t>El manejo de un hospital es algo que lleva días. Así que, pensamos para nuestro programa simular el tiempo de forma más rápida.</w:t>
-      </w:r>
-    </w:p>
-    <w:p>
-      <w:pPr>
-        <w:jc w:val="both"/>
-      </w:pPr>
-      <w:r>
-        <w:t>Podríamos crear una clase de utilidad llamada “Tiempo” o algo así, con un método llamado “</w:t>
-      </w:r>
-      <w:proofErr w:type="spellStart"/>
-      <w:proofErr w:type="gramStart"/>
-      <w:r>
-        <w:t>avanzarDia</w:t>
-      </w:r>
-      <w:proofErr w:type="spellEnd"/>
-      <w:r>
-        <w:t>(</w:t>
-      </w:r>
-      <w:proofErr w:type="gramEnd"/>
-      <w:r>
-        <w:t>)”</w:t>
-      </w:r>
-      <w:r>
-        <w:t xml:space="preserve"> que simule el avance de un día a otro en el hospital</w:t>
-      </w:r>
-      <w:r>
-        <w:t xml:space="preserve">. </w:t>
-      </w:r>
-    </w:p>
-    <w:p>
-      <w:pPr>
-        <w:jc w:val="both"/>
-      </w:pPr>
-      <w:r>
-        <w:t xml:space="preserve">De </w:t>
-      </w:r>
-      <w:r>
-        <w:t>esta</w:t>
-      </w:r>
-      <w:r>
-        <w:t xml:space="preserve"> forma, podremos simular el tiempo de forma más rápida en el hospital usando este método.</w:t>
-      </w:r>
-    </w:p>
-    <w:p>
-      <w:pPr>
-        <w:pStyle w:val="Ttulo3"/>
-      </w:pPr>
-      <w:bookmarkStart w:id="39" w:name="_Toc225990384"/>
-      <w:r>
-        <w:t>¿Qué se entiende por “médicos y personal de salud”?</w:t>
-      </w:r>
-      <w:bookmarkEnd w:id="39"/>
     </w:p>
     <w:p>
       <w:pPr>
@@ -8355,11 +7046,11 @@
       <w:pPr>
         <w:pStyle w:val="Ttulo3"/>
       </w:pPr>
-      <w:bookmarkStart w:id="40" w:name="_Toc225990385"/>
+      <w:bookmarkStart w:id="38" w:name="_Toc228071409"/>
       <w:r>
         <w:t>¿Quién gestiona el traslado de pacientes?</w:t>
       </w:r>
-      <w:bookmarkEnd w:id="40"/>
+      <w:bookmarkEnd w:id="38"/>
     </w:p>
     <w:p>
       <w:pPr>
@@ -8402,20 +7093,18 @@
       <w:pPr>
         <w:pStyle w:val="Ttulo3"/>
       </w:pPr>
-      <w:bookmarkStart w:id="41" w:name="_Toc225990386"/>
+      <w:bookmarkStart w:id="39" w:name="_Toc228071410"/>
       <w:r>
         <w:lastRenderedPageBreak/>
         <w:t xml:space="preserve">¿Quién se encarga de la evaluación final de los </w:t>
       </w:r>
-      <w:proofErr w:type="spellStart"/>
-      <w:r>
-        <w:t>paceintes</w:t>
-      </w:r>
-      <w:proofErr w:type="spellEnd"/>
+      <w:r>
+        <w:t>pacientes</w:t>
+      </w:r>
       <w:r>
         <w:t>?</w:t>
       </w:r>
-      <w:bookmarkEnd w:id="41"/>
+      <w:bookmarkEnd w:id="39"/>
     </w:p>
     <w:p>
       <w:pPr>
@@ -8472,103 +7161,13 @@
     <w:p>
       <w:pPr>
         <w:pStyle w:val="Ttulo3"/>
-        <w:ind w:left="0" w:hanging="76"/>
-      </w:pPr>
-      <w:bookmarkStart w:id="42" w:name="_Toc225990387"/>
-      <w:r>
-        <w:t>¿Las notas de evolución solo se pueden generar en una ronda médica?</w:t>
-      </w:r>
-      <w:bookmarkEnd w:id="42"/>
-    </w:p>
-    <w:p>
-      <w:pPr>
-        <w:pStyle w:val="Ttulo4"/>
-      </w:pPr>
-      <w:r>
-        <w:t>Enunciado:</w:t>
-      </w:r>
-    </w:p>
-    <w:p>
-      <w:r>
-        <w:t>“</w:t>
-      </w:r>
-      <w:r>
-        <w:rPr>
-          <w:i/>
-          <w:iCs/>
-        </w:rPr>
-        <w:t>Durante las rondas, se evalúa la evolución del paciente, se ajustan los tratamientos según sea necesario y se registran las observaciones en las notas de evolución.</w:t>
-      </w:r>
-      <w:r>
-        <w:t>”</w:t>
-      </w:r>
-    </w:p>
-    <w:p>
-      <w:pPr>
-        <w:pStyle w:val="Ttulo4"/>
-      </w:pPr>
-      <w:r>
-        <w:t>Explicación:</w:t>
-      </w:r>
-    </w:p>
-    <w:p>
-      <w:pPr>
-        <w:jc w:val="both"/>
-      </w:pPr>
-      <w:r>
-        <w:t>En el enunciado no mencionan que la generación de notas de evolución sea algo exclusivo de las rondas médicas.</w:t>
-      </w:r>
-    </w:p>
-    <w:p>
-      <w:pPr>
-        <w:jc w:val="both"/>
-      </w:pPr>
-      <w:r>
-        <w:t>Además, a</w:t>
-      </w:r>
-      <w:r>
-        <w:t>unque las “rondas medicas diarias” puedan generar notas, también puede ocurrir el caso de que se quiera generar una nueva nota de última hora fuera de una “ronda medica diaria”.</w:t>
-      </w:r>
-    </w:p>
-    <w:p>
-      <w:pPr>
-        <w:jc w:val="both"/>
-      </w:pPr>
-      <w:r>
-        <w:t>Así que, debemos permitir que aparte de generarse las notas en el proceso de generar una “ronda médica diaria”, también se puedan generar las notas sin necesidad de hacer ese proceso.</w:t>
-      </w:r>
-    </w:p>
-    <w:p>
-      <w:pPr>
-        <w:jc w:val="both"/>
-      </w:pPr>
-    </w:p>
-    <w:p>
-      <w:pPr>
-        <w:jc w:val="both"/>
-      </w:pPr>
-    </w:p>
-    <w:p>
-      <w:pPr>
-        <w:jc w:val="both"/>
-      </w:pPr>
-    </w:p>
-    <w:p>
-      <w:pPr>
-        <w:jc w:val="both"/>
-      </w:pPr>
-    </w:p>
-    <w:p>
-      <w:pPr>
-        <w:pStyle w:val="Ttulo3"/>
         <w:ind w:left="0" w:firstLine="0"/>
       </w:pPr>
-      <w:bookmarkStart w:id="43" w:name="_Toc225990388"/>
-      <w:r>
-        <w:lastRenderedPageBreak/>
+      <w:bookmarkStart w:id="40" w:name="_Toc228071411"/>
+      <w:r>
         <w:t>¿Cómo sabe el sistema que un paciente está listo para la evaluación final?</w:t>
       </w:r>
-      <w:bookmarkEnd w:id="43"/>
+      <w:bookmarkEnd w:id="40"/>
     </w:p>
     <w:p>
       <w:pPr>

</xml_diff>

<commit_message>
Documentación del diagrama de casos de usos y cambios en dicho diagrama
</commit_message>
<xml_diff>
--- a/documentacion/Análisis Del Enunciado 2/PROYECTO-RETO – Análisis _ Grupo2.docx
+++ b/documentacion/Análisis Del Enunciado 2/PROYECTO-RETO – Análisis _ Grupo2.docx
@@ -116,29 +116,7 @@
                                     <w:sz w:val="24"/>
                                     <w:szCs w:val="24"/>
                                   </w:rPr>
-                                  <w:t xml:space="preserve">Diana </w:t>
-                                </w:r>
-                                <w:proofErr w:type="spellStart"/>
-                                <w:r>
-                                  <w:rPr>
-                                    <w:rFonts w:ascii="Calisto MT" w:hAnsi="Calisto MT"/>
-                                    <w:b/>
-                                    <w:bCs/>
-                                    <w:sz w:val="24"/>
-                                    <w:szCs w:val="24"/>
-                                  </w:rPr>
-                                  <w:t>Rodriguez</w:t>
-                                </w:r>
-                                <w:proofErr w:type="spellEnd"/>
-                                <w:r>
-                                  <w:rPr>
-                                    <w:rFonts w:ascii="Calisto MT" w:hAnsi="Calisto MT"/>
-                                    <w:b/>
-                                    <w:bCs/>
-                                    <w:sz w:val="24"/>
-                                    <w:szCs w:val="24"/>
-                                  </w:rPr>
-                                  <w:t xml:space="preserve"> Pinillos</w:t>
+                                  <w:t>Diana Rodriguez Pinillos</w:t>
                                 </w:r>
                               </w:p>
                               <w:p>
@@ -160,42 +138,8 @@
                                     <w:sz w:val="24"/>
                                     <w:szCs w:val="24"/>
                                   </w:rPr>
-                                  <w:t xml:space="preserve">Alex </w:t>
+                                  <w:t>Alex Andrei Stoica</w:t>
                                 </w:r>
-                                <w:proofErr w:type="spellStart"/>
-                                <w:r>
-                                  <w:rPr>
-                                    <w:rFonts w:ascii="Calisto MT" w:hAnsi="Calisto MT"/>
-                                    <w:b/>
-                                    <w:bCs/>
-                                    <w:sz w:val="24"/>
-                                    <w:szCs w:val="24"/>
-                                  </w:rPr>
-                                  <w:t>Andrei</w:t>
-                                </w:r>
-                                <w:proofErr w:type="spellEnd"/>
-                                <w:r>
-                                  <w:rPr>
-                                    <w:rFonts w:ascii="Calisto MT" w:hAnsi="Calisto MT"/>
-                                    <w:b/>
-                                    <w:bCs/>
-                                    <w:sz w:val="24"/>
-                                    <w:szCs w:val="24"/>
-                                  </w:rPr>
-                                  <w:t xml:space="preserve"> </w:t>
-                                </w:r>
-                                <w:proofErr w:type="spellStart"/>
-                                <w:r>
-                                  <w:rPr>
-                                    <w:rFonts w:ascii="Calisto MT" w:hAnsi="Calisto MT"/>
-                                    <w:b/>
-                                    <w:bCs/>
-                                    <w:sz w:val="24"/>
-                                    <w:szCs w:val="24"/>
-                                  </w:rPr>
-                                  <w:t>Stoica</w:t>
-                                </w:r>
-                                <w:proofErr w:type="spellEnd"/>
                               </w:p>
                               <w:p>
                                 <w:pPr>
@@ -301,29 +245,7 @@
                               <w:sz w:val="24"/>
                               <w:szCs w:val="24"/>
                             </w:rPr>
-                            <w:t xml:space="preserve">Diana </w:t>
-                          </w:r>
-                          <w:proofErr w:type="spellStart"/>
-                          <w:r>
-                            <w:rPr>
-                              <w:rFonts w:ascii="Calisto MT" w:hAnsi="Calisto MT"/>
-                              <w:b/>
-                              <w:bCs/>
-                              <w:sz w:val="24"/>
-                              <w:szCs w:val="24"/>
-                            </w:rPr>
-                            <w:t>Rodriguez</w:t>
-                          </w:r>
-                          <w:proofErr w:type="spellEnd"/>
-                          <w:r>
-                            <w:rPr>
-                              <w:rFonts w:ascii="Calisto MT" w:hAnsi="Calisto MT"/>
-                              <w:b/>
-                              <w:bCs/>
-                              <w:sz w:val="24"/>
-                              <w:szCs w:val="24"/>
-                            </w:rPr>
-                            <w:t xml:space="preserve"> Pinillos</w:t>
+                            <w:t>Diana Rodriguez Pinillos</w:t>
                           </w:r>
                         </w:p>
                         <w:p>
@@ -345,42 +267,8 @@
                               <w:sz w:val="24"/>
                               <w:szCs w:val="24"/>
                             </w:rPr>
-                            <w:t xml:space="preserve">Alex </w:t>
+                            <w:t>Alex Andrei Stoica</w:t>
                           </w:r>
-                          <w:proofErr w:type="spellStart"/>
-                          <w:r>
-                            <w:rPr>
-                              <w:rFonts w:ascii="Calisto MT" w:hAnsi="Calisto MT"/>
-                              <w:b/>
-                              <w:bCs/>
-                              <w:sz w:val="24"/>
-                              <w:szCs w:val="24"/>
-                            </w:rPr>
-                            <w:t>Andrei</w:t>
-                          </w:r>
-                          <w:proofErr w:type="spellEnd"/>
-                          <w:r>
-                            <w:rPr>
-                              <w:rFonts w:ascii="Calisto MT" w:hAnsi="Calisto MT"/>
-                              <w:b/>
-                              <w:bCs/>
-                              <w:sz w:val="24"/>
-                              <w:szCs w:val="24"/>
-                            </w:rPr>
-                            <w:t xml:space="preserve"> </w:t>
-                          </w:r>
-                          <w:proofErr w:type="spellStart"/>
-                          <w:r>
-                            <w:rPr>
-                              <w:rFonts w:ascii="Calisto MT" w:hAnsi="Calisto MT"/>
-                              <w:b/>
-                              <w:bCs/>
-                              <w:sz w:val="24"/>
-                              <w:szCs w:val="24"/>
-                            </w:rPr>
-                            <w:t>Stoica</w:t>
-                          </w:r>
-                          <w:proofErr w:type="spellEnd"/>
                         </w:p>
                         <w:p>
                           <w:pPr>
@@ -964,7 +852,7 @@
                             <w:pPr>
                               <w:pStyle w:val="Ttulo1"/>
                             </w:pPr>
-                            <w:bookmarkStart w:id="0" w:name="_Toc228071385"/>
+                            <w:bookmarkStart w:id="0" w:name="_Toc228121806"/>
                             <w:r>
                               <w:rPr>
                                 <w:rFonts w:ascii="Segoe UI Emoji" w:hAnsi="Segoe UI Emoji"/>
@@ -1003,7 +891,7 @@
                       <w:pPr>
                         <w:pStyle w:val="Ttulo1"/>
                       </w:pPr>
-                      <w:bookmarkStart w:id="1" w:name="_Toc228071385"/>
+                      <w:bookmarkStart w:id="1" w:name="_Toc228121806"/>
                       <w:r>
                         <w:rPr>
                           <w:rFonts w:ascii="Segoe UI Emoji" w:hAnsi="Segoe UI Emoji"/>
@@ -1079,7 +967,7 @@
           <w:r>
             <w:fldChar w:fldCharType="separate"/>
           </w:r>
-          <w:hyperlink w:anchor="_Toc228071385" w:history="1">
+          <w:hyperlink w:anchor="_Toc228121806" w:history="1">
             <w:r>
               <w:rPr>
                 <w:rStyle w:val="Hipervnculo"/>
@@ -1114,7 +1002,7 @@
                 <w:noProof/>
                 <w:webHidden/>
               </w:rPr>
-              <w:instrText xml:space="preserve"> PAGEREF _Toc228071385 \h </w:instrText>
+              <w:instrText xml:space="preserve"> PAGEREF _Toc228121806 \h </w:instrText>
             </w:r>
             <w:r>
               <w:rPr>
@@ -1161,7 +1049,7 @@
               <w14:ligatures w14:val="standardContextual"/>
             </w:rPr>
           </w:pPr>
-          <w:hyperlink w:anchor="_Toc228071386" w:history="1">
+          <w:hyperlink w:anchor="_Toc228121807" w:history="1">
             <w:r>
               <w:rPr>
                 <w:rStyle w:val="Hipervnculo"/>
@@ -1196,7 +1084,7 @@
                 <w:noProof/>
                 <w:webHidden/>
               </w:rPr>
-              <w:instrText xml:space="preserve"> PAGEREF _Toc228071386 \h </w:instrText>
+              <w:instrText xml:space="preserve"> PAGEREF _Toc228121807 \h </w:instrText>
             </w:r>
             <w:r>
               <w:rPr>
@@ -1241,7 +1129,7 @@
               <w14:ligatures w14:val="standardContextual"/>
             </w:rPr>
           </w:pPr>
-          <w:hyperlink w:anchor="_Toc228071387" w:history="1">
+          <w:hyperlink w:anchor="_Toc228121808" w:history="1">
             <w:r>
               <w:rPr>
                 <w:rStyle w:val="Hipervnculo"/>
@@ -1264,7 +1152,7 @@
               <w:rPr>
                 <w:webHidden/>
               </w:rPr>
-              <w:instrText xml:space="preserve"> PAGEREF _Toc228071387 \h </w:instrText>
+              <w:instrText xml:space="preserve"> PAGEREF _Toc228121808 \h </w:instrText>
             </w:r>
             <w:r>
               <w:rPr>
@@ -1307,7 +1195,7 @@
               <w14:ligatures w14:val="standardContextual"/>
             </w:rPr>
           </w:pPr>
-          <w:hyperlink w:anchor="_Toc228071388" w:history="1">
+          <w:hyperlink w:anchor="_Toc228121809" w:history="1">
             <w:r>
               <w:rPr>
                 <w:rStyle w:val="Hipervnculo"/>
@@ -1334,7 +1222,7 @@
                 <w:noProof/>
                 <w:webHidden/>
               </w:rPr>
-              <w:instrText xml:space="preserve"> PAGEREF _Toc228071388 \h </w:instrText>
+              <w:instrText xml:space="preserve"> PAGEREF _Toc228121809 \h </w:instrText>
             </w:r>
             <w:r>
               <w:rPr>
@@ -1381,7 +1269,7 @@
               <w14:ligatures w14:val="standardContextual"/>
             </w:rPr>
           </w:pPr>
-          <w:hyperlink w:anchor="_Toc228071389" w:history="1">
+          <w:hyperlink w:anchor="_Toc228121810" w:history="1">
             <w:r>
               <w:rPr>
                 <w:rStyle w:val="Hipervnculo"/>
@@ -1408,7 +1296,7 @@
                 <w:noProof/>
                 <w:webHidden/>
               </w:rPr>
-              <w:instrText xml:space="preserve"> PAGEREF _Toc228071389 \h </w:instrText>
+              <w:instrText xml:space="preserve"> PAGEREF _Toc228121810 \h </w:instrText>
             </w:r>
             <w:r>
               <w:rPr>
@@ -1455,7 +1343,7 @@
               <w14:ligatures w14:val="standardContextual"/>
             </w:rPr>
           </w:pPr>
-          <w:hyperlink w:anchor="_Toc228071390" w:history="1">
+          <w:hyperlink w:anchor="_Toc228121811" w:history="1">
             <w:r>
               <w:rPr>
                 <w:rStyle w:val="Hipervnculo"/>
@@ -1482,7 +1370,7 @@
                 <w:noProof/>
                 <w:webHidden/>
               </w:rPr>
-              <w:instrText xml:space="preserve"> PAGEREF _Toc228071390 \h </w:instrText>
+              <w:instrText xml:space="preserve"> PAGEREF _Toc228121811 \h </w:instrText>
             </w:r>
             <w:r>
               <w:rPr>
@@ -1527,7 +1415,7 @@
               <w14:ligatures w14:val="standardContextual"/>
             </w:rPr>
           </w:pPr>
-          <w:hyperlink w:anchor="_Toc228071391" w:history="1">
+          <w:hyperlink w:anchor="_Toc228121812" w:history="1">
             <w:r>
               <w:rPr>
                 <w:rStyle w:val="Hipervnculo"/>
@@ -1550,7 +1438,7 @@
               <w:rPr>
                 <w:webHidden/>
               </w:rPr>
-              <w:instrText xml:space="preserve"> PAGEREF _Toc228071391 \h </w:instrText>
+              <w:instrText xml:space="preserve"> PAGEREF _Toc228121812 \h </w:instrText>
             </w:r>
             <w:r>
               <w:rPr>
@@ -1593,7 +1481,7 @@
               <w14:ligatures w14:val="standardContextual"/>
             </w:rPr>
           </w:pPr>
-          <w:hyperlink w:anchor="_Toc228071392" w:history="1">
+          <w:hyperlink w:anchor="_Toc228121813" w:history="1">
             <w:r>
               <w:rPr>
                 <w:rStyle w:val="Hipervnculo"/>
@@ -1620,7 +1508,7 @@
                 <w:noProof/>
                 <w:webHidden/>
               </w:rPr>
-              <w:instrText xml:space="preserve"> PAGEREF _Toc228071392 \h </w:instrText>
+              <w:instrText xml:space="preserve"> PAGEREF _Toc228121813 \h </w:instrText>
             </w:r>
             <w:r>
               <w:rPr>
@@ -1667,7 +1555,7 @@
               <w14:ligatures w14:val="standardContextual"/>
             </w:rPr>
           </w:pPr>
-          <w:hyperlink w:anchor="_Toc228071393" w:history="1">
+          <w:hyperlink w:anchor="_Toc228121814" w:history="1">
             <w:r>
               <w:rPr>
                 <w:rStyle w:val="Hipervnculo"/>
@@ -1694,7 +1582,7 @@
                 <w:noProof/>
                 <w:webHidden/>
               </w:rPr>
-              <w:instrText xml:space="preserve"> PAGEREF _Toc228071393 \h </w:instrText>
+              <w:instrText xml:space="preserve"> PAGEREF _Toc228121814 \h </w:instrText>
             </w:r>
             <w:r>
               <w:rPr>
@@ -1741,7 +1629,7 @@
               <w14:ligatures w14:val="standardContextual"/>
             </w:rPr>
           </w:pPr>
-          <w:hyperlink w:anchor="_Toc228071394" w:history="1">
+          <w:hyperlink w:anchor="_Toc228121815" w:history="1">
             <w:r>
               <w:rPr>
                 <w:rStyle w:val="Hipervnculo"/>
@@ -1768,7 +1656,7 @@
                 <w:noProof/>
                 <w:webHidden/>
               </w:rPr>
-              <w:instrText xml:space="preserve"> PAGEREF _Toc228071394 \h </w:instrText>
+              <w:instrText xml:space="preserve"> PAGEREF _Toc228121815 \h </w:instrText>
             </w:r>
             <w:r>
               <w:rPr>
@@ -1813,7 +1701,7 @@
               <w14:ligatures w14:val="standardContextual"/>
             </w:rPr>
           </w:pPr>
-          <w:hyperlink w:anchor="_Toc228071395" w:history="1">
+          <w:hyperlink w:anchor="_Toc228121816" w:history="1">
             <w:r>
               <w:rPr>
                 <w:rStyle w:val="Hipervnculo"/>
@@ -1836,7 +1724,7 @@
               <w:rPr>
                 <w:webHidden/>
               </w:rPr>
-              <w:instrText xml:space="preserve"> PAGEREF _Toc228071395 \h </w:instrText>
+              <w:instrText xml:space="preserve"> PAGEREF _Toc228121816 \h </w:instrText>
             </w:r>
             <w:r>
               <w:rPr>
@@ -1879,7 +1767,7 @@
               <w14:ligatures w14:val="standardContextual"/>
             </w:rPr>
           </w:pPr>
-          <w:hyperlink w:anchor="_Toc228071396" w:history="1">
+          <w:hyperlink w:anchor="_Toc228121817" w:history="1">
             <w:r>
               <w:rPr>
                 <w:rStyle w:val="Hipervnculo"/>
@@ -1906,7 +1794,7 @@
                 <w:noProof/>
                 <w:webHidden/>
               </w:rPr>
-              <w:instrText xml:space="preserve"> PAGEREF _Toc228071396 \h </w:instrText>
+              <w:instrText xml:space="preserve"> PAGEREF _Toc228121817 \h </w:instrText>
             </w:r>
             <w:r>
               <w:rPr>
@@ -1953,7 +1841,7 @@
               <w14:ligatures w14:val="standardContextual"/>
             </w:rPr>
           </w:pPr>
-          <w:hyperlink w:anchor="_Toc228071397" w:history="1">
+          <w:hyperlink w:anchor="_Toc228121818" w:history="1">
             <w:r>
               <w:rPr>
                 <w:rStyle w:val="Hipervnculo"/>
@@ -1980,7 +1868,7 @@
                 <w:noProof/>
                 <w:webHidden/>
               </w:rPr>
-              <w:instrText xml:space="preserve"> PAGEREF _Toc228071397 \h </w:instrText>
+              <w:instrText xml:space="preserve"> PAGEREF _Toc228121818 \h </w:instrText>
             </w:r>
             <w:r>
               <w:rPr>
@@ -2027,7 +1915,7 @@
               <w14:ligatures w14:val="standardContextual"/>
             </w:rPr>
           </w:pPr>
-          <w:hyperlink w:anchor="_Toc228071398" w:history="1">
+          <w:hyperlink w:anchor="_Toc228121819" w:history="1">
             <w:r>
               <w:rPr>
                 <w:rStyle w:val="Hipervnculo"/>
@@ -2054,7 +1942,7 @@
                 <w:noProof/>
                 <w:webHidden/>
               </w:rPr>
-              <w:instrText xml:space="preserve"> PAGEREF _Toc228071398 \h </w:instrText>
+              <w:instrText xml:space="preserve"> PAGEREF _Toc228121819 \h </w:instrText>
             </w:r>
             <w:r>
               <w:rPr>
@@ -2101,7 +1989,7 @@
               <w14:ligatures w14:val="standardContextual"/>
             </w:rPr>
           </w:pPr>
-          <w:hyperlink w:anchor="_Toc228071399" w:history="1">
+          <w:hyperlink w:anchor="_Toc228121820" w:history="1">
             <w:r>
               <w:rPr>
                 <w:rStyle w:val="Hipervnculo"/>
@@ -2128,7 +2016,7 @@
                 <w:noProof/>
                 <w:webHidden/>
               </w:rPr>
-              <w:instrText xml:space="preserve"> PAGEREF _Toc228071399 \h </w:instrText>
+              <w:instrText xml:space="preserve"> PAGEREF _Toc228121820 \h </w:instrText>
             </w:r>
             <w:r>
               <w:rPr>
@@ -2175,7 +2063,7 @@
               <w14:ligatures w14:val="standardContextual"/>
             </w:rPr>
           </w:pPr>
-          <w:hyperlink w:anchor="_Toc228071400" w:history="1">
+          <w:hyperlink w:anchor="_Toc228121821" w:history="1">
             <w:r>
               <w:rPr>
                 <w:rStyle w:val="Hipervnculo"/>
@@ -2202,7 +2090,7 @@
                 <w:noProof/>
                 <w:webHidden/>
               </w:rPr>
-              <w:instrText xml:space="preserve"> PAGEREF _Toc228071400 \h </w:instrText>
+              <w:instrText xml:space="preserve"> PAGEREF _Toc228121821 \h </w:instrText>
             </w:r>
             <w:r>
               <w:rPr>
@@ -2249,7 +2137,7 @@
               <w14:ligatures w14:val="standardContextual"/>
             </w:rPr>
           </w:pPr>
-          <w:hyperlink w:anchor="_Toc228071401" w:history="1">
+          <w:hyperlink w:anchor="_Toc228121822" w:history="1">
             <w:r>
               <w:rPr>
                 <w:rStyle w:val="Hipervnculo"/>
@@ -2276,7 +2164,7 @@
                 <w:noProof/>
                 <w:webHidden/>
               </w:rPr>
-              <w:instrText xml:space="preserve"> PAGEREF _Toc228071401 \h </w:instrText>
+              <w:instrText xml:space="preserve"> PAGEREF _Toc228121822 \h </w:instrText>
             </w:r>
             <w:r>
               <w:rPr>
@@ -2321,7 +2209,7 @@
               <w14:ligatures w14:val="standardContextual"/>
             </w:rPr>
           </w:pPr>
-          <w:hyperlink w:anchor="_Toc228071402" w:history="1">
+          <w:hyperlink w:anchor="_Toc228121823" w:history="1">
             <w:r>
               <w:rPr>
                 <w:rStyle w:val="Hipervnculo"/>
@@ -2344,7 +2232,7 @@
               <w:rPr>
                 <w:webHidden/>
               </w:rPr>
-              <w:instrText xml:space="preserve"> PAGEREF _Toc228071402 \h </w:instrText>
+              <w:instrText xml:space="preserve"> PAGEREF _Toc228121823 \h </w:instrText>
             </w:r>
             <w:r>
               <w:rPr>
@@ -2385,7 +2273,7 @@
               <w14:ligatures w14:val="standardContextual"/>
             </w:rPr>
           </w:pPr>
-          <w:hyperlink w:anchor="_Toc228071403" w:history="1">
+          <w:hyperlink w:anchor="_Toc228121824" w:history="1">
             <w:r>
               <w:rPr>
                 <w:rStyle w:val="Hipervnculo"/>
@@ -2408,7 +2296,7 @@
               <w:rPr>
                 <w:webHidden/>
               </w:rPr>
-              <w:instrText xml:space="preserve"> PAGEREF _Toc228071403 \h </w:instrText>
+              <w:instrText xml:space="preserve"> PAGEREF _Toc228121824 \h </w:instrText>
             </w:r>
             <w:r>
               <w:rPr>
@@ -2451,7 +2339,7 @@
               <w14:ligatures w14:val="standardContextual"/>
             </w:rPr>
           </w:pPr>
-          <w:hyperlink w:anchor="_Toc228071404" w:history="1">
+          <w:hyperlink w:anchor="_Toc228121825" w:history="1">
             <w:r>
               <w:rPr>
                 <w:rStyle w:val="Hipervnculo"/>
@@ -2478,7 +2366,7 @@
                 <w:noProof/>
                 <w:webHidden/>
               </w:rPr>
-              <w:instrText xml:space="preserve"> PAGEREF _Toc228071404 \h </w:instrText>
+              <w:instrText xml:space="preserve"> PAGEREF _Toc228121825 \h </w:instrText>
             </w:r>
             <w:r>
               <w:rPr>
@@ -2525,7 +2413,7 @@
               <w14:ligatures w14:val="standardContextual"/>
             </w:rPr>
           </w:pPr>
-          <w:hyperlink w:anchor="_Toc228071405" w:history="1">
+          <w:hyperlink w:anchor="_Toc228121826" w:history="1">
             <w:r>
               <w:rPr>
                 <w:rStyle w:val="Hipervnculo"/>
@@ -2552,7 +2440,7 @@
                 <w:noProof/>
                 <w:webHidden/>
               </w:rPr>
-              <w:instrText xml:space="preserve"> PAGEREF _Toc228071405 \h </w:instrText>
+              <w:instrText xml:space="preserve"> PAGEREF _Toc228121826 \h </w:instrText>
             </w:r>
             <w:r>
               <w:rPr>
@@ -2597,7 +2485,7 @@
               <w14:ligatures w14:val="standardContextual"/>
             </w:rPr>
           </w:pPr>
-          <w:hyperlink w:anchor="_Toc228071406" w:history="1">
+          <w:hyperlink w:anchor="_Toc228121827" w:history="1">
             <w:r>
               <w:rPr>
                 <w:rStyle w:val="Hipervnculo"/>
@@ -2620,7 +2508,7 @@
               <w:rPr>
                 <w:webHidden/>
               </w:rPr>
-              <w:instrText xml:space="preserve"> PAGEREF _Toc228071406 \h </w:instrText>
+              <w:instrText xml:space="preserve"> PAGEREF _Toc228121827 \h </w:instrText>
             </w:r>
             <w:r>
               <w:rPr>
@@ -2663,7 +2551,7 @@
               <w14:ligatures w14:val="standardContextual"/>
             </w:rPr>
           </w:pPr>
-          <w:hyperlink w:anchor="_Toc228071407" w:history="1">
+          <w:hyperlink w:anchor="_Toc228121828" w:history="1">
             <w:r>
               <w:rPr>
                 <w:rStyle w:val="Hipervnculo"/>
@@ -2690,7 +2578,7 @@
                 <w:noProof/>
                 <w:webHidden/>
               </w:rPr>
-              <w:instrText xml:space="preserve"> PAGEREF _Toc228071407 \h </w:instrText>
+              <w:instrText xml:space="preserve"> PAGEREF _Toc228121828 \h </w:instrText>
             </w:r>
             <w:r>
               <w:rPr>
@@ -2737,7 +2625,7 @@
               <w14:ligatures w14:val="standardContextual"/>
             </w:rPr>
           </w:pPr>
-          <w:hyperlink w:anchor="_Toc228071408" w:history="1">
+          <w:hyperlink w:anchor="_Toc228121829" w:history="1">
             <w:r>
               <w:rPr>
                 <w:rStyle w:val="Hipervnculo"/>
@@ -2764,7 +2652,7 @@
                 <w:noProof/>
                 <w:webHidden/>
               </w:rPr>
-              <w:instrText xml:space="preserve"> PAGEREF _Toc228071408 \h </w:instrText>
+              <w:instrText xml:space="preserve"> PAGEREF _Toc228121829 \h </w:instrText>
             </w:r>
             <w:r>
               <w:rPr>
@@ -2811,7 +2699,7 @@
               <w14:ligatures w14:val="standardContextual"/>
             </w:rPr>
           </w:pPr>
-          <w:hyperlink w:anchor="_Toc228071409" w:history="1">
+          <w:hyperlink w:anchor="_Toc228121830" w:history="1">
             <w:r>
               <w:rPr>
                 <w:rStyle w:val="Hipervnculo"/>
@@ -2838,7 +2726,7 @@
                 <w:noProof/>
                 <w:webHidden/>
               </w:rPr>
-              <w:instrText xml:space="preserve"> PAGEREF _Toc228071409 \h </w:instrText>
+              <w:instrText xml:space="preserve"> PAGEREF _Toc228121830 \h </w:instrText>
             </w:r>
             <w:r>
               <w:rPr>
@@ -2885,7 +2773,7 @@
               <w14:ligatures w14:val="standardContextual"/>
             </w:rPr>
           </w:pPr>
-          <w:hyperlink w:anchor="_Toc228071410" w:history="1">
+          <w:hyperlink w:anchor="_Toc228121831" w:history="1">
             <w:r>
               <w:rPr>
                 <w:rStyle w:val="Hipervnculo"/>
@@ -2912,7 +2800,7 @@
                 <w:noProof/>
                 <w:webHidden/>
               </w:rPr>
-              <w:instrText xml:space="preserve"> PAGEREF _Toc228071410 \h </w:instrText>
+              <w:instrText xml:space="preserve"> PAGEREF _Toc228121831 \h </w:instrText>
             </w:r>
             <w:r>
               <w:rPr>
@@ -2959,7 +2847,7 @@
               <w14:ligatures w14:val="standardContextual"/>
             </w:rPr>
           </w:pPr>
-          <w:hyperlink w:anchor="_Toc228071411" w:history="1">
+          <w:hyperlink w:anchor="_Toc228121832" w:history="1">
             <w:r>
               <w:rPr>
                 <w:rStyle w:val="Hipervnculo"/>
@@ -2986,7 +2874,7 @@
                 <w:noProof/>
                 <w:webHidden/>
               </w:rPr>
-              <w:instrText xml:space="preserve"> PAGEREF _Toc228071411 \h </w:instrText>
+              <w:instrText xml:space="preserve"> PAGEREF _Toc228121832 \h </w:instrText>
             </w:r>
             <w:r>
               <w:rPr>
@@ -3091,7 +2979,7 @@
                             <w:bookmarkStart w:id="2" w:name="_Toc201837460"/>
                             <w:bookmarkStart w:id="3" w:name="_Toc201837471"/>
                             <w:bookmarkStart w:id="4" w:name="_Toc201837593"/>
-                            <w:bookmarkStart w:id="5" w:name="_Toc228071386"/>
+                            <w:bookmarkStart w:id="5" w:name="_Toc228121807"/>
                             <w:r>
                               <w:rPr>
                                 <w:rFonts w:ascii="Segoe UI Emoji" w:hAnsi="Segoe UI Emoji"/>
@@ -3142,7 +3030,7 @@
                       <w:bookmarkStart w:id="6" w:name="_Toc201837460"/>
                       <w:bookmarkStart w:id="7" w:name="_Toc201837471"/>
                       <w:bookmarkStart w:id="8" w:name="_Toc201837593"/>
-                      <w:bookmarkStart w:id="9" w:name="_Toc228071386"/>
+                      <w:bookmarkStart w:id="9" w:name="_Toc228121807"/>
                       <w:r>
                         <w:rPr>
                           <w:rFonts w:ascii="Segoe UI Emoji" w:hAnsi="Segoe UI Emoji"/>
@@ -3180,7 +3068,7 @@
         <w:pStyle w:val="Ttulo2"/>
       </w:pPr>
       <w:bookmarkStart w:id="10" w:name="_Toc201837594"/>
-      <w:bookmarkStart w:id="11" w:name="_Toc228071387"/>
+      <w:bookmarkStart w:id="11" w:name="_Toc228121808"/>
       <w:r>
         <w:lastRenderedPageBreak/>
         <w:t>A</w:t>
@@ -3195,7 +3083,7 @@
       <w:pPr>
         <w:pStyle w:val="Ttulo3"/>
       </w:pPr>
-      <w:bookmarkStart w:id="12" w:name="_Toc228071388"/>
+      <w:bookmarkStart w:id="12" w:name="_Toc228121809"/>
       <w:r>
         <w:t>¿Qué es un actor?</w:t>
       </w:r>
@@ -3259,7 +3147,7 @@
       <w:pPr>
         <w:pStyle w:val="Ttulo3"/>
       </w:pPr>
-      <w:bookmarkStart w:id="13" w:name="_Toc228071389"/>
+      <w:bookmarkStart w:id="13" w:name="_Toc228121810"/>
       <w:r>
         <w:t>Actores:</w:t>
       </w:r>
@@ -3303,23 +3191,7 @@
           <w:b/>
           <w:bCs/>
         </w:rPr>
-        <w:t>Personal &lt;&lt;</w:t>
-      </w:r>
-      <w:proofErr w:type="spellStart"/>
-      <w:r>
-        <w:rPr>
-          <w:b/>
-          <w:bCs/>
-        </w:rPr>
-        <w:t>abstract</w:t>
-      </w:r>
-      <w:proofErr w:type="spellEnd"/>
-      <w:r>
-        <w:rPr>
-          <w:b/>
-          <w:bCs/>
-        </w:rPr>
-        <w:t>&gt;&gt;:</w:t>
+        <w:t>Personal &lt;&lt;abstract&gt;&gt;:</w:t>
       </w:r>
       <w:r>
         <w:t xml:space="preserve"> Representa a todos los tipos de trabajadores del hospital.</w:t>
@@ -3367,23 +3239,7 @@
           <w:b/>
           <w:bCs/>
         </w:rPr>
-        <w:t xml:space="preserve"> &lt;&lt;</w:t>
-      </w:r>
-      <w:proofErr w:type="spellStart"/>
-      <w:r>
-        <w:rPr>
-          <w:b/>
-          <w:bCs/>
-        </w:rPr>
-        <w:t>abstract</w:t>
-      </w:r>
-      <w:proofErr w:type="spellEnd"/>
-      <w:r>
-        <w:rPr>
-          <w:b/>
-          <w:bCs/>
-        </w:rPr>
-        <w:t>&gt;&gt;</w:t>
+        <w:t xml:space="preserve"> &lt;&lt;abstract&gt;&gt;</w:t>
       </w:r>
       <w:r>
         <w:rPr>
@@ -3545,23 +3401,7 @@
           <w:b/>
           <w:bCs/>
         </w:rPr>
-        <w:t>&lt;&lt;</w:t>
-      </w:r>
-      <w:proofErr w:type="spellStart"/>
-      <w:r>
-        <w:rPr>
-          <w:b/>
-          <w:bCs/>
-        </w:rPr>
-        <w:t>abstract</w:t>
-      </w:r>
-      <w:proofErr w:type="spellEnd"/>
-      <w:r>
-        <w:rPr>
-          <w:b/>
-          <w:bCs/>
-        </w:rPr>
-        <w:t>&gt;&gt;</w:t>
+        <w:t>&lt;&lt;abstract&gt;&gt;</w:t>
       </w:r>
       <w:r>
         <w:t>,</w:t>
@@ -3574,7 +3414,7 @@
       <w:pPr>
         <w:pStyle w:val="Ttulo3"/>
       </w:pPr>
-      <w:bookmarkStart w:id="14" w:name="_Toc228071390"/>
+      <w:bookmarkStart w:id="14" w:name="_Toc228121811"/>
       <w:r>
         <w:t xml:space="preserve">¿Por qué </w:t>
       </w:r>
@@ -3636,7 +3476,7 @@
       <w:pPr>
         <w:pStyle w:val="Ttulo2"/>
       </w:pPr>
-      <w:bookmarkStart w:id="15" w:name="_Toc228071391"/>
+      <w:bookmarkStart w:id="15" w:name="_Toc228121812"/>
       <w:r>
         <w:lastRenderedPageBreak/>
         <w:t>ENTIDADES</w:t>
@@ -3647,7 +3487,7 @@
       <w:pPr>
         <w:pStyle w:val="Ttulo3"/>
       </w:pPr>
-      <w:bookmarkStart w:id="16" w:name="_Toc228071392"/>
+      <w:bookmarkStart w:id="16" w:name="_Toc228121813"/>
       <w:r>
         <w:t>¿</w:t>
       </w:r>
@@ -3681,7 +3521,7 @@
       <w:pPr>
         <w:pStyle w:val="Ttulo3"/>
       </w:pPr>
-      <w:bookmarkStart w:id="17" w:name="_Toc228071393"/>
+      <w:bookmarkStart w:id="17" w:name="_Toc228121814"/>
       <w:r>
         <w:t>Entidades</w:t>
       </w:r>
@@ -4016,7 +3856,7 @@
       <w:pPr>
         <w:pStyle w:val="Ttulo3"/>
       </w:pPr>
-      <w:bookmarkStart w:id="18" w:name="_Toc228071394"/>
+      <w:bookmarkStart w:id="18" w:name="_Toc228121815"/>
       <w:r>
         <w:t>¿Por qué elegimos estas Entidades?</w:t>
       </w:r>
@@ -4059,7 +3899,7 @@
       <w:pPr>
         <w:pStyle w:val="Ttulo2"/>
       </w:pPr>
-      <w:bookmarkStart w:id="19" w:name="_Toc228071395"/>
+      <w:bookmarkStart w:id="19" w:name="_Toc228121816"/>
       <w:r>
         <w:lastRenderedPageBreak/>
         <w:t>ACCIONES</w:t>
@@ -4070,7 +3910,7 @@
       <w:pPr>
         <w:pStyle w:val="Ttulo3"/>
       </w:pPr>
-      <w:bookmarkStart w:id="20" w:name="_Toc228071396"/>
+      <w:bookmarkStart w:id="20" w:name="_Toc228121817"/>
       <w:r>
         <w:t>¿Qué son las acciones</w:t>
       </w:r>
@@ -4246,7 +4086,7 @@
       <w:pPr>
         <w:pStyle w:val="Ttulo3"/>
       </w:pPr>
-      <w:bookmarkStart w:id="21" w:name="_Toc228071397"/>
+      <w:bookmarkStart w:id="21" w:name="_Toc228121818"/>
       <w:r>
         <w:lastRenderedPageBreak/>
         <w:t>Asignación de Camas</w:t>
@@ -4373,19 +4213,7 @@
         <w:jc w:val="both"/>
       </w:pPr>
       <w:r>
-        <w:t>Asignar una cama es una acción donde</w:t>
-      </w:r>
-      <w:r>
-        <w:t>, según el enunciado,</w:t>
-      </w:r>
-      <w:r>
-        <w:t xml:space="preserve"> se ven involucrados un paciente</w:t>
-      </w:r>
-      <w:r>
-        <w:t>, una cama y</w:t>
-      </w:r>
-      <w:r>
-        <w:t xml:space="preserve"> un miembro del personal administrativo o de enfermería.</w:t>
+        <w:t>Asignar una cama es una acción que, según el enunciado, puede realizar un miembro del personal administrativo o de enfermería.</w:t>
       </w:r>
     </w:p>
     <w:p>
@@ -4476,31 +4304,25 @@
         <w:jc w:val="both"/>
       </w:pPr>
       <w:r>
-        <w:t>Está acción actualizar</w:t>
-      </w:r>
-      <w:r>
-        <w:t>á</w:t>
-      </w:r>
-      <w:r>
-        <w:t>,</w:t>
-      </w:r>
-      <w:r>
-        <w:t xml:space="preserve"> dentro del código referente al </w:t>
-      </w:r>
-      <w:r>
-        <w:t xml:space="preserve">ingreso de un </w:t>
-      </w:r>
-      <w:r>
-        <w:t>paciente</w:t>
-      </w:r>
-      <w:r>
-        <w:t>,</w:t>
-      </w:r>
-      <w:r>
-        <w:t xml:space="preserve"> la cama donde está asignado</w:t>
-      </w:r>
-      <w:r>
-        <w:t>, y en la cama, el paciente que contiene y su disponibilidad</w:t>
+        <w:t xml:space="preserve">Está acción </w:t>
+      </w:r>
+      <w:r>
+        <w:t>registrara en el sistema</w:t>
+      </w:r>
+      <w:r>
+        <w:t xml:space="preserve"> la cama</w:t>
+      </w:r>
+      <w:r>
+        <w:t>, habitación y unidad</w:t>
+      </w:r>
+      <w:r>
+        <w:t xml:space="preserve"> donde está asignado</w:t>
+      </w:r>
+      <w:r>
+        <w:t xml:space="preserve"> </w:t>
+      </w:r>
+      <w:r>
+        <w:t>el paciente</w:t>
       </w:r>
       <w:r>
         <w:t>.</w:t>
@@ -4551,7 +4373,7 @@
       <w:pPr>
         <w:pStyle w:val="Ttulo3"/>
       </w:pPr>
-      <w:bookmarkStart w:id="25" w:name="_Toc228071398"/>
+      <w:bookmarkStart w:id="25" w:name="_Toc228121819"/>
       <w:r>
         <w:lastRenderedPageBreak/>
         <w:t>Proceso de Rondas Medicas Diarias</w:t>
@@ -4702,6 +4524,14 @@
     </w:p>
     <w:p>
       <w:pPr>
+        <w:jc w:val="both"/>
+      </w:pPr>
+      <w:r>
+        <w:t>Registrar la información de una “ronda medica diaria de un paciente” que se hizo en la vida real es una acción que, puede realizar un miembro del personal de salud, incluyendo médicos.</w:t>
+      </w:r>
+    </w:p>
+    <w:p>
+      <w:pPr>
         <w:pStyle w:val="Ttulo5"/>
       </w:pPr>
       <w:r>
@@ -4713,6 +4543,14 @@
         <w:jc w:val="both"/>
       </w:pPr>
       <w:r>
+        <w:t>Está acción le permitirá al personal de Salud registrar en el sistema la información referente a la ronda medica diaria que se haya realizado en la vida real.</w:t>
+      </w:r>
+    </w:p>
+    <w:p>
+      <w:pPr>
+        <w:jc w:val="both"/>
+      </w:pPr>
+      <w:r>
         <w:t xml:space="preserve">Una vez un miembro del personal </w:t>
       </w:r>
       <w:r>
@@ -4724,14 +4562,6 @@
         <w:jc w:val="both"/>
       </w:pPr>
       <w:r>
-        <w:t>Está acción le permitirá al personal de Salud registrar en el sistema la información referente a la ronda medica diaria que se haya realizado en la vida real.</w:t>
-      </w:r>
-    </w:p>
-    <w:p>
-      <w:pPr>
-        <w:jc w:val="both"/>
-      </w:pPr>
-      <w:r>
         <w:t>A seleccionar está opción, se ingresará la unidad y aparecerán los pacientes de esa unidad, e información relacionada a cada paciente, como su estado.</w:t>
       </w:r>
     </w:p>
@@ -4742,11 +4572,6 @@
       <w:r>
         <w:t>Al seleccionar un paciente, el personal ingresará la observación de la ronda medica diaria que realizo en la vida real y podrá ajustar parámetros como tratamientos.</w:t>
       </w:r>
-    </w:p>
-    <w:p>
-      <w:pPr>
-        <w:jc w:val="both"/>
-      </w:pPr>
     </w:p>
     <w:p>
       <w:pPr>
@@ -4812,7 +4637,13 @@
         <w:t>actualizar</w:t>
       </w:r>
       <w:r>
-        <w:t xml:space="preserve"> los tratamientos del paciente en base a su estado y</w:t>
+        <w:t xml:space="preserve"> los tratamientos del paciente</w:t>
+      </w:r>
+      <w:r>
+        <w:t>,</w:t>
+      </w:r>
+      <w:r>
+        <w:t xml:space="preserve"> y</w:t>
       </w:r>
       <w:r>
         <w:t xml:space="preserve"> generará</w:t>
@@ -4824,7 +4655,13 @@
         <w:t>una nueva nota</w:t>
       </w:r>
       <w:r>
-        <w:t xml:space="preserve"> de evolución en el expediente del paciente.</w:t>
+        <w:t xml:space="preserve"> de evolución en el expediente del paciente</w:t>
+      </w:r>
+      <w:r>
+        <w:t>, todo esto dentro del sistema</w:t>
+      </w:r>
+      <w:r>
+        <w:t>.</w:t>
       </w:r>
       <w:bookmarkEnd w:id="26"/>
     </w:p>
@@ -4975,7 +4812,7 @@
       <w:pPr>
         <w:pStyle w:val="Ttulo3"/>
       </w:pPr>
-      <w:bookmarkStart w:id="27" w:name="_Toc228071399"/>
+      <w:bookmarkStart w:id="27" w:name="_Toc228121820"/>
       <w:r>
         <w:lastRenderedPageBreak/>
         <w:t>Evaluación final</w:t>
@@ -5137,6 +4974,14 @@
     </w:p>
     <w:p>
       <w:pPr>
+        <w:jc w:val="both"/>
+      </w:pPr>
+      <w:r>
+        <w:t>Hacer una evaluación final es una acción que, según el enunciado, puede realizar un miembro del personal médico.</w:t>
+      </w:r>
+    </w:p>
+    <w:p>
+      <w:pPr>
         <w:pStyle w:val="Ttulo5"/>
       </w:pPr>
       <w:r>
@@ -5253,21 +5098,9 @@
     </w:p>
     <w:p>
       <w:pPr>
-        <w:spacing w:line="276" w:lineRule="auto"/>
-        <w:jc w:val="both"/>
-      </w:pPr>
-    </w:p>
-    <w:p>
-      <w:pPr>
-        <w:spacing w:line="276" w:lineRule="auto"/>
-        <w:jc w:val="both"/>
-      </w:pPr>
-    </w:p>
-    <w:p>
-      <w:pPr>
         <w:pStyle w:val="Ttulo3"/>
       </w:pPr>
-      <w:bookmarkStart w:id="28" w:name="_Toc228071400"/>
+      <w:bookmarkStart w:id="28" w:name="_Toc228121821"/>
       <w:r>
         <w:lastRenderedPageBreak/>
         <w:t xml:space="preserve">Documentación del Alta </w:t>
@@ -5354,6 +5187,15 @@
     </w:p>
     <w:p>
       <w:pPr>
+        <w:spacing w:line="276" w:lineRule="auto"/>
+        <w:jc w:val="both"/>
+      </w:pPr>
+      <w:r>
+        <w:t>La “documentar el alta de un paciente” es una acción que, según el enunciado, puede realizar un miembro del personal administrativo.</w:t>
+      </w:r>
+    </w:p>
+    <w:p>
+      <w:pPr>
         <w:pStyle w:val="Ttulo5"/>
       </w:pPr>
       <w:r>
@@ -5437,7 +5279,13 @@
         <w:t xml:space="preserve"> la documentación del Alt</w:t>
       </w:r>
       <w:r>
-        <w:t>a registrada del paciente en el sistema</w:t>
+        <w:t>a de</w:t>
+      </w:r>
+      <w:r>
+        <w:t xml:space="preserve"> un</w:t>
+      </w:r>
+      <w:r>
+        <w:t xml:space="preserve"> paciente en el sistema</w:t>
       </w:r>
       <w:r>
         <w:t>.</w:t>
@@ -5542,18 +5390,6 @@
     <w:p>
       <w:pPr>
         <w:jc w:val="both"/>
-        <w:rPr>
-          <w:b/>
-          <w:bCs/>
-          <w:sz w:val="28"/>
-          <w:szCs w:val="28"/>
-          <w:u w:val="single"/>
-        </w:rPr>
-      </w:pPr>
-    </w:p>
-    <w:p>
-      <w:pPr>
-        <w:jc w:val="both"/>
       </w:pPr>
     </w:p>
     <w:p>
@@ -5561,7 +5397,7 @@
         <w:pStyle w:val="Ttulo3"/>
         <w:ind w:left="0" w:firstLine="0"/>
       </w:pPr>
-      <w:bookmarkStart w:id="30" w:name="_Toc228071401"/>
+      <w:bookmarkStart w:id="30" w:name="_Toc228121822"/>
       <w:r>
         <w:lastRenderedPageBreak/>
         <w:t>Traslado de un paciente a otra unidad u otro centro</w:t>
@@ -5695,16 +5531,171 @@
         <w:jc w:val="both"/>
       </w:pPr>
       <w:r>
-        <w:t>El traslado se trata de un proceso del cual al paciente se le asigna una nueva cama, en una nueva habitación de una nueva unidad</w:t>
-      </w:r>
-      <w:r>
-        <w:t xml:space="preserve"> o</w:t>
+        <w:t>El traslado se trata de una acción la cual al paciente se le asigna una nueva cama, en una nueva habitación de una nueva unidad o, se le traslada a otro hospital.</w:t>
+      </w:r>
+    </w:p>
+    <w:p>
+      <w:pPr>
+        <w:spacing w:line="276" w:lineRule="auto"/>
+        <w:jc w:val="both"/>
+      </w:pPr>
+      <w:r>
+        <w:t>En el enunciado hablan sobre que la “asignación de Camas” se encarga el personal administrativo y el de enfermería. Como en este caso no mencionan en el enunciado quien se encarga del traslado, sería correcto que quien se encargue del traslado de los pacientes sea también el personal administrativo y de enfermería.</w:t>
+      </w:r>
+    </w:p>
+    <w:p>
+      <w:pPr>
+        <w:spacing w:line="276" w:lineRule="auto"/>
+        <w:jc w:val="both"/>
+      </w:pPr>
+      <w:r>
+        <w:t>Dicho esto, “trasladar a un paciente” es una acción que puede realizar un miembro del personal administrativo o un miembro del personal de enfermería.</w:t>
+      </w:r>
+    </w:p>
+    <w:p>
+      <w:pPr>
+        <w:pStyle w:val="Ttulo5"/>
+      </w:pPr>
+      <w:r>
+        <w:t>¿Cómo se verá visualmente está acción?</w:t>
+      </w:r>
+    </w:p>
+    <w:p>
+      <w:pPr>
+        <w:spacing w:line="276" w:lineRule="auto"/>
+        <w:jc w:val="both"/>
+      </w:pPr>
+      <w:r>
+        <w:t>Cuando el miembro del personal administrativo o de enfermería inicie sesión, aparecerá una opción llamada “Traslado</w:t>
+      </w:r>
+      <w:r>
+        <w:t xml:space="preserve"> Paciente</w:t>
+      </w:r>
+      <w:r>
+        <w:t>”.</w:t>
+      </w:r>
+    </w:p>
+    <w:p>
+      <w:pPr>
+        <w:spacing w:line="276" w:lineRule="auto"/>
+        <w:jc w:val="both"/>
+      </w:pPr>
+      <w:r>
+        <w:t xml:space="preserve">Al seleccionar está opción, y luego seleccionar una unidad, </w:t>
+      </w:r>
+      <w:r>
+        <w:t>aparecerá</w:t>
+      </w:r>
+      <w:r>
+        <w:t xml:space="preserve"> una lista de los pacientes de dicha unidad, con información como </w:t>
+      </w:r>
+      <w:r>
+        <w:t>el estado</w:t>
+      </w:r>
+      <w:r>
+        <w:t>.</w:t>
+      </w:r>
+    </w:p>
+    <w:p>
+      <w:pPr>
+        <w:spacing w:line="276" w:lineRule="auto"/>
+        <w:jc w:val="both"/>
+      </w:pPr>
+      <w:r>
+        <w:t>Al seleccionar un paciente se dará la opción de trasladarlo a otra unidad o a otro hospital.</w:t>
+      </w:r>
+    </w:p>
+    <w:p>
+      <w:pPr>
+        <w:spacing w:line="276" w:lineRule="auto"/>
+        <w:jc w:val="both"/>
+      </w:pPr>
+      <w:r>
+        <w:t xml:space="preserve">Se </w:t>
+      </w:r>
+      <w:r>
+        <w:t>avisará</w:t>
+      </w:r>
+      <w:r>
+        <w:t xml:space="preserve"> si en dicha unidad no hay espacio para el traslado.</w:t>
+      </w:r>
+    </w:p>
+    <w:p>
+      <w:pPr>
+        <w:pStyle w:val="Ttulo5"/>
+      </w:pPr>
+      <w:r>
+        <w:t>¿Qué cambiar</w:t>
+      </w:r>
+      <w:r>
+        <w:t>á</w:t>
+      </w:r>
+      <w:r>
+        <w:t xml:space="preserve"> </w:t>
+      </w:r>
+      <w:r>
+        <w:t>este</w:t>
+      </w:r>
+      <w:r>
+        <w:t xml:space="preserve"> proceso/acción en el sistema?</w:t>
+      </w:r>
+    </w:p>
+    <w:p>
+      <w:pPr>
+        <w:jc w:val="both"/>
+      </w:pPr>
+      <w:r>
+        <w:t xml:space="preserve">Está acción </w:t>
+      </w:r>
+      <w:r>
+        <w:t>actualizar</w:t>
+      </w:r>
+      <w:r>
+        <w:t>á</w:t>
+      </w:r>
+      <w:r>
+        <w:t xml:space="preserve"> </w:t>
+      </w:r>
+      <w:r>
+        <w:t>la ubicación del paciente dentro del hospital</w:t>
+      </w:r>
+      <w:r>
+        <w:t>.</w:t>
+      </w:r>
+    </w:p>
+    <w:p>
+      <w:pPr>
+        <w:jc w:val="both"/>
+      </w:pPr>
+      <w:r>
+        <w:t xml:space="preserve">Si el traslado es a </w:t>
+      </w:r>
+      <w:r>
+        <w:t>otro hospital</w:t>
+      </w:r>
+      <w:r>
+        <w:t xml:space="preserve">, se rellenará </w:t>
+      </w:r>
+      <w:r>
+        <w:t>los datos</w:t>
+      </w:r>
+      <w:r>
+        <w:t xml:space="preserve"> sobre el nuevo hospital del paciente</w:t>
       </w:r>
       <w:r>
         <w:t>,</w:t>
       </w:r>
       <w:r>
-        <w:t xml:space="preserve"> se le traslada a otro hospital</w:t>
+        <w:t xml:space="preserve"> y el ingreso del paciente </w:t>
+      </w:r>
+      <w:r>
+        <w:t>pasará</w:t>
+      </w:r>
+      <w:r>
+        <w:t xml:space="preserve"> a estar inactivo</w:t>
+      </w:r>
+      <w:r>
+        <w:t>, todo esto dentro del sistema</w:t>
       </w:r>
       <w:r>
         <w:t>.</w:t>
@@ -5712,206 +5703,6 @@
     </w:p>
     <w:p>
       <w:pPr>
-        <w:spacing w:line="276" w:lineRule="auto"/>
-        <w:jc w:val="both"/>
-      </w:pPr>
-      <w:r>
-        <w:t>En el</w:t>
-      </w:r>
-      <w:r>
-        <w:t xml:space="preserve"> enunciado hablan</w:t>
-      </w:r>
-      <w:r>
-        <w:t xml:space="preserve"> sobre que la </w:t>
-      </w:r>
-      <w:r>
-        <w:t>“</w:t>
-      </w:r>
-      <w:r>
-        <w:t>asignación de Camas” se encargaba el personal administrativo y el de enfermería</w:t>
-      </w:r>
-      <w:r>
-        <w:t>.</w:t>
-      </w:r>
-      <w:r>
-        <w:t xml:space="preserve"> </w:t>
-      </w:r>
-      <w:r>
-        <w:t xml:space="preserve">Como en este caso no mencionan en el enunciado quien se encarga del traslado, </w:t>
-      </w:r>
-      <w:r>
-        <w:t>sería</w:t>
-      </w:r>
-      <w:r>
-        <w:t xml:space="preserve"> correcto que quien se encargue del traslado de los pacientes </w:t>
-      </w:r>
-      <w:r>
-        <w:t>sea también el personal administrativo y de enfermería</w:t>
-      </w:r>
-      <w:r>
-        <w:t>.</w:t>
-      </w:r>
-    </w:p>
-    <w:p>
-      <w:pPr>
-        <w:spacing w:line="276" w:lineRule="auto"/>
-        <w:jc w:val="both"/>
-      </w:pPr>
-      <w:r>
-        <w:t xml:space="preserve">Dicho esto, “trasladar a un paciente” es una acción donde se ven involucrados un paciente y, un miembro del personal administrativo o un miembro del personal de </w:t>
-      </w:r>
-      <w:r>
-        <w:t>enfermería</w:t>
-      </w:r>
-      <w:r>
-        <w:t>.</w:t>
-      </w:r>
-    </w:p>
-    <w:p>
-      <w:pPr>
-        <w:pStyle w:val="Ttulo5"/>
-      </w:pPr>
-      <w:r>
-        <w:t>¿Cómo se verá visualmente está acción?</w:t>
-      </w:r>
-    </w:p>
-    <w:p>
-      <w:pPr>
-        <w:spacing w:line="276" w:lineRule="auto"/>
-        <w:jc w:val="both"/>
-      </w:pPr>
-      <w:r>
-        <w:t xml:space="preserve">Cuando el miembro del personal </w:t>
-      </w:r>
-      <w:r>
-        <w:t>administrativo o de</w:t>
-      </w:r>
-      <w:r>
-        <w:t xml:space="preserve"> </w:t>
-      </w:r>
-      <w:r>
-        <w:t xml:space="preserve">enfermería </w:t>
-      </w:r>
-      <w:r>
-        <w:t>inicie sesión, aparecerá una opción llamada</w:t>
-      </w:r>
-      <w:r>
-        <w:t xml:space="preserve"> “Traslado”.</w:t>
-      </w:r>
-    </w:p>
-    <w:p>
-      <w:pPr>
-        <w:spacing w:line="276" w:lineRule="auto"/>
-        <w:jc w:val="both"/>
-      </w:pPr>
-      <w:r>
-        <w:t>Al seleccionar está opción, y luego seleccionar una unidad, aparecer una lista de los pacientes de dicha unidad, con información como su estado.</w:t>
-      </w:r>
-    </w:p>
-    <w:p>
-      <w:pPr>
-        <w:spacing w:line="276" w:lineRule="auto"/>
-        <w:jc w:val="both"/>
-      </w:pPr>
-      <w:r>
-        <w:t>Al seleccionar un paciente se dará la opción de trasladarlo a otra unidad o a otro hospital.</w:t>
-      </w:r>
-    </w:p>
-    <w:p>
-      <w:pPr>
-        <w:spacing w:line="276" w:lineRule="auto"/>
-        <w:jc w:val="both"/>
-      </w:pPr>
-      <w:r>
-        <w:t xml:space="preserve">Se </w:t>
-      </w:r>
-      <w:r>
-        <w:t>avisará</w:t>
-      </w:r>
-      <w:r>
-        <w:t xml:space="preserve"> si en dicha unidad no hay espacio para el traslado.</w:t>
-      </w:r>
-    </w:p>
-    <w:p>
-      <w:pPr>
-        <w:pStyle w:val="Ttulo5"/>
-      </w:pPr>
-      <w:r>
-        <w:t>¿Qué cambiar</w:t>
-      </w:r>
-      <w:r>
-        <w:t>á</w:t>
-      </w:r>
-      <w:r>
-        <w:t xml:space="preserve"> </w:t>
-      </w:r>
-      <w:r>
-        <w:t>este</w:t>
-      </w:r>
-      <w:r>
-        <w:t xml:space="preserve"> proceso/acción en el sistema?</w:t>
-      </w:r>
-    </w:p>
-    <w:p>
-      <w:pPr>
-        <w:jc w:val="both"/>
-      </w:pPr>
-      <w:r>
-        <w:t xml:space="preserve">Está acción </w:t>
-      </w:r>
-      <w:r>
-        <w:t>actualizar</w:t>
-      </w:r>
-      <w:r>
-        <w:t>á</w:t>
-      </w:r>
-      <w:r>
-        <w:t xml:space="preserve"> </w:t>
-      </w:r>
-      <w:r>
-        <w:t>la ubicación del paciente dentro del hospital</w:t>
-      </w:r>
-      <w:r>
-        <w:t>.</w:t>
-      </w:r>
-    </w:p>
-    <w:p>
-      <w:pPr>
-        <w:jc w:val="both"/>
-      </w:pPr>
-      <w:r>
-        <w:t xml:space="preserve">Si el traslado es a </w:t>
-      </w:r>
-      <w:r>
-        <w:t>otro hospital</w:t>
-      </w:r>
-      <w:r>
-        <w:t xml:space="preserve">, se rellenará </w:t>
-      </w:r>
-      <w:r>
-        <w:t>los datos</w:t>
-      </w:r>
-      <w:r>
-        <w:t xml:space="preserve"> sobre el nuevo hospital del paciente</w:t>
-      </w:r>
-      <w:r>
-        <w:t>,</w:t>
-      </w:r>
-      <w:r>
-        <w:t xml:space="preserve"> y el ingreso del paciente </w:t>
-      </w:r>
-      <w:r>
-        <w:t>pasará</w:t>
-      </w:r>
-      <w:r>
-        <w:t xml:space="preserve"> a estar inactivo</w:t>
-      </w:r>
-      <w:r>
-        <w:t>.</w:t>
-      </w:r>
-    </w:p>
-    <w:p>
-      <w:pPr>
         <w:jc w:val="both"/>
       </w:pPr>
     </w:p>
@@ -5919,7 +5710,7 @@
       <w:pPr>
         <w:pStyle w:val="Ttulo2"/>
       </w:pPr>
-      <w:bookmarkStart w:id="31" w:name="_Toc228071402"/>
+      <w:bookmarkStart w:id="31" w:name="_Toc228121823"/>
       <w:r>
         <w:lastRenderedPageBreak/>
         <w:t>REGLAS DEL SISTEMA</w:t>
@@ -6219,7 +6010,7 @@
       <w:pPr>
         <w:pStyle w:val="Ttulo2"/>
       </w:pPr>
-      <w:bookmarkStart w:id="32" w:name="_Toc228071403"/>
+      <w:bookmarkStart w:id="32" w:name="_Toc228121824"/>
       <w:r>
         <w:lastRenderedPageBreak/>
         <w:t xml:space="preserve">DATOS DE </w:t>
@@ -6242,7 +6033,7 @@
       <w:pPr>
         <w:pStyle w:val="Ttulo3"/>
       </w:pPr>
-      <w:bookmarkStart w:id="33" w:name="_Toc228071404"/>
+      <w:bookmarkStart w:id="33" w:name="_Toc228121825"/>
       <w:r>
         <w:t>ACTORES</w:t>
       </w:r>
@@ -6253,15 +6044,7 @@
         <w:pStyle w:val="Ttulo4"/>
       </w:pPr>
       <w:r>
-        <w:t>Personal &lt;&lt;</w:t>
-      </w:r>
-      <w:proofErr w:type="spellStart"/>
-      <w:r>
-        <w:t>abstract</w:t>
-      </w:r>
-      <w:proofErr w:type="spellEnd"/>
-      <w:r>
-        <w:t>&gt;&gt;:</w:t>
+        <w:t>Personal &lt;&lt;abstract&gt;&gt;:</w:t>
       </w:r>
     </w:p>
     <w:p>
@@ -6306,7 +6089,7 @@
         <w:spacing w:before="480"/>
         <w:ind w:left="357" w:hanging="357"/>
       </w:pPr>
-      <w:bookmarkStart w:id="34" w:name="_Toc228071405"/>
+      <w:bookmarkStart w:id="34" w:name="_Toc228121826"/>
       <w:r>
         <w:t>ENTIDADES</w:t>
       </w:r>
@@ -6885,7 +6668,7 @@
       <w:pPr>
         <w:pStyle w:val="Ttulo2"/>
       </w:pPr>
-      <w:bookmarkStart w:id="35" w:name="_Toc228071406"/>
+      <w:bookmarkStart w:id="35" w:name="_Toc228121827"/>
       <w:r>
         <w:lastRenderedPageBreak/>
         <w:t xml:space="preserve">DECISIONES </w:t>
@@ -6902,7 +6685,7 @@
       <w:pPr>
         <w:pStyle w:val="Ttulo3"/>
       </w:pPr>
-      <w:bookmarkStart w:id="36" w:name="_Toc228071407"/>
+      <w:bookmarkStart w:id="36" w:name="_Toc228121828"/>
       <w:r>
         <w:t>¿Cómo simular el tiempo?</w:t>
       </w:r>
@@ -6921,20 +6704,10 @@
         <w:jc w:val="both"/>
       </w:pPr>
       <w:r>
-        <w:t>Podríamos crear una clase de utilidad llamada “Tiempo” o algo así, con un método llamado “</w:t>
-      </w:r>
-      <w:proofErr w:type="spellStart"/>
-      <w:proofErr w:type="gramStart"/>
-      <w:r>
-        <w:t>avanzarDia</w:t>
-      </w:r>
-      <w:proofErr w:type="spellEnd"/>
-      <w:r>
-        <w:t>(</w:t>
-      </w:r>
-      <w:proofErr w:type="gramEnd"/>
-      <w:r>
-        <w:t>)”</w:t>
+        <w:t>En términos de programación, p</w:t>
+      </w:r>
+      <w:r>
+        <w:t>odríamos crear una clase de utilidad llamada “Tiempo” o algo así, con un método llamado “avanzarDia()”</w:t>
       </w:r>
       <w:r>
         <w:t xml:space="preserve"> que simule el avance de un día a otro en el hospital</w:t>
@@ -6961,7 +6734,7 @@
       <w:pPr>
         <w:pStyle w:val="Ttulo3"/>
       </w:pPr>
-      <w:bookmarkStart w:id="37" w:name="_Toc228071408"/>
+      <w:bookmarkStart w:id="37" w:name="_Toc228121829"/>
       <w:r>
         <w:t>¿Qué se entiende por “médicos y personal de salud”?</w:t>
       </w:r>
@@ -7024,11 +6797,9 @@
       <w:r>
         <w:t xml:space="preserve">“Personal de Salud” es un </w:t>
       </w:r>
-      <w:proofErr w:type="spellStart"/>
-      <w:r>
-        <w:t>termino</w:t>
-      </w:r>
-      <w:proofErr w:type="spellEnd"/>
+      <w:r>
+        <w:t>término</w:t>
+      </w:r>
       <w:r>
         <w:t xml:space="preserve"> que se usa para referirse a todos los trabajadores orientados al cuidado sanitario del paciente.</w:t>
       </w:r>
@@ -7046,7 +6817,7 @@
       <w:pPr>
         <w:pStyle w:val="Ttulo3"/>
       </w:pPr>
-      <w:bookmarkStart w:id="38" w:name="_Toc228071409"/>
+      <w:bookmarkStart w:id="38" w:name="_Toc228121830"/>
       <w:r>
         <w:t>¿Quién gestiona el traslado de pacientes?</w:t>
       </w:r>
@@ -7093,7 +6864,7 @@
       <w:pPr>
         <w:pStyle w:val="Ttulo3"/>
       </w:pPr>
-      <w:bookmarkStart w:id="39" w:name="_Toc228071410"/>
+      <w:bookmarkStart w:id="39" w:name="_Toc228121831"/>
       <w:r>
         <w:lastRenderedPageBreak/>
         <w:t xml:space="preserve">¿Quién se encarga de la evaluación final de los </w:t>
@@ -7163,7 +6934,7 @@
         <w:pStyle w:val="Ttulo3"/>
         <w:ind w:left="0" w:firstLine="0"/>
       </w:pPr>
-      <w:bookmarkStart w:id="40" w:name="_Toc228071411"/>
+      <w:bookmarkStart w:id="40" w:name="_Toc228121832"/>
       <w:r>
         <w:t>¿Cómo sabe el sistema que un paciente está listo para la evaluación final?</w:t>
       </w:r>

</xml_diff>

<commit_message>
Modificación del diagrama de casos de uso. Diagrama Listo
</commit_message>
<xml_diff>
--- a/documentacion/Análisis Del Enunciado 2/PROYECTO-RETO – Análisis _ Grupo2.docx
+++ b/documentacion/Análisis Del Enunciado 2/PROYECTO-RETO – Análisis _ Grupo2.docx
@@ -116,7 +116,29 @@
                                     <w:sz w:val="24"/>
                                     <w:szCs w:val="24"/>
                                   </w:rPr>
-                                  <w:t>Diana Rodriguez Pinillos</w:t>
+                                  <w:t xml:space="preserve">Diana </w:t>
+                                </w:r>
+                                <w:proofErr w:type="spellStart"/>
+                                <w:r>
+                                  <w:rPr>
+                                    <w:rFonts w:ascii="Calisto MT" w:hAnsi="Calisto MT"/>
+                                    <w:b/>
+                                    <w:bCs/>
+                                    <w:sz w:val="24"/>
+                                    <w:szCs w:val="24"/>
+                                  </w:rPr>
+                                  <w:t>Rodriguez</w:t>
+                                </w:r>
+                                <w:proofErr w:type="spellEnd"/>
+                                <w:r>
+                                  <w:rPr>
+                                    <w:rFonts w:ascii="Calisto MT" w:hAnsi="Calisto MT"/>
+                                    <w:b/>
+                                    <w:bCs/>
+                                    <w:sz w:val="24"/>
+                                    <w:szCs w:val="24"/>
+                                  </w:rPr>
+                                  <w:t xml:space="preserve"> Pinillos</w:t>
                                 </w:r>
                               </w:p>
                               <w:p>
@@ -138,8 +160,42 @@
                                     <w:sz w:val="24"/>
                                     <w:szCs w:val="24"/>
                                   </w:rPr>
-                                  <w:t>Alex Andrei Stoica</w:t>
+                                  <w:t xml:space="preserve">Alex </w:t>
                                 </w:r>
+                                <w:proofErr w:type="spellStart"/>
+                                <w:r>
+                                  <w:rPr>
+                                    <w:rFonts w:ascii="Calisto MT" w:hAnsi="Calisto MT"/>
+                                    <w:b/>
+                                    <w:bCs/>
+                                    <w:sz w:val="24"/>
+                                    <w:szCs w:val="24"/>
+                                  </w:rPr>
+                                  <w:t>Andrei</w:t>
+                                </w:r>
+                                <w:proofErr w:type="spellEnd"/>
+                                <w:r>
+                                  <w:rPr>
+                                    <w:rFonts w:ascii="Calisto MT" w:hAnsi="Calisto MT"/>
+                                    <w:b/>
+                                    <w:bCs/>
+                                    <w:sz w:val="24"/>
+                                    <w:szCs w:val="24"/>
+                                  </w:rPr>
+                                  <w:t xml:space="preserve"> </w:t>
+                                </w:r>
+                                <w:proofErr w:type="spellStart"/>
+                                <w:r>
+                                  <w:rPr>
+                                    <w:rFonts w:ascii="Calisto MT" w:hAnsi="Calisto MT"/>
+                                    <w:b/>
+                                    <w:bCs/>
+                                    <w:sz w:val="24"/>
+                                    <w:szCs w:val="24"/>
+                                  </w:rPr>
+                                  <w:t>Stoica</w:t>
+                                </w:r>
+                                <w:proofErr w:type="spellEnd"/>
                               </w:p>
                               <w:p>
                                 <w:pPr>
@@ -245,7 +301,29 @@
                               <w:sz w:val="24"/>
                               <w:szCs w:val="24"/>
                             </w:rPr>
-                            <w:t>Diana Rodriguez Pinillos</w:t>
+                            <w:t xml:space="preserve">Diana </w:t>
+                          </w:r>
+                          <w:proofErr w:type="spellStart"/>
+                          <w:r>
+                            <w:rPr>
+                              <w:rFonts w:ascii="Calisto MT" w:hAnsi="Calisto MT"/>
+                              <w:b/>
+                              <w:bCs/>
+                              <w:sz w:val="24"/>
+                              <w:szCs w:val="24"/>
+                            </w:rPr>
+                            <w:t>Rodriguez</w:t>
+                          </w:r>
+                          <w:proofErr w:type="spellEnd"/>
+                          <w:r>
+                            <w:rPr>
+                              <w:rFonts w:ascii="Calisto MT" w:hAnsi="Calisto MT"/>
+                              <w:b/>
+                              <w:bCs/>
+                              <w:sz w:val="24"/>
+                              <w:szCs w:val="24"/>
+                            </w:rPr>
+                            <w:t xml:space="preserve"> Pinillos</w:t>
                           </w:r>
                         </w:p>
                         <w:p>
@@ -267,8 +345,42 @@
                               <w:sz w:val="24"/>
                               <w:szCs w:val="24"/>
                             </w:rPr>
-                            <w:t>Alex Andrei Stoica</w:t>
+                            <w:t xml:space="preserve">Alex </w:t>
                           </w:r>
+                          <w:proofErr w:type="spellStart"/>
+                          <w:r>
+                            <w:rPr>
+                              <w:rFonts w:ascii="Calisto MT" w:hAnsi="Calisto MT"/>
+                              <w:b/>
+                              <w:bCs/>
+                              <w:sz w:val="24"/>
+                              <w:szCs w:val="24"/>
+                            </w:rPr>
+                            <w:t>Andrei</w:t>
+                          </w:r>
+                          <w:proofErr w:type="spellEnd"/>
+                          <w:r>
+                            <w:rPr>
+                              <w:rFonts w:ascii="Calisto MT" w:hAnsi="Calisto MT"/>
+                              <w:b/>
+                              <w:bCs/>
+                              <w:sz w:val="24"/>
+                              <w:szCs w:val="24"/>
+                            </w:rPr>
+                            <w:t xml:space="preserve"> </w:t>
+                          </w:r>
+                          <w:proofErr w:type="spellStart"/>
+                          <w:r>
+                            <w:rPr>
+                              <w:rFonts w:ascii="Calisto MT" w:hAnsi="Calisto MT"/>
+                              <w:b/>
+                              <w:bCs/>
+                              <w:sz w:val="24"/>
+                              <w:szCs w:val="24"/>
+                            </w:rPr>
+                            <w:t>Stoica</w:t>
+                          </w:r>
+                          <w:proofErr w:type="spellEnd"/>
                         </w:p>
                         <w:p>
                           <w:pPr>
@@ -2976,19 +3088,19 @@
                             <w:pPr>
                               <w:pStyle w:val="Ttulo1"/>
                             </w:pPr>
-                            <w:bookmarkStart w:id="2" w:name="_Toc201837460"/>
-                            <w:bookmarkStart w:id="3" w:name="_Toc201837471"/>
-                            <w:bookmarkStart w:id="4" w:name="_Toc201837593"/>
-                            <w:bookmarkStart w:id="5" w:name="_Toc228121807"/>
+                            <w:bookmarkStart w:id="1" w:name="_Toc201837460"/>
+                            <w:bookmarkStart w:id="2" w:name="_Toc201837471"/>
+                            <w:bookmarkStart w:id="3" w:name="_Toc201837593"/>
+                            <w:bookmarkStart w:id="4" w:name="_Toc228121807"/>
                             <w:r>
                               <w:rPr>
                                 <w:rFonts w:ascii="Segoe UI Emoji" w:hAnsi="Segoe UI Emoji"/>
                               </w:rPr>
                               <w:t>🧱</w:t>
                             </w:r>
+                            <w:bookmarkEnd w:id="1"/>
                             <w:bookmarkEnd w:id="2"/>
                             <w:bookmarkEnd w:id="3"/>
-                            <w:bookmarkEnd w:id="4"/>
                             <w:r>
                               <w:t>AN</w:t>
                             </w:r>
@@ -2998,7 +3110,7 @@
                             <w:r>
                               <w:t>LISIS</w:t>
                             </w:r>
-                            <w:bookmarkEnd w:id="5"/>
+                            <w:bookmarkEnd w:id="4"/>
                           </w:p>
                         </w:txbxContent>
                       </wps:txbx>
@@ -3067,8 +3179,8 @@
       <w:pPr>
         <w:pStyle w:val="Ttulo2"/>
       </w:pPr>
-      <w:bookmarkStart w:id="10" w:name="_Toc201837594"/>
-      <w:bookmarkStart w:id="11" w:name="_Toc228121808"/>
+      <w:bookmarkStart w:id="5" w:name="_Toc201837594"/>
+      <w:bookmarkStart w:id="6" w:name="_Toc228121808"/>
       <w:r>
         <w:lastRenderedPageBreak/>
         <w:t>A</w:t>
@@ -3076,18 +3188,18 @@
       <w:r>
         <w:t>CTORES</w:t>
       </w:r>
-      <w:bookmarkEnd w:id="10"/>
-      <w:bookmarkEnd w:id="11"/>
+      <w:bookmarkEnd w:id="5"/>
+      <w:bookmarkEnd w:id="6"/>
     </w:p>
     <w:p>
       <w:pPr>
         <w:pStyle w:val="Ttulo3"/>
       </w:pPr>
-      <w:bookmarkStart w:id="12" w:name="_Toc228121809"/>
+      <w:bookmarkStart w:id="7" w:name="_Toc228121809"/>
       <w:r>
         <w:t>¿Qué es un actor?</w:t>
       </w:r>
-      <w:bookmarkEnd w:id="12"/>
+      <w:bookmarkEnd w:id="7"/>
     </w:p>
     <w:p>
       <w:pPr>
@@ -3147,11 +3259,11 @@
       <w:pPr>
         <w:pStyle w:val="Ttulo3"/>
       </w:pPr>
-      <w:bookmarkStart w:id="13" w:name="_Toc228121810"/>
+      <w:bookmarkStart w:id="8" w:name="_Toc228121810"/>
       <w:r>
         <w:t>Actores:</w:t>
       </w:r>
-      <w:bookmarkEnd w:id="13"/>
+      <w:bookmarkEnd w:id="8"/>
     </w:p>
     <w:p>
       <w:pPr>
@@ -3191,7 +3303,23 @@
           <w:b/>
           <w:bCs/>
         </w:rPr>
-        <w:t>Personal &lt;&lt;abstract&gt;&gt;:</w:t>
+        <w:t>Personal &lt;&lt;</w:t>
+      </w:r>
+      <w:proofErr w:type="spellStart"/>
+      <w:r>
+        <w:rPr>
+          <w:b/>
+          <w:bCs/>
+        </w:rPr>
+        <w:t>abstract</w:t>
+      </w:r>
+      <w:proofErr w:type="spellEnd"/>
+      <w:r>
+        <w:rPr>
+          <w:b/>
+          <w:bCs/>
+        </w:rPr>
+        <w:t>&gt;&gt;:</w:t>
       </w:r>
       <w:r>
         <w:t xml:space="preserve"> Representa a todos los tipos de trabajadores del hospital.</w:t>
@@ -3239,7 +3367,23 @@
           <w:b/>
           <w:bCs/>
         </w:rPr>
-        <w:t xml:space="preserve"> &lt;&lt;abstract&gt;&gt;</w:t>
+        <w:t xml:space="preserve"> &lt;&lt;</w:t>
+      </w:r>
+      <w:proofErr w:type="spellStart"/>
+      <w:r>
+        <w:rPr>
+          <w:b/>
+          <w:bCs/>
+        </w:rPr>
+        <w:t>abstract</w:t>
+      </w:r>
+      <w:proofErr w:type="spellEnd"/>
+      <w:r>
+        <w:rPr>
+          <w:b/>
+          <w:bCs/>
+        </w:rPr>
+        <w:t>&gt;&gt;</w:t>
       </w:r>
       <w:r>
         <w:rPr>
@@ -3401,7 +3545,23 @@
           <w:b/>
           <w:bCs/>
         </w:rPr>
-        <w:t>&lt;&lt;abstract&gt;&gt;</w:t>
+        <w:t>&lt;&lt;</w:t>
+      </w:r>
+      <w:proofErr w:type="spellStart"/>
+      <w:r>
+        <w:rPr>
+          <w:b/>
+          <w:bCs/>
+        </w:rPr>
+        <w:t>abstract</w:t>
+      </w:r>
+      <w:proofErr w:type="spellEnd"/>
+      <w:r>
+        <w:rPr>
+          <w:b/>
+          <w:bCs/>
+        </w:rPr>
+        <w:t>&gt;&gt;</w:t>
       </w:r>
       <w:r>
         <w:t>,</w:t>
@@ -3414,7 +3574,7 @@
       <w:pPr>
         <w:pStyle w:val="Ttulo3"/>
       </w:pPr>
-      <w:bookmarkStart w:id="14" w:name="_Toc228121811"/>
+      <w:bookmarkStart w:id="9" w:name="_Toc228121811"/>
       <w:r>
         <w:t xml:space="preserve">¿Por qué </w:t>
       </w:r>
@@ -3430,7 +3590,7 @@
       <w:r>
         <w:t>ctores?</w:t>
       </w:r>
-      <w:bookmarkEnd w:id="14"/>
+      <w:bookmarkEnd w:id="9"/>
     </w:p>
     <w:p>
       <w:pPr>
@@ -3476,18 +3636,18 @@
       <w:pPr>
         <w:pStyle w:val="Ttulo2"/>
       </w:pPr>
-      <w:bookmarkStart w:id="15" w:name="_Toc228121812"/>
+      <w:bookmarkStart w:id="10" w:name="_Toc228121812"/>
       <w:r>
         <w:lastRenderedPageBreak/>
         <w:t>ENTIDADES</w:t>
       </w:r>
-      <w:bookmarkEnd w:id="15"/>
+      <w:bookmarkEnd w:id="10"/>
     </w:p>
     <w:p>
       <w:pPr>
         <w:pStyle w:val="Ttulo3"/>
       </w:pPr>
-      <w:bookmarkStart w:id="16" w:name="_Toc228121813"/>
+      <w:bookmarkStart w:id="11" w:name="_Toc228121813"/>
       <w:r>
         <w:t>¿</w:t>
       </w:r>
@@ -3497,7 +3657,7 @@
       <w:r>
         <w:t>?</w:t>
       </w:r>
-      <w:bookmarkEnd w:id="16"/>
+      <w:bookmarkEnd w:id="11"/>
     </w:p>
     <w:p>
       <w:pPr>
@@ -3521,14 +3681,14 @@
       <w:pPr>
         <w:pStyle w:val="Ttulo3"/>
       </w:pPr>
-      <w:bookmarkStart w:id="17" w:name="_Toc228121814"/>
+      <w:bookmarkStart w:id="12" w:name="_Toc228121814"/>
       <w:r>
         <w:t>Entidades</w:t>
       </w:r>
       <w:r>
         <w:t>:</w:t>
       </w:r>
-      <w:bookmarkEnd w:id="17"/>
+      <w:bookmarkEnd w:id="12"/>
     </w:p>
     <w:p>
       <w:pPr>
@@ -3856,11 +4016,11 @@
       <w:pPr>
         <w:pStyle w:val="Ttulo3"/>
       </w:pPr>
-      <w:bookmarkStart w:id="18" w:name="_Toc228121815"/>
+      <w:bookmarkStart w:id="13" w:name="_Toc228121815"/>
       <w:r>
         <w:t>¿Por qué elegimos estas Entidades?</w:t>
       </w:r>
-      <w:bookmarkEnd w:id="18"/>
+      <w:bookmarkEnd w:id="13"/>
     </w:p>
     <w:p>
       <w:pPr>
@@ -3899,18 +4059,18 @@
       <w:pPr>
         <w:pStyle w:val="Ttulo2"/>
       </w:pPr>
-      <w:bookmarkStart w:id="19" w:name="_Toc228121816"/>
+      <w:bookmarkStart w:id="14" w:name="_Toc228121816"/>
       <w:r>
         <w:lastRenderedPageBreak/>
         <w:t>ACCIONES</w:t>
       </w:r>
-      <w:bookmarkEnd w:id="19"/>
+      <w:bookmarkEnd w:id="14"/>
     </w:p>
     <w:p>
       <w:pPr>
         <w:pStyle w:val="Ttulo3"/>
       </w:pPr>
-      <w:bookmarkStart w:id="20" w:name="_Toc228121817"/>
+      <w:bookmarkStart w:id="15" w:name="_Toc228121817"/>
       <w:r>
         <w:t>¿Qué son las acciones</w:t>
       </w:r>
@@ -3920,7 +4080,7 @@
       <w:r>
         <w:t>:</w:t>
       </w:r>
-      <w:bookmarkEnd w:id="20"/>
+      <w:bookmarkEnd w:id="15"/>
     </w:p>
     <w:p>
       <w:pPr>
@@ -3959,7 +4119,15 @@
         <w:t xml:space="preserve">Cómo guardar la información </w:t>
       </w:r>
       <w:r>
-        <w:t>de una ronda medica en el sistema que le hizo a un paciente en la vida real.</w:t>
+        <w:t xml:space="preserve">de una ronda </w:t>
+      </w:r>
+      <w:proofErr w:type="spellStart"/>
+      <w:r>
+        <w:t>medica</w:t>
+      </w:r>
+      <w:proofErr w:type="spellEnd"/>
+      <w:r>
+        <w:t xml:space="preserve"> en el sistema que le hizo a un paciente en la vida real.</w:t>
       </w:r>
     </w:p>
     <w:p>
@@ -4086,7 +4254,7 @@
       <w:pPr>
         <w:pStyle w:val="Ttulo3"/>
       </w:pPr>
-      <w:bookmarkStart w:id="21" w:name="_Toc228121818"/>
+      <w:bookmarkStart w:id="16" w:name="_Toc228121818"/>
       <w:r>
         <w:lastRenderedPageBreak/>
         <w:t>Asignación de Camas</w:t>
@@ -4094,7 +4262,7 @@
       <w:r>
         <w:t>:</w:t>
       </w:r>
-      <w:bookmarkEnd w:id="21"/>
+      <w:bookmarkEnd w:id="16"/>
     </w:p>
     <w:p>
       <w:pPr>
@@ -4196,7 +4364,7 @@
       <w:pPr>
         <w:pStyle w:val="Ttulo5"/>
       </w:pPr>
-      <w:bookmarkStart w:id="22" w:name="_Hlk225629102"/>
+      <w:bookmarkStart w:id="17" w:name="_Hlk225629102"/>
       <w:r>
         <w:t xml:space="preserve">¿Quiénes se involucran en </w:t>
       </w:r>
@@ -4207,7 +4375,7 @@
         <w:t>acción?</w:t>
       </w:r>
     </w:p>
-    <w:bookmarkEnd w:id="22"/>
+    <w:bookmarkEnd w:id="17"/>
     <w:p>
       <w:pPr>
         <w:jc w:val="both"/>
@@ -4273,11 +4441,11 @@
         <w:spacing w:before="240"/>
         <w:ind w:left="357" w:hanging="357"/>
       </w:pPr>
-      <w:bookmarkStart w:id="23" w:name="_Hlk225629156"/>
+      <w:bookmarkStart w:id="18" w:name="_Hlk225629156"/>
       <w:r>
         <w:t>¿</w:t>
       </w:r>
-      <w:bookmarkStart w:id="24" w:name="_Hlk225629166"/>
+      <w:bookmarkStart w:id="19" w:name="_Hlk225629166"/>
       <w:r>
         <w:t>Qué cambiar</w:t>
       </w:r>
@@ -4296,9 +4464,9 @@
       <w:r>
         <w:t>?</w:t>
       </w:r>
-      <w:bookmarkEnd w:id="24"/>
-    </w:p>
-    <w:bookmarkEnd w:id="23"/>
+      <w:bookmarkEnd w:id="19"/>
+    </w:p>
+    <w:bookmarkEnd w:id="18"/>
     <w:p>
       <w:pPr>
         <w:jc w:val="both"/>
@@ -4373,7 +4541,7 @@
       <w:pPr>
         <w:pStyle w:val="Ttulo3"/>
       </w:pPr>
-      <w:bookmarkStart w:id="25" w:name="_Toc228121819"/>
+      <w:bookmarkStart w:id="20" w:name="_Toc228121819"/>
       <w:r>
         <w:lastRenderedPageBreak/>
         <w:t>Proceso de Rondas Medicas Diarias</w:t>
@@ -4381,7 +4549,7 @@
       <w:r>
         <w:t>:</w:t>
       </w:r>
-      <w:bookmarkEnd w:id="25"/>
+      <w:bookmarkEnd w:id="20"/>
     </w:p>
     <w:p>
       <w:pPr>
@@ -4444,7 +4612,7 @@
           <w:numId w:val="7"/>
         </w:numPr>
       </w:pPr>
-      <w:bookmarkStart w:id="26" w:name="_Hlk225444366"/>
+      <w:bookmarkStart w:id="21" w:name="_Hlk225444366"/>
       <w:r>
         <w:t>Explicación de ambigüedad</w:t>
       </w:r>
@@ -4663,7 +4831,7 @@
       <w:r>
         <w:t>.</w:t>
       </w:r>
-      <w:bookmarkEnd w:id="26"/>
+      <w:bookmarkEnd w:id="21"/>
     </w:p>
     <w:p>
       <w:pPr>
@@ -4812,7 +4980,7 @@
       <w:pPr>
         <w:pStyle w:val="Ttulo3"/>
       </w:pPr>
-      <w:bookmarkStart w:id="27" w:name="_Toc228121820"/>
+      <w:bookmarkStart w:id="22" w:name="_Toc228121820"/>
       <w:r>
         <w:lastRenderedPageBreak/>
         <w:t>Evaluación final</w:t>
@@ -4820,7 +4988,7 @@
       <w:r>
         <w:t xml:space="preserve"> a un Paciente</w:t>
       </w:r>
-      <w:bookmarkEnd w:id="27"/>
+      <w:bookmarkEnd w:id="22"/>
     </w:p>
     <w:p>
       <w:pPr>
@@ -5100,7 +5268,7 @@
       <w:pPr>
         <w:pStyle w:val="Ttulo3"/>
       </w:pPr>
-      <w:bookmarkStart w:id="28" w:name="_Toc228121821"/>
+      <w:bookmarkStart w:id="23" w:name="_Toc228121821"/>
       <w:r>
         <w:lastRenderedPageBreak/>
         <w:t xml:space="preserve">Documentación del Alta </w:t>
@@ -5108,7 +5276,7 @@
       <w:r>
         <w:t>de un Paciente</w:t>
       </w:r>
-      <w:bookmarkEnd w:id="28"/>
+      <w:bookmarkEnd w:id="23"/>
     </w:p>
     <w:p>
       <w:pPr>
@@ -5179,11 +5347,11 @@
         <w:spacing w:line="276" w:lineRule="auto"/>
         <w:jc w:val="both"/>
       </w:pPr>
-      <w:bookmarkStart w:id="29" w:name="_Hlk225628972"/>
+      <w:bookmarkStart w:id="24" w:name="_Hlk225628972"/>
       <w:r>
         <w:t>La “documentación del alta de un paciente” es una acción donde, según el enunciado, se ven involucrados un paciente y un miembro del personal administrativo.</w:t>
       </w:r>
-      <w:bookmarkEnd w:id="29"/>
+      <w:bookmarkEnd w:id="24"/>
     </w:p>
     <w:p>
       <w:pPr>
@@ -5397,7 +5565,7 @@
         <w:pStyle w:val="Ttulo3"/>
         <w:ind w:left="0" w:firstLine="0"/>
       </w:pPr>
-      <w:bookmarkStart w:id="30" w:name="_Toc228121822"/>
+      <w:bookmarkStart w:id="25" w:name="_Toc228121822"/>
       <w:r>
         <w:lastRenderedPageBreak/>
         <w:t>Traslado de un paciente a otra unidad u otro centro</w:t>
@@ -5408,7 +5576,7 @@
       <w:r>
         <w:t>médico</w:t>
       </w:r>
-      <w:bookmarkEnd w:id="30"/>
+      <w:bookmarkEnd w:id="25"/>
     </w:p>
     <w:p>
       <w:pPr>
@@ -5710,12 +5878,12 @@
       <w:pPr>
         <w:pStyle w:val="Ttulo2"/>
       </w:pPr>
-      <w:bookmarkStart w:id="31" w:name="_Toc228121823"/>
+      <w:bookmarkStart w:id="26" w:name="_Toc228121823"/>
       <w:r>
         <w:lastRenderedPageBreak/>
         <w:t>REGLAS DEL SISTEMA</w:t>
       </w:r>
-      <w:bookmarkEnd w:id="31"/>
+      <w:bookmarkEnd w:id="26"/>
     </w:p>
     <w:p>
       <w:pPr>
@@ -6010,7 +6178,7 @@
       <w:pPr>
         <w:pStyle w:val="Ttulo2"/>
       </w:pPr>
-      <w:bookmarkStart w:id="32" w:name="_Toc228121824"/>
+      <w:bookmarkStart w:id="27" w:name="_Toc228121824"/>
       <w:r>
         <w:lastRenderedPageBreak/>
         <w:t xml:space="preserve">DATOS DE </w:t>
@@ -6027,24 +6195,32 @@
       <w:r>
         <w:t>ENTIDAD</w:t>
       </w:r>
-      <w:bookmarkEnd w:id="32"/>
+      <w:bookmarkEnd w:id="27"/>
     </w:p>
     <w:p>
       <w:pPr>
         <w:pStyle w:val="Ttulo3"/>
       </w:pPr>
-      <w:bookmarkStart w:id="33" w:name="_Toc228121825"/>
+      <w:bookmarkStart w:id="28" w:name="_Toc228121825"/>
       <w:r>
         <w:t>ACTORES</w:t>
       </w:r>
-      <w:bookmarkEnd w:id="33"/>
+      <w:bookmarkEnd w:id="28"/>
     </w:p>
     <w:p>
       <w:pPr>
         <w:pStyle w:val="Ttulo4"/>
       </w:pPr>
       <w:r>
-        <w:t>Personal &lt;&lt;abstract&gt;&gt;:</w:t>
+        <w:t>Personal &lt;&lt;</w:t>
+      </w:r>
+      <w:proofErr w:type="spellStart"/>
+      <w:r>
+        <w:t>abstract</w:t>
+      </w:r>
+      <w:proofErr w:type="spellEnd"/>
+      <w:r>
+        <w:t>&gt;&gt;:</w:t>
       </w:r>
     </w:p>
     <w:p>
@@ -6089,11 +6265,11 @@
         <w:spacing w:before="480"/>
         <w:ind w:left="357" w:hanging="357"/>
       </w:pPr>
-      <w:bookmarkStart w:id="34" w:name="_Toc228121826"/>
+      <w:bookmarkStart w:id="29" w:name="_Toc228121826"/>
       <w:r>
         <w:t>ENTIDADES</w:t>
       </w:r>
-      <w:bookmarkEnd w:id="34"/>
+      <w:bookmarkEnd w:id="29"/>
     </w:p>
     <w:p>
       <w:pPr>
@@ -6425,13 +6601,7 @@
         </w:numPr>
       </w:pPr>
       <w:r>
-        <w:t>Hora</w:t>
-      </w:r>
-      <w:r>
-        <w:t xml:space="preserve"> del</w:t>
-      </w:r>
-      <w:r>
-        <w:t xml:space="preserve"> Traslado</w:t>
+        <w:t>Motivo Del Traslado</w:t>
       </w:r>
     </w:p>
     <w:p>
@@ -6668,7 +6838,7 @@
       <w:pPr>
         <w:pStyle w:val="Ttulo2"/>
       </w:pPr>
-      <w:bookmarkStart w:id="35" w:name="_Toc228121827"/>
+      <w:bookmarkStart w:id="30" w:name="_Toc228121827"/>
       <w:r>
         <w:lastRenderedPageBreak/>
         <w:t xml:space="preserve">DECISIONES </w:t>
@@ -6679,17 +6849,17 @@
       <w:r>
         <w:t xml:space="preserve"> Y JUSTIFICADAS</w:t>
       </w:r>
-      <w:bookmarkEnd w:id="35"/>
+      <w:bookmarkEnd w:id="30"/>
     </w:p>
     <w:p>
       <w:pPr>
         <w:pStyle w:val="Ttulo3"/>
       </w:pPr>
-      <w:bookmarkStart w:id="36" w:name="_Toc228121828"/>
+      <w:bookmarkStart w:id="31" w:name="_Toc228121828"/>
       <w:r>
         <w:t>¿Cómo simular el tiempo?</w:t>
       </w:r>
-      <w:bookmarkEnd w:id="36"/>
+      <w:bookmarkEnd w:id="31"/>
     </w:p>
     <w:p>
       <w:pPr>
@@ -6707,7 +6877,20 @@
         <w:t>En términos de programación, p</w:t>
       </w:r>
       <w:r>
-        <w:t>odríamos crear una clase de utilidad llamada “Tiempo” o algo así, con un método llamado “avanzarDia()”</w:t>
+        <w:t>odríamos crear una clase de utilidad llamada “Tiempo” o algo así, con un método llamado “</w:t>
+      </w:r>
+      <w:proofErr w:type="spellStart"/>
+      <w:proofErr w:type="gramStart"/>
+      <w:r>
+        <w:t>avanzarDia</w:t>
+      </w:r>
+      <w:proofErr w:type="spellEnd"/>
+      <w:r>
+        <w:t>(</w:t>
+      </w:r>
+      <w:proofErr w:type="gramEnd"/>
+      <w:r>
+        <w:t>)”</w:t>
       </w:r>
       <w:r>
         <w:t xml:space="preserve"> que simule el avance de un día a otro en el hospital</w:t>
@@ -6734,11 +6917,11 @@
       <w:pPr>
         <w:pStyle w:val="Ttulo3"/>
       </w:pPr>
-      <w:bookmarkStart w:id="37" w:name="_Toc228121829"/>
+      <w:bookmarkStart w:id="32" w:name="_Toc228121829"/>
       <w:r>
         <w:t>¿Qué se entiende por “médicos y personal de salud”?</w:t>
       </w:r>
-      <w:bookmarkEnd w:id="37"/>
+      <w:bookmarkEnd w:id="32"/>
     </w:p>
     <w:p>
       <w:pPr>
@@ -6817,11 +7000,11 @@
       <w:pPr>
         <w:pStyle w:val="Ttulo3"/>
       </w:pPr>
-      <w:bookmarkStart w:id="38" w:name="_Toc228121830"/>
+      <w:bookmarkStart w:id="33" w:name="_Toc228121830"/>
       <w:r>
         <w:t>¿Quién gestiona el traslado de pacientes?</w:t>
       </w:r>
-      <w:bookmarkEnd w:id="38"/>
+      <w:bookmarkEnd w:id="33"/>
     </w:p>
     <w:p>
       <w:pPr>
@@ -6864,7 +7047,7 @@
       <w:pPr>
         <w:pStyle w:val="Ttulo3"/>
       </w:pPr>
-      <w:bookmarkStart w:id="39" w:name="_Toc228121831"/>
+      <w:bookmarkStart w:id="34" w:name="_Toc228121831"/>
       <w:r>
         <w:lastRenderedPageBreak/>
         <w:t xml:space="preserve">¿Quién se encarga de la evaluación final de los </w:t>
@@ -6875,7 +7058,7 @@
       <w:r>
         <w:t>?</w:t>
       </w:r>
-      <w:bookmarkEnd w:id="39"/>
+      <w:bookmarkEnd w:id="34"/>
     </w:p>
     <w:p>
       <w:pPr>
@@ -6934,11 +7117,11 @@
         <w:pStyle w:val="Ttulo3"/>
         <w:ind w:left="0" w:firstLine="0"/>
       </w:pPr>
-      <w:bookmarkStart w:id="40" w:name="_Toc228121832"/>
+      <w:bookmarkStart w:id="35" w:name="_Toc228121832"/>
       <w:r>
         <w:t>¿Cómo sabe el sistema que un paciente está listo para la evaluación final?</w:t>
       </w:r>
-      <w:bookmarkEnd w:id="40"/>
+      <w:bookmarkEnd w:id="35"/>
     </w:p>
     <w:p>
       <w:pPr>

</xml_diff>

<commit_message>
Clase Ingreso.java Listo y modificaciones en atributo clase Ingreso en diagrama de clases
</commit_message>
<xml_diff>
--- a/documentacion/Análisis Del Enunciado 2/PROYECTO-RETO – Análisis _ Grupo2.docx
+++ b/documentacion/Análisis Del Enunciado 2/PROYECTO-RETO – Análisis _ Grupo2.docx
@@ -116,29 +116,7 @@
                                     <w:sz w:val="24"/>
                                     <w:szCs w:val="24"/>
                                   </w:rPr>
-                                  <w:t xml:space="preserve">Diana </w:t>
-                                </w:r>
-                                <w:proofErr w:type="spellStart"/>
-                                <w:r>
-                                  <w:rPr>
-                                    <w:rFonts w:ascii="Calisto MT" w:hAnsi="Calisto MT"/>
-                                    <w:b/>
-                                    <w:bCs/>
-                                    <w:sz w:val="24"/>
-                                    <w:szCs w:val="24"/>
-                                  </w:rPr>
-                                  <w:t>Rodriguez</w:t>
-                                </w:r>
-                                <w:proofErr w:type="spellEnd"/>
-                                <w:r>
-                                  <w:rPr>
-                                    <w:rFonts w:ascii="Calisto MT" w:hAnsi="Calisto MT"/>
-                                    <w:b/>
-                                    <w:bCs/>
-                                    <w:sz w:val="24"/>
-                                    <w:szCs w:val="24"/>
-                                  </w:rPr>
-                                  <w:t xml:space="preserve"> Pinillos</w:t>
+                                  <w:t>Diana Rodriguez Pinillos</w:t>
                                 </w:r>
                               </w:p>
                               <w:p>
@@ -160,42 +138,8 @@
                                     <w:sz w:val="24"/>
                                     <w:szCs w:val="24"/>
                                   </w:rPr>
-                                  <w:t xml:space="preserve">Alex </w:t>
+                                  <w:t>Alex Andrei Stoica</w:t>
                                 </w:r>
-                                <w:proofErr w:type="spellStart"/>
-                                <w:r>
-                                  <w:rPr>
-                                    <w:rFonts w:ascii="Calisto MT" w:hAnsi="Calisto MT"/>
-                                    <w:b/>
-                                    <w:bCs/>
-                                    <w:sz w:val="24"/>
-                                    <w:szCs w:val="24"/>
-                                  </w:rPr>
-                                  <w:t>Andrei</w:t>
-                                </w:r>
-                                <w:proofErr w:type="spellEnd"/>
-                                <w:r>
-                                  <w:rPr>
-                                    <w:rFonts w:ascii="Calisto MT" w:hAnsi="Calisto MT"/>
-                                    <w:b/>
-                                    <w:bCs/>
-                                    <w:sz w:val="24"/>
-                                    <w:szCs w:val="24"/>
-                                  </w:rPr>
-                                  <w:t xml:space="preserve"> </w:t>
-                                </w:r>
-                                <w:proofErr w:type="spellStart"/>
-                                <w:r>
-                                  <w:rPr>
-                                    <w:rFonts w:ascii="Calisto MT" w:hAnsi="Calisto MT"/>
-                                    <w:b/>
-                                    <w:bCs/>
-                                    <w:sz w:val="24"/>
-                                    <w:szCs w:val="24"/>
-                                  </w:rPr>
-                                  <w:t>Stoica</w:t>
-                                </w:r>
-                                <w:proofErr w:type="spellEnd"/>
                               </w:p>
                               <w:p>
                                 <w:pPr>
@@ -301,29 +245,7 @@
                               <w:sz w:val="24"/>
                               <w:szCs w:val="24"/>
                             </w:rPr>
-                            <w:t xml:space="preserve">Diana </w:t>
-                          </w:r>
-                          <w:proofErr w:type="spellStart"/>
-                          <w:r>
-                            <w:rPr>
-                              <w:rFonts w:ascii="Calisto MT" w:hAnsi="Calisto MT"/>
-                              <w:b/>
-                              <w:bCs/>
-                              <w:sz w:val="24"/>
-                              <w:szCs w:val="24"/>
-                            </w:rPr>
-                            <w:t>Rodriguez</w:t>
-                          </w:r>
-                          <w:proofErr w:type="spellEnd"/>
-                          <w:r>
-                            <w:rPr>
-                              <w:rFonts w:ascii="Calisto MT" w:hAnsi="Calisto MT"/>
-                              <w:b/>
-                              <w:bCs/>
-                              <w:sz w:val="24"/>
-                              <w:szCs w:val="24"/>
-                            </w:rPr>
-                            <w:t xml:space="preserve"> Pinillos</w:t>
+                            <w:t>Diana Rodriguez Pinillos</w:t>
                           </w:r>
                         </w:p>
                         <w:p>
@@ -345,42 +267,8 @@
                               <w:sz w:val="24"/>
                               <w:szCs w:val="24"/>
                             </w:rPr>
-                            <w:t xml:space="preserve">Alex </w:t>
+                            <w:t>Alex Andrei Stoica</w:t>
                           </w:r>
-                          <w:proofErr w:type="spellStart"/>
-                          <w:r>
-                            <w:rPr>
-                              <w:rFonts w:ascii="Calisto MT" w:hAnsi="Calisto MT"/>
-                              <w:b/>
-                              <w:bCs/>
-                              <w:sz w:val="24"/>
-                              <w:szCs w:val="24"/>
-                            </w:rPr>
-                            <w:t>Andrei</w:t>
-                          </w:r>
-                          <w:proofErr w:type="spellEnd"/>
-                          <w:r>
-                            <w:rPr>
-                              <w:rFonts w:ascii="Calisto MT" w:hAnsi="Calisto MT"/>
-                              <w:b/>
-                              <w:bCs/>
-                              <w:sz w:val="24"/>
-                              <w:szCs w:val="24"/>
-                            </w:rPr>
-                            <w:t xml:space="preserve"> </w:t>
-                          </w:r>
-                          <w:proofErr w:type="spellStart"/>
-                          <w:r>
-                            <w:rPr>
-                              <w:rFonts w:ascii="Calisto MT" w:hAnsi="Calisto MT"/>
-                              <w:b/>
-                              <w:bCs/>
-                              <w:sz w:val="24"/>
-                              <w:szCs w:val="24"/>
-                            </w:rPr>
-                            <w:t>Stoica</w:t>
-                          </w:r>
-                          <w:proofErr w:type="spellEnd"/>
                         </w:p>
                         <w:p>
                           <w:pPr>
@@ -3088,19 +2976,19 @@
                             <w:pPr>
                               <w:pStyle w:val="Ttulo1"/>
                             </w:pPr>
-                            <w:bookmarkStart w:id="1" w:name="_Toc201837460"/>
-                            <w:bookmarkStart w:id="2" w:name="_Toc201837471"/>
-                            <w:bookmarkStart w:id="3" w:name="_Toc201837593"/>
-                            <w:bookmarkStart w:id="4" w:name="_Toc228121807"/>
+                            <w:bookmarkStart w:id="2" w:name="_Toc201837460"/>
+                            <w:bookmarkStart w:id="3" w:name="_Toc201837471"/>
+                            <w:bookmarkStart w:id="4" w:name="_Toc201837593"/>
+                            <w:bookmarkStart w:id="5" w:name="_Toc228121807"/>
                             <w:r>
                               <w:rPr>
                                 <w:rFonts w:ascii="Segoe UI Emoji" w:hAnsi="Segoe UI Emoji"/>
                               </w:rPr>
                               <w:t>🧱</w:t>
                             </w:r>
-                            <w:bookmarkEnd w:id="1"/>
                             <w:bookmarkEnd w:id="2"/>
                             <w:bookmarkEnd w:id="3"/>
+                            <w:bookmarkEnd w:id="4"/>
                             <w:r>
                               <w:t>AN</w:t>
                             </w:r>
@@ -3110,7 +2998,7 @@
                             <w:r>
                               <w:t>LISIS</w:t>
                             </w:r>
-                            <w:bookmarkEnd w:id="4"/>
+                            <w:bookmarkEnd w:id="5"/>
                           </w:p>
                         </w:txbxContent>
                       </wps:txbx>
@@ -3179,8 +3067,8 @@
       <w:pPr>
         <w:pStyle w:val="Ttulo2"/>
       </w:pPr>
-      <w:bookmarkStart w:id="5" w:name="_Toc201837594"/>
-      <w:bookmarkStart w:id="6" w:name="_Toc228121808"/>
+      <w:bookmarkStart w:id="10" w:name="_Toc201837594"/>
+      <w:bookmarkStart w:id="11" w:name="_Toc228121808"/>
       <w:r>
         <w:lastRenderedPageBreak/>
         <w:t>A</w:t>
@@ -3188,18 +3076,18 @@
       <w:r>
         <w:t>CTORES</w:t>
       </w:r>
-      <w:bookmarkEnd w:id="5"/>
-      <w:bookmarkEnd w:id="6"/>
+      <w:bookmarkEnd w:id="10"/>
+      <w:bookmarkEnd w:id="11"/>
     </w:p>
     <w:p>
       <w:pPr>
         <w:pStyle w:val="Ttulo3"/>
       </w:pPr>
-      <w:bookmarkStart w:id="7" w:name="_Toc228121809"/>
+      <w:bookmarkStart w:id="12" w:name="_Toc228121809"/>
       <w:r>
         <w:t>¿Qué es un actor?</w:t>
       </w:r>
-      <w:bookmarkEnd w:id="7"/>
+      <w:bookmarkEnd w:id="12"/>
     </w:p>
     <w:p>
       <w:pPr>
@@ -3259,11 +3147,11 @@
       <w:pPr>
         <w:pStyle w:val="Ttulo3"/>
       </w:pPr>
-      <w:bookmarkStart w:id="8" w:name="_Toc228121810"/>
+      <w:bookmarkStart w:id="13" w:name="_Toc228121810"/>
       <w:r>
         <w:t>Actores:</w:t>
       </w:r>
-      <w:bookmarkEnd w:id="8"/>
+      <w:bookmarkEnd w:id="13"/>
     </w:p>
     <w:p>
       <w:pPr>
@@ -3303,23 +3191,7 @@
           <w:b/>
           <w:bCs/>
         </w:rPr>
-        <w:t>Personal &lt;&lt;</w:t>
-      </w:r>
-      <w:proofErr w:type="spellStart"/>
-      <w:r>
-        <w:rPr>
-          <w:b/>
-          <w:bCs/>
-        </w:rPr>
-        <w:t>abstract</w:t>
-      </w:r>
-      <w:proofErr w:type="spellEnd"/>
-      <w:r>
-        <w:rPr>
-          <w:b/>
-          <w:bCs/>
-        </w:rPr>
-        <w:t>&gt;&gt;:</w:t>
+        <w:t>Personal &lt;&lt;abstract&gt;&gt;:</w:t>
       </w:r>
       <w:r>
         <w:t xml:space="preserve"> Representa a todos los tipos de trabajadores del hospital.</w:t>
@@ -3367,23 +3239,7 @@
           <w:b/>
           <w:bCs/>
         </w:rPr>
-        <w:t xml:space="preserve"> &lt;&lt;</w:t>
-      </w:r>
-      <w:proofErr w:type="spellStart"/>
-      <w:r>
-        <w:rPr>
-          <w:b/>
-          <w:bCs/>
-        </w:rPr>
-        <w:t>abstract</w:t>
-      </w:r>
-      <w:proofErr w:type="spellEnd"/>
-      <w:r>
-        <w:rPr>
-          <w:b/>
-          <w:bCs/>
-        </w:rPr>
-        <w:t>&gt;&gt;</w:t>
+        <w:t xml:space="preserve"> &lt;&lt;abstract&gt;&gt;</w:t>
       </w:r>
       <w:r>
         <w:rPr>
@@ -3545,23 +3401,7 @@
           <w:b/>
           <w:bCs/>
         </w:rPr>
-        <w:t>&lt;&lt;</w:t>
-      </w:r>
-      <w:proofErr w:type="spellStart"/>
-      <w:r>
-        <w:rPr>
-          <w:b/>
-          <w:bCs/>
-        </w:rPr>
-        <w:t>abstract</w:t>
-      </w:r>
-      <w:proofErr w:type="spellEnd"/>
-      <w:r>
-        <w:rPr>
-          <w:b/>
-          <w:bCs/>
-        </w:rPr>
-        <w:t>&gt;&gt;</w:t>
+        <w:t>&lt;&lt;abstract&gt;&gt;</w:t>
       </w:r>
       <w:r>
         <w:t>,</w:t>
@@ -3574,7 +3414,7 @@
       <w:pPr>
         <w:pStyle w:val="Ttulo3"/>
       </w:pPr>
-      <w:bookmarkStart w:id="9" w:name="_Toc228121811"/>
+      <w:bookmarkStart w:id="14" w:name="_Toc228121811"/>
       <w:r>
         <w:t xml:space="preserve">¿Por qué </w:t>
       </w:r>
@@ -3590,7 +3430,7 @@
       <w:r>
         <w:t>ctores?</w:t>
       </w:r>
-      <w:bookmarkEnd w:id="9"/>
+      <w:bookmarkEnd w:id="14"/>
     </w:p>
     <w:p>
       <w:pPr>
@@ -3636,18 +3476,18 @@
       <w:pPr>
         <w:pStyle w:val="Ttulo2"/>
       </w:pPr>
-      <w:bookmarkStart w:id="10" w:name="_Toc228121812"/>
+      <w:bookmarkStart w:id="15" w:name="_Toc228121812"/>
       <w:r>
         <w:lastRenderedPageBreak/>
         <w:t>ENTIDADES</w:t>
       </w:r>
-      <w:bookmarkEnd w:id="10"/>
+      <w:bookmarkEnd w:id="15"/>
     </w:p>
     <w:p>
       <w:pPr>
         <w:pStyle w:val="Ttulo3"/>
       </w:pPr>
-      <w:bookmarkStart w:id="11" w:name="_Toc228121813"/>
+      <w:bookmarkStart w:id="16" w:name="_Toc228121813"/>
       <w:r>
         <w:t>¿</w:t>
       </w:r>
@@ -3657,7 +3497,7 @@
       <w:r>
         <w:t>?</w:t>
       </w:r>
-      <w:bookmarkEnd w:id="11"/>
+      <w:bookmarkEnd w:id="16"/>
     </w:p>
     <w:p>
       <w:pPr>
@@ -3681,14 +3521,14 @@
       <w:pPr>
         <w:pStyle w:val="Ttulo3"/>
       </w:pPr>
-      <w:bookmarkStart w:id="12" w:name="_Toc228121814"/>
+      <w:bookmarkStart w:id="17" w:name="_Toc228121814"/>
       <w:r>
         <w:t>Entidades</w:t>
       </w:r>
       <w:r>
         <w:t>:</w:t>
       </w:r>
-      <w:bookmarkEnd w:id="12"/>
+      <w:bookmarkEnd w:id="17"/>
     </w:p>
     <w:p>
       <w:pPr>
@@ -4016,11 +3856,11 @@
       <w:pPr>
         <w:pStyle w:val="Ttulo3"/>
       </w:pPr>
-      <w:bookmarkStart w:id="13" w:name="_Toc228121815"/>
+      <w:bookmarkStart w:id="18" w:name="_Toc228121815"/>
       <w:r>
         <w:t>¿Por qué elegimos estas Entidades?</w:t>
       </w:r>
-      <w:bookmarkEnd w:id="13"/>
+      <w:bookmarkEnd w:id="18"/>
     </w:p>
     <w:p>
       <w:pPr>
@@ -4059,18 +3899,18 @@
       <w:pPr>
         <w:pStyle w:val="Ttulo2"/>
       </w:pPr>
-      <w:bookmarkStart w:id="14" w:name="_Toc228121816"/>
+      <w:bookmarkStart w:id="19" w:name="_Toc228121816"/>
       <w:r>
         <w:lastRenderedPageBreak/>
         <w:t>ACCIONES</w:t>
       </w:r>
-      <w:bookmarkEnd w:id="14"/>
+      <w:bookmarkEnd w:id="19"/>
     </w:p>
     <w:p>
       <w:pPr>
         <w:pStyle w:val="Ttulo3"/>
       </w:pPr>
-      <w:bookmarkStart w:id="15" w:name="_Toc228121817"/>
+      <w:bookmarkStart w:id="20" w:name="_Toc228121817"/>
       <w:r>
         <w:t>¿Qué son las acciones</w:t>
       </w:r>
@@ -4080,7 +3920,7 @@
       <w:r>
         <w:t>:</w:t>
       </w:r>
-      <w:bookmarkEnd w:id="15"/>
+      <w:bookmarkEnd w:id="20"/>
     </w:p>
     <w:p>
       <w:pPr>
@@ -4119,15 +3959,7 @@
         <w:t xml:space="preserve">Cómo guardar la información </w:t>
       </w:r>
       <w:r>
-        <w:t xml:space="preserve">de una ronda </w:t>
-      </w:r>
-      <w:proofErr w:type="spellStart"/>
-      <w:r>
-        <w:t>medica</w:t>
-      </w:r>
-      <w:proofErr w:type="spellEnd"/>
-      <w:r>
-        <w:t xml:space="preserve"> en el sistema que le hizo a un paciente en la vida real.</w:t>
+        <w:t>de una ronda medica en el sistema que le hizo a un paciente en la vida real.</w:t>
       </w:r>
     </w:p>
     <w:p>
@@ -4254,7 +4086,7 @@
       <w:pPr>
         <w:pStyle w:val="Ttulo3"/>
       </w:pPr>
-      <w:bookmarkStart w:id="16" w:name="_Toc228121818"/>
+      <w:bookmarkStart w:id="21" w:name="_Toc228121818"/>
       <w:r>
         <w:lastRenderedPageBreak/>
         <w:t>Asignación de Camas</w:t>
@@ -4262,7 +4094,7 @@
       <w:r>
         <w:t>:</w:t>
       </w:r>
-      <w:bookmarkEnd w:id="16"/>
+      <w:bookmarkEnd w:id="21"/>
     </w:p>
     <w:p>
       <w:pPr>
@@ -4364,7 +4196,7 @@
       <w:pPr>
         <w:pStyle w:val="Ttulo5"/>
       </w:pPr>
-      <w:bookmarkStart w:id="17" w:name="_Hlk225629102"/>
+      <w:bookmarkStart w:id="22" w:name="_Hlk225629102"/>
       <w:r>
         <w:t xml:space="preserve">¿Quiénes se involucran en </w:t>
       </w:r>
@@ -4375,7 +4207,7 @@
         <w:t>acción?</w:t>
       </w:r>
     </w:p>
-    <w:bookmarkEnd w:id="17"/>
+    <w:bookmarkEnd w:id="22"/>
     <w:p>
       <w:pPr>
         <w:jc w:val="both"/>
@@ -4441,11 +4273,11 @@
         <w:spacing w:before="240"/>
         <w:ind w:left="357" w:hanging="357"/>
       </w:pPr>
-      <w:bookmarkStart w:id="18" w:name="_Hlk225629156"/>
+      <w:bookmarkStart w:id="23" w:name="_Hlk225629156"/>
       <w:r>
         <w:t>¿</w:t>
       </w:r>
-      <w:bookmarkStart w:id="19" w:name="_Hlk225629166"/>
+      <w:bookmarkStart w:id="24" w:name="_Hlk225629166"/>
       <w:r>
         <w:t>Qué cambiar</w:t>
       </w:r>
@@ -4464,9 +4296,9 @@
       <w:r>
         <w:t>?</w:t>
       </w:r>
-      <w:bookmarkEnd w:id="19"/>
-    </w:p>
-    <w:bookmarkEnd w:id="18"/>
+      <w:bookmarkEnd w:id="24"/>
+    </w:p>
+    <w:bookmarkEnd w:id="23"/>
     <w:p>
       <w:pPr>
         <w:jc w:val="both"/>
@@ -4541,7 +4373,7 @@
       <w:pPr>
         <w:pStyle w:val="Ttulo3"/>
       </w:pPr>
-      <w:bookmarkStart w:id="20" w:name="_Toc228121819"/>
+      <w:bookmarkStart w:id="25" w:name="_Toc228121819"/>
       <w:r>
         <w:lastRenderedPageBreak/>
         <w:t>Proceso de Rondas Medicas Diarias</w:t>
@@ -4549,7 +4381,7 @@
       <w:r>
         <w:t>:</w:t>
       </w:r>
-      <w:bookmarkEnd w:id="20"/>
+      <w:bookmarkEnd w:id="25"/>
     </w:p>
     <w:p>
       <w:pPr>
@@ -4612,7 +4444,7 @@
           <w:numId w:val="7"/>
         </w:numPr>
       </w:pPr>
-      <w:bookmarkStart w:id="21" w:name="_Hlk225444366"/>
+      <w:bookmarkStart w:id="26" w:name="_Hlk225444366"/>
       <w:r>
         <w:t>Explicación de ambigüedad</w:t>
       </w:r>
@@ -4831,7 +4663,7 @@
       <w:r>
         <w:t>.</w:t>
       </w:r>
-      <w:bookmarkEnd w:id="21"/>
+      <w:bookmarkEnd w:id="26"/>
     </w:p>
     <w:p>
       <w:pPr>
@@ -4980,7 +4812,7 @@
       <w:pPr>
         <w:pStyle w:val="Ttulo3"/>
       </w:pPr>
-      <w:bookmarkStart w:id="22" w:name="_Toc228121820"/>
+      <w:bookmarkStart w:id="27" w:name="_Toc228121820"/>
       <w:r>
         <w:lastRenderedPageBreak/>
         <w:t>Evaluación final</w:t>
@@ -4988,7 +4820,7 @@
       <w:r>
         <w:t xml:space="preserve"> a un Paciente</w:t>
       </w:r>
-      <w:bookmarkEnd w:id="22"/>
+      <w:bookmarkEnd w:id="27"/>
     </w:p>
     <w:p>
       <w:pPr>
@@ -5268,7 +5100,7 @@
       <w:pPr>
         <w:pStyle w:val="Ttulo3"/>
       </w:pPr>
-      <w:bookmarkStart w:id="23" w:name="_Toc228121821"/>
+      <w:bookmarkStart w:id="28" w:name="_Toc228121821"/>
       <w:r>
         <w:lastRenderedPageBreak/>
         <w:t xml:space="preserve">Documentación del Alta </w:t>
@@ -5276,7 +5108,7 @@
       <w:r>
         <w:t>de un Paciente</w:t>
       </w:r>
-      <w:bookmarkEnd w:id="23"/>
+      <w:bookmarkEnd w:id="28"/>
     </w:p>
     <w:p>
       <w:pPr>
@@ -5347,11 +5179,11 @@
         <w:spacing w:line="276" w:lineRule="auto"/>
         <w:jc w:val="both"/>
       </w:pPr>
-      <w:bookmarkStart w:id="24" w:name="_Hlk225628972"/>
+      <w:bookmarkStart w:id="29" w:name="_Hlk225628972"/>
       <w:r>
         <w:t>La “documentación del alta de un paciente” es una acción donde, según el enunciado, se ven involucrados un paciente y un miembro del personal administrativo.</w:t>
       </w:r>
-      <w:bookmarkEnd w:id="24"/>
+      <w:bookmarkEnd w:id="29"/>
     </w:p>
     <w:p>
       <w:pPr>
@@ -5565,7 +5397,7 @@
         <w:pStyle w:val="Ttulo3"/>
         <w:ind w:left="0" w:firstLine="0"/>
       </w:pPr>
-      <w:bookmarkStart w:id="25" w:name="_Toc228121822"/>
+      <w:bookmarkStart w:id="30" w:name="_Toc228121822"/>
       <w:r>
         <w:lastRenderedPageBreak/>
         <w:t>Traslado de un paciente a otra unidad u otro centro</w:t>
@@ -5576,7 +5408,7 @@
       <w:r>
         <w:t>médico</w:t>
       </w:r>
-      <w:bookmarkEnd w:id="25"/>
+      <w:bookmarkEnd w:id="30"/>
     </w:p>
     <w:p>
       <w:pPr>
@@ -5878,12 +5710,12 @@
       <w:pPr>
         <w:pStyle w:val="Ttulo2"/>
       </w:pPr>
-      <w:bookmarkStart w:id="26" w:name="_Toc228121823"/>
+      <w:bookmarkStart w:id="31" w:name="_Toc228121823"/>
       <w:r>
         <w:lastRenderedPageBreak/>
         <w:t>REGLAS DEL SISTEMA</w:t>
       </w:r>
-      <w:bookmarkEnd w:id="26"/>
+      <w:bookmarkEnd w:id="31"/>
     </w:p>
     <w:p>
       <w:pPr>
@@ -6178,7 +6010,7 @@
       <w:pPr>
         <w:pStyle w:val="Ttulo2"/>
       </w:pPr>
-      <w:bookmarkStart w:id="27" w:name="_Toc228121824"/>
+      <w:bookmarkStart w:id="32" w:name="_Toc228121824"/>
       <w:r>
         <w:lastRenderedPageBreak/>
         <w:t xml:space="preserve">DATOS DE </w:t>
@@ -6195,32 +6027,24 @@
       <w:r>
         <w:t>ENTIDAD</w:t>
       </w:r>
-      <w:bookmarkEnd w:id="27"/>
+      <w:bookmarkEnd w:id="32"/>
     </w:p>
     <w:p>
       <w:pPr>
         <w:pStyle w:val="Ttulo3"/>
       </w:pPr>
-      <w:bookmarkStart w:id="28" w:name="_Toc228121825"/>
+      <w:bookmarkStart w:id="33" w:name="_Toc228121825"/>
       <w:r>
         <w:t>ACTORES</w:t>
       </w:r>
-      <w:bookmarkEnd w:id="28"/>
+      <w:bookmarkEnd w:id="33"/>
     </w:p>
     <w:p>
       <w:pPr>
         <w:pStyle w:val="Ttulo4"/>
       </w:pPr>
       <w:r>
-        <w:t>Personal &lt;&lt;</w:t>
-      </w:r>
-      <w:proofErr w:type="spellStart"/>
-      <w:r>
-        <w:t>abstract</w:t>
-      </w:r>
-      <w:proofErr w:type="spellEnd"/>
-      <w:r>
-        <w:t>&gt;&gt;:</w:t>
+        <w:t>Personal &lt;&lt;abstract&gt;&gt;:</w:t>
       </w:r>
     </w:p>
     <w:p>
@@ -6265,11 +6089,11 @@
         <w:spacing w:before="480"/>
         <w:ind w:left="357" w:hanging="357"/>
       </w:pPr>
-      <w:bookmarkStart w:id="29" w:name="_Toc228121826"/>
+      <w:bookmarkStart w:id="34" w:name="_Toc228121826"/>
       <w:r>
         <w:t>ENTIDADES</w:t>
       </w:r>
-      <w:bookmarkEnd w:id="29"/>
+      <w:bookmarkEnd w:id="34"/>
     </w:p>
     <w:p>
       <w:pPr>
@@ -6475,7 +6299,7 @@
         </w:numPr>
       </w:pPr>
       <w:r>
-        <w:t>Discapacidades</w:t>
+        <w:t>Discapacidad</w:t>
       </w:r>
     </w:p>
     <w:p>
@@ -6838,7 +6662,7 @@
       <w:pPr>
         <w:pStyle w:val="Ttulo2"/>
       </w:pPr>
-      <w:bookmarkStart w:id="30" w:name="_Toc228121827"/>
+      <w:bookmarkStart w:id="35" w:name="_Toc228121827"/>
       <w:r>
         <w:lastRenderedPageBreak/>
         <w:t xml:space="preserve">DECISIONES </w:t>
@@ -6849,17 +6673,17 @@
       <w:r>
         <w:t xml:space="preserve"> Y JUSTIFICADAS</w:t>
       </w:r>
-      <w:bookmarkEnd w:id="30"/>
+      <w:bookmarkEnd w:id="35"/>
     </w:p>
     <w:p>
       <w:pPr>
         <w:pStyle w:val="Ttulo3"/>
       </w:pPr>
-      <w:bookmarkStart w:id="31" w:name="_Toc228121828"/>
+      <w:bookmarkStart w:id="36" w:name="_Toc228121828"/>
       <w:r>
         <w:t>¿Cómo simular el tiempo?</w:t>
       </w:r>
-      <w:bookmarkEnd w:id="31"/>
+      <w:bookmarkEnd w:id="36"/>
     </w:p>
     <w:p>
       <w:pPr>
@@ -6877,20 +6701,7 @@
         <w:t>En términos de programación, p</w:t>
       </w:r>
       <w:r>
-        <w:t>odríamos crear una clase de utilidad llamada “Tiempo” o algo así, con un método llamado “</w:t>
-      </w:r>
-      <w:proofErr w:type="spellStart"/>
-      <w:proofErr w:type="gramStart"/>
-      <w:r>
-        <w:t>avanzarDia</w:t>
-      </w:r>
-      <w:proofErr w:type="spellEnd"/>
-      <w:r>
-        <w:t>(</w:t>
-      </w:r>
-      <w:proofErr w:type="gramEnd"/>
-      <w:r>
-        <w:t>)”</w:t>
+        <w:t>odríamos crear una clase de utilidad llamada “Tiempo” o algo así, con un método llamado “avanzarDia()”</w:t>
       </w:r>
       <w:r>
         <w:t xml:space="preserve"> que simule el avance de un día a otro en el hospital</w:t>
@@ -6917,11 +6728,11 @@
       <w:pPr>
         <w:pStyle w:val="Ttulo3"/>
       </w:pPr>
-      <w:bookmarkStart w:id="32" w:name="_Toc228121829"/>
+      <w:bookmarkStart w:id="37" w:name="_Toc228121829"/>
       <w:r>
         <w:t>¿Qué se entiende por “médicos y personal de salud”?</w:t>
       </w:r>
-      <w:bookmarkEnd w:id="32"/>
+      <w:bookmarkEnd w:id="37"/>
     </w:p>
     <w:p>
       <w:pPr>
@@ -7000,11 +6811,11 @@
       <w:pPr>
         <w:pStyle w:val="Ttulo3"/>
       </w:pPr>
-      <w:bookmarkStart w:id="33" w:name="_Toc228121830"/>
+      <w:bookmarkStart w:id="38" w:name="_Toc228121830"/>
       <w:r>
         <w:t>¿Quién gestiona el traslado de pacientes?</w:t>
       </w:r>
-      <w:bookmarkEnd w:id="33"/>
+      <w:bookmarkEnd w:id="38"/>
     </w:p>
     <w:p>
       <w:pPr>
@@ -7047,7 +6858,7 @@
       <w:pPr>
         <w:pStyle w:val="Ttulo3"/>
       </w:pPr>
-      <w:bookmarkStart w:id="34" w:name="_Toc228121831"/>
+      <w:bookmarkStart w:id="39" w:name="_Toc228121831"/>
       <w:r>
         <w:lastRenderedPageBreak/>
         <w:t xml:space="preserve">¿Quién se encarga de la evaluación final de los </w:t>
@@ -7058,7 +6869,7 @@
       <w:r>
         <w:t>?</w:t>
       </w:r>
-      <w:bookmarkEnd w:id="34"/>
+      <w:bookmarkEnd w:id="39"/>
     </w:p>
     <w:p>
       <w:pPr>
@@ -7117,11 +6928,11 @@
         <w:pStyle w:val="Ttulo3"/>
         <w:ind w:left="0" w:firstLine="0"/>
       </w:pPr>
-      <w:bookmarkStart w:id="35" w:name="_Toc228121832"/>
+      <w:bookmarkStart w:id="40" w:name="_Toc228121832"/>
       <w:r>
         <w:t>¿Cómo sabe el sistema que un paciente está listo para la evaluación final?</w:t>
       </w:r>
-      <w:bookmarkEnd w:id="35"/>
+      <w:bookmarkEnd w:id="40"/>
     </w:p>
     <w:p>
       <w:pPr>

</xml_diff>